<commit_message>
Updated FGR with Lit Review & References
</commit_message>
<xml_diff>
--- a/FInal-Grp-6.docx
+++ b/FInal-Grp-6.docx
@@ -884,6 +884,7 @@
     <w:p/>
     <w:p>
       <w:pPr>
+        <w:spacing w:line="276" w:lineRule="auto"/>
         <w:ind w:firstLine="720"/>
       </w:pPr>
       <w:r>
@@ -900,17 +901,16 @@
       <w:r>
         <w:t xml:space="preserve"> for their roles as our Project Client and Project Supervisor throughout the course of this academic year, their words of encouragement and wisdom through the </w:t>
       </w:r>
-      <w:proofErr w:type="gramStart"/>
-      <w:r>
-        <w:t>myriad</w:t>
-      </w:r>
-      <w:proofErr w:type="gramEnd"/>
+      <w:r>
+        <w:t>myriads</w:t>
+      </w:r>
       <w:r>
         <w:t xml:space="preserve"> of meetings that we had were vastly meaningful and appreciated.</w:t>
       </w:r>
     </w:p>
     <w:p>
       <w:pPr>
+        <w:spacing w:line="276" w:lineRule="auto"/>
         <w:ind w:firstLine="720"/>
       </w:pPr>
       <w:r>
@@ -922,19 +922,11 @@
       <w:r>
         <w:t xml:space="preserve"> for their support, insight, and guidance throughout the course of this project</w:t>
       </w:r>
-      <w:proofErr w:type="gramStart"/>
       <w:r>
         <w:t xml:space="preserve">, </w:t>
       </w:r>
       <w:r>
-        <w:t>,</w:t>
-      </w:r>
-      <w:proofErr w:type="gramEnd"/>
-      <w:r>
-        <w:t xml:space="preserve"> we would not have been able to get where we did without their</w:t>
-      </w:r>
-      <w:r>
-        <w:t xml:space="preserve"> support:</w:t>
+        <w:t>we would not have been able to get where we did without their support:</w:t>
       </w:r>
     </w:p>
     <w:p>
@@ -3092,31 +3084,41 @@
     </w:p>
     <w:p>
       <w:pPr>
-        <w:ind w:firstLine="720"/>
-      </w:pPr>
-      <w:r>
-        <w:t>“In Malaysia, there exists roughly 52,000 of newly reported cancer case in the year 2022, and that approximately 32,000 patients died of cancer in the same year. Out of the 52,000 new cases, 181 cases were of melanoma, and that 88 patients died of melanoma in that same year.” – Excerpt from our Project Description.</w:t>
-      </w:r>
-    </w:p>
-    <w:p>
-      <w:pPr>
-        <w:ind w:firstLine="720"/>
+        <w:spacing w:line="276" w:lineRule="auto"/>
+      </w:pPr>
+      <w:r>
+        <w:t xml:space="preserve">“In Malaysia, there exists roughly 52,000 of newly reported cancer case in the year 2022, and that approximately 32,000 patients died of cancer in the same year. Out of the 52,000 new cases, 181 cases were of melanoma, and that 88 patients died of melanoma in that same year.” – Excerpt from </w:t>
+      </w:r>
+      <w:r>
+        <w:t>the</w:t>
+      </w:r>
+      <w:r>
+        <w:t xml:space="preserve"> Project Description.</w:t>
+      </w:r>
+    </w:p>
+    <w:p>
+      <w:pPr>
+        <w:spacing w:line="276" w:lineRule="auto"/>
       </w:pPr>
       <w:r>
         <w:t xml:space="preserve">Dr. Ir. Hermawan Nugroho is the project’s client and is currently an Assistant Professor within the Department of Electrical and Electronics Engineering, his research focuses on five fields but can </w:t>
       </w:r>
-      <w:proofErr w:type="gramStart"/>
-      <w:r>
-        <w:t>summarized</w:t>
-      </w:r>
-      <w:proofErr w:type="gramEnd"/>
-      <w:r>
-        <w:t xml:space="preserve"> to Image &amp; Signal Processing and AI applications in unmanned vehicles.</w:t>
-      </w:r>
-    </w:p>
-    <w:p>
-      <w:pPr>
-        <w:ind w:firstLine="720"/>
+      <w:r>
+        <w:t>be summarized</w:t>
+      </w:r>
+      <w:r>
+        <w:t xml:space="preserve"> </w:t>
+      </w:r>
+      <w:r>
+        <w:t>as</w:t>
+      </w:r>
+      <w:r>
+        <w:t xml:space="preserve"> Image &amp; Signal Processing and AI applications in unmanned vehicles.</w:t>
+      </w:r>
+    </w:p>
+    <w:p>
+      <w:pPr>
+        <w:spacing w:line="276" w:lineRule="auto"/>
       </w:pPr>
       <w:r>
         <w:t xml:space="preserve">The project’s client has graciously provided us with a final year dissertation conducted by </w:t>
@@ -3150,6 +3152,9 @@
       <w:bookmarkEnd w:id="3"/>
     </w:p>
     <w:p>
+      <w:pPr>
+        <w:spacing w:line="276" w:lineRule="auto"/>
+      </w:pPr>
       <w:r>
         <w:t>For the purposes of this project, we have used and acquired six (6) datasets to varying degrees of implementation:</w:t>
       </w:r>
@@ -3161,18 +3166,23 @@
           <w:ilvl w:val="0"/>
           <w:numId w:val="27"/>
         </w:numPr>
-        <w:spacing w:after="240"/>
-      </w:pPr>
-      <w:r>
-        <w:t xml:space="preserve">HAM10000: The “Humans Against Machines” dataset is a 10,015 </w:t>
-      </w:r>
-      <w:proofErr w:type="spellStart"/>
-      <w:r>
-        <w:t>dermoscopic</w:t>
-      </w:r>
-      <w:proofErr w:type="spellEnd"/>
-      <w:r>
-        <w:t xml:space="preserve"> dataset that consists of 7 classes and more than 50% of the images contained within have been confirmed through histopathology, this dataset was as one of our main training pool datasets.</w:t>
+        <w:spacing w:line="276" w:lineRule="auto"/>
+        <w:ind w:left="648"/>
+      </w:pPr>
+      <w:r>
+        <w:t xml:space="preserve">HAM10000: The “Humans Against Machines” dataset is a 10,015 dermoscopic dataset that consists of 7 classes and more than 50% of the images contained within have been confirmed through histopathology, this dataset was as one of </w:t>
+      </w:r>
+      <w:r>
+        <w:t xml:space="preserve">the </w:t>
+      </w:r>
+      <w:r>
+        <w:t>main training pool</w:t>
+      </w:r>
+      <w:r>
+        <w:t xml:space="preserve"> </w:t>
+      </w:r>
+      <w:r>
+        <w:t>datasets.</w:t>
       </w:r>
       <w:r>
         <w:br/>
@@ -3185,18 +3195,21 @@
           <w:ilvl w:val="0"/>
           <w:numId w:val="27"/>
         </w:numPr>
-      </w:pPr>
-      <w:r>
-        <w:t>ISIC2019: The 2019 “International Skin Imaging Collaboration” challenge contains our next</w:t>
-      </w:r>
-      <w:r>
-        <w:t xml:space="preserve"> </w:t>
-      </w:r>
-      <w:proofErr w:type="spellStart"/>
-      <w:r>
-        <w:t>dermoscopic</w:t>
-      </w:r>
-      <w:proofErr w:type="spellEnd"/>
+        <w:spacing w:line="276" w:lineRule="auto"/>
+        <w:ind w:left="648"/>
+      </w:pPr>
+      <w:r>
+        <w:t xml:space="preserve">ISIC2019: The 2019 “International Skin Imaging Collaboration” challenge contains </w:t>
+      </w:r>
+      <w:r>
+        <w:t>the</w:t>
+      </w:r>
+      <w:r>
+        <w:t xml:space="preserve"> next</w:t>
+      </w:r>
+      <w:r>
+        <w:t xml:space="preserve"> dermoscopic</w:t>
+      </w:r>
       <w:r>
         <w:t xml:space="preserve"> training dataset, which consists of unique images for the 2019 challenge and contains images from previous challenges (2017-2018), ISIC2019 has 8 classes with the newest addition being </w:t>
       </w:r>
@@ -3214,6 +3227,8 @@
           <w:ilvl w:val="0"/>
           <w:numId w:val="27"/>
         </w:numPr>
+        <w:spacing w:line="276" w:lineRule="auto"/>
+        <w:ind w:left="648"/>
       </w:pPr>
       <w:r>
         <w:t>PH</w:t>
@@ -3240,25 +3255,27 @@
         <w:t>2</w:t>
       </w:r>
       <w:r>
-        <w:t xml:space="preserve"> is another </w:t>
-      </w:r>
-      <w:proofErr w:type="spellStart"/>
-      <w:r>
-        <w:t>dermoscopic</w:t>
-      </w:r>
-      <w:proofErr w:type="spellEnd"/>
-      <w:r>
-        <w:t xml:space="preserve"> image dataset </w:t>
+        <w:t xml:space="preserve"> is another dermoscopic image dataset </w:t>
       </w:r>
       <w:r>
         <w:t>acquired at the Dermatology Service of Hospital Pedro Hispano, Matosinhos, Portugal.</w:t>
       </w:r>
       <w:r>
-        <w:t xml:space="preserve"> It consists of 160 melanocytic nevi images and 40 melanoma images and is used as our first external test dataset.</w:t>
-      </w:r>
-      <w:r>
-        <w:br/>
-      </w:r>
+        <w:t xml:space="preserve"> It consists of 160 melanocytic nevi images and 40 melanoma images and is used as </w:t>
+      </w:r>
+      <w:r>
+        <w:t>the</w:t>
+      </w:r>
+      <w:r>
+        <w:t xml:space="preserve"> first external test dataset.</w:t>
+      </w:r>
+    </w:p>
+    <w:p>
+      <w:pPr>
+        <w:pStyle w:val="ListParagraph"/>
+        <w:spacing w:line="276" w:lineRule="auto"/>
+        <w:ind w:left="648"/>
+      </w:pPr>
     </w:p>
     <w:p>
       <w:pPr>
@@ -3267,16 +3284,37 @@
           <w:ilvl w:val="0"/>
           <w:numId w:val="27"/>
         </w:numPr>
-      </w:pPr>
-      <w:r>
+        <w:spacing w:line="276" w:lineRule="auto"/>
+        <w:ind w:left="648"/>
+      </w:pPr>
+      <w:r>
+        <w:lastRenderedPageBreak/>
         <w:t>PAD-UFES-20:</w:t>
       </w:r>
       <w:r>
-        <w:t xml:space="preserve"> The PAD-UFES-20 dataset comprises of approximately 2300 images captured using smartphone cameras over 6 classes, over 58% of the image samples are proven via a biopsy.</w:t>
-      </w:r>
-      <w:r>
-        <w:br/>
-      </w:r>
+        <w:t xml:space="preserve"> The PAD-UFES-20 dataset </w:t>
+      </w:r>
+      <w:r>
+        <w:t>comprises</w:t>
+      </w:r>
+      <w:r>
+        <w:t xml:space="preserve"> approximately 2300 images captured using smartphone cameras over 6 classes, over 58% of the image samples are proven via </w:t>
+      </w:r>
+      <w:proofErr w:type="gramStart"/>
+      <w:r>
+        <w:t>a biopsy</w:t>
+      </w:r>
+      <w:proofErr w:type="gramEnd"/>
+      <w:r>
+        <w:t>.</w:t>
+      </w:r>
+    </w:p>
+    <w:p>
+      <w:pPr>
+        <w:pStyle w:val="ListParagraph"/>
+        <w:spacing w:line="276" w:lineRule="auto"/>
+        <w:ind w:left="648"/>
+      </w:pPr>
     </w:p>
     <w:p>
       <w:pPr>
@@ -3285,27 +3323,17 @@
           <w:ilvl w:val="0"/>
           <w:numId w:val="27"/>
         </w:numPr>
+        <w:spacing w:line="276" w:lineRule="auto"/>
+        <w:ind w:left="648"/>
       </w:pPr>
       <w:r>
         <w:t xml:space="preserve">MRA-MIDAS: </w:t>
       </w:r>
       <w:r>
-        <w:t xml:space="preserve">The Multi-Modal Image Dataset for AI-based Skin Cancer is provided by the Melanoma Research Alliance and is based on 3830 total images acquired from 1290 unique lesions taken using smartphones and </w:t>
-      </w:r>
-      <w:proofErr w:type="spellStart"/>
-      <w:r>
-        <w:t>dermoscopes</w:t>
-      </w:r>
-      <w:proofErr w:type="spellEnd"/>
-      <w:r>
-        <w:t xml:space="preserve">, </w:t>
-      </w:r>
-      <w:r>
-        <w:t xml:space="preserve">some issues </w:t>
-      </w:r>
-      <w:r>
-        <w:lastRenderedPageBreak/>
-        <w:t>were found with this dataset and were brought up with the Stanford AIMI team, where one of our members maintained an correspondence with them, however no response was received from their end after submission of the list of notable dataset issues.</w:t>
+        <w:t xml:space="preserve">The Multi-Modal Image Dataset for AI-based Skin Cancer is provided by the Melanoma Research Alliance and is based on 3830 total images acquired from 1290 unique lesions taken using smartphones and dermoscopes, </w:t>
+      </w:r>
+      <w:r>
+        <w:t>some issues were found with this dataset and were brought up with the Stanford AIMI team, where one of our members maintained an correspondence with them, however no response was received from their end after submission of the list of notable dataset issues.</w:t>
       </w:r>
       <w:r>
         <w:br/>
@@ -3318,6 +3346,8 @@
           <w:ilvl w:val="0"/>
           <w:numId w:val="27"/>
         </w:numPr>
+        <w:spacing w:line="276" w:lineRule="auto"/>
+        <w:ind w:left="648"/>
       </w:pPr>
       <w:r>
         <w:t xml:space="preserve">Fitzpatrick 17k Dataset: </w:t>
@@ -3355,118 +3385,145 @@
     </w:p>
     <w:p>
       <w:pPr>
+        <w:spacing w:line="276" w:lineRule="auto"/>
+      </w:pPr>
+      <w:r>
+        <w:t>The primary objective of this project is to develop a mobile application that will assist its users in monitoring their skin condition and detect early symptoms of skin cancer; effectively acting as a ‘diagnostic triage’ tool.</w:t>
+      </w:r>
+    </w:p>
+    <w:p>
+      <w:pPr>
+        <w:spacing w:line="276" w:lineRule="auto"/>
+      </w:pPr>
+      <w:r>
+        <w:t>Furthermore, we aim to refer stakeholders to medical professionals for medical and dermatological advice when applicable or when the need arises.</w:t>
+      </w:r>
+    </w:p>
+    <w:p>
+      <w:pPr>
+        <w:spacing w:line="276" w:lineRule="auto"/>
+      </w:pPr>
+      <w:r>
+        <w:t xml:space="preserve">Our project scope </w:t>
+      </w:r>
+      <w:r>
+        <w:t>directs us to</w:t>
+      </w:r>
+      <w:r>
+        <w:t xml:space="preserve"> utilize Python </w:t>
+      </w:r>
+      <w:r>
+        <w:t xml:space="preserve">and </w:t>
+      </w:r>
+      <w:r>
+        <w:t>PyTorch</w:t>
+      </w:r>
+      <w:r>
+        <w:t xml:space="preserve"> in combination with various external modules to create </w:t>
+      </w:r>
+      <w:r>
+        <w:t>the</w:t>
+      </w:r>
+      <w:r>
+        <w:t xml:space="preserve"> classification model and then utilize</w:t>
+      </w:r>
+      <w:r>
+        <w:t xml:space="preserve"> </w:t>
+      </w:r>
+      <w:r>
+        <w:t>Flutter</w:t>
+      </w:r>
+      <w:r>
+        <w:t xml:space="preserve"> </w:t>
+      </w:r>
+      <w:r>
+        <w:t xml:space="preserve">as </w:t>
+      </w:r>
+      <w:r>
+        <w:t>the</w:t>
+      </w:r>
+      <w:r>
+        <w:t xml:space="preserve"> frontend as to </w:t>
+      </w:r>
+      <w:r>
+        <w:t xml:space="preserve">achieve </w:t>
+      </w:r>
+      <w:r>
+        <w:t>the</w:t>
+      </w:r>
+      <w:r>
+        <w:t xml:space="preserve"> goal of analyzing the possibility of skin cancer from </w:t>
+      </w:r>
+      <w:r>
+        <w:t>a photo</w:t>
+      </w:r>
+      <w:r>
+        <w:t>graph</w:t>
+      </w:r>
+      <w:r>
+        <w:t xml:space="preserve"> that is taken or uploaded from a user’s personal mobile phone, provided that it is supported by </w:t>
+      </w:r>
+      <w:r>
+        <w:t>the</w:t>
+      </w:r>
+      <w:r>
+        <w:t xml:space="preserve"> application.</w:t>
+      </w:r>
+      <w:r>
+        <w:t xml:space="preserve"> </w:t>
+      </w:r>
+    </w:p>
+    <w:p>
+      <w:pPr>
+        <w:spacing w:line="276" w:lineRule="auto"/>
+      </w:pPr>
+      <w:r>
+        <w:t xml:space="preserve">The system will then </w:t>
+      </w:r>
+      <w:r>
+        <w:t xml:space="preserve">categorize and </w:t>
+      </w:r>
+      <w:r>
+        <w:t>measure</w:t>
+      </w:r>
+      <w:r>
+        <w:t xml:space="preserve"> the photograph to determine the likelihood </w:t>
+      </w:r>
+      <w:r>
+        <w:t>o</w:t>
+      </w:r>
+      <w:r>
+        <w:t>f skin cancer being present through characteristics such as bulky papules &amp; ulcerations.</w:t>
+      </w:r>
+      <w:r>
+        <w:t xml:space="preserve"> If the likelihood of skin cancer is </w:t>
+      </w:r>
+      <w:r>
+        <w:t>high,</w:t>
+      </w:r>
+      <w:r>
+        <w:t xml:space="preserve"> then the user will be suggested to visit </w:t>
+      </w:r>
+      <w:r>
+        <w:t>their nearest dermatologist or hospital for further action and confirmation.</w:t>
+      </w:r>
+    </w:p>
+    <w:p>
+      <w:pPr>
+        <w:spacing w:line="276" w:lineRule="auto"/>
         <w:ind w:firstLine="720"/>
       </w:pPr>
       <w:r>
-        <w:t>The primary objective of this project is to develop a mobile application that will assist its users in monitoring their skin condition and detect early symptoms of skin cancer; effectively acting as a ‘diagnostic triage’ tool.</w:t>
-      </w:r>
-    </w:p>
-    <w:p>
-      <w:pPr>
-        <w:ind w:firstLine="720"/>
-      </w:pPr>
-      <w:r>
-        <w:t>Furthermore, we aim to refer stakeholders to medical professionals for medical and dermatological advice when applicable or when the need arises.</w:t>
-      </w:r>
-    </w:p>
-    <w:p>
-      <w:pPr>
-        <w:ind w:firstLine="720"/>
-      </w:pPr>
-      <w:r>
-        <w:t xml:space="preserve">Our project scope </w:t>
-      </w:r>
-      <w:r>
-        <w:t>directs us to</w:t>
-      </w:r>
-      <w:r>
-        <w:t xml:space="preserve"> utilize Python </w:t>
-      </w:r>
-      <w:r>
-        <w:t xml:space="preserve">and </w:t>
-      </w:r>
-      <w:proofErr w:type="spellStart"/>
-      <w:r>
-        <w:t>Pytorch</w:t>
-      </w:r>
-      <w:proofErr w:type="spellEnd"/>
-      <w:r>
-        <w:t xml:space="preserve"> in combination with various external modules to create our classification model and then utilize</w:t>
-      </w:r>
-      <w:r>
-        <w:t xml:space="preserve"> </w:t>
-      </w:r>
-      <w:r>
-        <w:t>Flutter</w:t>
-      </w:r>
-      <w:r>
-        <w:t xml:space="preserve"> </w:t>
-      </w:r>
-      <w:r>
-        <w:t xml:space="preserve">as our frontend as to </w:t>
-      </w:r>
-      <w:r>
-        <w:t xml:space="preserve">achieve our goal of analyzing the possibility of skin cancer from </w:t>
-      </w:r>
-      <w:r>
-        <w:t>a photo</w:t>
-      </w:r>
-      <w:r>
-        <w:t>graph</w:t>
-      </w:r>
-      <w:r>
-        <w:t xml:space="preserve"> that is taken or uploaded from a user’s personal mobile phone, provided that it is supported by our application.</w:t>
-      </w:r>
-      <w:r>
-        <w:t xml:space="preserve"> </w:t>
-      </w:r>
-    </w:p>
-    <w:p>
-      <w:pPr>
-        <w:ind w:firstLine="720"/>
-      </w:pPr>
-      <w:r>
-        <w:t xml:space="preserve">The system will then </w:t>
-      </w:r>
-      <w:r>
-        <w:t xml:space="preserve">categorize and </w:t>
-      </w:r>
-      <w:r>
-        <w:t>measure</w:t>
-      </w:r>
-      <w:r>
-        <w:t xml:space="preserve"> the photograph to determine the likelihood </w:t>
-      </w:r>
-      <w:r>
-        <w:t>o</w:t>
-      </w:r>
-      <w:r>
-        <w:t>f skin cancer being present through characteristics such as bulky papules &amp; ulcerations.</w:t>
-      </w:r>
-      <w:r>
-        <w:t xml:space="preserve"> If the likelihood of skin cancer is </w:t>
-      </w:r>
-      <w:proofErr w:type="gramStart"/>
-      <w:r>
-        <w:t>high</w:t>
-      </w:r>
-      <w:proofErr w:type="gramEnd"/>
-      <w:r>
-        <w:t xml:space="preserve"> then the user will be suggested to visit </w:t>
-      </w:r>
-      <w:r>
-        <w:t>their nearest dermatologist or hospital for further action and confirmation.</w:t>
-      </w:r>
-    </w:p>
-    <w:p>
-      <w:pPr>
-        <w:ind w:firstLine="720"/>
-      </w:pPr>
-      <w:r>
         <w:t xml:space="preserve">Provided is a </w:t>
       </w:r>
       <w:r>
-        <w:t>summary list of our project’s capabilities and functionalities:</w:t>
+        <w:t xml:space="preserve">summary list of </w:t>
+      </w:r>
+      <w:r>
+        <w:t>the</w:t>
+      </w:r>
+      <w:r>
+        <w:t xml:space="preserve"> project’s capabilities and functionalities:</w:t>
       </w:r>
     </w:p>
     <w:p>
@@ -3476,6 +3533,7 @@
           <w:ilvl w:val="0"/>
           <w:numId w:val="28"/>
         </w:numPr>
+        <w:spacing w:line="276" w:lineRule="auto"/>
       </w:pPr>
       <w:r>
         <w:t>Uploading or taking images using the application for Skin Cancer classification and inference.</w:t>
@@ -3488,17 +3546,10 @@
           <w:ilvl w:val="0"/>
           <w:numId w:val="28"/>
         </w:numPr>
-      </w:pPr>
-      <w:r>
-        <w:t xml:space="preserve">Providing </w:t>
-      </w:r>
-      <w:proofErr w:type="gramStart"/>
-      <w:r>
-        <w:t>referral</w:t>
-      </w:r>
-      <w:proofErr w:type="gramEnd"/>
-      <w:r>
-        <w:t xml:space="preserve"> to medical practitioners and dermatologists if cause-of-concern is found.</w:t>
+        <w:spacing w:line="276" w:lineRule="auto"/>
+      </w:pPr>
+      <w:r>
+        <w:t>The application will then make gauge the available information to infer the possibility of the user having skin cancer.</w:t>
       </w:r>
     </w:p>
     <w:p>
@@ -3508,529 +3559,45 @@
           <w:ilvl w:val="0"/>
           <w:numId w:val="28"/>
         </w:numPr>
-        <w:rPr>
-          <w:highlight w:val="yellow"/>
-        </w:rPr>
-      </w:pPr>
-      <w:r>
-        <w:rPr>
-          <w:highlight w:val="yellow"/>
-        </w:rPr>
-        <w:t>[WIP]</w:t>
-      </w:r>
-    </w:p>
-    <w:p>
-      <w:r>
-        <w:br w:type="page"/>
-      </w:r>
-    </w:p>
-    <w:p>
-      <w:pPr>
-        <w:pStyle w:val="Chapters"/>
-      </w:pPr>
-      <w:r>
-        <w:lastRenderedPageBreak/>
-        <w:t xml:space="preserve">Chapter </w:t>
-      </w:r>
-      <w:r>
-        <w:t>2</w:t>
-      </w:r>
-    </w:p>
-    <w:p>
-      <w:pPr>
-        <w:pStyle w:val="Heading2"/>
-      </w:pPr>
-      <w:bookmarkStart w:id="5" w:name="_Toc227368700"/>
-      <w:r>
-        <w:t>Background Information</w:t>
-      </w:r>
-      <w:bookmarkEnd w:id="5"/>
-    </w:p>
-    <w:p>
-      <w:pPr>
-        <w:pStyle w:val="Heading3"/>
-      </w:pPr>
-      <w:bookmarkStart w:id="6" w:name="_Toc216281418"/>
-      <w:bookmarkStart w:id="7" w:name="_Toc227368701"/>
-      <w:r>
-        <w:t>2</w:t>
-      </w:r>
-      <w:r>
-        <w:t>.1</w:t>
-      </w:r>
-      <w:r>
-        <w:tab/>
-      </w:r>
-      <w:bookmarkEnd w:id="6"/>
-      <w:r>
-        <w:t>Similar Systems</w:t>
-      </w:r>
-      <w:bookmarkEnd w:id="7"/>
-      <w:r>
-        <w:t xml:space="preserve"> </w:t>
-      </w:r>
-    </w:p>
-    <w:p>
-      <w:proofErr w:type="spellStart"/>
-      <w:r>
-        <w:t>Asd</w:t>
-      </w:r>
-      <w:proofErr w:type="spellEnd"/>
-    </w:p>
-    <w:p>
-      <w:pPr>
-        <w:pStyle w:val="Heading3"/>
-      </w:pPr>
-      <w:bookmarkStart w:id="8" w:name="_Toc227368702"/>
-      <w:r>
-        <w:t xml:space="preserve">2.2 </w:t>
-      </w:r>
-      <w:r>
-        <w:tab/>
-      </w:r>
-      <w:r>
-        <w:t>Literature Review</w:t>
-      </w:r>
-      <w:bookmarkEnd w:id="8"/>
-    </w:p>
-    <w:p>
-      <w:r>
-        <w:t xml:space="preserve">The current research </w:t>
-      </w:r>
-      <w:r>
-        <w:t xml:space="preserve">in AI usage in Skin Cancer Diagnosis highlights a </w:t>
-      </w:r>
-      <w:r>
-        <w:t>d</w:t>
-      </w:r>
-      <w:r>
-        <w:t xml:space="preserve">isproportionate performance disparity between specialized </w:t>
-      </w:r>
-      <w:r>
-        <w:t xml:space="preserve">medical AI applications and general-purpose LLMs. And meanwhile models </w:t>
-      </w:r>
-      <w:r>
-        <w:t xml:space="preserve">such as GPT-4 have advanced multimodal functionalities, </w:t>
-      </w:r>
-      <w:r>
-        <w:t>recent studies show that they are not suitable for clinical dermatology as of now</w:t>
-      </w:r>
-      <w:r>
-        <w:t xml:space="preserve">. A study published in JAAD found that while ChatGPT Vision managed to identify broad features, it </w:t>
-      </w:r>
-      <w:r>
-        <w:t>hallucinated symptoms and markers or missed subtle irregularities</w:t>
-      </w:r>
-      <w:r>
-        <w:rPr>
-          <w:noProof/>
-        </w:rPr>
-        <w:t xml:space="preserve"> [</w:t>
-      </w:r>
-      <w:r>
-        <w:rPr>
-          <w:noProof/>
-        </w:rPr>
-        <w:t>4]</w:t>
-      </w:r>
-      <w:r>
-        <w:t>.</w:t>
-      </w:r>
-      <w:r>
-        <w:t xml:space="preserve"> </w:t>
-      </w:r>
-      <w:r>
-        <w:t xml:space="preserve">Meanwhile </w:t>
-      </w:r>
-      <w:r>
-        <w:t xml:space="preserve">comparative </w:t>
-      </w:r>
-      <w:r>
-        <w:t xml:space="preserve">research </w:t>
-      </w:r>
-      <w:r>
-        <w:t xml:space="preserve">papers found that </w:t>
-      </w:r>
-      <w:r>
-        <w:t>consumer-purpose LLMs such as ChatGPT-4 Omni consistently underperform when matched against specialized</w:t>
-      </w:r>
-      <w:r>
-        <w:t xml:space="preserve"> dermatological algorithms</w:t>
-      </w:r>
-      <w:r>
-        <w:t xml:space="preserve"> [5].</w:t>
-      </w:r>
-      <w:r>
-        <w:t xml:space="preserve"> These findings </w:t>
-      </w:r>
-      <w:r>
-        <w:t xml:space="preserve">imply that </w:t>
-      </w:r>
-      <w:r>
-        <w:t xml:space="preserve">the reliance on </w:t>
-      </w:r>
-      <w:r>
-        <w:t>L</w:t>
-      </w:r>
-      <w:r>
-        <w:t>LM’s</w:t>
-      </w:r>
-      <w:r>
-        <w:t xml:space="preserve"> is insufficient for a rel</w:t>
-      </w:r>
-      <w:r>
-        <w:t xml:space="preserve">iable diagnosis, justifying the development </w:t>
-      </w:r>
-      <w:r>
-        <w:t>of a dedicated, domain-specific application.</w:t>
-      </w:r>
-    </w:p>
-    <w:p/>
-    <w:p>
-      <w:r>
-        <w:t xml:space="preserve">A main concern that arises is the issue when comparing accuracy results in controlled environments versus </w:t>
-      </w:r>
-      <w:r>
-        <w:t>real-life conditio</w:t>
-      </w:r>
-      <w:r>
-        <w:t xml:space="preserve">ns, where AI </w:t>
-      </w:r>
-      <w:r>
-        <w:t xml:space="preserve">models </w:t>
-      </w:r>
-      <w:r>
-        <w:t>have feasibly attained high accuracy rates often exceeding 90% in controlled studies but have seen significant accuracy drops when applied to user-generated smartphone images</w:t>
-      </w:r>
-      <w:r>
-        <w:t xml:space="preserve"> </w:t>
-      </w:r>
-      <w:r>
-        <w:t>[2].</w:t>
-      </w:r>
-      <w:r>
-        <w:t xml:space="preserve"> This </w:t>
-      </w:r>
-      <w:r>
-        <w:t>decline in performance can be attributed to t</w:t>
-      </w:r>
-      <w:r>
-        <w:t xml:space="preserve">he gap that exists between standardized, controlled images and </w:t>
-      </w:r>
-      <w:r>
-        <w:t>irregular, blurry</w:t>
-      </w:r>
-      <w:r>
-        <w:t xml:space="preserve"> or dimly lit images</w:t>
-      </w:r>
-      <w:r>
-        <w:t xml:space="preserve"> which are more commonly seen in photos taken by patients</w:t>
-      </w:r>
-      <w:r>
-        <w:t xml:space="preserve">, </w:t>
-      </w:r>
-      <w:r>
-        <w:t xml:space="preserve">this emphasizes the necessity for data pre-processing and the ability to handle lower-quality input data more effectively than </w:t>
-      </w:r>
-      <w:r>
-        <w:t>models that solely rely on academic models.</w:t>
-      </w:r>
-    </w:p>
-    <w:p/>
-    <w:p>
-      <w:r>
-        <w:t xml:space="preserve">And </w:t>
-      </w:r>
-      <w:proofErr w:type="gramStart"/>
-      <w:r>
-        <w:t>in spite of</w:t>
-      </w:r>
-      <w:proofErr w:type="gramEnd"/>
-      <w:r>
-        <w:t xml:space="preserve"> the current obstacles, </w:t>
-      </w:r>
-      <w:r>
-        <w:t xml:space="preserve">automated </w:t>
-      </w:r>
-      <w:r>
-        <w:t xml:space="preserve">algorithms </w:t>
-      </w:r>
-    </w:p>
-    <w:p>
-      <w:r>
-        <w:t>•</w:t>
-      </w:r>
-      <w:r>
-        <w:tab/>
-        <w:t>Background information and research such as</w:t>
-      </w:r>
-    </w:p>
-    <w:p>
-      <w:r>
-        <w:t>o</w:t>
-      </w:r>
-      <w:r>
-        <w:tab/>
-        <w:t xml:space="preserve">survey of any existing systems that address similar </w:t>
-      </w:r>
-      <w:proofErr w:type="spellStart"/>
-      <w:r>
-        <w:t>problems</w:t>
-      </w:r>
-      <w:r>
-        <w:t>z</w:t>
-      </w:r>
-      <w:proofErr w:type="spellEnd"/>
-    </w:p>
-    <w:p>
-      <w:r>
-        <w:t>o</w:t>
-      </w:r>
-      <w:r>
-        <w:tab/>
-        <w:t>results of any market research conducted</w:t>
-      </w:r>
-    </w:p>
-    <w:p>
-      <w:r>
-        <w:t>o</w:t>
-      </w:r>
-      <w:r>
-        <w:tab/>
-        <w:t>results of technical research into suitable platforms, tools, technologies, algorithms, data structures, etc.</w:t>
-      </w:r>
-    </w:p>
-    <w:p>
-      <w:r>
-        <w:t xml:space="preserve">- </w:t>
-      </w:r>
-      <w:r>
-        <w:tab/>
-        <w:t>Includes Literature Review</w:t>
-      </w:r>
-    </w:p>
-    <w:p/>
+        <w:spacing w:line="276" w:lineRule="auto"/>
+      </w:pPr>
+      <w:r>
+        <w:t>The application will p</w:t>
+      </w:r>
+      <w:r>
+        <w:t>rovid</w:t>
+      </w:r>
+      <w:r>
+        <w:t xml:space="preserve">e </w:t>
+      </w:r>
+      <w:r>
+        <w:t>referrals</w:t>
+      </w:r>
+      <w:r>
+        <w:t xml:space="preserve"> to medical practitioners and dermatologists if cause-of-concern is found.</w:t>
+      </w:r>
+    </w:p>
     <w:p>
       <w:pPr>
         <w:pStyle w:val="ListParagraph"/>
         <w:numPr>
           <w:ilvl w:val="0"/>
-          <w:numId w:val="21"/>
+          <w:numId w:val="28"/>
         </w:numPr>
-        <w:rPr>
-          <w:lang w:val="en-GB"/>
-        </w:rPr>
-      </w:pPr>
-      <w:r>
-        <w:rPr>
-          <w:lang w:val="en-GB"/>
+        <w:spacing w:line="276" w:lineRule="auto"/>
+        <w:rPr>
+          <w:highlight w:val="yellow"/>
+        </w:rPr>
+      </w:pPr>
+      <w:r>
+        <w:rPr>
+          <w:highlight w:val="yellow"/>
         </w:rPr>
         <w:lastRenderedPageBreak/>
-        <w:t xml:space="preserve">Sem 1 focused on Literature review, UI, assigning work, and ensuring everyone is prepared for collaborative working (using Git &amp; </w:t>
-      </w:r>
-      <w:proofErr w:type="spellStart"/>
-      <w:r>
-        <w:rPr>
-          <w:lang w:val="en-GB"/>
-        </w:rPr>
-        <w:t>Github</w:t>
-      </w:r>
-      <w:proofErr w:type="spellEnd"/>
-      <w:r>
-        <w:rPr>
-          <w:lang w:val="en-GB"/>
-        </w:rPr>
-        <w:t>, etc)</w:t>
-      </w:r>
-    </w:p>
-    <w:p>
-      <w:pPr>
-        <w:pStyle w:val="ListParagraph"/>
-        <w:numPr>
-          <w:ilvl w:val="0"/>
-          <w:numId w:val="21"/>
-        </w:numPr>
-        <w:rPr>
-          <w:lang w:val="en-GB"/>
-        </w:rPr>
-      </w:pPr>
-      <w:r>
-        <w:rPr>
-          <w:lang w:val="en-GB"/>
-        </w:rPr>
-        <w:t>Lit Review Links &amp; Datasets:</w:t>
-      </w:r>
-      <w:r>
-        <w:rPr>
-          <w:lang w:val="en-GB"/>
-        </w:rPr>
-        <w:t xml:space="preserve"> [ALL REFERENCES HAVE BEEN ADDED, check </w:t>
-      </w:r>
-      <w:r>
-        <w:rPr>
-          <w:lang w:val="en-GB"/>
-        </w:rPr>
-        <w:t xml:space="preserve">“Manage Sources”, </w:t>
-      </w:r>
-      <w:proofErr w:type="spellStart"/>
-      <w:r>
-        <w:rPr>
-          <w:lang w:val="en-GB"/>
-        </w:rPr>
-        <w:t>its</w:t>
-      </w:r>
-      <w:proofErr w:type="spellEnd"/>
-      <w:r>
-        <w:rPr>
-          <w:lang w:val="en-GB"/>
-        </w:rPr>
-        <w:t xml:space="preserve"> in IEEE]</w:t>
-      </w:r>
-    </w:p>
-    <w:p>
-      <w:pPr>
-        <w:pStyle w:val="ListParagraph"/>
-        <w:numPr>
-          <w:ilvl w:val="1"/>
-          <w:numId w:val="21"/>
-        </w:numPr>
-        <w:rPr>
-          <w:lang w:val="en-GB"/>
-        </w:rPr>
-      </w:pPr>
-      <w:hyperlink r:id="rId12" w:history="1">
-        <w:r>
-          <w:rPr>
-            <w:rStyle w:val="Hyperlink"/>
-            <w:lang w:val="en-GB"/>
-          </w:rPr>
-          <w:t>Stanford Dataset</w:t>
-        </w:r>
-      </w:hyperlink>
-    </w:p>
-    <w:p>
-      <w:pPr>
-        <w:pStyle w:val="ListParagraph"/>
-        <w:numPr>
-          <w:ilvl w:val="1"/>
-          <w:numId w:val="21"/>
-        </w:numPr>
-        <w:rPr>
-          <w:lang w:val="en-GB"/>
-        </w:rPr>
-      </w:pPr>
-      <w:r>
-        <w:rPr>
-          <w:lang w:val="en-GB"/>
-        </w:rPr>
-        <w:t xml:space="preserve">ScienceDirect: </w:t>
-      </w:r>
-      <w:hyperlink r:id="rId13" w:history="1">
-        <w:r>
-          <w:rPr>
-            <w:rStyle w:val="Hyperlink"/>
-            <w:lang w:val="en-GB"/>
-          </w:rPr>
-          <w:t>Artificial Intelligence in Skin Cancer Diagnosis: A Reality Check</w:t>
-        </w:r>
-      </w:hyperlink>
-    </w:p>
-    <w:p>
-      <w:pPr>
-        <w:pStyle w:val="ListParagraph"/>
-        <w:numPr>
-          <w:ilvl w:val="1"/>
-          <w:numId w:val="21"/>
-        </w:numPr>
-        <w:rPr>
-          <w:lang w:val="en-GB"/>
-        </w:rPr>
-      </w:pPr>
-      <w:r>
-        <w:rPr>
-          <w:lang w:val="en-GB"/>
-        </w:rPr>
-        <w:t xml:space="preserve">Nature: </w:t>
-      </w:r>
-      <w:hyperlink r:id="rId14" w:history="1">
-        <w:r>
-          <w:rPr>
-            <w:rStyle w:val="Hyperlink"/>
-            <w:lang w:val="en-GB"/>
-          </w:rPr>
-          <w:t>Early automated detection system for skin cancer diagnosis using artificial intelligent techniques</w:t>
-        </w:r>
-      </w:hyperlink>
-    </w:p>
-    <w:p>
-      <w:pPr>
-        <w:pStyle w:val="ListParagraph"/>
-        <w:numPr>
-          <w:ilvl w:val="1"/>
-          <w:numId w:val="21"/>
-        </w:numPr>
-        <w:rPr>
-          <w:lang w:val="en-GB"/>
-        </w:rPr>
-      </w:pPr>
-      <w:r>
-        <w:rPr>
-          <w:lang w:val="en-GB"/>
-        </w:rPr>
-        <w:t xml:space="preserve">JAAD: </w:t>
-      </w:r>
-      <w:hyperlink r:id="rId15" w:history="1">
-        <w:r>
-          <w:rPr>
-            <w:rStyle w:val="Hyperlink"/>
-          </w:rPr>
-          <w:t>Can ChatGPT vision diagnose melanoma? An exploratory diagnostic accuracy study</w:t>
-        </w:r>
-      </w:hyperlink>
-    </w:p>
-    <w:p>
-      <w:pPr>
-        <w:pStyle w:val="ListParagraph"/>
-        <w:numPr>
-          <w:ilvl w:val="1"/>
-          <w:numId w:val="21"/>
-        </w:numPr>
-        <w:rPr>
-          <w:lang w:val="en-GB"/>
-        </w:rPr>
-      </w:pPr>
-      <w:r>
-        <w:t xml:space="preserve">NCBI, NLM: </w:t>
-      </w:r>
-      <w:hyperlink r:id="rId16" w:history="1">
-        <w:r>
-          <w:rPr>
-            <w:rStyle w:val="Hyperlink"/>
-          </w:rPr>
-          <w:t>Evaluating the Diagnostic Accuracy of ChatGPT-4 Omni and ChatGPT-4 Turbo in Identifying Melanoma: Comparative Study - PMC</w:t>
-        </w:r>
-      </w:hyperlink>
-    </w:p>
-    <w:p>
-      <w:pPr>
-        <w:rPr>
-          <w:lang w:val="en-GB"/>
-        </w:rPr>
-      </w:pPr>
-    </w:p>
-    <w:p/>
-    <w:p>
-      <w:r>
-        <w:t xml:space="preserve">2.1. </w:t>
-      </w:r>
-      <w:r>
-        <w:t>Similar Systems</w:t>
-      </w:r>
-    </w:p>
-    <w:p>
-      <w:r>
-        <w:t>2.2. Literature Review</w:t>
-      </w:r>
+        <w:t>[WIP]</w:t>
+      </w:r>
+    </w:p>
+    <w:p>
       <w:r>
         <w:br w:type="page"/>
       </w:r>
@@ -4044,6 +3611,440 @@
         <w:t xml:space="preserve">Chapter </w:t>
       </w:r>
       <w:r>
+        <w:t>2</w:t>
+      </w:r>
+    </w:p>
+    <w:p>
+      <w:pPr>
+        <w:pStyle w:val="Heading2"/>
+      </w:pPr>
+      <w:bookmarkStart w:id="5" w:name="_Toc227368700"/>
+      <w:r>
+        <w:t>Background Information</w:t>
+      </w:r>
+      <w:bookmarkEnd w:id="5"/>
+    </w:p>
+    <w:p>
+      <w:pPr>
+        <w:pStyle w:val="Heading3"/>
+      </w:pPr>
+      <w:bookmarkStart w:id="6" w:name="_Toc216281418"/>
+      <w:bookmarkStart w:id="7" w:name="_Toc227368701"/>
+      <w:r>
+        <w:t>2</w:t>
+      </w:r>
+      <w:r>
+        <w:t>.1</w:t>
+      </w:r>
+      <w:r>
+        <w:tab/>
+      </w:r>
+      <w:bookmarkEnd w:id="6"/>
+      <w:r>
+        <w:t>Similar Systems</w:t>
+      </w:r>
+      <w:bookmarkEnd w:id="7"/>
+      <w:r>
+        <w:t xml:space="preserve"> </w:t>
+      </w:r>
+    </w:p>
+    <w:p>
+      <w:pPr>
+        <w:spacing w:line="276" w:lineRule="auto"/>
+      </w:pPr>
+      <w:r>
+        <w:t xml:space="preserve">Various systems already exist that aim to address and incorporate AI-assisted skin cancer detection, each of them with their own distinct and unique approaches and limitations which have informed </w:t>
+      </w:r>
+      <w:r>
+        <w:t>the</w:t>
+      </w:r>
+      <w:r>
+        <w:t xml:space="preserve"> project’s design decisions.</w:t>
+      </w:r>
+    </w:p>
+    <w:p>
+      <w:pPr>
+        <w:spacing w:line="276" w:lineRule="auto"/>
+      </w:pPr>
+      <w:r>
+        <w:t xml:space="preserve">DERM is an AI skin cancer detection system </w:t>
+      </w:r>
+      <w:r>
+        <w:t>which facilitates the assessment of skin lesions and assists secondary medical institutions by reducing the need for urgent suspected skin cancer appointments [8]. The main drawback pertains to the clinical workflow and standardized equipment (dermoscopes) used in this process, where the skin lesion images are captured by healthcare professionals rather than by the patients themselves [8].</w:t>
+      </w:r>
+    </w:p>
+    <w:p>
+      <w:pPr>
+        <w:spacing w:line="276" w:lineRule="auto"/>
+      </w:pPr>
+      <w:r>
+        <w:t>Meanwhile, SkinVision</w:t>
+      </w:r>
+      <w:r>
+        <w:t xml:space="preserve"> is another consumer appli</w:t>
+      </w:r>
+      <w:r>
+        <w:t>cation that categorizes skin lesions into three sections: Low Risk, High Risk, &amp; In-Review, where High Risk and In Review images are forwarded to SkinVision’s board of dermatologists for further assessment</w:t>
+      </w:r>
+      <w:r>
+        <w:t xml:space="preserve"> [9]</w:t>
+      </w:r>
+      <w:r>
+        <w:t>. They use 3 modified pre-trained ResNET-50 CNNs trained on 200,000+ dermatologists-labelled images across a variety of skin types, ages and genders, this serves as the largest setback as we do not have access to their proprietary dataset in addition to the fact that their app follows a subscription-service payment plan including an option to pay for a single image inference</w:t>
+      </w:r>
+      <w:r>
+        <w:t xml:space="preserve"> [9][10]</w:t>
+      </w:r>
+      <w:r>
+        <w:t>.</w:t>
+      </w:r>
+    </w:p>
+    <w:p>
+      <w:pPr>
+        <w:spacing w:line="276" w:lineRule="auto"/>
+      </w:pPr>
+      <w:r>
+        <w:t xml:space="preserve">Our project aims to </w:t>
+      </w:r>
+      <w:r>
+        <w:t>distinguish</w:t>
+      </w:r>
+      <w:r>
+        <w:t xml:space="preserve"> itself by incorporating various features, including a multimodal approach via incorporating patient metadata</w:t>
+      </w:r>
+      <w:r>
+        <w:t xml:space="preserve"> alongside image classification and prioritizing accessibility through smartphone-based input while lowering the prerequisites needed to access care.</w:t>
+      </w:r>
+    </w:p>
+    <w:p>
+      <w:pPr>
+        <w:pStyle w:val="Heading3"/>
+      </w:pPr>
+      <w:bookmarkStart w:id="8" w:name="_Toc227368702"/>
+      <w:r>
+        <w:t xml:space="preserve">2.2 </w:t>
+      </w:r>
+      <w:r>
+        <w:tab/>
+      </w:r>
+      <w:r>
+        <w:t>Literature Review</w:t>
+      </w:r>
+      <w:bookmarkEnd w:id="8"/>
+    </w:p>
+    <w:p>
+      <w:pPr>
+        <w:spacing w:line="276" w:lineRule="auto"/>
+      </w:pPr>
+      <w:r>
+        <w:t xml:space="preserve">The current research </w:t>
+      </w:r>
+      <w:r>
+        <w:t xml:space="preserve">in AI usage in Skin Cancer Diagnosis highlights a </w:t>
+      </w:r>
+      <w:r>
+        <w:t>d</w:t>
+      </w:r>
+      <w:r>
+        <w:t xml:space="preserve">isproportionate performance disparity between specialized </w:t>
+      </w:r>
+      <w:r>
+        <w:t xml:space="preserve">medical AI applications and general-purpose LLMs. And meanwhile models </w:t>
+      </w:r>
+      <w:r>
+        <w:t xml:space="preserve">such as GPT-4 have advanced multimodal functionalities, </w:t>
+      </w:r>
+      <w:r>
+        <w:t>recent studies show that they are not suitable for clinical dermatology as of now</w:t>
+      </w:r>
+      <w:r>
+        <w:t xml:space="preserve">. A study published in JAAD found that while ChatGPT Vision managed to identify broad features, it </w:t>
+      </w:r>
+      <w:r>
+        <w:t>hallucinated symptoms and markers or missed subtle irregularities</w:t>
+      </w:r>
+      <w:r>
+        <w:rPr>
+          <w:noProof/>
+        </w:rPr>
+        <w:t xml:space="preserve"> [</w:t>
+      </w:r>
+      <w:r>
+        <w:rPr>
+          <w:noProof/>
+        </w:rPr>
+        <w:t>1</w:t>
+      </w:r>
+      <w:r>
+        <w:rPr>
+          <w:noProof/>
+        </w:rPr>
+        <w:t>4]</w:t>
+      </w:r>
+      <w:r>
+        <w:t>.</w:t>
+      </w:r>
+      <w:r>
+        <w:t xml:space="preserve"> </w:t>
+      </w:r>
+      <w:r>
+        <w:t xml:space="preserve">Meanwhile </w:t>
+      </w:r>
+      <w:r>
+        <w:t xml:space="preserve">comparative </w:t>
+      </w:r>
+      <w:r>
+        <w:t xml:space="preserve">research </w:t>
+      </w:r>
+      <w:r>
+        <w:t xml:space="preserve">papers found that </w:t>
+      </w:r>
+      <w:r>
+        <w:t>consumer-purpose LLMs such as ChatGPT-4 Omni consistently underperform when matched against specialized</w:t>
+      </w:r>
+      <w:r>
+        <w:t xml:space="preserve"> dermatological algorithms</w:t>
+      </w:r>
+      <w:r>
+        <w:t xml:space="preserve"> [</w:t>
+      </w:r>
+      <w:r>
+        <w:t>1</w:t>
+      </w:r>
+      <w:r>
+        <w:t>5].</w:t>
+      </w:r>
+      <w:r>
+        <w:t xml:space="preserve"> These findings </w:t>
+      </w:r>
+      <w:r>
+        <w:t xml:space="preserve">imply that </w:t>
+      </w:r>
+      <w:r>
+        <w:t xml:space="preserve">the reliance on </w:t>
+      </w:r>
+      <w:r>
+        <w:t>L</w:t>
+      </w:r>
+      <w:r>
+        <w:t>LM’s</w:t>
+      </w:r>
+      <w:r>
+        <w:t xml:space="preserve"> is insufficient for a rel</w:t>
+      </w:r>
+      <w:r>
+        <w:t xml:space="preserve">iable diagnosis, justifying the development </w:t>
+      </w:r>
+      <w:r>
+        <w:t>of a dedicated, domain-specific application.</w:t>
+      </w:r>
+    </w:p>
+    <w:p>
+      <w:pPr>
+        <w:spacing w:line="276" w:lineRule="auto"/>
+      </w:pPr>
+      <w:r>
+        <w:lastRenderedPageBreak/>
+        <w:t xml:space="preserve">A main concern that arises is the issue when comparing accuracy results in controlled environments versus </w:t>
+      </w:r>
+      <w:r>
+        <w:t>real-life conditio</w:t>
+      </w:r>
+      <w:r>
+        <w:t xml:space="preserve">ns, where AI </w:t>
+      </w:r>
+      <w:r>
+        <w:t xml:space="preserve">models </w:t>
+      </w:r>
+      <w:r>
+        <w:t xml:space="preserve">have feasibly attained high accuracy </w:t>
+      </w:r>
+      <w:r>
+        <w:t>rates,</w:t>
+      </w:r>
+      <w:r>
+        <w:t xml:space="preserve"> often exceeding 90% in controlled studies but have seen significant accuracy drops when applied to user-generated smartphone images</w:t>
+      </w:r>
+      <w:r>
+        <w:t xml:space="preserve"> </w:t>
+      </w:r>
+      <w:r>
+        <w:t>[</w:t>
+      </w:r>
+      <w:r>
+        <w:t>1</w:t>
+      </w:r>
+      <w:r>
+        <w:t>2].</w:t>
+      </w:r>
+      <w:r>
+        <w:t xml:space="preserve"> This </w:t>
+      </w:r>
+      <w:r>
+        <w:t>decline in performance can be attributed to t</w:t>
+      </w:r>
+      <w:r>
+        <w:t xml:space="preserve">he gap that exists between standardized, controlled images and </w:t>
+      </w:r>
+      <w:r>
+        <w:t>irregular, blurry</w:t>
+      </w:r>
+      <w:r>
+        <w:t xml:space="preserve"> or dimly lit images</w:t>
+      </w:r>
+      <w:r>
+        <w:t xml:space="preserve"> which are more commonly seen in photos taken by patients</w:t>
+      </w:r>
+      <w:r>
+        <w:t xml:space="preserve">, </w:t>
+      </w:r>
+      <w:r>
+        <w:t xml:space="preserve">this emphasizes the necessity for data pre-processing and the ability to handle lower-quality input data more effectively than </w:t>
+      </w:r>
+      <w:r>
+        <w:t>models that solely rely on academic models.</w:t>
+      </w:r>
+    </w:p>
+    <w:p>
+      <w:pPr>
+        <w:spacing w:line="276" w:lineRule="auto"/>
+      </w:pPr>
+      <w:r>
+        <w:t xml:space="preserve">And </w:t>
+      </w:r>
+      <w:proofErr w:type="gramStart"/>
+      <w:r>
+        <w:t>in spite of</w:t>
+      </w:r>
+      <w:proofErr w:type="gramEnd"/>
+      <w:r>
+        <w:t xml:space="preserve"> the current obstacles, </w:t>
+      </w:r>
+      <w:r>
+        <w:t xml:space="preserve">automated </w:t>
+      </w:r>
+      <w:r>
+        <w:t xml:space="preserve">algorithms </w:t>
+      </w:r>
+      <w:r>
+        <w:t xml:space="preserve">have demonstrated considerable potential. A notable study published in Nature by Esteva et al., showcased that a Deep Convolutional Neural Network (DCNN) trained on ~130,000 images using </w:t>
+      </w:r>
+      <w:proofErr w:type="spellStart"/>
+      <w:r>
+        <w:t>GoogleNet’s</w:t>
+      </w:r>
+      <w:proofErr w:type="spellEnd"/>
+      <w:r>
+        <w:t xml:space="preserve"> Inception V3’s backbone achieved classification performance on par with board-certified dermatologists. T</w:t>
+      </w:r>
+      <w:r>
+        <w:t xml:space="preserve">his study employed transfer learning, pre-training on more than 1 million images from ImageNet before fine-tuning on dermatological data. This established the precedent needed to allow us to proceed with </w:t>
+      </w:r>
+      <w:r>
+        <w:t xml:space="preserve">the </w:t>
+      </w:r>
+      <w:r>
+        <w:t>transfer learning approach [5]</w:t>
+      </w:r>
+      <w:r>
+        <w:t>.</w:t>
+      </w:r>
+    </w:p>
+    <w:p>
+      <w:pPr>
+        <w:spacing w:line="276" w:lineRule="auto"/>
+      </w:pPr>
+      <w:r>
+        <w:t>Chong Jia Luo’s dissertation on lightweight deep learning networks for skin cancer classification explored the use of a modified MobileNetV1 architecture with the dropout layer removed and the final layer replaced with a dense layer using SoftMax activation for multi-class classification. Additionally, the dissertation mentions the concept of Generative Adversarial Networks (GANs) as a teacher-student network to generate and classify images simultaneously, though this approach carries risks of introducing artifacts, inaccurate labeling, and increased complexity</w:t>
+      </w:r>
+      <w:r>
+        <w:t xml:space="preserve"> [1]</w:t>
+      </w:r>
+      <w:r>
+        <w:t>. However</w:t>
+      </w:r>
+      <w:r>
+        <w:t xml:space="preserve"> while conducting the literature review for the “Introduction to Image Processing” COMP2032 coursework, the paper on White Blood Cell (WBC) segmentation and classification by Mohamad Abou Ali, Fadi and Ignacio detailed the usage of a model called the “Segment Anything Model” that was utilized to segment WBC’s from Red Blood Cells (RBC) and compartmentalize them to create entirely distinct, composite images</w:t>
+      </w:r>
+      <w:r>
+        <w:t xml:space="preserve"> [16].</w:t>
+      </w:r>
+    </w:p>
+    <w:p>
+      <w:pPr>
+        <w:spacing w:line="276" w:lineRule="auto"/>
+      </w:pPr>
+      <w:r>
+        <w:t xml:space="preserve">Data preprocessing is another area where research has been conducted, </w:t>
+      </w:r>
+      <w:proofErr w:type="spellStart"/>
+      <w:r>
+        <w:t>Swapno</w:t>
+      </w:r>
+      <w:proofErr w:type="spellEnd"/>
+      <w:r>
+        <w:t xml:space="preserve"> et al. developed a skin cancer preprocessing pipeline that standardizes image sizes, unifies color space information across different datasets and employed adaptive filters and morphological operations to remove hair from images, minimizing the impact of artifacts on analysis. Various of these preprocessing steps were employed in our iteration of the project and ranged from image resizing, pixel value normalization, data augmentation and contrast modification as they were all informed by paper [3].</w:t>
+      </w:r>
+    </w:p>
+    <w:p>
+      <w:pPr>
+        <w:spacing w:line="276" w:lineRule="auto"/>
+      </w:pPr>
+      <w:r>
+        <w:t>Class imbalance has shown to be a very prominent issue in skin cancer datasets, especially with melanoma consisting of an extraordinarily minor subset of all skin cancer cases and moles (melanocytic nevi) overwhelming most of the sampled images. Research has shown that without mitigation, models tend to overfit to majority classes which adversely affects the minority classes [1][2]. The literature however proposes several strategies to address this, including inverse frequency class weighting, where the weight assigned to each class is inversely proportional to its frequency in the dataset</w:t>
+      </w:r>
+      <w:r>
+        <w:t xml:space="preserve"> in addition to deliberately increasing </w:t>
+      </w:r>
+      <w:r>
+        <w:lastRenderedPageBreak/>
+        <w:t>the malignant class weightage on top of that [2]</w:t>
+      </w:r>
+      <w:r>
+        <w:t>. This philo</w:t>
+      </w:r>
+      <w:r>
+        <w:t>sophy was employed as a false negative classification of any malignant lesion carries significantly greater consequences than a false positive.</w:t>
+      </w:r>
+    </w:p>
+    <w:p>
+      <w:pPr>
+        <w:spacing w:line="276" w:lineRule="auto"/>
+      </w:pPr>
+      <w:r>
+        <w:t>The FitzPatrick Skin Type scale is a scale that classifies skin color from Type I to Type VI (Lightest to Darkest</w:t>
+      </w:r>
+      <w:r>
+        <w:t>);</w:t>
+      </w:r>
+      <w:r>
+        <w:t xml:space="preserve"> </w:t>
+      </w:r>
+      <w:r>
+        <w:t>however,</w:t>
+      </w:r>
+      <w:r>
+        <w:t xml:space="preserve"> it carries an issue where it was never calibrated for darker skin tones as it was developed by Thomas Fitzpatrick in 1975 for white-skinned patients to guide UV and sun exposure responses</w:t>
+      </w:r>
+      <w:r>
+        <w:t xml:space="preserve"> [17]</w:t>
+      </w:r>
+      <w:r>
+        <w:t>.</w:t>
+      </w:r>
+      <w:r>
+        <w:br w:type="page"/>
+      </w:r>
+    </w:p>
+    <w:p>
+      <w:pPr>
+        <w:pStyle w:val="Chapters"/>
+      </w:pPr>
+      <w:r>
+        <w:lastRenderedPageBreak/>
+        <w:t xml:space="preserve">Chapter </w:t>
+      </w:r>
+      <w:r>
         <w:t>3</w:t>
       </w:r>
     </w:p>
@@ -4070,6 +4071,9 @@
       <w:bookmarkEnd w:id="9"/>
     </w:p>
     <w:p>
+      <w:pPr>
+        <w:spacing w:line="276" w:lineRule="auto"/>
+      </w:pPr>
       <w:r>
         <w:t>This chapter</w:t>
       </w:r>
@@ -4086,7 +4090,13 @@
         <w:t xml:space="preserve">e existence of a foundation </w:t>
       </w:r>
       <w:r>
-        <w:t>that will allow us to measure our goals as we progress through t</w:t>
+        <w:t xml:space="preserve">that will allow us to measure </w:t>
+      </w:r>
+      <w:r>
+        <w:t>the</w:t>
+      </w:r>
+      <w:r>
+        <w:t xml:space="preserve"> goals as we progress through t</w:t>
       </w:r>
       <w:r>
         <w:t>h</w:t>
@@ -4108,6 +4118,7 @@
           <w:ilvl w:val="0"/>
           <w:numId w:val="23"/>
         </w:numPr>
+        <w:spacing w:line="276" w:lineRule="auto"/>
       </w:pPr>
       <w:r>
         <w:t>F</w:t>
@@ -4155,9 +4166,14 @@
           <w:ilvl w:val="0"/>
           <w:numId w:val="23"/>
         </w:numPr>
-      </w:pPr>
-      <w:r>
-        <w:t>Non-Functional System Re</w:t>
+        <w:spacing w:line="276" w:lineRule="auto"/>
+      </w:pPr>
+      <w:r>
+        <w:t xml:space="preserve">Non-Functional </w:t>
+      </w:r>
+      <w:proofErr w:type="gramStart"/>
+      <w:r>
+        <w:t>System Re</w:t>
       </w:r>
       <w:r>
         <w:softHyphen/>
@@ -4195,6 +4211,7 @@
         <w:t>quirements</w:t>
       </w:r>
       <w:proofErr w:type="spellEnd"/>
+      <w:proofErr w:type="gramEnd"/>
       <w:r>
         <w:t xml:space="preserve"> [NFSR]: </w:t>
       </w:r>
@@ -4215,6 +4232,7 @@
           <w:ilvl w:val="0"/>
           <w:numId w:val="23"/>
         </w:numPr>
+        <w:spacing w:line="276" w:lineRule="auto"/>
       </w:pPr>
       <w:r>
         <w:t xml:space="preserve">Functional User Requirements [FUR]: </w:t>
@@ -4226,10 +4244,12 @@
         <w:t xml:space="preserve">that the </w:t>
       </w:r>
       <w:proofErr w:type="spellStart"/>
+      <w:proofErr w:type="gramStart"/>
       <w:r>
         <w:t>enduser</w:t>
       </w:r>
       <w:proofErr w:type="spellEnd"/>
+      <w:proofErr w:type="gramEnd"/>
       <w:r>
         <w:t xml:space="preserve"> must be able to perform </w:t>
       </w:r>
@@ -4245,6 +4265,7 @@
           <w:ilvl w:val="0"/>
           <w:numId w:val="23"/>
         </w:numPr>
+        <w:spacing w:line="276" w:lineRule="auto"/>
       </w:pPr>
       <w:r>
         <w:t xml:space="preserve">Non-Functional User Requirements [NFUR]: The requirements </w:t>
@@ -4259,7 +4280,11 @@
         <w:t xml:space="preserve">the user experience and </w:t>
       </w:r>
       <w:r>
-        <w:t>expectations to be taken into consideration.</w:t>
+        <w:t xml:space="preserve">expectations to be taken into </w:t>
+      </w:r>
+      <w:proofErr w:type="gramStart"/>
+      <w:r>
+        <w:t>consideration.</w:t>
       </w:r>
       <w:r>
         <w:softHyphen/>
@@ -4267,8 +4292,13 @@
       <w:r>
         <w:softHyphen/>
       </w:r>
-    </w:p>
-    <w:p/>
+      <w:proofErr w:type="gramEnd"/>
+    </w:p>
+    <w:p>
+      <w:pPr>
+        <w:spacing w:line="276" w:lineRule="auto"/>
+      </w:pPr>
+    </w:p>
     <w:p>
       <w:pPr>
         <w:pStyle w:val="Heading3"/>
@@ -4290,6 +4320,7 @@
     </w:p>
     <w:p>
       <w:pPr>
+        <w:spacing w:line="276" w:lineRule="auto"/>
         <w:ind w:left="1440" w:hanging="1440"/>
       </w:pPr>
       <w:r>
@@ -4322,6 +4353,7 @@
     </w:p>
     <w:p>
       <w:pPr>
+        <w:spacing w:line="276" w:lineRule="auto"/>
         <w:ind w:left="1440" w:hanging="1440"/>
       </w:pPr>
       <w:r>
@@ -4339,6 +4371,7 @@
     </w:p>
     <w:p>
       <w:pPr>
+        <w:spacing w:line="276" w:lineRule="auto"/>
         <w:ind w:left="1440" w:hanging="1440"/>
       </w:pPr>
       <w:r>
@@ -4364,6 +4397,7 @@
     </w:p>
     <w:p>
       <w:pPr>
+        <w:spacing w:line="276" w:lineRule="auto"/>
         <w:ind w:left="1440" w:hanging="1440"/>
       </w:pPr>
       <w:r>
@@ -4392,6 +4426,7 @@
     </w:p>
     <w:p>
       <w:pPr>
+        <w:spacing w:line="276" w:lineRule="auto"/>
         <w:ind w:left="1440" w:hanging="1440"/>
       </w:pPr>
       <w:r>
@@ -4419,10 +4454,21 @@
         <w:t xml:space="preserve">application </w:t>
       </w:r>
       <w:r>
-        <w:t>to the CNN.</w:t>
-      </w:r>
-    </w:p>
-    <w:p>
+        <w:t xml:space="preserve">to </w:t>
+      </w:r>
+      <w:proofErr w:type="gramStart"/>
+      <w:r>
+        <w:t>the CNN</w:t>
+      </w:r>
+      <w:proofErr w:type="gramEnd"/>
+      <w:r>
+        <w:t>.</w:t>
+      </w:r>
+    </w:p>
+    <w:p>
+      <w:pPr>
+        <w:spacing w:line="276" w:lineRule="auto"/>
+      </w:pPr>
       <w:r>
         <w:t>FSR-4.</w:t>
       </w:r>
@@ -4438,6 +4484,7 @@
     </w:p>
     <w:p>
       <w:pPr>
+        <w:spacing w:line="276" w:lineRule="auto"/>
         <w:ind w:left="1440" w:hanging="1440"/>
       </w:pPr>
       <w:r>
@@ -4447,8 +4494,13 @@
         <w:tab/>
       </w:r>
       <w:r>
-        <w:t>The system shall</w:t>
-      </w:r>
+        <w:t xml:space="preserve">The system </w:t>
+      </w:r>
+      <w:proofErr w:type="gramStart"/>
+      <w:r>
+        <w:t>shall</w:t>
+      </w:r>
+      <w:proofErr w:type="gramEnd"/>
       <w:r>
         <w:t xml:space="preserve"> generate a percentage score based on the likelihood of </w:t>
       </w:r>
@@ -4458,6 +4510,7 @@
     </w:p>
     <w:p>
       <w:pPr>
+        <w:spacing w:line="276" w:lineRule="auto"/>
         <w:ind w:left="1440" w:hanging="1440"/>
       </w:pPr>
       <w:r>
@@ -4510,6 +4563,7 @@
     </w:p>
     <w:p>
       <w:pPr>
+        <w:spacing w:line="276" w:lineRule="auto"/>
         <w:ind w:left="1440" w:hanging="1440"/>
       </w:pPr>
       <w:r>
@@ -4542,6 +4596,7 @@
     </w:p>
     <w:p>
       <w:pPr>
+        <w:spacing w:line="276" w:lineRule="auto"/>
         <w:ind w:left="1440" w:hanging="1440"/>
       </w:pPr>
       <w:r>
@@ -4551,17 +4606,34 @@
         <w:tab/>
       </w:r>
       <w:r>
-        <w:t xml:space="preserve">The CNN model shall </w:t>
+        <w:t xml:space="preserve">The CNN model </w:t>
+      </w:r>
+      <w:proofErr w:type="gramStart"/>
+      <w:r>
+        <w:t>shall</w:t>
+      </w:r>
+      <w:proofErr w:type="gramEnd"/>
+      <w:r>
+        <w:t xml:space="preserve"> </w:t>
       </w:r>
       <w:r>
         <w:t>be maintainable and support u</w:t>
       </w:r>
       <w:r>
-        <w:t>pdates to allow for improved accuracies in the future.</w:t>
-      </w:r>
-    </w:p>
-    <w:p>
-      <w:pPr>
+        <w:t xml:space="preserve">pdates to allow for improved </w:t>
+      </w:r>
+      <w:proofErr w:type="gramStart"/>
+      <w:r>
+        <w:t>accuracies</w:t>
+      </w:r>
+      <w:proofErr w:type="gramEnd"/>
+      <w:r>
+        <w:t xml:space="preserve"> in the future.</w:t>
+      </w:r>
+    </w:p>
+    <w:p>
+      <w:pPr>
+        <w:spacing w:line="276" w:lineRule="auto"/>
         <w:ind w:left="1440" w:hanging="1440"/>
       </w:pPr>
       <w:r>
@@ -4592,6 +4664,7 @@
     </w:p>
     <w:p>
       <w:pPr>
+        <w:spacing w:line="276" w:lineRule="auto"/>
         <w:ind w:left="1440" w:hanging="1440"/>
       </w:pPr>
       <w:r>
@@ -4601,7 +4674,15 @@
         <w:tab/>
       </w:r>
       <w:r>
-        <w:t>The application shall be built using</w:t>
+        <w:t xml:space="preserve">The application </w:t>
+      </w:r>
+      <w:proofErr w:type="gramStart"/>
+      <w:r>
+        <w:t>shall</w:t>
+      </w:r>
+      <w:proofErr w:type="gramEnd"/>
+      <w:r>
+        <w:t xml:space="preserve"> be built using</w:t>
       </w:r>
       <w:r>
         <w:t xml:space="preserve"> Flutter</w:t>
@@ -4620,6 +4701,7 @@
     </w:p>
     <w:p>
       <w:pPr>
+        <w:spacing w:line="276" w:lineRule="auto"/>
         <w:ind w:left="1440" w:hanging="1440"/>
       </w:pPr>
       <w:r>
@@ -4643,6 +4725,7 @@
     </w:p>
     <w:p>
       <w:pPr>
+        <w:spacing w:line="276" w:lineRule="auto"/>
         <w:ind w:left="1440" w:hanging="1440"/>
       </w:pPr>
       <w:r>
@@ -4694,6 +4777,7 @@
     </w:p>
     <w:p>
       <w:pPr>
+        <w:spacing w:line="276" w:lineRule="auto"/>
         <w:ind w:left="1440" w:hanging="1440"/>
       </w:pPr>
       <w:r>
@@ -4721,6 +4805,7 @@
     </w:p>
     <w:p>
       <w:pPr>
+        <w:spacing w:line="276" w:lineRule="auto"/>
         <w:ind w:left="1440" w:hanging="1440"/>
       </w:pPr>
       <w:r>
@@ -4738,6 +4823,9 @@
       </w:r>
     </w:p>
     <w:p>
+      <w:pPr>
+        <w:spacing w:line="276" w:lineRule="auto"/>
+      </w:pPr>
       <w:r>
         <w:t>FUR-1.</w:t>
       </w:r>
@@ -4754,6 +4842,7 @@
     </w:p>
     <w:p>
       <w:pPr>
+        <w:spacing w:line="276" w:lineRule="auto"/>
         <w:ind w:left="720" w:firstLine="720"/>
       </w:pPr>
       <w:r>
@@ -4763,6 +4852,7 @@
     <w:bookmarkEnd w:id="14"/>
     <w:p>
       <w:pPr>
+        <w:spacing w:line="276" w:lineRule="auto"/>
         <w:ind w:left="1440" w:hanging="1440"/>
       </w:pPr>
       <w:r>
@@ -4777,6 +4867,7 @@
     </w:p>
     <w:p>
       <w:pPr>
+        <w:spacing w:line="276" w:lineRule="auto"/>
         <w:ind w:left="1440" w:hanging="1440"/>
       </w:pPr>
       <w:r>
@@ -4791,6 +4882,7 @@
     </w:p>
     <w:p>
       <w:pPr>
+        <w:spacing w:line="276" w:lineRule="auto"/>
         <w:ind w:left="1440" w:hanging="1440"/>
       </w:pPr>
       <w:r>
@@ -4809,6 +4901,7 @@
     </w:p>
     <w:p>
       <w:pPr>
+        <w:spacing w:line="276" w:lineRule="auto"/>
         <w:ind w:left="1440" w:hanging="1440"/>
       </w:pPr>
       <w:r>
@@ -4823,6 +4916,7 @@
     </w:p>
     <w:p>
       <w:pPr>
+        <w:spacing w:line="276" w:lineRule="auto"/>
         <w:ind w:left="1440" w:hanging="1440"/>
       </w:pPr>
       <w:r>
@@ -4837,6 +4931,7 @@
     </w:p>
     <w:p>
       <w:pPr>
+        <w:spacing w:line="276" w:lineRule="auto"/>
         <w:ind w:left="1440" w:hanging="1440"/>
       </w:pPr>
       <w:r>
@@ -4907,6 +5002,7 @@
     </w:p>
     <w:p>
       <w:r>
+        <w:lastRenderedPageBreak/>
         <w:t>NFUR-3.</w:t>
       </w:r>
       <w:r>
@@ -5141,7 +5237,7 @@
           <w:lang w:val="en-MY"/>
         </w:rPr>
       </w:pPr>
-      <w:hyperlink r:id="rId17" w:history="1">
+      <w:hyperlink r:id="rId12" w:history="1">
         <w:r>
           <w:rPr>
             <w:rStyle w:val="Hyperlink"/>
@@ -5322,7 +5418,7 @@
                     <pic:cNvPicPr/>
                   </pic:nvPicPr>
                   <pic:blipFill>
-                    <a:blip r:embed="rId18"/>
+                    <a:blip r:embed="rId13"/>
                     <a:stretch>
                       <a:fillRect/>
                     </a:stretch>
@@ -5362,7 +5458,7 @@
                     <pic:cNvPicPr/>
                   </pic:nvPicPr>
                   <pic:blipFill>
-                    <a:blip r:embed="rId19"/>
+                    <a:blip r:embed="rId14"/>
                     <a:stretch>
                       <a:fillRect/>
                     </a:stretch>
@@ -5402,7 +5498,7 @@
                     <pic:cNvPicPr/>
                   </pic:nvPicPr>
                   <pic:blipFill>
-                    <a:blip r:embed="rId20"/>
+                    <a:blip r:embed="rId15"/>
                     <a:stretch>
                       <a:fillRect/>
                     </a:stretch>
@@ -5569,1483 +5665,73 @@
     <w:p>
       <w:pPr>
         <w:pStyle w:val="ListParagraph"/>
-        <w:rPr>
-          <w:rFonts w:ascii="Calibri" w:eastAsia="Calibri" w:hAnsi="Calibri"/>
-          <w:noProof/>
-          <w:sz w:val="20"/>
-          <w:szCs w:val="20"/>
-        </w:rPr>
-      </w:pPr>
-      <w:r>
-        <w:fldChar w:fldCharType="begin"/>
-      </w:r>
-      <w:r>
-        <w:instrText xml:space="preserve"> BIBLIOGRAPHY  \l 1033 </w:instrText>
-      </w:r>
-      <w:r>
-        <w:fldChar w:fldCharType="separate"/>
-      </w:r>
-    </w:p>
-    <w:tbl>
-      <w:tblPr>
-        <w:tblW w:w="5000" w:type="pct"/>
-        <w:tblCellSpacing w:w="15" w:type="dxa"/>
-        <w:tblCellMar>
-          <w:top w:w="15" w:type="dxa"/>
-          <w:left w:w="15" w:type="dxa"/>
-          <w:bottom w:w="15" w:type="dxa"/>
-          <w:right w:w="15" w:type="dxa"/>
-        </w:tblCellMar>
-        <w:tblLook w:val="04A0" w:firstRow="1" w:lastRow="0" w:firstColumn="1" w:lastColumn="0" w:noHBand="0" w:noVBand="1"/>
-      </w:tblPr>
-      <w:tblGrid>
-        <w:gridCol w:w="376"/>
-        <w:gridCol w:w="8984"/>
-      </w:tblGrid>
-      <w:tr>
-        <w:trPr>
-          <w:divId w:val="476724875"/>
-          <w:tblCellSpacing w:w="15" w:type="dxa"/>
-        </w:trPr>
-        <w:tc>
-          <w:tcPr>
-            <w:tcW w:w="50" w:type="pct"/>
-            <w:hideMark/>
-          </w:tcPr>
-          <w:p>
-            <w:pPr>
-              <w:pStyle w:val="Bibliography"/>
-              <w:rPr>
-                <w:noProof/>
-              </w:rPr>
-            </w:pPr>
-            <w:r>
-              <w:rPr>
-                <w:noProof/>
-              </w:rPr>
-              <w:t xml:space="preserve">[1] </w:t>
-            </w:r>
-          </w:p>
-        </w:tc>
-        <w:tc>
-          <w:tcPr>
-            <w:tcW w:w="0" w:type="auto"/>
-            <w:hideMark/>
-          </w:tcPr>
-          <w:p>
-            <w:pPr>
-              <w:pStyle w:val="Bibliography"/>
-              <w:rPr>
-                <w:noProof/>
-              </w:rPr>
-            </w:pPr>
-            <w:r>
-              <w:rPr>
-                <w:noProof/>
-              </w:rPr>
-              <w:t xml:space="preserve">Center for Artificial Intelligence in Medicine &amp; Imaging | Stanford University, "MRA-MIDAS: Multimodal Image Dataset for AI-based Skin Cancer," Stanford University, Stanford, </w:t>
-            </w:r>
-            <w:r>
-              <w:rPr>
-                <w:noProof/>
-              </w:rPr>
-              <w:t>https://doi.org/10.71718/15nz-jv40</w:t>
-            </w:r>
-            <w:r>
-              <w:rPr>
-                <w:noProof/>
-              </w:rPr>
-              <w:t>.</w:t>
-            </w:r>
-            <w:r>
-              <w:rPr>
-                <w:noProof/>
-              </w:rPr>
-              <w:t xml:space="preserve"> </w:t>
-            </w:r>
-            <w:r>
-              <w:rPr>
-                <w:noProof/>
-              </w:rPr>
-              <w:t>2025.</w:t>
-            </w:r>
-          </w:p>
-        </w:tc>
-      </w:tr>
-      <w:tr>
-        <w:trPr>
-          <w:divId w:val="476724875"/>
-          <w:tblCellSpacing w:w="15" w:type="dxa"/>
-        </w:trPr>
-        <w:tc>
-          <w:tcPr>
-            <w:tcW w:w="50" w:type="pct"/>
-            <w:hideMark/>
-          </w:tcPr>
-          <w:p>
-            <w:pPr>
-              <w:pStyle w:val="Bibliography"/>
-              <w:rPr>
-                <w:noProof/>
-              </w:rPr>
-            </w:pPr>
-            <w:r>
-              <w:rPr>
-                <w:noProof/>
-              </w:rPr>
-              <w:t xml:space="preserve">[2] </w:t>
-            </w:r>
-          </w:p>
-        </w:tc>
-        <w:tc>
-          <w:tcPr>
-            <w:tcW w:w="0" w:type="auto"/>
-            <w:hideMark/>
-          </w:tcPr>
-          <w:p>
-            <w:pPr>
-              <w:pStyle w:val="Bibliography"/>
-              <w:rPr>
-                <w:noProof/>
-              </w:rPr>
-            </w:pPr>
-            <w:r>
-              <w:rPr>
-                <w:noProof/>
-              </w:rPr>
-              <w:t>A. B. J. M. S. P. G. A. H. K. Gabriella Brancaccio, "Artificial Intelligence in Skin Cancer Diagnosis: A Reality Check," 21 February 2023. [Online]. Available: https://doi.org/10.1016/j.jid.2023.10.004. [Accessed 11 December 2025].</w:t>
-            </w:r>
-          </w:p>
-        </w:tc>
-      </w:tr>
-      <w:tr>
-        <w:trPr>
-          <w:divId w:val="476724875"/>
-          <w:tblCellSpacing w:w="15" w:type="dxa"/>
-        </w:trPr>
-        <w:tc>
-          <w:tcPr>
-            <w:tcW w:w="50" w:type="pct"/>
-            <w:hideMark/>
-          </w:tcPr>
-          <w:p>
-            <w:pPr>
-              <w:pStyle w:val="Bibliography"/>
-              <w:rPr>
-                <w:noProof/>
-              </w:rPr>
-            </w:pPr>
-            <w:r>
-              <w:rPr>
-                <w:noProof/>
-              </w:rPr>
-              <w:t xml:space="preserve">[3] </w:t>
-            </w:r>
-          </w:p>
-        </w:tc>
-        <w:tc>
-          <w:tcPr>
-            <w:tcW w:w="0" w:type="auto"/>
-            <w:hideMark/>
-          </w:tcPr>
-          <w:p>
-            <w:pPr>
-              <w:pStyle w:val="Bibliography"/>
-              <w:rPr>
-                <w:noProof/>
-              </w:rPr>
-            </w:pPr>
-            <w:r>
-              <w:rPr>
-                <w:noProof/>
-              </w:rPr>
-              <w:t>N. S. A. Mahmoud, "Early automated detection system for skin cancer diagnosis using artificial intelligent techniques.," 28 April 2024. [Online]. Available: https://doi.org/10.1038/s41598-024-59783-0. [Accessed 11 December 2025].</w:t>
-            </w:r>
-          </w:p>
-        </w:tc>
-      </w:tr>
-      <w:tr>
-        <w:trPr>
-          <w:divId w:val="476724875"/>
-          <w:tblCellSpacing w:w="15" w:type="dxa"/>
-        </w:trPr>
-        <w:tc>
-          <w:tcPr>
-            <w:tcW w:w="50" w:type="pct"/>
-            <w:hideMark/>
-          </w:tcPr>
-          <w:p>
-            <w:pPr>
-              <w:pStyle w:val="Bibliography"/>
-              <w:rPr>
-                <w:noProof/>
-              </w:rPr>
-            </w:pPr>
-            <w:r>
-              <w:rPr>
-                <w:noProof/>
-              </w:rPr>
-              <w:t xml:space="preserve">[4] </w:t>
-            </w:r>
-          </w:p>
-        </w:tc>
-        <w:tc>
-          <w:tcPr>
-            <w:tcW w:w="0" w:type="auto"/>
-            <w:hideMark/>
-          </w:tcPr>
-          <w:p>
-            <w:pPr>
-              <w:pStyle w:val="Bibliography"/>
-              <w:rPr>
-                <w:noProof/>
-              </w:rPr>
-            </w:pPr>
-            <w:r>
-              <w:rPr>
-                <w:noProof/>
-              </w:rPr>
-              <w:t>N. e. a. Shifai, "Can ChatGPT vision diagnose melanoma? An exploratory diagnostic accuracy study," 18 January 2024. [Online]. Available: https://doi.org/10.1016/j.jaad.2023.12.062. [Accessed 11 December 2025].</w:t>
-            </w:r>
-          </w:p>
-        </w:tc>
-      </w:tr>
-      <w:tr>
-        <w:trPr>
-          <w:divId w:val="476724875"/>
-          <w:tblCellSpacing w:w="15" w:type="dxa"/>
-        </w:trPr>
-        <w:tc>
-          <w:tcPr>
-            <w:tcW w:w="50" w:type="pct"/>
-            <w:hideMark/>
-          </w:tcPr>
-          <w:p>
-            <w:pPr>
-              <w:pStyle w:val="Bibliography"/>
-              <w:rPr>
-                <w:noProof/>
-              </w:rPr>
-            </w:pPr>
-            <w:r>
-              <w:rPr>
-                <w:noProof/>
-              </w:rPr>
-              <w:t xml:space="preserve">[5] </w:t>
-            </w:r>
-          </w:p>
-        </w:tc>
-        <w:tc>
-          <w:tcPr>
-            <w:tcW w:w="0" w:type="auto"/>
-            <w:hideMark/>
-          </w:tcPr>
-          <w:p>
-            <w:pPr>
-              <w:pStyle w:val="Bibliography"/>
-              <w:rPr>
-                <w:noProof/>
-              </w:rPr>
-            </w:pPr>
-            <w:r>
-              <w:rPr>
-                <w:noProof/>
-              </w:rPr>
-              <w:t>C. N. C. M. H. T. C. J. G. W. H. J. Sattler SS, "Evaluating the Diagnostic Accuracy of ChatGPT-4 Omni and ChatGPT-4 Turbo in Identifying Melanoma: Comparative Study.," 21 March 2025. [Online]. Available: https://doi.org/10.2196/67551. [Accessed 11 December 2025].</w:t>
-            </w:r>
-          </w:p>
-        </w:tc>
-      </w:tr>
-    </w:tbl>
-    <w:p>
-      <w:pPr>
-        <w:divId w:val="476724875"/>
-        <w:rPr>
-          <w:noProof/>
-        </w:rPr>
-      </w:pPr>
-    </w:p>
-    <w:p>
-      <w:r>
-        <w:fldChar w:fldCharType="end"/>
-      </w:r>
-    </w:p>
-    <w:p/>
-    <w:p/>
-    <w:p/>
-    <w:p>
-      <w:r>
-        <w:br w:type="page"/>
-      </w:r>
-    </w:p>
-    <w:p>
-      <w:pPr>
-        <w:pStyle w:val="Chapters"/>
-      </w:pPr>
-      <w:r>
-        <w:lastRenderedPageBreak/>
-        <w:t xml:space="preserve">Chapter </w:t>
-      </w:r>
-      <w:r>
-        <w:t>8</w:t>
-      </w:r>
-    </w:p>
-    <w:p>
-      <w:pPr>
-        <w:pStyle w:val="Heading2"/>
-      </w:pPr>
-      <w:bookmarkStart w:id="27" w:name="_Toc227368719"/>
-      <w:r>
-        <w:t>Appendix</w:t>
-      </w:r>
-      <w:bookmarkEnd w:id="27"/>
+        <w:spacing w:line="276" w:lineRule="auto"/>
+      </w:pPr>
+      <w:r>
+        <w:t>Model Creation Literature Review</w:t>
+      </w:r>
     </w:p>
     <w:p>
       <w:pPr>
         <w:pStyle w:val="ListParagraph"/>
         <w:numPr>
           <w:ilvl w:val="0"/>
-          <w:numId w:val="25"/>
+          <w:numId w:val="35"/>
         </w:numPr>
-      </w:pPr>
-      <w:r>
-        <w:t>Excerpt</w:t>
-      </w:r>
-      <w:r>
-        <w:t xml:space="preserve"> from </w:t>
-      </w:r>
-      <w:r>
-        <w:t>Meeting Minutes #01:</w:t>
-      </w:r>
-    </w:p>
-    <w:tbl>
-      <w:tblPr>
-        <w:tblStyle w:val="TableGrid"/>
-        <w:tblW w:w="0" w:type="auto"/>
-        <w:tblInd w:w="720" w:type="dxa"/>
-        <w:tblLook w:val="04A0" w:firstRow="1" w:lastRow="0" w:firstColumn="1" w:lastColumn="0" w:noHBand="0" w:noVBand="1"/>
-      </w:tblPr>
-      <w:tblGrid>
-        <w:gridCol w:w="8630"/>
-      </w:tblGrid>
-      <w:tr>
-        <w:tc>
-          <w:tcPr>
-            <w:tcW w:w="9350" w:type="dxa"/>
-          </w:tcPr>
-          <w:p>
-            <w:pPr>
-              <w:pStyle w:val="ListParagraph"/>
-              <w:numPr>
-                <w:ilvl w:val="0"/>
-                <w:numId w:val="13"/>
-              </w:numPr>
-              <w:autoSpaceDE w:val="0"/>
-              <w:autoSpaceDN w:val="0"/>
-              <w:adjustRightInd w:val="0"/>
-              <w:rPr>
-                <w:lang w:val="en-MY"/>
-              </w:rPr>
-            </w:pPr>
-            <w:r>
-              <w:rPr>
-                <w:lang w:val="en-MY"/>
-              </w:rPr>
-              <w:t xml:space="preserve">Dr. Nabil is the Academic Supervisor, managing conflicts within the team and ensuring progress is stable with </w:t>
-            </w:r>
-            <w:proofErr w:type="spellStart"/>
-            <w:r>
-              <w:rPr>
-                <w:lang w:val="en-MY"/>
-              </w:rPr>
-              <w:t>atleast</w:t>
-            </w:r>
-            <w:proofErr w:type="spellEnd"/>
-            <w:r>
-              <w:rPr>
-                <w:lang w:val="en-MY"/>
-              </w:rPr>
-              <w:t xml:space="preserve"> one (1) commit per week.</w:t>
-            </w:r>
-          </w:p>
-          <w:p>
-            <w:pPr>
-              <w:autoSpaceDE w:val="0"/>
-              <w:autoSpaceDN w:val="0"/>
-              <w:adjustRightInd w:val="0"/>
-              <w:rPr>
-                <w:lang w:val="en-MY"/>
-              </w:rPr>
-            </w:pPr>
-          </w:p>
-          <w:p>
-            <w:pPr>
-              <w:pStyle w:val="ListParagraph"/>
-              <w:numPr>
-                <w:ilvl w:val="0"/>
-                <w:numId w:val="13"/>
-              </w:numPr>
-              <w:autoSpaceDE w:val="0"/>
-              <w:autoSpaceDN w:val="0"/>
-              <w:adjustRightInd w:val="0"/>
-              <w:rPr>
-                <w:lang w:val="en-MY"/>
-              </w:rPr>
-            </w:pPr>
-            <w:r>
-              <w:rPr>
-                <w:lang w:val="en-MY"/>
-              </w:rPr>
-              <w:t>Usage of AI is permissible only as a support tool, affirmation of the module to be a year-long module.</w:t>
-            </w:r>
-          </w:p>
-          <w:p>
-            <w:pPr>
-              <w:autoSpaceDE w:val="0"/>
-              <w:autoSpaceDN w:val="0"/>
-              <w:adjustRightInd w:val="0"/>
-              <w:rPr>
-                <w:lang w:val="en-MY"/>
-              </w:rPr>
-            </w:pPr>
-          </w:p>
-          <w:p>
-            <w:pPr>
-              <w:pStyle w:val="ListParagraph"/>
-              <w:numPr>
-                <w:ilvl w:val="0"/>
-                <w:numId w:val="13"/>
-              </w:numPr>
-              <w:autoSpaceDE w:val="0"/>
-              <w:autoSpaceDN w:val="0"/>
-              <w:adjustRightInd w:val="0"/>
-              <w:rPr>
-                <w:lang w:val="en-MY"/>
-              </w:rPr>
-            </w:pPr>
-            <w:r>
-              <w:rPr>
-                <w:lang w:val="en-MY"/>
-              </w:rPr>
-              <w:t xml:space="preserve">Dr. Nugroho works with dermatologists, skin cancer cases in Malaysia </w:t>
-            </w:r>
-            <w:proofErr w:type="gramStart"/>
-            <w:r>
-              <w:rPr>
-                <w:lang w:val="en-MY"/>
-              </w:rPr>
-              <w:t>is</w:t>
-            </w:r>
-            <w:proofErr w:type="gramEnd"/>
-            <w:r>
-              <w:rPr>
-                <w:lang w:val="en-MY"/>
-              </w:rPr>
-              <w:t xml:space="preserve"> not that high, </w:t>
-            </w:r>
-            <w:proofErr w:type="spellStart"/>
-            <w:r>
-              <w:rPr>
-                <w:lang w:val="en-MY"/>
-              </w:rPr>
-              <w:t>malay</w:t>
-            </w:r>
-            <w:proofErr w:type="spellEnd"/>
-            <w:r>
-              <w:rPr>
-                <w:lang w:val="en-MY"/>
-              </w:rPr>
-              <w:t xml:space="preserve"> women are finding difficulty finding expert female dermatologists to provide them care.</w:t>
-            </w:r>
-          </w:p>
-          <w:p>
-            <w:pPr>
-              <w:autoSpaceDE w:val="0"/>
-              <w:autoSpaceDN w:val="0"/>
-              <w:adjustRightInd w:val="0"/>
-              <w:rPr>
-                <w:lang w:val="en-MY"/>
-              </w:rPr>
-            </w:pPr>
-          </w:p>
-          <w:p>
-            <w:pPr>
-              <w:pStyle w:val="ListParagraph"/>
-              <w:numPr>
-                <w:ilvl w:val="0"/>
-                <w:numId w:val="13"/>
-              </w:numPr>
-              <w:autoSpaceDE w:val="0"/>
-              <w:autoSpaceDN w:val="0"/>
-              <w:adjustRightInd w:val="0"/>
-              <w:rPr>
-                <w:lang w:val="en-MY"/>
-              </w:rPr>
-            </w:pPr>
-            <w:r>
-              <w:rPr>
-                <w:lang w:val="en-MY"/>
-              </w:rPr>
-              <w:t xml:space="preserve">Skin Cancer was previously determined using DNN's or </w:t>
-            </w:r>
-            <w:proofErr w:type="gramStart"/>
-            <w:r>
-              <w:rPr>
-                <w:lang w:val="en-MY"/>
-              </w:rPr>
-              <w:t>CNN's</w:t>
-            </w:r>
-            <w:proofErr w:type="gramEnd"/>
-            <w:r>
-              <w:rPr>
-                <w:lang w:val="en-MY"/>
-              </w:rPr>
-              <w:t xml:space="preserve"> with stakeholders sending in their photos to be compared against them.</w:t>
-            </w:r>
-          </w:p>
-          <w:p>
-            <w:pPr>
-              <w:autoSpaceDE w:val="0"/>
-              <w:autoSpaceDN w:val="0"/>
-              <w:adjustRightInd w:val="0"/>
-              <w:rPr>
-                <w:lang w:val="en-MY"/>
-              </w:rPr>
-            </w:pPr>
-          </w:p>
-          <w:p>
-            <w:pPr>
-              <w:pStyle w:val="ListParagraph"/>
-              <w:numPr>
-                <w:ilvl w:val="0"/>
-                <w:numId w:val="13"/>
-              </w:numPr>
-              <w:autoSpaceDE w:val="0"/>
-              <w:autoSpaceDN w:val="0"/>
-              <w:adjustRightInd w:val="0"/>
-              <w:rPr>
-                <w:lang w:val="en-MY"/>
-              </w:rPr>
-            </w:pPr>
-            <w:r>
-              <w:rPr>
-                <w:lang w:val="en-MY"/>
-              </w:rPr>
-              <w:t>Severity level to be implemented with low-level akin to sunburn/damage and high-level akin to melanoma and skin cancer.</w:t>
-            </w:r>
-          </w:p>
-          <w:p>
-            <w:pPr>
-              <w:autoSpaceDE w:val="0"/>
-              <w:autoSpaceDN w:val="0"/>
-              <w:adjustRightInd w:val="0"/>
-              <w:rPr>
-                <w:lang w:val="en-MY"/>
-              </w:rPr>
-            </w:pPr>
-          </w:p>
-          <w:p>
-            <w:pPr>
-              <w:pStyle w:val="ListParagraph"/>
-              <w:numPr>
-                <w:ilvl w:val="0"/>
-                <w:numId w:val="13"/>
-              </w:numPr>
-              <w:autoSpaceDE w:val="0"/>
-              <w:autoSpaceDN w:val="0"/>
-              <w:adjustRightInd w:val="0"/>
-              <w:rPr>
-                <w:lang w:val="en-MY"/>
-              </w:rPr>
-            </w:pPr>
-            <w:r>
-              <w:rPr>
-                <w:lang w:val="en-MY"/>
-              </w:rPr>
-              <w:t>Priority is set for accessibility (i.e. preference over visible lights/personal phone cameras over professional medical imaging for a subset of individuals).</w:t>
-            </w:r>
-          </w:p>
-          <w:p>
-            <w:pPr>
-              <w:pStyle w:val="ListParagraph"/>
-              <w:rPr>
-                <w:lang w:val="en-MY"/>
-              </w:rPr>
-            </w:pPr>
-          </w:p>
-          <w:p>
-            <w:pPr>
-              <w:pStyle w:val="ListParagraph"/>
-              <w:numPr>
-                <w:ilvl w:val="0"/>
-                <w:numId w:val="13"/>
-              </w:numPr>
-              <w:autoSpaceDE w:val="0"/>
-              <w:autoSpaceDN w:val="0"/>
-              <w:adjustRightInd w:val="0"/>
-              <w:rPr>
-                <w:lang w:val="en-MY"/>
-              </w:rPr>
-            </w:pPr>
-            <w:r>
-              <w:rPr>
-                <w:lang w:val="en-MY"/>
-              </w:rPr>
-              <w:t xml:space="preserve">Two ways to acquire datasets: </w:t>
-            </w:r>
-          </w:p>
-          <w:p>
-            <w:pPr>
-              <w:pStyle w:val="ListParagraph"/>
-              <w:numPr>
-                <w:ilvl w:val="0"/>
-                <w:numId w:val="26"/>
-              </w:numPr>
-              <w:autoSpaceDE w:val="0"/>
-              <w:autoSpaceDN w:val="0"/>
-              <w:adjustRightInd w:val="0"/>
-              <w:rPr>
-                <w:lang w:val="en-MY"/>
-              </w:rPr>
-            </w:pPr>
-            <w:r>
-              <w:rPr>
-                <w:lang w:val="en-MY"/>
-              </w:rPr>
-              <w:t>Communicate with hospitals and fill out ethical forms.</w:t>
-            </w:r>
-          </w:p>
-          <w:p>
-            <w:pPr>
-              <w:pStyle w:val="ListParagraph"/>
-              <w:numPr>
-                <w:ilvl w:val="0"/>
-                <w:numId w:val="26"/>
-              </w:numPr>
-              <w:autoSpaceDE w:val="0"/>
-              <w:autoSpaceDN w:val="0"/>
-              <w:adjustRightInd w:val="0"/>
-              <w:rPr>
-                <w:lang w:val="en-MY"/>
-              </w:rPr>
-            </w:pPr>
-            <w:r>
-              <w:rPr>
-                <w:lang w:val="en-MY"/>
-              </w:rPr>
-              <w:t>Attempt to find them using Mendeley and online sources.</w:t>
-            </w:r>
-          </w:p>
-          <w:p>
-            <w:pPr>
-              <w:autoSpaceDE w:val="0"/>
-              <w:autoSpaceDN w:val="0"/>
-              <w:adjustRightInd w:val="0"/>
-              <w:rPr>
-                <w:lang w:val="en-MY"/>
-              </w:rPr>
-            </w:pPr>
-          </w:p>
-          <w:p>
-            <w:pPr>
-              <w:pStyle w:val="ListParagraph"/>
-              <w:numPr>
-                <w:ilvl w:val="0"/>
-                <w:numId w:val="13"/>
-              </w:numPr>
-              <w:autoSpaceDE w:val="0"/>
-              <w:autoSpaceDN w:val="0"/>
-              <w:adjustRightInd w:val="0"/>
-              <w:rPr>
-                <w:lang w:val="en-MY"/>
-              </w:rPr>
-            </w:pPr>
-            <w:r>
-              <w:rPr>
-                <w:lang w:val="en-MY"/>
-              </w:rPr>
-              <w:t>Analysis can be done on the cloud or mobile depending on method of comparison and dataset/depth of codebase.</w:t>
-            </w:r>
-          </w:p>
-          <w:p>
-            <w:pPr>
-              <w:autoSpaceDE w:val="0"/>
-              <w:autoSpaceDN w:val="0"/>
-              <w:adjustRightInd w:val="0"/>
-              <w:rPr>
-                <w:lang w:val="en-MY"/>
-              </w:rPr>
-            </w:pPr>
-          </w:p>
-          <w:p>
-            <w:pPr>
-              <w:pStyle w:val="ListParagraph"/>
-              <w:numPr>
-                <w:ilvl w:val="0"/>
-                <w:numId w:val="13"/>
-              </w:numPr>
-              <w:autoSpaceDE w:val="0"/>
-              <w:autoSpaceDN w:val="0"/>
-              <w:adjustRightInd w:val="0"/>
-              <w:rPr>
-                <w:lang w:val="en-MY"/>
-              </w:rPr>
-            </w:pPr>
-            <w:r>
-              <w:rPr>
-                <w:lang w:val="en-MY"/>
-              </w:rPr>
-              <w:t>Possibility of false positives, major concern since dealing with skin cancer.</w:t>
-            </w:r>
-          </w:p>
-          <w:p>
-            <w:pPr>
-              <w:pStyle w:val="ListParagraph"/>
-              <w:numPr>
-                <w:ilvl w:val="1"/>
-                <w:numId w:val="13"/>
-              </w:numPr>
-              <w:autoSpaceDE w:val="0"/>
-              <w:autoSpaceDN w:val="0"/>
-              <w:adjustRightInd w:val="0"/>
-              <w:rPr>
-                <w:lang w:val="en-MY"/>
-              </w:rPr>
-            </w:pPr>
-            <w:r>
-              <w:rPr>
-                <w:lang w:val="en-MY"/>
-              </w:rPr>
-              <w:t>Preference to false positives over false negatives.</w:t>
-            </w:r>
-          </w:p>
-          <w:p>
-            <w:pPr>
-              <w:autoSpaceDE w:val="0"/>
-              <w:autoSpaceDN w:val="0"/>
-              <w:adjustRightInd w:val="0"/>
-              <w:rPr>
-                <w:lang w:val="en-MY"/>
-              </w:rPr>
-            </w:pPr>
-          </w:p>
-          <w:p>
-            <w:pPr>
-              <w:pStyle w:val="ListParagraph"/>
-              <w:numPr>
-                <w:ilvl w:val="0"/>
-                <w:numId w:val="13"/>
-              </w:numPr>
-              <w:autoSpaceDE w:val="0"/>
-              <w:autoSpaceDN w:val="0"/>
-              <w:adjustRightInd w:val="0"/>
-              <w:rPr>
-                <w:lang w:val="en-MY"/>
-              </w:rPr>
-            </w:pPr>
-            <w:r>
-              <w:rPr>
-                <w:lang w:val="en-MY"/>
-              </w:rPr>
-              <w:t>Methodology of determining melanin levels and how skincare affects it is already available.</w:t>
-            </w:r>
-          </w:p>
-          <w:p>
-            <w:pPr>
-              <w:autoSpaceDE w:val="0"/>
-              <w:autoSpaceDN w:val="0"/>
-              <w:adjustRightInd w:val="0"/>
-              <w:rPr>
-                <w:lang w:val="en-MY"/>
-              </w:rPr>
-            </w:pPr>
-          </w:p>
-          <w:p>
-            <w:pPr>
-              <w:pStyle w:val="ListParagraph"/>
-              <w:numPr>
-                <w:ilvl w:val="0"/>
-                <w:numId w:val="13"/>
-              </w:numPr>
-              <w:autoSpaceDE w:val="0"/>
-              <w:autoSpaceDN w:val="0"/>
-              <w:adjustRightInd w:val="0"/>
-              <w:rPr>
-                <w:lang w:val="en-MY"/>
-              </w:rPr>
-            </w:pPr>
-            <w:r>
-              <w:rPr>
-                <w:lang w:val="en-MY"/>
-              </w:rPr>
-              <w:t>Factors to take into consideration:</w:t>
-            </w:r>
-          </w:p>
-          <w:p>
-            <w:pPr>
-              <w:pStyle w:val="ListParagraph"/>
-              <w:numPr>
-                <w:ilvl w:val="1"/>
-                <w:numId w:val="13"/>
-              </w:numPr>
-              <w:autoSpaceDE w:val="0"/>
-              <w:autoSpaceDN w:val="0"/>
-              <w:adjustRightInd w:val="0"/>
-              <w:rPr>
-                <w:lang w:val="en-MY"/>
-              </w:rPr>
-            </w:pPr>
-            <w:r>
-              <w:rPr>
-                <w:lang w:val="en-MY"/>
-              </w:rPr>
-              <w:t>Lighting Condition</w:t>
-            </w:r>
-          </w:p>
-          <w:p>
-            <w:pPr>
-              <w:pStyle w:val="ListParagraph"/>
-              <w:numPr>
-                <w:ilvl w:val="1"/>
-                <w:numId w:val="13"/>
-              </w:numPr>
-              <w:autoSpaceDE w:val="0"/>
-              <w:autoSpaceDN w:val="0"/>
-              <w:adjustRightInd w:val="0"/>
-              <w:rPr>
-                <w:lang w:val="en-MY"/>
-              </w:rPr>
-            </w:pPr>
-            <w:r>
-              <w:rPr>
-                <w:lang w:val="en-MY"/>
-              </w:rPr>
-              <w:t>Photo Quality (based on Camera/Phone)</w:t>
-            </w:r>
-          </w:p>
-          <w:p>
-            <w:pPr>
-              <w:pStyle w:val="ListParagraph"/>
-              <w:numPr>
-                <w:ilvl w:val="1"/>
-                <w:numId w:val="13"/>
-              </w:numPr>
-              <w:autoSpaceDE w:val="0"/>
-              <w:autoSpaceDN w:val="0"/>
-              <w:adjustRightInd w:val="0"/>
-              <w:rPr>
-                <w:lang w:val="en-MY"/>
-              </w:rPr>
-            </w:pPr>
-            <w:r>
-              <w:rPr>
-                <w:lang w:val="en-MY"/>
-              </w:rPr>
-              <w:t>Time of Day</w:t>
-            </w:r>
-          </w:p>
-          <w:p>
-            <w:pPr>
-              <w:pStyle w:val="ListParagraph"/>
-              <w:numPr>
-                <w:ilvl w:val="1"/>
-                <w:numId w:val="13"/>
-              </w:numPr>
-              <w:autoSpaceDE w:val="0"/>
-              <w:autoSpaceDN w:val="0"/>
-              <w:adjustRightInd w:val="0"/>
-              <w:rPr>
-                <w:lang w:val="en-MY"/>
-              </w:rPr>
-            </w:pPr>
-            <w:r>
-              <w:rPr>
-                <w:lang w:val="en-MY"/>
-              </w:rPr>
-              <w:t>Temperature &amp; Blood Pressure</w:t>
-            </w:r>
-          </w:p>
-          <w:p>
-            <w:pPr>
-              <w:autoSpaceDE w:val="0"/>
-              <w:autoSpaceDN w:val="0"/>
-              <w:adjustRightInd w:val="0"/>
-              <w:rPr>
-                <w:lang w:val="en-MY"/>
-              </w:rPr>
-            </w:pPr>
-          </w:p>
-          <w:p>
-            <w:pPr>
-              <w:pStyle w:val="ListParagraph"/>
-              <w:numPr>
-                <w:ilvl w:val="0"/>
-                <w:numId w:val="13"/>
-              </w:numPr>
-              <w:autoSpaceDE w:val="0"/>
-              <w:autoSpaceDN w:val="0"/>
-              <w:adjustRightInd w:val="0"/>
-              <w:rPr>
-                <w:lang w:val="en-MY"/>
-              </w:rPr>
-            </w:pPr>
-            <w:proofErr w:type="spellStart"/>
-            <w:r>
-              <w:rPr>
-                <w:lang w:val="en-MY"/>
-              </w:rPr>
-              <w:t>Criterias</w:t>
-            </w:r>
-            <w:proofErr w:type="spellEnd"/>
-            <w:r>
-              <w:rPr>
-                <w:lang w:val="en-MY"/>
-              </w:rPr>
-              <w:t>:</w:t>
-            </w:r>
-          </w:p>
-          <w:p>
-            <w:pPr>
-              <w:pStyle w:val="ListParagraph"/>
-              <w:numPr>
-                <w:ilvl w:val="1"/>
-                <w:numId w:val="13"/>
-              </w:numPr>
-              <w:autoSpaceDE w:val="0"/>
-              <w:autoSpaceDN w:val="0"/>
-              <w:adjustRightInd w:val="0"/>
-              <w:rPr>
-                <w:lang w:val="en-MY"/>
-              </w:rPr>
-            </w:pPr>
-            <w:r>
-              <w:rPr>
-                <w:lang w:val="en-MY"/>
-              </w:rPr>
-              <w:t>Accuracy (major concern, hopefully higher than 50-60%)</w:t>
-            </w:r>
-          </w:p>
-          <w:p>
-            <w:pPr>
-              <w:pStyle w:val="ListParagraph"/>
-              <w:numPr>
-                <w:ilvl w:val="1"/>
-                <w:numId w:val="13"/>
-              </w:numPr>
-              <w:autoSpaceDE w:val="0"/>
-              <w:autoSpaceDN w:val="0"/>
-              <w:adjustRightInd w:val="0"/>
-              <w:rPr>
-                <w:lang w:val="en-MY"/>
-              </w:rPr>
-            </w:pPr>
-            <w:r>
-              <w:rPr>
-                <w:lang w:val="en-MY"/>
-              </w:rPr>
-              <w:t>Speed</w:t>
-            </w:r>
-          </w:p>
-          <w:p>
-            <w:pPr>
-              <w:pStyle w:val="ListParagraph"/>
-              <w:numPr>
-                <w:ilvl w:val="1"/>
-                <w:numId w:val="13"/>
-              </w:numPr>
-              <w:autoSpaceDE w:val="0"/>
-              <w:autoSpaceDN w:val="0"/>
-              <w:adjustRightInd w:val="0"/>
-              <w:rPr>
-                <w:lang w:val="en-MY"/>
-              </w:rPr>
-            </w:pPr>
-            <w:r>
-              <w:rPr>
-                <w:lang w:val="en-MY"/>
-              </w:rPr>
-              <w:t>Datasets (notable, locations(??))</w:t>
-            </w:r>
-          </w:p>
-        </w:tc>
-      </w:tr>
-    </w:tbl>
-    <w:p>
-      <w:pPr>
-        <w:pStyle w:val="ListParagraph"/>
-      </w:pPr>
+        <w:spacing w:line="276" w:lineRule="auto"/>
+      </w:pPr>
+      <w:r>
+        <w:t>C. J. Luo, "Lightweight Deep Learning Network for Skin Cancer Classification," University of Nottingham Malaysia (UNMC), 31 May. 2020.</w:t>
+      </w:r>
     </w:p>
     <w:p>
       <w:pPr>
         <w:pStyle w:val="ListParagraph"/>
         <w:numPr>
           <w:ilvl w:val="0"/>
-          <w:numId w:val="25"/>
+          <w:numId w:val="35"/>
         </w:numPr>
-      </w:pPr>
-      <w:r>
-        <w:t>Excerpt from Meeting Minutes #03:</w:t>
-      </w:r>
-    </w:p>
-    <w:tbl>
-      <w:tblPr>
-        <w:tblStyle w:val="TableGrid"/>
-        <w:tblW w:w="0" w:type="auto"/>
-        <w:tblInd w:w="720" w:type="dxa"/>
-        <w:tblLook w:val="04A0" w:firstRow="1" w:lastRow="0" w:firstColumn="1" w:lastColumn="0" w:noHBand="0" w:noVBand="1"/>
-      </w:tblPr>
-      <w:tblGrid>
-        <w:gridCol w:w="8630"/>
-      </w:tblGrid>
-      <w:tr>
-        <w:tc>
-          <w:tcPr>
-            <w:tcW w:w="9350" w:type="dxa"/>
-          </w:tcPr>
-          <w:p>
-            <w:pPr>
-              <w:pStyle w:val="ListParagraph"/>
-              <w:numPr>
-                <w:ilvl w:val="0"/>
-                <w:numId w:val="13"/>
-              </w:numPr>
-              <w:rPr>
-                <w:lang w:val="en-GB"/>
-              </w:rPr>
-            </w:pPr>
-            <w:r>
-              <w:rPr>
-                <w:lang w:val="en-GB"/>
-              </w:rPr>
-              <w:t>Meeting starts @ 1:08PM</w:t>
-            </w:r>
-          </w:p>
-          <w:p>
-            <w:pPr>
-              <w:pStyle w:val="ListParagraph"/>
-              <w:rPr>
-                <w:lang w:val="en-GB"/>
-              </w:rPr>
-            </w:pPr>
-          </w:p>
-          <w:p>
-            <w:pPr>
-              <w:pStyle w:val="ListParagraph"/>
-              <w:numPr>
-                <w:ilvl w:val="0"/>
-                <w:numId w:val="13"/>
-              </w:numPr>
-              <w:rPr>
-                <w:lang w:val="en-GB"/>
-              </w:rPr>
-            </w:pPr>
-            <w:r>
-              <w:rPr>
-                <w:lang w:val="en-GB"/>
-              </w:rPr>
-              <w:t xml:space="preserve">Dr. Hermawan is updated regarding accuracy and dataset viability with the Malaysian populus and general </w:t>
-            </w:r>
-            <w:proofErr w:type="spellStart"/>
-            <w:r>
-              <w:rPr>
-                <w:lang w:val="en-GB"/>
-              </w:rPr>
-              <w:t>skintype</w:t>
-            </w:r>
-            <w:proofErr w:type="spellEnd"/>
-            <w:r>
-              <w:rPr>
-                <w:lang w:val="en-GB"/>
-              </w:rPr>
-              <w:t xml:space="preserve"> (Fitzpatrick Scale III &amp; IV).</w:t>
-            </w:r>
-          </w:p>
-          <w:p>
-            <w:pPr>
-              <w:pStyle w:val="ListParagraph"/>
-              <w:numPr>
-                <w:ilvl w:val="1"/>
-                <w:numId w:val="13"/>
-              </w:numPr>
-              <w:rPr>
-                <w:lang w:val="en-GB"/>
-              </w:rPr>
-            </w:pPr>
-            <w:r>
-              <w:rPr>
-                <w:lang w:val="en-GB"/>
-              </w:rPr>
-              <w:t>Concerns are a non-issue as long as a dataset with commercial-grade photographs are available.</w:t>
-            </w:r>
-          </w:p>
-          <w:p>
-            <w:pPr>
-              <w:pStyle w:val="ListParagraph"/>
-              <w:ind w:left="1440"/>
-              <w:rPr>
-                <w:lang w:val="en-GB"/>
-              </w:rPr>
-            </w:pPr>
-          </w:p>
-          <w:p>
-            <w:pPr>
-              <w:pStyle w:val="ListParagraph"/>
-              <w:numPr>
-                <w:ilvl w:val="0"/>
-                <w:numId w:val="13"/>
-              </w:numPr>
-              <w:rPr>
-                <w:lang w:val="en-GB"/>
-              </w:rPr>
-            </w:pPr>
-            <w:r>
-              <w:rPr>
-                <w:lang w:val="en-GB"/>
-              </w:rPr>
-              <w:t>Dr. Hermawan confirms that the project may run purely based on visible lights (RGB, YMCK) spectrum if physical, architectural or financial constraints become too overbearing, this is noted as the initial project brief stated the use of hyperspectral and multispectral imaging analysis.</w:t>
-            </w:r>
-          </w:p>
-          <w:p>
-            <w:pPr>
-              <w:pStyle w:val="ListParagraph"/>
-              <w:rPr>
-                <w:lang w:val="en-GB"/>
-              </w:rPr>
-            </w:pPr>
-          </w:p>
-          <w:p>
-            <w:pPr>
-              <w:pStyle w:val="ListParagraph"/>
-              <w:numPr>
-                <w:ilvl w:val="0"/>
-                <w:numId w:val="13"/>
-              </w:numPr>
-              <w:rPr>
-                <w:lang w:val="en-GB"/>
-              </w:rPr>
-            </w:pPr>
-            <w:r>
-              <w:rPr>
-                <w:lang w:val="en-GB"/>
-              </w:rPr>
-              <w:t>Concerns raised regarding the ethics form are eased as Dr. Hermawan reaffirms that if the dataset is acquired via public means, a detailed ethics form may not be needed.</w:t>
-            </w:r>
-          </w:p>
-          <w:p>
-            <w:pPr>
-              <w:pStyle w:val="ListParagraph"/>
-              <w:rPr>
-                <w:lang w:val="en-GB"/>
-              </w:rPr>
-            </w:pPr>
-          </w:p>
-          <w:p>
-            <w:pPr>
-              <w:pStyle w:val="ListParagraph"/>
-              <w:numPr>
-                <w:ilvl w:val="0"/>
-                <w:numId w:val="13"/>
-              </w:numPr>
-              <w:rPr>
-                <w:lang w:val="en-GB"/>
-              </w:rPr>
-            </w:pPr>
-            <w:r>
-              <w:rPr>
-                <w:lang w:val="en-GB"/>
-              </w:rPr>
-              <w:t>A note is issued that a possible dataset may be viable but may only be used for non-</w:t>
-            </w:r>
-            <w:proofErr w:type="spellStart"/>
-            <w:r>
-              <w:rPr>
-                <w:lang w:val="en-GB"/>
-              </w:rPr>
-              <w:t>commerical</w:t>
-            </w:r>
-            <w:proofErr w:type="spellEnd"/>
-            <w:r>
-              <w:rPr>
-                <w:lang w:val="en-GB"/>
-              </w:rPr>
-              <w:t xml:space="preserve">, academic research purposes only. (Refer to </w:t>
-            </w:r>
-            <w:hyperlink r:id="rId21" w:history="1">
-              <w:r>
-                <w:rPr>
-                  <w:rStyle w:val="Hyperlink"/>
-                  <w:lang w:val="en-GB"/>
-                </w:rPr>
-                <w:t>Attached Link #01</w:t>
-              </w:r>
-            </w:hyperlink>
-            <w:r>
-              <w:rPr>
-                <w:lang w:val="en-GB"/>
-              </w:rPr>
-              <w:t>.)</w:t>
-            </w:r>
-          </w:p>
-          <w:p>
-            <w:pPr>
-              <w:pStyle w:val="ListParagraph"/>
-              <w:rPr>
-                <w:lang w:val="en-GB"/>
-              </w:rPr>
-            </w:pPr>
-          </w:p>
-          <w:p>
-            <w:pPr>
-              <w:pStyle w:val="ListParagraph"/>
-              <w:numPr>
-                <w:ilvl w:val="0"/>
-                <w:numId w:val="13"/>
-              </w:numPr>
-              <w:rPr>
-                <w:lang w:val="en-GB"/>
-              </w:rPr>
-            </w:pPr>
-            <w:r>
-              <w:rPr>
-                <w:lang w:val="en-GB"/>
-              </w:rPr>
-              <w:t>Slight discussion on the lack of assistance or constructive/assistive responses by hospitals, governmental agencies, etc.</w:t>
-            </w:r>
-          </w:p>
-          <w:p>
-            <w:pPr>
-              <w:pStyle w:val="ListParagraph"/>
-              <w:rPr>
-                <w:lang w:val="en-GB"/>
-              </w:rPr>
-            </w:pPr>
-          </w:p>
-          <w:p>
-            <w:pPr>
-              <w:pStyle w:val="ListParagraph"/>
-              <w:numPr>
-                <w:ilvl w:val="0"/>
-                <w:numId w:val="13"/>
-              </w:numPr>
-              <w:rPr>
-                <w:lang w:val="en-GB"/>
-              </w:rPr>
-            </w:pPr>
-            <w:r>
-              <w:rPr>
-                <w:lang w:val="en-GB"/>
-              </w:rPr>
-              <w:t>Dr. Hermawan provided insight on the ability of having two datasets achieve similar results based on the algorithm, methodology and fitting techniques used.</w:t>
-            </w:r>
-          </w:p>
-          <w:p>
-            <w:pPr>
-              <w:pStyle w:val="ListParagraph"/>
-              <w:rPr>
-                <w:lang w:val="en-GB"/>
-              </w:rPr>
-            </w:pPr>
-          </w:p>
-          <w:p>
-            <w:pPr>
-              <w:pStyle w:val="ListParagraph"/>
-              <w:numPr>
-                <w:ilvl w:val="0"/>
-                <w:numId w:val="13"/>
-              </w:numPr>
-              <w:rPr>
-                <w:lang w:val="en-GB"/>
-              </w:rPr>
-            </w:pPr>
-            <w:r>
-              <w:rPr>
-                <w:lang w:val="en-GB"/>
-              </w:rPr>
-              <w:t>Future meetings will take place on Friday between 9:00AM to 10:00AM GMT+8, this was set based on the availability of all individuals involved.</w:t>
-            </w:r>
-          </w:p>
-          <w:p>
-            <w:pPr>
-              <w:pStyle w:val="ListParagraph"/>
-              <w:rPr>
-                <w:lang w:val="en-GB"/>
-              </w:rPr>
-            </w:pPr>
-          </w:p>
-          <w:p>
-            <w:pPr>
-              <w:pStyle w:val="ListParagraph"/>
-              <w:numPr>
-                <w:ilvl w:val="0"/>
-                <w:numId w:val="13"/>
-              </w:numPr>
-              <w:rPr>
-                <w:lang w:val="en-GB"/>
-              </w:rPr>
-            </w:pPr>
-            <w:r>
-              <w:rPr>
-                <w:lang w:val="en-GB"/>
-              </w:rPr>
-              <w:t xml:space="preserve">Group Lead, Yew “Sunshine” Hang Lau, distributed articles amongst team members to further conduct our </w:t>
-            </w:r>
-            <w:proofErr w:type="spellStart"/>
-            <w:r>
-              <w:rPr>
-                <w:lang w:val="en-GB"/>
-              </w:rPr>
-              <w:t>literatuve</w:t>
-            </w:r>
-            <w:proofErr w:type="spellEnd"/>
-            <w:r>
-              <w:rPr>
-                <w:lang w:val="en-GB"/>
-              </w:rPr>
-              <w:t xml:space="preserve"> review, to be done by 22</w:t>
-            </w:r>
-            <w:r>
-              <w:rPr>
-                <w:vertAlign w:val="superscript"/>
-                <w:lang w:val="en-GB"/>
-              </w:rPr>
-              <w:t>nd</w:t>
-            </w:r>
-            <w:r>
-              <w:rPr>
-                <w:lang w:val="en-GB"/>
-              </w:rPr>
-              <w:t xml:space="preserve"> of </w:t>
-            </w:r>
-            <w:proofErr w:type="gramStart"/>
-            <w:r>
-              <w:rPr>
-                <w:lang w:val="en-GB"/>
-              </w:rPr>
-              <w:t>October,</w:t>
-            </w:r>
-            <w:proofErr w:type="gramEnd"/>
-            <w:r>
-              <w:rPr>
-                <w:lang w:val="en-GB"/>
-              </w:rPr>
-              <w:t xml:space="preserve"> 2025.</w:t>
-            </w:r>
-          </w:p>
-          <w:p>
-            <w:pPr>
-              <w:pStyle w:val="ListParagraph"/>
-              <w:rPr>
-                <w:lang w:val="en-GB"/>
-              </w:rPr>
-            </w:pPr>
-          </w:p>
-          <w:p>
-            <w:pPr>
-              <w:pStyle w:val="ListParagraph"/>
-              <w:numPr>
-                <w:ilvl w:val="0"/>
-                <w:numId w:val="13"/>
-              </w:numPr>
-              <w:rPr>
-                <w:lang w:val="en-GB"/>
-              </w:rPr>
-            </w:pPr>
-            <w:r>
-              <w:rPr>
-                <w:lang w:val="en-GB"/>
-              </w:rPr>
-              <w:lastRenderedPageBreak/>
-              <w:t>Meeting Minutes #03, Ethics Form &amp; Initiation of the Interim Report to be done by the 16</w:t>
-            </w:r>
-            <w:r>
-              <w:rPr>
-                <w:vertAlign w:val="superscript"/>
-                <w:lang w:val="en-GB"/>
-              </w:rPr>
-              <w:t>th</w:t>
-            </w:r>
-            <w:r>
-              <w:rPr>
-                <w:lang w:val="en-GB"/>
-              </w:rPr>
-              <w:t xml:space="preserve"> of </w:t>
-            </w:r>
-            <w:proofErr w:type="gramStart"/>
-            <w:r>
-              <w:rPr>
-                <w:lang w:val="en-GB"/>
-              </w:rPr>
-              <w:t>October,</w:t>
-            </w:r>
-            <w:proofErr w:type="gramEnd"/>
-            <w:r>
-              <w:rPr>
-                <w:lang w:val="en-GB"/>
-              </w:rPr>
-              <w:t xml:space="preserve"> 2025.</w:t>
-            </w:r>
-          </w:p>
-        </w:tc>
-      </w:tr>
-    </w:tbl>
-    <w:p>
-      <w:pPr>
-        <w:pStyle w:val="ListParagraph"/>
-      </w:pPr>
+        <w:spacing w:line="276" w:lineRule="auto"/>
+      </w:pPr>
+      <w:r>
+        <w:t xml:space="preserve">Z. Yu, C. Xin, Y. Yu, J. Xia, and L. Han, “AI dermatology: Reviewing the frontiers of skin cancer detection technologies,” Intelligent Oncology, vol. 1, no. 2, pp. 89–104, Mar. 2025, </w:t>
+      </w:r>
+      <w:proofErr w:type="spellStart"/>
+      <w:r>
+        <w:t>doi</w:t>
+      </w:r>
+      <w:proofErr w:type="spellEnd"/>
+      <w:r>
+        <w:t>: 10.1016/j.intonc.2025.03.002.</w:t>
+      </w:r>
     </w:p>
     <w:p>
       <w:pPr>
         <w:pStyle w:val="ListParagraph"/>
         <w:numPr>
           <w:ilvl w:val="0"/>
-          <w:numId w:val="25"/>
+          <w:numId w:val="35"/>
         </w:numPr>
-      </w:pPr>
-      <w:r>
-        <w:t>a</w:t>
-      </w:r>
-    </w:p>
-    <w:p/>
-    <w:p>
-      <w:r>
-        <w:br w:type="page"/>
-      </w:r>
-    </w:p>
-    <w:p>
-      <w:r>
-        <w:lastRenderedPageBreak/>
-        <w:t>Guidelines</w:t>
-      </w:r>
-      <w:r>
-        <w:t>:</w:t>
-      </w:r>
-      <w:r>
-        <w:t xml:space="preserve"> </w:t>
-      </w:r>
-      <w:r>
-        <w:rPr>
-          <w:highlight w:val="yellow"/>
-        </w:rPr>
-        <w:t xml:space="preserve">[TO BE REMOVED AFTER </w:t>
-      </w:r>
-      <w:r>
-        <w:rPr>
-          <w:highlight w:val="yellow"/>
-        </w:rPr>
-        <w:t>REPORT FINALIZATON]</w:t>
-      </w:r>
-    </w:p>
-    <w:p>
-      <w:r>
-        <w:t xml:space="preserve">The Interim Group Report should be 4000–5000 words (around 12–15 </w:t>
-      </w:r>
-      <w:proofErr w:type="gramStart"/>
-      <w:r>
-        <w:t>pages;</w:t>
-      </w:r>
-      <w:proofErr w:type="gramEnd"/>
-      <w:r>
-        <w:t xml:space="preserve"> excluding any appendices). It is due around the half-way stage of the project. Each group must submit one such report, written as a group. The main content of the report should be:</w:t>
+        <w:spacing w:line="276" w:lineRule="auto"/>
+      </w:pPr>
+      <w:r>
+        <w:t xml:space="preserve">S. M. R. </w:t>
+      </w:r>
+      <w:proofErr w:type="spellStart"/>
+      <w:r>
+        <w:t>Swapno</w:t>
+      </w:r>
+      <w:proofErr w:type="spellEnd"/>
+      <w:r>
+        <w:t xml:space="preserve">, S. M. N. Nobel, P. K. Meena, V. P. Meena, J. Bahadur, and A. Appaji, “Accelerated and precise skin cancer detection through an enhanced machine learning pipeline for improved diagnostic accuracy,” Results in Engineering, vol. 25, p. 104168, Jan. 2025, </w:t>
+      </w:r>
+      <w:proofErr w:type="spellStart"/>
+      <w:r>
+        <w:t>doi</w:t>
+      </w:r>
+      <w:proofErr w:type="spellEnd"/>
+      <w:r>
+        <w:t>: 10.1016/j.rineng.2025.104168.</w:t>
       </w:r>
     </w:p>
     <w:p>
@@ -7053,12 +5739,20 @@
         <w:pStyle w:val="ListParagraph"/>
         <w:numPr>
           <w:ilvl w:val="0"/>
-          <w:numId w:val="15"/>
+          <w:numId w:val="35"/>
         </w:numPr>
-      </w:pPr>
-      <w:bookmarkStart w:id="28" w:name="_Hlk216276323"/>
-      <w:r>
-        <w:t>Updated and expanded description of the problem to be solved.</w:t>
+        <w:spacing w:line="276" w:lineRule="auto"/>
+      </w:pPr>
+      <w:r>
+        <w:t xml:space="preserve">R. R, V. P, and N. K, “Advanced Deep Learning Strategies for Skin Lesion Segmentation using R2U-Net,” 2024 International Conference on Communication, Computing, Smart Materials and Devices (ICCCSMD), pp. 1–6, Dec. 2024, </w:t>
+      </w:r>
+      <w:proofErr w:type="spellStart"/>
+      <w:r>
+        <w:t>doi</w:t>
+      </w:r>
+      <w:proofErr w:type="spellEnd"/>
+      <w:r>
+        <w:t>: 10.1109/icccsmd63546.2024.11015162.</w:t>
       </w:r>
     </w:p>
     <w:p>
@@ -7066,62 +5760,41 @@
         <w:pStyle w:val="ListParagraph"/>
         <w:numPr>
           <w:ilvl w:val="0"/>
-          <w:numId w:val="15"/>
+          <w:numId w:val="35"/>
         </w:numPr>
-      </w:pPr>
-      <w:bookmarkStart w:id="29" w:name="_Hlk216276274"/>
-      <w:bookmarkEnd w:id="28"/>
-      <w:r>
-        <w:t>Background information and research such as</w:t>
-      </w:r>
-    </w:p>
-    <w:p>
-      <w:pPr>
-        <w:pStyle w:val="ListParagraph"/>
-        <w:numPr>
-          <w:ilvl w:val="1"/>
-          <w:numId w:val="15"/>
-        </w:numPr>
-      </w:pPr>
-      <w:r>
-        <w:t>survey of any existing systems that address similar problems</w:t>
-      </w:r>
-    </w:p>
-    <w:p>
-      <w:pPr>
-        <w:pStyle w:val="ListParagraph"/>
-        <w:numPr>
-          <w:ilvl w:val="1"/>
-          <w:numId w:val="15"/>
-        </w:numPr>
-      </w:pPr>
-      <w:r>
-        <w:t>results of any market research conducted</w:t>
-      </w:r>
-    </w:p>
-    <w:p>
-      <w:pPr>
-        <w:pStyle w:val="ListParagraph"/>
-        <w:numPr>
-          <w:ilvl w:val="1"/>
-          <w:numId w:val="15"/>
-        </w:numPr>
-      </w:pPr>
-      <w:r>
-        <w:t>results of technical research into suitable platforms, tools, technologies, algorithms, data structures, etc.</w:t>
-      </w:r>
-    </w:p>
-    <w:bookmarkEnd w:id="29"/>
+        <w:spacing w:line="276" w:lineRule="auto"/>
+      </w:pPr>
+      <w:r>
+        <w:t xml:space="preserve">A. Esteva et al., “Dermatologist-level classification of skin cancer with deep neural networks,” Nature, vol. 542, no. 7639, pp. 115–118, Jan. 2017, </w:t>
+      </w:r>
+      <w:proofErr w:type="spellStart"/>
+      <w:r>
+        <w:t>doi</w:t>
+      </w:r>
+      <w:proofErr w:type="spellEnd"/>
+      <w:r>
+        <w:t>: 10.1038/nature21056.</w:t>
+      </w:r>
+    </w:p>
     <w:p>
       <w:pPr>
         <w:pStyle w:val="ListParagraph"/>
         <w:numPr>
           <w:ilvl w:val="0"/>
-          <w:numId w:val="15"/>
+          <w:numId w:val="35"/>
         </w:numPr>
-      </w:pPr>
-      <w:r>
-        <w:t>Requirements specification for the system to be built (agreed between the group and supervisor).</w:t>
+        <w:spacing w:line="276" w:lineRule="auto"/>
+      </w:pPr>
+      <w:r>
+        <w:t xml:space="preserve">A. S. Chiou et al., “Multimodal image Dataset for AI-Based Skin Cancer (MIDAS) benchmarking,” NEJM AI, vol. 2, no. 6, May 2025, </w:t>
+      </w:r>
+      <w:proofErr w:type="spellStart"/>
+      <w:r>
+        <w:t>doi</w:t>
+      </w:r>
+      <w:proofErr w:type="spellEnd"/>
+      <w:r>
+        <w:t>: 10.1056/aidbp2400732.</w:t>
       </w:r>
     </w:p>
     <w:p>
@@ -7129,11 +5802,43 @@
         <w:pStyle w:val="ListParagraph"/>
         <w:numPr>
           <w:ilvl w:val="0"/>
-          <w:numId w:val="15"/>
+          <w:numId w:val="35"/>
         </w:numPr>
-      </w:pPr>
-      <w:r>
-        <w:t>Initial design of the proposed system and its user interface.</w:t>
+        <w:spacing w:line="276" w:lineRule="auto"/>
+      </w:pPr>
+      <w:r>
+        <w:t xml:space="preserve">N. R. </w:t>
+      </w:r>
+      <w:proofErr w:type="spellStart"/>
+      <w:r>
+        <w:t>Kurtansky</w:t>
+      </w:r>
+      <w:proofErr w:type="spellEnd"/>
+      <w:r>
+        <w:t xml:space="preserve"> et al., “The SLICE-3D dataset: 400,000 skin lesion image crops extracted from 3D TBP for skin cancer detection,” Scientific Data, vol. 11, no. 1, p. 884, Aug. 2024, </w:t>
+      </w:r>
+      <w:proofErr w:type="spellStart"/>
+      <w:r>
+        <w:t>doi</w:t>
+      </w:r>
+      <w:proofErr w:type="spellEnd"/>
+      <w:r>
+        <w:t>: 10.1038/s41597-024-03743-w.</w:t>
+      </w:r>
+    </w:p>
+    <w:p>
+      <w:pPr>
+        <w:pStyle w:val="ListParagraph"/>
+        <w:spacing w:line="276" w:lineRule="auto"/>
+      </w:pPr>
+    </w:p>
+    <w:p>
+      <w:pPr>
+        <w:pStyle w:val="ListParagraph"/>
+        <w:spacing w:line="276" w:lineRule="auto"/>
+      </w:pPr>
+      <w:r>
+        <w:t>Interim Report &amp; Lit Review Research</w:t>
       </w:r>
     </w:p>
     <w:p>
@@ -7141,11 +5846,40 @@
         <w:pStyle w:val="ListParagraph"/>
         <w:numPr>
           <w:ilvl w:val="0"/>
-          <w:numId w:val="15"/>
+          <w:numId w:val="35"/>
         </w:numPr>
-      </w:pPr>
-      <w:r>
-        <w:t>Record of key implementation decisions, such as programming languages, operating systems, computers, and any additional software and hardware to be used, along with reasons for those decisions.</w:t>
+        <w:spacing w:line="276" w:lineRule="auto"/>
+      </w:pPr>
+      <w:r>
+        <w:t xml:space="preserve">L. Thomas </w:t>
+      </w:r>
+      <w:r>
+        <w:rPr>
+          <w:i/>
+          <w:iCs/>
+        </w:rPr>
+        <w:t>et al.</w:t>
+      </w:r>
+      <w:r>
+        <w:t xml:space="preserve">, "Real-world post-deployment performance of a novel machine learning-based digital health technology for skin lesion assessment and suggestions for post-market surveillance," </w:t>
+      </w:r>
+      <w:r>
+        <w:rPr>
+          <w:i/>
+          <w:iCs/>
+        </w:rPr>
+        <w:t>Front. Med.</w:t>
+      </w:r>
+      <w:r>
+        <w:t xml:space="preserve">, vol. 10, p. 1264846, Oct. 2023, </w:t>
+      </w:r>
+      <w:proofErr w:type="spellStart"/>
+      <w:r>
+        <w:t>doi</w:t>
+      </w:r>
+      <w:proofErr w:type="spellEnd"/>
+      <w:r>
+        <w:t>: 10.3389/fmed.2023.1264846.</w:t>
       </w:r>
     </w:p>
     <w:p>
@@ -7153,19 +5887,12 @@
         <w:pStyle w:val="ListParagraph"/>
         <w:numPr>
           <w:ilvl w:val="0"/>
-          <w:numId w:val="15"/>
+          <w:numId w:val="35"/>
         </w:numPr>
-      </w:pPr>
-      <w:r>
-        <w:t xml:space="preserve">Results of any initial implementation steps/prototyping. Summary of the </w:t>
-      </w:r>
-      <w:proofErr w:type="gramStart"/>
-      <w:r>
-        <w:t>outputs</w:t>
-      </w:r>
-      <w:proofErr w:type="gramEnd"/>
-      <w:r>
-        <w:t xml:space="preserve"> generated by your implementation of mini-Scrum (e.g. burndown chart).</w:t>
+        <w:spacing w:line="276" w:lineRule="auto"/>
+      </w:pPr>
+      <w:r>
+        <w:t>SkinVision, "The SkinVision Algorithm," SkinVision. [Online]. Available: https://www.skinvision.com/clinical-research/how-the-algorithm-works. [Accessed: Apr. 21, 2026].</w:t>
       </w:r>
     </w:p>
     <w:p>
@@ -7173,11 +5900,36 @@
         <w:pStyle w:val="ListParagraph"/>
         <w:numPr>
           <w:ilvl w:val="0"/>
-          <w:numId w:val="15"/>
+          <w:numId w:val="35"/>
         </w:numPr>
-      </w:pPr>
-      <w:r>
-        <w:t>Discussion of any problems encountered so far, including both technical issues and management issues.</w:t>
+        <w:spacing w:line="276" w:lineRule="auto"/>
+      </w:pPr>
+      <w:r>
+        <w:t>SkinVision, "</w:t>
+      </w:r>
+      <w:r>
+        <w:t>Getting Started,</w:t>
+      </w:r>
+      <w:r>
+        <w:t xml:space="preserve">" SkinVision. [Online]. </w:t>
+      </w:r>
+      <w:r>
+        <w:rPr>
+          <w:lang w:val="en-MY"/>
+        </w:rPr>
+        <w:t xml:space="preserve">Available: </w:t>
+      </w:r>
+      <w:r>
+        <w:t>https://www.skinvision.com/getting-started#pricing-and-plans</w:t>
+      </w:r>
+      <w:r>
+        <w:rPr>
+          <w:lang w:val="en-MY"/>
+        </w:rPr>
+        <w:t xml:space="preserve"> </w:t>
+      </w:r>
+      <w:r>
+        <w:t>[Accessed: Apr. 21, 2026].</w:t>
       </w:r>
     </w:p>
     <w:p>
@@ -7185,38 +5937,216 @@
         <w:pStyle w:val="ListParagraph"/>
         <w:numPr>
           <w:ilvl w:val="0"/>
-          <w:numId w:val="15"/>
+          <w:numId w:val="35"/>
         </w:numPr>
-      </w:pPr>
-      <w:r>
-        <w:t>Time plan for the project.</w:t>
-      </w:r>
-    </w:p>
-    <w:p>
-      <w:pPr>
-        <w:rPr>
-          <w:lang w:val="en-GB"/>
-        </w:rPr>
-      </w:pPr>
-      <w:r>
-        <w:rPr>
-          <w:lang w:val="en-GB"/>
-        </w:rPr>
-        <w:t>Description</w:t>
-      </w:r>
-      <w:r>
-        <w:rPr>
-          <w:lang w:val="en-GB"/>
-        </w:rPr>
-        <w:t>s of the project/problem:</w:t>
-      </w:r>
-    </w:p>
-    <w:p>
-      <w:pPr>
-        <w:rPr>
-          <w:lang w:val="en-GB"/>
-        </w:rPr>
-      </w:pPr>
+        <w:spacing w:line="276" w:lineRule="auto"/>
+      </w:pPr>
+      <w:r>
+        <w:lastRenderedPageBreak/>
+        <w:t>Center for Artificial Intelligence in Medicine &amp; Imaging | Stanford University, "MRA-MIDAS: Multimodal Image Dataset for AI-based Skin Cancer," Stanford University, Stanford, https://doi.org/10.71718/15nz-jv40. 2025.</w:t>
+      </w:r>
+    </w:p>
+    <w:p>
+      <w:pPr>
+        <w:pStyle w:val="ListParagraph"/>
+        <w:numPr>
+          <w:ilvl w:val="0"/>
+          <w:numId w:val="35"/>
+        </w:numPr>
+        <w:spacing w:line="276" w:lineRule="auto"/>
+      </w:pPr>
+      <w:r>
+        <w:t xml:space="preserve">G. Brancaccio, A. </w:t>
+      </w:r>
+      <w:proofErr w:type="spellStart"/>
+      <w:r>
+        <w:t>Balato</w:t>
+      </w:r>
+      <w:proofErr w:type="spellEnd"/>
+      <w:r>
+        <w:t xml:space="preserve">, J. </w:t>
+      </w:r>
+      <w:proofErr w:type="spellStart"/>
+      <w:r>
+        <w:t>Malvehy</w:t>
+      </w:r>
+      <w:proofErr w:type="spellEnd"/>
+      <w:r>
+        <w:t xml:space="preserve">, S. Puig, G. Argenziano, and H. Kittler, "Artificial intelligence in skin cancer diagnosis: A reality check," </w:t>
+      </w:r>
+      <w:r>
+        <w:rPr>
+          <w:i/>
+          <w:iCs/>
+        </w:rPr>
+        <w:t>J. Invest. Dermatol.</w:t>
+      </w:r>
+      <w:r>
+        <w:t xml:space="preserve">, Feb. 2023, </w:t>
+      </w:r>
+      <w:proofErr w:type="spellStart"/>
+      <w:r>
+        <w:t>doi</w:t>
+      </w:r>
+      <w:proofErr w:type="spellEnd"/>
+      <w:r>
+        <w:t>: 10.1016/j.jid.2023.10.004.</w:t>
+      </w:r>
+    </w:p>
+    <w:p>
+      <w:pPr>
+        <w:pStyle w:val="ListParagraph"/>
+        <w:numPr>
+          <w:ilvl w:val="0"/>
+          <w:numId w:val="35"/>
+        </w:numPr>
+        <w:spacing w:line="276" w:lineRule="auto"/>
+      </w:pPr>
+      <w:r>
+        <w:t>N. S. A. Mahmoud, "Early automated detection system for skin cancer diagnosis using artificial intelligent techniques.," 28 April 2024, https://doi.org/10.1038/s41598-024-59783-0.</w:t>
+      </w:r>
+    </w:p>
+    <w:p>
+      <w:pPr>
+        <w:pStyle w:val="ListParagraph"/>
+        <w:numPr>
+          <w:ilvl w:val="0"/>
+          <w:numId w:val="35"/>
+        </w:numPr>
+        <w:spacing w:line="276" w:lineRule="auto"/>
+      </w:pPr>
+      <w:r>
+        <w:t xml:space="preserve">N. e. a. </w:t>
+      </w:r>
+      <w:proofErr w:type="spellStart"/>
+      <w:r>
+        <w:t>Shifai</w:t>
+      </w:r>
+      <w:proofErr w:type="spellEnd"/>
+      <w:r>
+        <w:t xml:space="preserve">, "Can ChatGPT vision diagnose melanoma? An exploratory diagnostic accuracy study," 18 January 2024, https://doi.org/10.1016/j.jaad.2023.12.062. </w:t>
+      </w:r>
+    </w:p>
+    <w:p>
+      <w:pPr>
+        <w:pStyle w:val="ListParagraph"/>
+        <w:numPr>
+          <w:ilvl w:val="0"/>
+          <w:numId w:val="35"/>
+        </w:numPr>
+        <w:spacing w:line="276" w:lineRule="auto"/>
+      </w:pPr>
+      <w:r>
+        <w:t xml:space="preserve">S. S. Sattler </w:t>
+      </w:r>
+      <w:r>
+        <w:rPr>
+          <w:i/>
+          <w:iCs/>
+        </w:rPr>
+        <w:t>et al.</w:t>
+      </w:r>
+      <w:r>
+        <w:t xml:space="preserve">, "Evaluating the diagnostic accuracy of ChatGPT-4 Omni and ChatGPT-4 Turbo in identifying melanoma: Comparative study," </w:t>
+      </w:r>
+      <w:r>
+        <w:rPr>
+          <w:i/>
+          <w:iCs/>
+        </w:rPr>
+        <w:t>JMIR Dermatol.</w:t>
+      </w:r>
+      <w:r>
+        <w:t xml:space="preserve">, vol. 8, p. e67551, Mar. 2025, </w:t>
+      </w:r>
+      <w:proofErr w:type="spellStart"/>
+      <w:r>
+        <w:t>doi</w:t>
+      </w:r>
+      <w:proofErr w:type="spellEnd"/>
+      <w:r>
+        <w:t>: 10.2196/67551.</w:t>
+      </w:r>
+    </w:p>
+    <w:p>
+      <w:pPr>
+        <w:pStyle w:val="ListParagraph"/>
+        <w:numPr>
+          <w:ilvl w:val="0"/>
+          <w:numId w:val="35"/>
+        </w:numPr>
+        <w:spacing w:line="276" w:lineRule="auto"/>
+      </w:pPr>
+      <w:r>
+        <w:t xml:space="preserve">M. Abou Ali, F. </w:t>
+      </w:r>
+      <w:proofErr w:type="spellStart"/>
+      <w:r>
+        <w:t>Dornaika</w:t>
+      </w:r>
+      <w:proofErr w:type="spellEnd"/>
+      <w:r>
+        <w:t>, and I. Arganda-Carreras, ‘Blood Cell Revolution: Unveiling 11 Distinct Types with “Naturalize” Augmentation’, Algorithms, vol. 16, no. 12, 2023.</w:t>
+      </w:r>
+    </w:p>
+    <w:p>
+      <w:pPr>
+        <w:pStyle w:val="ListParagraph"/>
+        <w:numPr>
+          <w:ilvl w:val="0"/>
+          <w:numId w:val="35"/>
+        </w:numPr>
+        <w:spacing w:line="276" w:lineRule="auto"/>
+      </w:pPr>
+      <w:r>
+        <w:t xml:space="preserve">P. Goon, C. Banfield, O. Bello, and N. J. Levell, "Skin cancers in skin types IV-VI: Does the Fitzpatrick scale give a false sense of security?" </w:t>
+      </w:r>
+      <w:r>
+        <w:rPr>
+          <w:i/>
+          <w:iCs/>
+        </w:rPr>
+        <w:t>Skin Health Dis.</w:t>
+      </w:r>
+      <w:r>
+        <w:t xml:space="preserve">, vol. 1, no. 3, p. e40, Jun. 2021, </w:t>
+      </w:r>
+      <w:proofErr w:type="spellStart"/>
+      <w:r>
+        <w:t>doi</w:t>
+      </w:r>
+      <w:proofErr w:type="spellEnd"/>
+      <w:r>
+        <w:t>: 10.1002/ski2.40.</w:t>
+      </w:r>
+    </w:p>
+    <w:p/>
+    <w:p>
+      <w:r>
+        <w:br w:type="page"/>
+      </w:r>
+    </w:p>
+    <w:p>
+      <w:pPr>
+        <w:pStyle w:val="Chapters"/>
+      </w:pPr>
+      <w:r>
+        <w:lastRenderedPageBreak/>
+        <w:t xml:space="preserve">Chapter </w:t>
+      </w:r>
+      <w:r>
+        <w:t>8</w:t>
+      </w:r>
+    </w:p>
+    <w:p>
+      <w:pPr>
+        <w:pStyle w:val="Heading2"/>
+      </w:pPr>
+      <w:bookmarkStart w:id="27" w:name="_Toc227368719"/>
+      <w:r>
+        <w:t>Appendix</w:t>
+      </w:r>
+      <w:bookmarkEnd w:id="27"/>
     </w:p>
     <w:p>
       <w:pPr>
@@ -7304,7 +6234,7 @@
           <w:lang w:val="en-GB"/>
         </w:rPr>
       </w:pPr>
-      <w:hyperlink r:id="rId22" w:history="1">
+      <w:hyperlink r:id="rId16" w:history="1">
         <w:r>
           <w:rPr>
             <w:rStyle w:val="Hyperlink"/>
@@ -7331,7 +6261,7 @@
         </w:rPr>
         <w:t xml:space="preserve">ScienceDirect: </w:t>
       </w:r>
-      <w:hyperlink r:id="rId23" w:history="1">
+      <w:hyperlink r:id="rId17" w:history="1">
         <w:r>
           <w:rPr>
             <w:rStyle w:val="Hyperlink"/>
@@ -7358,7 +6288,7 @@
         </w:rPr>
         <w:t xml:space="preserve">Nature: </w:t>
       </w:r>
-      <w:hyperlink r:id="rId24" w:history="1">
+      <w:hyperlink r:id="rId18" w:history="1">
         <w:r>
           <w:rPr>
             <w:rStyle w:val="Hyperlink"/>
@@ -7385,7 +6315,7 @@
         </w:rPr>
         <w:t xml:space="preserve">JAAD: </w:t>
       </w:r>
-      <w:hyperlink r:id="rId25" w:history="1">
+      <w:hyperlink r:id="rId19" w:history="1">
         <w:r>
           <w:rPr>
             <w:rStyle w:val="Hyperlink"/>
@@ -7411,7 +6341,7 @@
       <w:r>
         <w:t xml:space="preserve">CBI, NLM: </w:t>
       </w:r>
-      <w:hyperlink r:id="rId26" w:history="1">
+      <w:hyperlink r:id="rId20" w:history="1">
         <w:r>
           <w:rPr>
             <w:rStyle w:val="Hyperlink"/>
@@ -7513,7 +6443,7 @@
           <w:lang w:val="en-MY"/>
         </w:rPr>
       </w:pPr>
-      <w:hyperlink r:id="rId27" w:history="1">
+      <w:hyperlink r:id="rId21" w:history="1">
         <w:r>
           <w:rPr>
             <w:rStyle w:val="Hyperlink"/>
@@ -7546,7 +6476,6 @@
         <w:rPr>
           <w:lang w:val="en-GB"/>
         </w:rPr>
-        <w:lastRenderedPageBreak/>
         <w:t>Record of key implementation decision:</w:t>
       </w:r>
     </w:p>
@@ -7761,6 +6690,7 @@
         <w:rPr>
           <w:lang w:val="en-GB"/>
         </w:rPr>
+        <w:lastRenderedPageBreak/>
         <w:t>T</w:t>
       </w:r>
       <w:r>
@@ -7859,7 +6789,7 @@
       </w:r>
     </w:p>
     <w:sectPr>
-      <w:headerReference w:type="default" r:id="rId28"/>
+      <w:headerReference w:type="default" r:id="rId22"/>
       <w:pgSz w:w="12240" w:h="15840"/>
       <w:pgMar w:top="720" w:right="1440" w:bottom="720" w:left="1440" w:header="720" w:footer="720" w:gutter="0"/>
       <w:cols w:space="720"/>
@@ -8891,6 +7821,95 @@
     </w:lvl>
   </w:abstractNum>
   <w:abstractNum w:abstractNumId="9" w15:restartNumberingAfterBreak="0">
+    <w:nsid w:val="2E3E47AA"/>
+    <w:multiLevelType w:val="hybridMultilevel"/>
+    <w:tmpl w:val="F4C4B788"/>
+    <w:lvl w:ilvl="0" w:tplc="C4A6BD9E">
+      <w:start w:val="1"/>
+      <w:numFmt w:val="decimal"/>
+      <w:lvlText w:val="[%1]"/>
+      <w:lvlJc w:val="right"/>
+      <w:pPr>
+        <w:ind w:left="720" w:hanging="360"/>
+      </w:pPr>
+      <w:rPr>
+        <w:rFonts w:hint="default"/>
+      </w:rPr>
+    </w:lvl>
+    <w:lvl w:ilvl="1" w:tplc="44090019" w:tentative="1">
+      <w:start w:val="1"/>
+      <w:numFmt w:val="lowerLetter"/>
+      <w:lvlText w:val="%2."/>
+      <w:lvlJc w:val="left"/>
+      <w:pPr>
+        <w:ind w:left="1440" w:hanging="360"/>
+      </w:pPr>
+    </w:lvl>
+    <w:lvl w:ilvl="2" w:tplc="4409001B" w:tentative="1">
+      <w:start w:val="1"/>
+      <w:numFmt w:val="lowerRoman"/>
+      <w:lvlText w:val="%3."/>
+      <w:lvlJc w:val="right"/>
+      <w:pPr>
+        <w:ind w:left="2160" w:hanging="180"/>
+      </w:pPr>
+    </w:lvl>
+    <w:lvl w:ilvl="3" w:tplc="4409000F" w:tentative="1">
+      <w:start w:val="1"/>
+      <w:numFmt w:val="decimal"/>
+      <w:lvlText w:val="%4."/>
+      <w:lvlJc w:val="left"/>
+      <w:pPr>
+        <w:ind w:left="2880" w:hanging="360"/>
+      </w:pPr>
+    </w:lvl>
+    <w:lvl w:ilvl="4" w:tplc="44090019" w:tentative="1">
+      <w:start w:val="1"/>
+      <w:numFmt w:val="lowerLetter"/>
+      <w:lvlText w:val="%5."/>
+      <w:lvlJc w:val="left"/>
+      <w:pPr>
+        <w:ind w:left="3600" w:hanging="360"/>
+      </w:pPr>
+    </w:lvl>
+    <w:lvl w:ilvl="5" w:tplc="4409001B" w:tentative="1">
+      <w:start w:val="1"/>
+      <w:numFmt w:val="lowerRoman"/>
+      <w:lvlText w:val="%6."/>
+      <w:lvlJc w:val="right"/>
+      <w:pPr>
+        <w:ind w:left="4320" w:hanging="180"/>
+      </w:pPr>
+    </w:lvl>
+    <w:lvl w:ilvl="6" w:tplc="4409000F" w:tentative="1">
+      <w:start w:val="1"/>
+      <w:numFmt w:val="decimal"/>
+      <w:lvlText w:val="%7."/>
+      <w:lvlJc w:val="left"/>
+      <w:pPr>
+        <w:ind w:left="5040" w:hanging="360"/>
+      </w:pPr>
+    </w:lvl>
+    <w:lvl w:ilvl="7" w:tplc="44090019" w:tentative="1">
+      <w:start w:val="1"/>
+      <w:numFmt w:val="lowerLetter"/>
+      <w:lvlText w:val="%8."/>
+      <w:lvlJc w:val="left"/>
+      <w:pPr>
+        <w:ind w:left="5760" w:hanging="360"/>
+      </w:pPr>
+    </w:lvl>
+    <w:lvl w:ilvl="8" w:tplc="4409001B" w:tentative="1">
+      <w:start w:val="1"/>
+      <w:numFmt w:val="lowerRoman"/>
+      <w:lvlText w:val="%9."/>
+      <w:lvlJc w:val="right"/>
+      <w:pPr>
+        <w:ind w:left="6480" w:hanging="180"/>
+      </w:pPr>
+    </w:lvl>
+  </w:abstractNum>
+  <w:abstractNum w:abstractNumId="10" w15:restartNumberingAfterBreak="0">
     <w:nsid w:val="38944EA4"/>
     <w:multiLevelType w:val="hybridMultilevel"/>
     <w:tmpl w:val="AAD67C14"/>
@@ -9002,7 +8021,7 @@
       </w:rPr>
     </w:lvl>
   </w:abstractNum>
-  <w:abstractNum w:abstractNumId="10" w15:restartNumberingAfterBreak="0">
+  <w:abstractNum w:abstractNumId="11" w15:restartNumberingAfterBreak="0">
     <w:nsid w:val="3D1D3552"/>
     <w:multiLevelType w:val="multilevel"/>
     <w:tmpl w:val="8BFE283E"/>
@@ -9151,7 +8170,7 @@
       </w:rPr>
     </w:lvl>
   </w:abstractNum>
-  <w:abstractNum w:abstractNumId="11" w15:restartNumberingAfterBreak="0">
+  <w:abstractNum w:abstractNumId="12" w15:restartNumberingAfterBreak="0">
     <w:nsid w:val="3EB26CE6"/>
     <w:multiLevelType w:val="hybridMultilevel"/>
     <w:tmpl w:val="6D5A9D6C"/>
@@ -9240,7 +8259,7 @@
       </w:pPr>
     </w:lvl>
   </w:abstractNum>
-  <w:abstractNum w:abstractNumId="12" w15:restartNumberingAfterBreak="0">
+  <w:abstractNum w:abstractNumId="13" w15:restartNumberingAfterBreak="0">
     <w:nsid w:val="3F531559"/>
     <w:multiLevelType w:val="hybridMultilevel"/>
     <w:tmpl w:val="05A03E6A"/>
@@ -9353,7 +8372,7 @@
       </w:rPr>
     </w:lvl>
   </w:abstractNum>
-  <w:abstractNum w:abstractNumId="13" w15:restartNumberingAfterBreak="0">
+  <w:abstractNum w:abstractNumId="14" w15:restartNumberingAfterBreak="0">
     <w:nsid w:val="40CF0D06"/>
     <w:multiLevelType w:val="hybridMultilevel"/>
     <w:tmpl w:val="9F54ED7A"/>
@@ -9465,7 +8484,7 @@
       </w:rPr>
     </w:lvl>
   </w:abstractNum>
-  <w:abstractNum w:abstractNumId="14" w15:restartNumberingAfterBreak="0">
+  <w:abstractNum w:abstractNumId="15" w15:restartNumberingAfterBreak="0">
     <w:nsid w:val="42822500"/>
     <w:multiLevelType w:val="hybridMultilevel"/>
     <w:tmpl w:val="855A3BC4"/>
@@ -9578,7 +8597,7 @@
       </w:rPr>
     </w:lvl>
   </w:abstractNum>
-  <w:abstractNum w:abstractNumId="15" w15:restartNumberingAfterBreak="0">
+  <w:abstractNum w:abstractNumId="16" w15:restartNumberingAfterBreak="0">
     <w:nsid w:val="44EB257A"/>
     <w:multiLevelType w:val="hybridMultilevel"/>
     <w:tmpl w:val="027A4658"/>
@@ -9664,7 +8683,7 @@
       </w:pPr>
     </w:lvl>
   </w:abstractNum>
-  <w:abstractNum w:abstractNumId="16" w15:restartNumberingAfterBreak="0">
+  <w:abstractNum w:abstractNumId="17" w15:restartNumberingAfterBreak="0">
     <w:nsid w:val="4A7A62E0"/>
     <w:multiLevelType w:val="hybridMultilevel"/>
     <w:tmpl w:val="A880A792"/>
@@ -9777,7 +8796,7 @@
       </w:rPr>
     </w:lvl>
   </w:abstractNum>
-  <w:abstractNum w:abstractNumId="17" w15:restartNumberingAfterBreak="0">
+  <w:abstractNum w:abstractNumId="18" w15:restartNumberingAfterBreak="0">
     <w:nsid w:val="4CDA17E8"/>
     <w:multiLevelType w:val="hybridMultilevel"/>
     <w:tmpl w:val="6E402B14"/>
@@ -9866,7 +8885,7 @@
       </w:pPr>
     </w:lvl>
   </w:abstractNum>
-  <w:abstractNum w:abstractNumId="18" w15:restartNumberingAfterBreak="0">
+  <w:abstractNum w:abstractNumId="19" w15:restartNumberingAfterBreak="0">
     <w:nsid w:val="59F8519C"/>
     <w:multiLevelType w:val="hybridMultilevel"/>
     <w:tmpl w:val="23D8909E"/>
@@ -9955,7 +8974,7 @@
       </w:pPr>
     </w:lvl>
   </w:abstractNum>
-  <w:abstractNum w:abstractNumId="19" w15:restartNumberingAfterBreak="0">
+  <w:abstractNum w:abstractNumId="20" w15:restartNumberingAfterBreak="0">
     <w:nsid w:val="5C416AF1"/>
     <w:multiLevelType w:val="hybridMultilevel"/>
     <w:tmpl w:val="CD0AB6F2"/>
@@ -10067,7 +9086,7 @@
       </w:rPr>
     </w:lvl>
   </w:abstractNum>
-  <w:abstractNum w:abstractNumId="20" w15:restartNumberingAfterBreak="0">
+  <w:abstractNum w:abstractNumId="21" w15:restartNumberingAfterBreak="0">
     <w:nsid w:val="5C9054E2"/>
     <w:multiLevelType w:val="hybridMultilevel"/>
     <w:tmpl w:val="41221862"/>
@@ -10156,7 +9175,7 @@
       </w:pPr>
     </w:lvl>
   </w:abstractNum>
-  <w:abstractNum w:abstractNumId="21" w15:restartNumberingAfterBreak="0">
+  <w:abstractNum w:abstractNumId="22" w15:restartNumberingAfterBreak="0">
     <w:nsid w:val="60F96E99"/>
     <w:multiLevelType w:val="hybridMultilevel"/>
     <w:tmpl w:val="C0A40084"/>
@@ -10245,7 +9264,7 @@
       </w:pPr>
     </w:lvl>
   </w:abstractNum>
-  <w:abstractNum w:abstractNumId="22" w15:restartNumberingAfterBreak="0">
+  <w:abstractNum w:abstractNumId="23" w15:restartNumberingAfterBreak="0">
     <w:nsid w:val="629D7DD8"/>
     <w:multiLevelType w:val="hybridMultilevel"/>
     <w:tmpl w:val="538A5500"/>
@@ -10358,7 +9377,7 @@
       </w:rPr>
     </w:lvl>
   </w:abstractNum>
-  <w:abstractNum w:abstractNumId="23" w15:restartNumberingAfterBreak="0">
+  <w:abstractNum w:abstractNumId="24" w15:restartNumberingAfterBreak="0">
     <w:nsid w:val="63B73DCB"/>
     <w:multiLevelType w:val="hybridMultilevel"/>
     <w:tmpl w:val="70C6C83A"/>
@@ -10470,7 +9489,7 @@
       </w:rPr>
     </w:lvl>
   </w:abstractNum>
-  <w:abstractNum w:abstractNumId="24" w15:restartNumberingAfterBreak="0">
+  <w:abstractNum w:abstractNumId="25" w15:restartNumberingAfterBreak="0">
     <w:nsid w:val="6422414F"/>
     <w:multiLevelType w:val="hybridMultilevel"/>
     <w:tmpl w:val="667041EA"/>
@@ -10559,7 +9578,7 @@
       </w:pPr>
     </w:lvl>
   </w:abstractNum>
-  <w:abstractNum w:abstractNumId="25" w15:restartNumberingAfterBreak="0">
+  <w:abstractNum w:abstractNumId="26" w15:restartNumberingAfterBreak="0">
     <w:nsid w:val="67271D44"/>
     <w:multiLevelType w:val="hybridMultilevel"/>
     <w:tmpl w:val="551C9252"/>
@@ -10648,7 +9667,7 @@
       </w:pPr>
     </w:lvl>
   </w:abstractNum>
-  <w:abstractNum w:abstractNumId="26" w15:restartNumberingAfterBreak="0">
+  <w:abstractNum w:abstractNumId="27" w15:restartNumberingAfterBreak="0">
     <w:nsid w:val="67D6578A"/>
     <w:multiLevelType w:val="hybridMultilevel"/>
     <w:tmpl w:val="EE640D16"/>
@@ -10737,7 +9756,7 @@
       </w:pPr>
     </w:lvl>
   </w:abstractNum>
-  <w:abstractNum w:abstractNumId="27" w15:restartNumberingAfterBreak="0">
+  <w:abstractNum w:abstractNumId="28" w15:restartNumberingAfterBreak="0">
     <w:nsid w:val="68932351"/>
     <w:multiLevelType w:val="hybridMultilevel"/>
     <w:tmpl w:val="F8B4B71A"/>
@@ -10852,7 +9871,7 @@
       </w:rPr>
     </w:lvl>
   </w:abstractNum>
-  <w:abstractNum w:abstractNumId="28" w15:restartNumberingAfterBreak="0">
+  <w:abstractNum w:abstractNumId="29" w15:restartNumberingAfterBreak="0">
     <w:nsid w:val="70DF70C4"/>
     <w:multiLevelType w:val="hybridMultilevel"/>
     <w:tmpl w:val="A0C2BCFA"/>
@@ -10941,7 +9960,7 @@
       </w:pPr>
     </w:lvl>
   </w:abstractNum>
-  <w:abstractNum w:abstractNumId="29" w15:restartNumberingAfterBreak="0">
+  <w:abstractNum w:abstractNumId="30" w15:restartNumberingAfterBreak="0">
     <w:nsid w:val="73F00399"/>
     <w:multiLevelType w:val="hybridMultilevel"/>
     <w:tmpl w:val="8C18E526"/>
@@ -11054,7 +10073,7 @@
       </w:rPr>
     </w:lvl>
   </w:abstractNum>
-  <w:abstractNum w:abstractNumId="30" w15:restartNumberingAfterBreak="0">
+  <w:abstractNum w:abstractNumId="31" w15:restartNumberingAfterBreak="0">
     <w:nsid w:val="76921010"/>
     <w:multiLevelType w:val="hybridMultilevel"/>
     <w:tmpl w:val="774E685A"/>
@@ -11169,7 +10188,7 @@
       </w:rPr>
     </w:lvl>
   </w:abstractNum>
-  <w:abstractNum w:abstractNumId="31" w15:restartNumberingAfterBreak="0">
+  <w:abstractNum w:abstractNumId="32" w15:restartNumberingAfterBreak="0">
     <w:nsid w:val="770E2803"/>
     <w:multiLevelType w:val="hybridMultilevel"/>
     <w:tmpl w:val="030E71F0"/>
@@ -11282,7 +10301,7 @@
       </w:rPr>
     </w:lvl>
   </w:abstractNum>
-  <w:abstractNum w:abstractNumId="32" w15:restartNumberingAfterBreak="0">
+  <w:abstractNum w:abstractNumId="33" w15:restartNumberingAfterBreak="0">
     <w:nsid w:val="7A0C5E08"/>
     <w:multiLevelType w:val="hybridMultilevel"/>
     <w:tmpl w:val="3DE85C4E"/>
@@ -11395,7 +10414,7 @@
       </w:rPr>
     </w:lvl>
   </w:abstractNum>
-  <w:abstractNum w:abstractNumId="33" w15:restartNumberingAfterBreak="0">
+  <w:abstractNum w:abstractNumId="34" w15:restartNumberingAfterBreak="0">
     <w:nsid w:val="7FC861B9"/>
     <w:multiLevelType w:val="hybridMultilevel"/>
     <w:tmpl w:val="EC2CDBDC"/>
@@ -11485,76 +10504,76 @@
     </w:lvl>
   </w:abstractNum>
   <w:num w:numId="1" w16cid:durableId="2064712393">
-    <w:abstractNumId w:val="11"/>
+    <w:abstractNumId w:val="12"/>
   </w:num>
   <w:num w:numId="2" w16cid:durableId="982613840">
-    <w:abstractNumId w:val="28"/>
+    <w:abstractNumId w:val="29"/>
   </w:num>
   <w:num w:numId="3" w16cid:durableId="34696722">
     <w:abstractNumId w:val="4"/>
   </w:num>
   <w:num w:numId="4" w16cid:durableId="979724115">
-    <w:abstractNumId w:val="33"/>
+    <w:abstractNumId w:val="34"/>
   </w:num>
   <w:num w:numId="5" w16cid:durableId="516575690">
-    <w:abstractNumId w:val="15"/>
+    <w:abstractNumId w:val="16"/>
   </w:num>
   <w:num w:numId="6" w16cid:durableId="807745686">
     <w:abstractNumId w:val="1"/>
   </w:num>
   <w:num w:numId="7" w16cid:durableId="1520049316">
-    <w:abstractNumId w:val="32"/>
+    <w:abstractNumId w:val="33"/>
   </w:num>
   <w:num w:numId="8" w16cid:durableId="198973599">
     <w:abstractNumId w:val="8"/>
   </w:num>
   <w:num w:numId="9" w16cid:durableId="1177623024">
-    <w:abstractNumId w:val="26"/>
+    <w:abstractNumId w:val="27"/>
   </w:num>
   <w:num w:numId="10" w16cid:durableId="511070537">
-    <w:abstractNumId w:val="21"/>
+    <w:abstractNumId w:val="22"/>
   </w:num>
   <w:num w:numId="11" w16cid:durableId="784427824">
-    <w:abstractNumId w:val="25"/>
+    <w:abstractNumId w:val="26"/>
   </w:num>
   <w:num w:numId="12" w16cid:durableId="1457140122">
     <w:abstractNumId w:val="7"/>
   </w:num>
   <w:num w:numId="13" w16cid:durableId="1692686484">
-    <w:abstractNumId w:val="29"/>
+    <w:abstractNumId w:val="30"/>
   </w:num>
   <w:num w:numId="14" w16cid:durableId="1897155767">
-    <w:abstractNumId w:val="14"/>
+    <w:abstractNumId w:val="15"/>
   </w:num>
   <w:num w:numId="15" w16cid:durableId="370228397">
-    <w:abstractNumId w:val="10"/>
+    <w:abstractNumId w:val="11"/>
   </w:num>
   <w:num w:numId="16" w16cid:durableId="1930963845">
     <w:abstractNumId w:val="0"/>
   </w:num>
   <w:num w:numId="17" w16cid:durableId="1342272576">
-    <w:abstractNumId w:val="23"/>
+    <w:abstractNumId w:val="24"/>
   </w:num>
   <w:num w:numId="18" w16cid:durableId="182745335">
-    <w:abstractNumId w:val="9"/>
+    <w:abstractNumId w:val="10"/>
   </w:num>
   <w:num w:numId="19" w16cid:durableId="1896819236">
-    <w:abstractNumId w:val="19"/>
+    <w:abstractNumId w:val="20"/>
   </w:num>
   <w:num w:numId="20" w16cid:durableId="1344630814">
-    <w:abstractNumId w:val="13"/>
+    <w:abstractNumId w:val="14"/>
   </w:num>
   <w:num w:numId="21" w16cid:durableId="154348362">
     <w:abstractNumId w:val="6"/>
   </w:num>
   <w:num w:numId="22" w16cid:durableId="1093937543">
-    <w:abstractNumId w:val="24"/>
+    <w:abstractNumId w:val="25"/>
   </w:num>
   <w:num w:numId="23" w16cid:durableId="742989385">
-    <w:abstractNumId w:val="20"/>
+    <w:abstractNumId w:val="21"/>
   </w:num>
   <w:num w:numId="24" w16cid:durableId="1092820407">
-    <w:abstractNumId w:val="17"/>
+    <w:abstractNumId w:val="18"/>
   </w:num>
   <w:num w:numId="25" w16cid:durableId="1203713366">
     <w:abstractNumId w:val="5"/>
@@ -11563,28 +10582,31 @@
     <w:abstractNumId w:val="2"/>
   </w:num>
   <w:num w:numId="27" w16cid:durableId="1589270320">
-    <w:abstractNumId w:val="18"/>
+    <w:abstractNumId w:val="19"/>
   </w:num>
   <w:num w:numId="28" w16cid:durableId="1025403573">
-    <w:abstractNumId w:val="16"/>
+    <w:abstractNumId w:val="17"/>
   </w:num>
   <w:num w:numId="29" w16cid:durableId="21789852">
-    <w:abstractNumId w:val="27"/>
+    <w:abstractNumId w:val="28"/>
   </w:num>
   <w:num w:numId="30" w16cid:durableId="1454862240">
-    <w:abstractNumId w:val="22"/>
+    <w:abstractNumId w:val="23"/>
   </w:num>
   <w:num w:numId="31" w16cid:durableId="173737922">
-    <w:abstractNumId w:val="30"/>
+    <w:abstractNumId w:val="31"/>
   </w:num>
   <w:num w:numId="32" w16cid:durableId="1350176460">
-    <w:abstractNumId w:val="31"/>
+    <w:abstractNumId w:val="32"/>
   </w:num>
   <w:num w:numId="33" w16cid:durableId="1992562078">
-    <w:abstractNumId w:val="12"/>
+    <w:abstractNumId w:val="13"/>
   </w:num>
   <w:num w:numId="34" w16cid:durableId="906451187">
     <w:abstractNumId w:val="3"/>
+  </w:num>
+  <w:num w:numId="35" w16cid:durableId="1425036502">
+    <w:abstractNumId w:val="9"/>
   </w:num>
 </w:numbering>
 </file>
@@ -11981,9 +11003,10 @@
   <w:style w:type="paragraph" w:default="1" w:styleId="Normal">
     <w:name w:val="Normal"/>
     <w:qFormat/>
-    <w:rsid w:val="008F3D04"/>
+    <w:rsid w:val="00097B3F"/>
     <w:pPr>
-      <w:spacing w:after="120"/>
+      <w:spacing w:after="120" w:line="280" w:lineRule="atLeast"/>
+      <w:jc w:val="both"/>
     </w:pPr>
     <w:rPr>
       <w:rFonts w:ascii="Cambria" w:eastAsia="Times New Roman" w:hAnsi="Cambria"/>
@@ -13162,7 +12185,7 @@
     <b:MonthAccessed>December</b:MonthAccessed>
     <b:DayAccessed>11</b:DayAccessed>
     <b:URL>https://doi.org/10.1016/j.jid.2023.10.004</b:URL>
-    <b:RefOrder>3</b:RefOrder>
+    <b:RefOrder>2</b:RefOrder>
   </b:Source>
   <b:Source>
     <b:Tag>Mah24</b:Tag>
@@ -13187,7 +12210,7 @@
     <b:MonthAccessed>December</b:MonthAccessed>
     <b:DayAccessed>11</b:DayAccessed>
     <b:URL>https://doi.org/10.1038/s41598-024-59783-0</b:URL>
-    <b:RefOrder>4</b:RefOrder>
+    <b:RefOrder>1</b:RefOrder>
   </b:Source>
   <b:Source>
     <b:Tag>Shi24</b:Tag>
@@ -13212,7 +12235,7 @@
     <b:MonthAccessed>December</b:MonthAccessed>
     <b:DayAccessed>11</b:DayAccessed>
     <b:URL>https://doi.org/10.1016/j.jaad.2023.12.062</b:URL>
-    <b:RefOrder>1</b:RefOrder>
+    <b:RefOrder>3</b:RefOrder>
   </b:Source>
   <b:Source>
     <b:Tag>Sat25</b:Tag>
@@ -13237,7 +12260,7 @@
     <b:MonthAccessed>December</b:MonthAccessed>
     <b:DayAccessed>11</b:DayAccessed>
     <b:URL>https://doi.org/10.2196/67551</b:URL>
-    <b:RefOrder>2</b:RefOrder>
+    <b:RefOrder>4</b:RefOrder>
   </b:Source>
   <b:Source>
     <b:Tag>Cen25</b:Tag>
@@ -13298,7 +12321,7 @@
 </file>
 
 <file path=customXml/itemProps3.xml><?xml version="1.0" encoding="utf-8"?>
-<ds:datastoreItem xmlns:ds="http://schemas.openxmlformats.org/officeDocument/2006/customXml" ds:itemID="{450C9498-E5EB-43B5-8596-41731A25802E}">
+<ds:datastoreItem xmlns:ds="http://schemas.openxmlformats.org/officeDocument/2006/customXml" ds:itemID="{F0E44BB1-C071-45EF-BD0E-FEE1D61E3AE5}">
   <ds:schemaRefs>
     <ds:schemaRef ds:uri="http://schemas.openxmlformats.org/officeDocument/2006/bibliography"/>
   </ds:schemaRefs>

</xml_diff>

<commit_message>
Doc: Even more work!
</commit_message>
<xml_diff>
--- a/FInal-Grp-6.docx
+++ b/FInal-Grp-6.docx
@@ -1053,7 +1053,7 @@
         </w:rPr>
         <w:fldChar w:fldCharType="separate"/>
       </w:r>
-      <w:hyperlink w:anchor="_Toc227646561" w:history="1">
+      <w:hyperlink w:anchor="_Toc227649871" w:history="1">
         <w:r>
           <w:rPr>
             <w:rStyle w:val="Hyperlink"/>
@@ -1080,7 +1080,7 @@
             <w:noProof/>
             <w:webHidden/>
           </w:rPr>
-          <w:instrText xml:space="preserve"> PAGEREF _Toc227646561 \h </w:instrText>
+          <w:instrText xml:space="preserve"> PAGEREF _Toc227649871 \h </w:instrText>
         </w:r>
         <w:r>
           <w:rPr>
@@ -1100,7 +1100,7 @@
             <w:noProof/>
             <w:webHidden/>
           </w:rPr>
-          <w:t>4</w:t>
+          <w:t>5</w:t>
         </w:r>
         <w:r>
           <w:rPr>
@@ -1126,7 +1126,7 @@
           <w14:ligatures w14:val="standardContextual"/>
         </w:rPr>
       </w:pPr>
-      <w:hyperlink w:anchor="_Toc227646562" w:history="1">
+      <w:hyperlink w:anchor="_Toc227649872" w:history="1">
         <w:r>
           <w:rPr>
             <w:rStyle w:val="Hyperlink"/>
@@ -1170,7 +1170,7 @@
             <w:noProof/>
             <w:webHidden/>
           </w:rPr>
-          <w:instrText xml:space="preserve"> PAGEREF _Toc227646562 \h </w:instrText>
+          <w:instrText xml:space="preserve"> PAGEREF _Toc227649872 \h </w:instrText>
         </w:r>
         <w:r>
           <w:rPr>
@@ -1190,7 +1190,7 @@
             <w:noProof/>
             <w:webHidden/>
           </w:rPr>
-          <w:t>4</w:t>
+          <w:t>5</w:t>
         </w:r>
         <w:r>
           <w:rPr>
@@ -1216,7 +1216,7 @@
           <w14:ligatures w14:val="standardContextual"/>
         </w:rPr>
       </w:pPr>
-      <w:hyperlink w:anchor="_Toc227646563" w:history="1">
+      <w:hyperlink w:anchor="_Toc227649873" w:history="1">
         <w:r>
           <w:rPr>
             <w:rStyle w:val="Hyperlink"/>
@@ -1260,7 +1260,7 @@
             <w:noProof/>
             <w:webHidden/>
           </w:rPr>
-          <w:instrText xml:space="preserve"> PAGEREF _Toc227646563 \h </w:instrText>
+          <w:instrText xml:space="preserve"> PAGEREF _Toc227649873 \h </w:instrText>
         </w:r>
         <w:r>
           <w:rPr>
@@ -1280,7 +1280,7 @@
             <w:noProof/>
             <w:webHidden/>
           </w:rPr>
-          <w:t>4</w:t>
+          <w:t>5</w:t>
         </w:r>
         <w:r>
           <w:rPr>
@@ -1306,7 +1306,7 @@
           <w14:ligatures w14:val="standardContextual"/>
         </w:rPr>
       </w:pPr>
-      <w:hyperlink w:anchor="_Toc227646564" w:history="1">
+      <w:hyperlink w:anchor="_Toc227649874" w:history="1">
         <w:r>
           <w:rPr>
             <w:rStyle w:val="Hyperlink"/>
@@ -1350,7 +1350,7 @@
             <w:noProof/>
             <w:webHidden/>
           </w:rPr>
-          <w:instrText xml:space="preserve"> PAGEREF _Toc227646564 \h </w:instrText>
+          <w:instrText xml:space="preserve"> PAGEREF _Toc227649874 \h </w:instrText>
         </w:r>
         <w:r>
           <w:rPr>
@@ -1370,7 +1370,7 @@
             <w:noProof/>
             <w:webHidden/>
           </w:rPr>
-          <w:t>5</w:t>
+          <w:t>6</w:t>
         </w:r>
         <w:r>
           <w:rPr>
@@ -1395,13 +1395,13 @@
           <w14:ligatures w14:val="standardContextual"/>
         </w:rPr>
       </w:pPr>
-      <w:hyperlink w:anchor="_Toc227646565" w:history="1">
+      <w:hyperlink w:anchor="_Toc227649875" w:history="1">
         <w:r>
           <w:rPr>
             <w:rStyle w:val="Hyperlink"/>
             <w:noProof/>
           </w:rPr>
-          <w:t>Background Information</w:t>
+          <w:t>Background Research</w:t>
         </w:r>
         <w:r>
           <w:rPr>
@@ -1422,7 +1422,7 @@
             <w:noProof/>
             <w:webHidden/>
           </w:rPr>
-          <w:instrText xml:space="preserve"> PAGEREF _Toc227646565 \h </w:instrText>
+          <w:instrText xml:space="preserve"> PAGEREF _Toc227649875 \h </w:instrText>
         </w:r>
         <w:r>
           <w:rPr>
@@ -1442,7 +1442,7 @@
             <w:noProof/>
             <w:webHidden/>
           </w:rPr>
-          <w:t>6</w:t>
+          <w:t>7</w:t>
         </w:r>
         <w:r>
           <w:rPr>
@@ -1468,7 +1468,7 @@
           <w14:ligatures w14:val="standardContextual"/>
         </w:rPr>
       </w:pPr>
-      <w:hyperlink w:anchor="_Toc227646566" w:history="1">
+      <w:hyperlink w:anchor="_Toc227649876" w:history="1">
         <w:r>
           <w:rPr>
             <w:rStyle w:val="Hyperlink"/>
@@ -1512,7 +1512,7 @@
             <w:noProof/>
             <w:webHidden/>
           </w:rPr>
-          <w:instrText xml:space="preserve"> PAGEREF _Toc227646566 \h </w:instrText>
+          <w:instrText xml:space="preserve"> PAGEREF _Toc227649876 \h </w:instrText>
         </w:r>
         <w:r>
           <w:rPr>
@@ -1532,7 +1532,277 @@
             <w:noProof/>
             <w:webHidden/>
           </w:rPr>
-          <w:t>6</w:t>
+          <w:t>7</w:t>
+        </w:r>
+        <w:r>
+          <w:rPr>
+            <w:noProof/>
+            <w:webHidden/>
+          </w:rPr>
+          <w:fldChar w:fldCharType="end"/>
+        </w:r>
+      </w:hyperlink>
+    </w:p>
+    <w:p>
+      <w:pPr>
+        <w:pStyle w:val="TOC4"/>
+        <w:tabs>
+          <w:tab w:val="left" w:pos="1680"/>
+          <w:tab w:val="right" w:leader="dot" w:pos="9350"/>
+        </w:tabs>
+        <w:rPr>
+          <w:rFonts w:asciiTheme="minorHAnsi" w:eastAsiaTheme="minorEastAsia" w:hAnsiTheme="minorHAnsi" w:cstheme="minorBidi"/>
+          <w:noProof/>
+          <w:kern w:val="2"/>
+          <w:lang w:val="en-MY" w:eastAsia="zh-CN"/>
+          <w14:ligatures w14:val="standardContextual"/>
+        </w:rPr>
+      </w:pPr>
+      <w:hyperlink w:anchor="_Toc227649880" w:history="1">
+        <w:r>
+          <w:rPr>
+            <w:rStyle w:val="Hyperlink"/>
+            <w:noProof/>
+          </w:rPr>
+          <w:t>2.1.1</w:t>
+        </w:r>
+        <w:r>
+          <w:rPr>
+            <w:rFonts w:asciiTheme="minorHAnsi" w:eastAsiaTheme="minorEastAsia" w:hAnsiTheme="minorHAnsi" w:cstheme="minorBidi"/>
+            <w:noProof/>
+            <w:kern w:val="2"/>
+            <w:lang w:val="en-MY" w:eastAsia="zh-CN"/>
+            <w14:ligatures w14:val="standardContextual"/>
+          </w:rPr>
+          <w:tab/>
+        </w:r>
+        <w:r>
+          <w:rPr>
+            <w:rStyle w:val="Hyperlink"/>
+            <w:noProof/>
+          </w:rPr>
+          <w:t>DERM</w:t>
+        </w:r>
+        <w:r>
+          <w:rPr>
+            <w:noProof/>
+            <w:webHidden/>
+          </w:rPr>
+          <w:tab/>
+        </w:r>
+        <w:r>
+          <w:rPr>
+            <w:noProof/>
+            <w:webHidden/>
+          </w:rPr>
+          <w:fldChar w:fldCharType="begin"/>
+        </w:r>
+        <w:r>
+          <w:rPr>
+            <w:noProof/>
+            <w:webHidden/>
+          </w:rPr>
+          <w:instrText xml:space="preserve"> PAGEREF _Toc227649880 \h </w:instrText>
+        </w:r>
+        <w:r>
+          <w:rPr>
+            <w:noProof/>
+            <w:webHidden/>
+          </w:rPr>
+        </w:r>
+        <w:r>
+          <w:rPr>
+            <w:noProof/>
+            <w:webHidden/>
+          </w:rPr>
+          <w:fldChar w:fldCharType="separate"/>
+        </w:r>
+        <w:r>
+          <w:rPr>
+            <w:noProof/>
+            <w:webHidden/>
+          </w:rPr>
+          <w:t>7</w:t>
+        </w:r>
+        <w:r>
+          <w:rPr>
+            <w:noProof/>
+            <w:webHidden/>
+          </w:rPr>
+          <w:fldChar w:fldCharType="end"/>
+        </w:r>
+      </w:hyperlink>
+    </w:p>
+    <w:p>
+      <w:pPr>
+        <w:pStyle w:val="TOC4"/>
+        <w:tabs>
+          <w:tab w:val="left" w:pos="1680"/>
+          <w:tab w:val="right" w:leader="dot" w:pos="9350"/>
+        </w:tabs>
+        <w:rPr>
+          <w:rFonts w:asciiTheme="minorHAnsi" w:eastAsiaTheme="minorEastAsia" w:hAnsiTheme="minorHAnsi" w:cstheme="minorBidi"/>
+          <w:noProof/>
+          <w:kern w:val="2"/>
+          <w:lang w:val="en-MY" w:eastAsia="zh-CN"/>
+          <w14:ligatures w14:val="standardContextual"/>
+        </w:rPr>
+      </w:pPr>
+      <w:hyperlink w:anchor="_Toc227649881" w:history="1">
+        <w:r>
+          <w:rPr>
+            <w:rStyle w:val="Hyperlink"/>
+            <w:noProof/>
+          </w:rPr>
+          <w:t>2.1.2</w:t>
+        </w:r>
+        <w:r>
+          <w:rPr>
+            <w:rFonts w:asciiTheme="minorHAnsi" w:eastAsiaTheme="minorEastAsia" w:hAnsiTheme="minorHAnsi" w:cstheme="minorBidi"/>
+            <w:noProof/>
+            <w:kern w:val="2"/>
+            <w:lang w:val="en-MY" w:eastAsia="zh-CN"/>
+            <w14:ligatures w14:val="standardContextual"/>
+          </w:rPr>
+          <w:tab/>
+        </w:r>
+        <w:r>
+          <w:rPr>
+            <w:rStyle w:val="Hyperlink"/>
+            <w:noProof/>
+          </w:rPr>
+          <w:t>Model Dermatol</w:t>
+        </w:r>
+        <w:r>
+          <w:rPr>
+            <w:noProof/>
+            <w:webHidden/>
+          </w:rPr>
+          <w:tab/>
+        </w:r>
+        <w:r>
+          <w:rPr>
+            <w:noProof/>
+            <w:webHidden/>
+          </w:rPr>
+          <w:fldChar w:fldCharType="begin"/>
+        </w:r>
+        <w:r>
+          <w:rPr>
+            <w:noProof/>
+            <w:webHidden/>
+          </w:rPr>
+          <w:instrText xml:space="preserve"> PAGEREF _Toc227649881 \h </w:instrText>
+        </w:r>
+        <w:r>
+          <w:rPr>
+            <w:noProof/>
+            <w:webHidden/>
+          </w:rPr>
+        </w:r>
+        <w:r>
+          <w:rPr>
+            <w:noProof/>
+            <w:webHidden/>
+          </w:rPr>
+          <w:fldChar w:fldCharType="separate"/>
+        </w:r>
+        <w:r>
+          <w:rPr>
+            <w:noProof/>
+            <w:webHidden/>
+          </w:rPr>
+          <w:t>7</w:t>
+        </w:r>
+        <w:r>
+          <w:rPr>
+            <w:noProof/>
+            <w:webHidden/>
+          </w:rPr>
+          <w:fldChar w:fldCharType="end"/>
+        </w:r>
+      </w:hyperlink>
+    </w:p>
+    <w:p>
+      <w:pPr>
+        <w:pStyle w:val="TOC4"/>
+        <w:tabs>
+          <w:tab w:val="left" w:pos="1680"/>
+          <w:tab w:val="right" w:leader="dot" w:pos="9350"/>
+        </w:tabs>
+        <w:rPr>
+          <w:rFonts w:asciiTheme="minorHAnsi" w:eastAsiaTheme="minorEastAsia" w:hAnsiTheme="minorHAnsi" w:cstheme="minorBidi"/>
+          <w:noProof/>
+          <w:kern w:val="2"/>
+          <w:lang w:val="en-MY" w:eastAsia="zh-CN"/>
+          <w14:ligatures w14:val="standardContextual"/>
+        </w:rPr>
+      </w:pPr>
+      <w:hyperlink w:anchor="_Toc227649882" w:history="1">
+        <w:r>
+          <w:rPr>
+            <w:rStyle w:val="Hyperlink"/>
+            <w:noProof/>
+          </w:rPr>
+          <w:t>2.1.3</w:t>
+        </w:r>
+        <w:r>
+          <w:rPr>
+            <w:rFonts w:asciiTheme="minorHAnsi" w:eastAsiaTheme="minorEastAsia" w:hAnsiTheme="minorHAnsi" w:cstheme="minorBidi"/>
+            <w:noProof/>
+            <w:kern w:val="2"/>
+            <w:lang w:val="en-MY" w:eastAsia="zh-CN"/>
+            <w14:ligatures w14:val="standardContextual"/>
+          </w:rPr>
+          <w:tab/>
+        </w:r>
+        <w:r>
+          <w:rPr>
+            <w:rStyle w:val="Hyperlink"/>
+            <w:noProof/>
+          </w:rPr>
+          <w:t>SkinVision</w:t>
+        </w:r>
+        <w:r>
+          <w:rPr>
+            <w:noProof/>
+            <w:webHidden/>
+          </w:rPr>
+          <w:tab/>
+        </w:r>
+        <w:r>
+          <w:rPr>
+            <w:noProof/>
+            <w:webHidden/>
+          </w:rPr>
+          <w:fldChar w:fldCharType="begin"/>
+        </w:r>
+        <w:r>
+          <w:rPr>
+            <w:noProof/>
+            <w:webHidden/>
+          </w:rPr>
+          <w:instrText xml:space="preserve"> PAGEREF _Toc227649882 \h </w:instrText>
+        </w:r>
+        <w:r>
+          <w:rPr>
+            <w:noProof/>
+            <w:webHidden/>
+          </w:rPr>
+        </w:r>
+        <w:r>
+          <w:rPr>
+            <w:noProof/>
+            <w:webHidden/>
+          </w:rPr>
+          <w:fldChar w:fldCharType="separate"/>
+        </w:r>
+        <w:r>
+          <w:rPr>
+            <w:noProof/>
+            <w:webHidden/>
+          </w:rPr>
+          <w:t>8</w:t>
         </w:r>
         <w:r>
           <w:rPr>
@@ -1558,7 +1828,7 @@
           <w14:ligatures w14:val="standardContextual"/>
         </w:rPr>
       </w:pPr>
-      <w:hyperlink w:anchor="_Toc227646567" w:history="1">
+      <w:hyperlink w:anchor="_Toc227649883" w:history="1">
         <w:r>
           <w:rPr>
             <w:rStyle w:val="Hyperlink"/>
@@ -1602,7 +1872,7 @@
             <w:noProof/>
             <w:webHidden/>
           </w:rPr>
-          <w:instrText xml:space="preserve"> PAGEREF _Toc227646567 \h </w:instrText>
+          <w:instrText xml:space="preserve"> PAGEREF _Toc227649883 \h </w:instrText>
         </w:r>
         <w:r>
           <w:rPr>
@@ -1622,7 +1892,7 @@
             <w:noProof/>
             <w:webHidden/>
           </w:rPr>
-          <w:t>6</w:t>
+          <w:t>8</w:t>
         </w:r>
         <w:r>
           <w:rPr>
@@ -1647,7 +1917,7 @@
           <w14:ligatures w14:val="standardContextual"/>
         </w:rPr>
       </w:pPr>
-      <w:hyperlink w:anchor="_Toc227646568" w:history="1">
+      <w:hyperlink w:anchor="_Toc227649884" w:history="1">
         <w:r>
           <w:rPr>
             <w:rStyle w:val="Hyperlink"/>
@@ -1674,7 +1944,7 @@
             <w:noProof/>
             <w:webHidden/>
           </w:rPr>
-          <w:instrText xml:space="preserve"> PAGEREF _Toc227646568 \h </w:instrText>
+          <w:instrText xml:space="preserve"> PAGEREF _Toc227649884 \h </w:instrText>
         </w:r>
         <w:r>
           <w:rPr>
@@ -1694,7 +1964,7 @@
             <w:noProof/>
             <w:webHidden/>
           </w:rPr>
-          <w:t>9</w:t>
+          <w:t>11</w:t>
         </w:r>
         <w:r>
           <w:rPr>
@@ -1720,7 +1990,7 @@
           <w14:ligatures w14:val="standardContextual"/>
         </w:rPr>
       </w:pPr>
-      <w:hyperlink w:anchor="_Toc227646569" w:history="1">
+      <w:hyperlink w:anchor="_Toc227649885" w:history="1">
         <w:r>
           <w:rPr>
             <w:rStyle w:val="Hyperlink"/>
@@ -1764,7 +2034,7 @@
             <w:noProof/>
             <w:webHidden/>
           </w:rPr>
-          <w:instrText xml:space="preserve"> PAGEREF _Toc227646569 \h </w:instrText>
+          <w:instrText xml:space="preserve"> PAGEREF _Toc227649885 \h </w:instrText>
         </w:r>
         <w:r>
           <w:rPr>
@@ -1784,7 +2054,7 @@
             <w:noProof/>
             <w:webHidden/>
           </w:rPr>
-          <w:t>9</w:t>
+          <w:t>11</w:t>
         </w:r>
         <w:r>
           <w:rPr>
@@ -1810,7 +2080,7 @@
           <w14:ligatures w14:val="standardContextual"/>
         </w:rPr>
       </w:pPr>
-      <w:hyperlink w:anchor="_Toc227646570" w:history="1">
+      <w:hyperlink w:anchor="_Toc227649886" w:history="1">
         <w:r>
           <w:rPr>
             <w:rStyle w:val="Hyperlink"/>
@@ -1854,7 +2124,7 @@
             <w:noProof/>
             <w:webHidden/>
           </w:rPr>
-          <w:instrText xml:space="preserve"> PAGEREF _Toc227646570 \h </w:instrText>
+          <w:instrText xml:space="preserve"> PAGEREF _Toc227649886 \h </w:instrText>
         </w:r>
         <w:r>
           <w:rPr>
@@ -1874,7 +2144,7 @@
             <w:noProof/>
             <w:webHidden/>
           </w:rPr>
-          <w:t>10</w:t>
+          <w:t>12</w:t>
         </w:r>
         <w:r>
           <w:rPr>
@@ -1900,7 +2170,7 @@
           <w14:ligatures w14:val="standardContextual"/>
         </w:rPr>
       </w:pPr>
-      <w:hyperlink w:anchor="_Toc227646571" w:history="1">
+      <w:hyperlink w:anchor="_Toc227649887" w:history="1">
         <w:r>
           <w:rPr>
             <w:rStyle w:val="Hyperlink"/>
@@ -1944,7 +2214,7 @@
             <w:noProof/>
             <w:webHidden/>
           </w:rPr>
-          <w:instrText xml:space="preserve"> PAGEREF _Toc227646571 \h </w:instrText>
+          <w:instrText xml:space="preserve"> PAGEREF _Toc227649887 \h </w:instrText>
         </w:r>
         <w:r>
           <w:rPr>
@@ -1964,7 +2234,7 @@
             <w:noProof/>
             <w:webHidden/>
           </w:rPr>
-          <w:t>10</w:t>
+          <w:t>12</w:t>
         </w:r>
         <w:r>
           <w:rPr>
@@ -1990,7 +2260,7 @@
           <w14:ligatures w14:val="standardContextual"/>
         </w:rPr>
       </w:pPr>
-      <w:hyperlink w:anchor="_Toc227646572" w:history="1">
+      <w:hyperlink w:anchor="_Toc227649888" w:history="1">
         <w:r>
           <w:rPr>
             <w:rStyle w:val="Hyperlink"/>
@@ -2034,7 +2304,7 @@
             <w:noProof/>
             <w:webHidden/>
           </w:rPr>
-          <w:instrText xml:space="preserve"> PAGEREF _Toc227646572 \h </w:instrText>
+          <w:instrText xml:space="preserve"> PAGEREF _Toc227649888 \h </w:instrText>
         </w:r>
         <w:r>
           <w:rPr>
@@ -2054,7 +2324,7 @@
             <w:noProof/>
             <w:webHidden/>
           </w:rPr>
-          <w:t>10</w:t>
+          <w:t>12</w:t>
         </w:r>
         <w:r>
           <w:rPr>
@@ -2079,7 +2349,7 @@
           <w14:ligatures w14:val="standardContextual"/>
         </w:rPr>
       </w:pPr>
-      <w:hyperlink w:anchor="_Toc227646573" w:history="1">
+      <w:hyperlink w:anchor="_Toc227649889" w:history="1">
         <w:r>
           <w:rPr>
             <w:rStyle w:val="Hyperlink"/>
@@ -2106,7 +2376,7 @@
             <w:noProof/>
             <w:webHidden/>
           </w:rPr>
-          <w:instrText xml:space="preserve"> PAGEREF _Toc227646573 \h </w:instrText>
+          <w:instrText xml:space="preserve"> PAGEREF _Toc227649889 \h </w:instrText>
         </w:r>
         <w:r>
           <w:rPr>
@@ -2126,7 +2396,7 @@
             <w:noProof/>
             <w:webHidden/>
           </w:rPr>
-          <w:t>11</w:t>
+          <w:t>13</w:t>
         </w:r>
         <w:r>
           <w:rPr>
@@ -2152,7 +2422,7 @@
           <w14:ligatures w14:val="standardContextual"/>
         </w:rPr>
       </w:pPr>
-      <w:hyperlink w:anchor="_Toc227646574" w:history="1">
+      <w:hyperlink w:anchor="_Toc227649890" w:history="1">
         <w:r>
           <w:rPr>
             <w:rStyle w:val="Hyperlink"/>
@@ -2196,7 +2466,7 @@
             <w:noProof/>
             <w:webHidden/>
           </w:rPr>
-          <w:instrText xml:space="preserve"> PAGEREF _Toc227646574 \h </w:instrText>
+          <w:instrText xml:space="preserve"> PAGEREF _Toc227649890 \h </w:instrText>
         </w:r>
         <w:r>
           <w:rPr>
@@ -2216,7 +2486,187 @@
             <w:noProof/>
             <w:webHidden/>
           </w:rPr>
-          <w:t>11</w:t>
+          <w:t>13</w:t>
+        </w:r>
+        <w:r>
+          <w:rPr>
+            <w:noProof/>
+            <w:webHidden/>
+          </w:rPr>
+          <w:fldChar w:fldCharType="end"/>
+        </w:r>
+      </w:hyperlink>
+    </w:p>
+    <w:p>
+      <w:pPr>
+        <w:pStyle w:val="TOC4"/>
+        <w:tabs>
+          <w:tab w:val="left" w:pos="1680"/>
+          <w:tab w:val="right" w:leader="dot" w:pos="9350"/>
+        </w:tabs>
+        <w:rPr>
+          <w:rFonts w:asciiTheme="minorHAnsi" w:eastAsiaTheme="minorEastAsia" w:hAnsiTheme="minorHAnsi" w:cstheme="minorBidi"/>
+          <w:noProof/>
+          <w:kern w:val="2"/>
+          <w:lang w:val="en-MY" w:eastAsia="zh-CN"/>
+          <w14:ligatures w14:val="standardContextual"/>
+        </w:rPr>
+      </w:pPr>
+      <w:hyperlink w:anchor="_Toc227649891" w:history="1">
+        <w:r>
+          <w:rPr>
+            <w:rStyle w:val="Hyperlink"/>
+            <w:noProof/>
+          </w:rPr>
+          <w:t xml:space="preserve">4.1.1. </w:t>
+        </w:r>
+        <w:r>
+          <w:rPr>
+            <w:rFonts w:asciiTheme="minorHAnsi" w:eastAsiaTheme="minorEastAsia" w:hAnsiTheme="minorHAnsi" w:cstheme="minorBidi"/>
+            <w:noProof/>
+            <w:kern w:val="2"/>
+            <w:lang w:val="en-MY" w:eastAsia="zh-CN"/>
+            <w14:ligatures w14:val="standardContextual"/>
+          </w:rPr>
+          <w:tab/>
+        </w:r>
+        <w:r>
+          <w:rPr>
+            <w:rStyle w:val="Hyperlink"/>
+            <w:noProof/>
+          </w:rPr>
+          <w:t>Dart</w:t>
+        </w:r>
+        <w:r>
+          <w:rPr>
+            <w:noProof/>
+            <w:webHidden/>
+          </w:rPr>
+          <w:tab/>
+        </w:r>
+        <w:r>
+          <w:rPr>
+            <w:noProof/>
+            <w:webHidden/>
+          </w:rPr>
+          <w:fldChar w:fldCharType="begin"/>
+        </w:r>
+        <w:r>
+          <w:rPr>
+            <w:noProof/>
+            <w:webHidden/>
+          </w:rPr>
+          <w:instrText xml:space="preserve"> PAGEREF _Toc227649891 \h </w:instrText>
+        </w:r>
+        <w:r>
+          <w:rPr>
+            <w:noProof/>
+            <w:webHidden/>
+          </w:rPr>
+        </w:r>
+        <w:r>
+          <w:rPr>
+            <w:noProof/>
+            <w:webHidden/>
+          </w:rPr>
+          <w:fldChar w:fldCharType="separate"/>
+        </w:r>
+        <w:r>
+          <w:rPr>
+            <w:noProof/>
+            <w:webHidden/>
+          </w:rPr>
+          <w:t>13</w:t>
+        </w:r>
+        <w:r>
+          <w:rPr>
+            <w:noProof/>
+            <w:webHidden/>
+          </w:rPr>
+          <w:fldChar w:fldCharType="end"/>
+        </w:r>
+      </w:hyperlink>
+    </w:p>
+    <w:p>
+      <w:pPr>
+        <w:pStyle w:val="TOC4"/>
+        <w:tabs>
+          <w:tab w:val="left" w:pos="1680"/>
+          <w:tab w:val="right" w:leader="dot" w:pos="9350"/>
+        </w:tabs>
+        <w:rPr>
+          <w:rFonts w:asciiTheme="minorHAnsi" w:eastAsiaTheme="minorEastAsia" w:hAnsiTheme="minorHAnsi" w:cstheme="minorBidi"/>
+          <w:noProof/>
+          <w:kern w:val="2"/>
+          <w:lang w:val="en-MY" w:eastAsia="zh-CN"/>
+          <w14:ligatures w14:val="standardContextual"/>
+        </w:rPr>
+      </w:pPr>
+      <w:hyperlink w:anchor="_Toc227649892" w:history="1">
+        <w:r>
+          <w:rPr>
+            <w:rStyle w:val="Hyperlink"/>
+            <w:noProof/>
+          </w:rPr>
+          <w:t xml:space="preserve">4.1.2. </w:t>
+        </w:r>
+        <w:r>
+          <w:rPr>
+            <w:rFonts w:asciiTheme="minorHAnsi" w:eastAsiaTheme="minorEastAsia" w:hAnsiTheme="minorHAnsi" w:cstheme="minorBidi"/>
+            <w:noProof/>
+            <w:kern w:val="2"/>
+            <w:lang w:val="en-MY" w:eastAsia="zh-CN"/>
+            <w14:ligatures w14:val="standardContextual"/>
+          </w:rPr>
+          <w:tab/>
+        </w:r>
+        <w:r>
+          <w:rPr>
+            <w:rStyle w:val="Hyperlink"/>
+            <w:noProof/>
+          </w:rPr>
+          <w:t>Python</w:t>
+        </w:r>
+        <w:r>
+          <w:rPr>
+            <w:noProof/>
+            <w:webHidden/>
+          </w:rPr>
+          <w:tab/>
+        </w:r>
+        <w:r>
+          <w:rPr>
+            <w:noProof/>
+            <w:webHidden/>
+          </w:rPr>
+          <w:fldChar w:fldCharType="begin"/>
+        </w:r>
+        <w:r>
+          <w:rPr>
+            <w:noProof/>
+            <w:webHidden/>
+          </w:rPr>
+          <w:instrText xml:space="preserve"> PAGEREF _Toc227649892 \h </w:instrText>
+        </w:r>
+        <w:r>
+          <w:rPr>
+            <w:noProof/>
+            <w:webHidden/>
+          </w:rPr>
+        </w:r>
+        <w:r>
+          <w:rPr>
+            <w:noProof/>
+            <w:webHidden/>
+          </w:rPr>
+          <w:fldChar w:fldCharType="separate"/>
+        </w:r>
+        <w:r>
+          <w:rPr>
+            <w:noProof/>
+            <w:webHidden/>
+          </w:rPr>
+          <w:t>13</w:t>
         </w:r>
         <w:r>
           <w:rPr>
@@ -2242,7 +2692,7 @@
           <w14:ligatures w14:val="standardContextual"/>
         </w:rPr>
       </w:pPr>
-      <w:hyperlink w:anchor="_Toc227646575" w:history="1">
+      <w:hyperlink w:anchor="_Toc227649893" w:history="1">
         <w:r>
           <w:rPr>
             <w:rStyle w:val="Hyperlink"/>
@@ -2265,7 +2715,7 @@
             <w:rStyle w:val="Hyperlink"/>
             <w:noProof/>
           </w:rPr>
-          <w:t>Applications and Services</w:t>
+          <w:t>Coding Languages</w:t>
         </w:r>
         <w:r>
           <w:rPr>
@@ -2286,7 +2736,7 @@
             <w:noProof/>
             <w:webHidden/>
           </w:rPr>
-          <w:instrText xml:space="preserve"> PAGEREF _Toc227646575 \h </w:instrText>
+          <w:instrText xml:space="preserve"> PAGEREF _Toc227649893 \h </w:instrText>
         </w:r>
         <w:r>
           <w:rPr>
@@ -2306,7 +2756,277 @@
             <w:noProof/>
             <w:webHidden/>
           </w:rPr>
-          <w:t>11</w:t>
+          <w:t>13</w:t>
+        </w:r>
+        <w:r>
+          <w:rPr>
+            <w:noProof/>
+            <w:webHidden/>
+          </w:rPr>
+          <w:fldChar w:fldCharType="end"/>
+        </w:r>
+      </w:hyperlink>
+    </w:p>
+    <w:p>
+      <w:pPr>
+        <w:pStyle w:val="TOC4"/>
+        <w:tabs>
+          <w:tab w:val="left" w:pos="1680"/>
+          <w:tab w:val="right" w:leader="dot" w:pos="9350"/>
+        </w:tabs>
+        <w:rPr>
+          <w:rFonts w:asciiTheme="minorHAnsi" w:eastAsiaTheme="minorEastAsia" w:hAnsiTheme="minorHAnsi" w:cstheme="minorBidi"/>
+          <w:noProof/>
+          <w:kern w:val="2"/>
+          <w:lang w:val="en-MY" w:eastAsia="zh-CN"/>
+          <w14:ligatures w14:val="standardContextual"/>
+        </w:rPr>
+      </w:pPr>
+      <w:hyperlink w:anchor="_Toc227649894" w:history="1">
+        <w:r>
+          <w:rPr>
+            <w:rStyle w:val="Hyperlink"/>
+            <w:noProof/>
+          </w:rPr>
+          <w:t xml:space="preserve">4.2.1. </w:t>
+        </w:r>
+        <w:r>
+          <w:rPr>
+            <w:rFonts w:asciiTheme="minorHAnsi" w:eastAsiaTheme="minorEastAsia" w:hAnsiTheme="minorHAnsi" w:cstheme="minorBidi"/>
+            <w:noProof/>
+            <w:kern w:val="2"/>
+            <w:lang w:val="en-MY" w:eastAsia="zh-CN"/>
+            <w14:ligatures w14:val="standardContextual"/>
+          </w:rPr>
+          <w:tab/>
+        </w:r>
+        <w:r>
+          <w:rPr>
+            <w:rStyle w:val="Hyperlink"/>
+            <w:noProof/>
+          </w:rPr>
+          <w:t>Firebase</w:t>
+        </w:r>
+        <w:r>
+          <w:rPr>
+            <w:noProof/>
+            <w:webHidden/>
+          </w:rPr>
+          <w:tab/>
+        </w:r>
+        <w:r>
+          <w:rPr>
+            <w:noProof/>
+            <w:webHidden/>
+          </w:rPr>
+          <w:fldChar w:fldCharType="begin"/>
+        </w:r>
+        <w:r>
+          <w:rPr>
+            <w:noProof/>
+            <w:webHidden/>
+          </w:rPr>
+          <w:instrText xml:space="preserve"> PAGEREF _Toc227649894 \h </w:instrText>
+        </w:r>
+        <w:r>
+          <w:rPr>
+            <w:noProof/>
+            <w:webHidden/>
+          </w:rPr>
+        </w:r>
+        <w:r>
+          <w:rPr>
+            <w:noProof/>
+            <w:webHidden/>
+          </w:rPr>
+          <w:fldChar w:fldCharType="separate"/>
+        </w:r>
+        <w:r>
+          <w:rPr>
+            <w:noProof/>
+            <w:webHidden/>
+          </w:rPr>
+          <w:t>13</w:t>
+        </w:r>
+        <w:r>
+          <w:rPr>
+            <w:noProof/>
+            <w:webHidden/>
+          </w:rPr>
+          <w:fldChar w:fldCharType="end"/>
+        </w:r>
+      </w:hyperlink>
+    </w:p>
+    <w:p>
+      <w:pPr>
+        <w:pStyle w:val="TOC4"/>
+        <w:tabs>
+          <w:tab w:val="left" w:pos="1680"/>
+          <w:tab w:val="right" w:leader="dot" w:pos="9350"/>
+        </w:tabs>
+        <w:rPr>
+          <w:rFonts w:asciiTheme="minorHAnsi" w:eastAsiaTheme="minorEastAsia" w:hAnsiTheme="minorHAnsi" w:cstheme="minorBidi"/>
+          <w:noProof/>
+          <w:kern w:val="2"/>
+          <w:lang w:val="en-MY" w:eastAsia="zh-CN"/>
+          <w14:ligatures w14:val="standardContextual"/>
+        </w:rPr>
+      </w:pPr>
+      <w:hyperlink w:anchor="_Toc227649895" w:history="1">
+        <w:r>
+          <w:rPr>
+            <w:rStyle w:val="Hyperlink"/>
+            <w:noProof/>
+          </w:rPr>
+          <w:t xml:space="preserve">4.2.2. </w:t>
+        </w:r>
+        <w:r>
+          <w:rPr>
+            <w:rFonts w:asciiTheme="minorHAnsi" w:eastAsiaTheme="minorEastAsia" w:hAnsiTheme="minorHAnsi" w:cstheme="minorBidi"/>
+            <w:noProof/>
+            <w:kern w:val="2"/>
+            <w:lang w:val="en-MY" w:eastAsia="zh-CN"/>
+            <w14:ligatures w14:val="standardContextual"/>
+          </w:rPr>
+          <w:tab/>
+        </w:r>
+        <w:r>
+          <w:rPr>
+            <w:rStyle w:val="Hyperlink"/>
+            <w:noProof/>
+          </w:rPr>
+          <w:t>PythonAnywhere</w:t>
+        </w:r>
+        <w:r>
+          <w:rPr>
+            <w:noProof/>
+            <w:webHidden/>
+          </w:rPr>
+          <w:tab/>
+        </w:r>
+        <w:r>
+          <w:rPr>
+            <w:noProof/>
+            <w:webHidden/>
+          </w:rPr>
+          <w:fldChar w:fldCharType="begin"/>
+        </w:r>
+        <w:r>
+          <w:rPr>
+            <w:noProof/>
+            <w:webHidden/>
+          </w:rPr>
+          <w:instrText xml:space="preserve"> PAGEREF _Toc227649895 \h </w:instrText>
+        </w:r>
+        <w:r>
+          <w:rPr>
+            <w:noProof/>
+            <w:webHidden/>
+          </w:rPr>
+        </w:r>
+        <w:r>
+          <w:rPr>
+            <w:noProof/>
+            <w:webHidden/>
+          </w:rPr>
+          <w:fldChar w:fldCharType="separate"/>
+        </w:r>
+        <w:r>
+          <w:rPr>
+            <w:noProof/>
+            <w:webHidden/>
+          </w:rPr>
+          <w:t>13</w:t>
+        </w:r>
+        <w:r>
+          <w:rPr>
+            <w:noProof/>
+            <w:webHidden/>
+          </w:rPr>
+          <w:fldChar w:fldCharType="end"/>
+        </w:r>
+      </w:hyperlink>
+    </w:p>
+    <w:p>
+      <w:pPr>
+        <w:pStyle w:val="TOC4"/>
+        <w:tabs>
+          <w:tab w:val="left" w:pos="1680"/>
+          <w:tab w:val="right" w:leader="dot" w:pos="9350"/>
+        </w:tabs>
+        <w:rPr>
+          <w:rFonts w:asciiTheme="minorHAnsi" w:eastAsiaTheme="minorEastAsia" w:hAnsiTheme="minorHAnsi" w:cstheme="minorBidi"/>
+          <w:noProof/>
+          <w:kern w:val="2"/>
+          <w:lang w:val="en-MY" w:eastAsia="zh-CN"/>
+          <w14:ligatures w14:val="standardContextual"/>
+        </w:rPr>
+      </w:pPr>
+      <w:hyperlink w:anchor="_Toc227649896" w:history="1">
+        <w:r>
+          <w:rPr>
+            <w:rStyle w:val="Hyperlink"/>
+            <w:noProof/>
+          </w:rPr>
+          <w:t xml:space="preserve">4.2.3. </w:t>
+        </w:r>
+        <w:r>
+          <w:rPr>
+            <w:rFonts w:asciiTheme="minorHAnsi" w:eastAsiaTheme="minorEastAsia" w:hAnsiTheme="minorHAnsi" w:cstheme="minorBidi"/>
+            <w:noProof/>
+            <w:kern w:val="2"/>
+            <w:lang w:val="en-MY" w:eastAsia="zh-CN"/>
+            <w14:ligatures w14:val="standardContextual"/>
+          </w:rPr>
+          <w:tab/>
+        </w:r>
+        <w:r>
+          <w:rPr>
+            <w:rStyle w:val="Hyperlink"/>
+            <w:noProof/>
+          </w:rPr>
+          <w:t>GitHub</w:t>
+        </w:r>
+        <w:r>
+          <w:rPr>
+            <w:noProof/>
+            <w:webHidden/>
+          </w:rPr>
+          <w:tab/>
+        </w:r>
+        <w:r>
+          <w:rPr>
+            <w:noProof/>
+            <w:webHidden/>
+          </w:rPr>
+          <w:fldChar w:fldCharType="begin"/>
+        </w:r>
+        <w:r>
+          <w:rPr>
+            <w:noProof/>
+            <w:webHidden/>
+          </w:rPr>
+          <w:instrText xml:space="preserve"> PAGEREF _Toc227649896 \h </w:instrText>
+        </w:r>
+        <w:r>
+          <w:rPr>
+            <w:noProof/>
+            <w:webHidden/>
+          </w:rPr>
+        </w:r>
+        <w:r>
+          <w:rPr>
+            <w:noProof/>
+            <w:webHidden/>
+          </w:rPr>
+          <w:fldChar w:fldCharType="separate"/>
+        </w:r>
+        <w:r>
+          <w:rPr>
+            <w:noProof/>
+            <w:webHidden/>
+          </w:rPr>
+          <w:t>14</w:t>
         </w:r>
         <w:r>
           <w:rPr>
@@ -2332,7 +3052,7 @@
           <w14:ligatures w14:val="standardContextual"/>
         </w:rPr>
       </w:pPr>
-      <w:hyperlink w:anchor="_Toc227646576" w:history="1">
+      <w:hyperlink w:anchor="_Toc227649897" w:history="1">
         <w:r>
           <w:rPr>
             <w:rStyle w:val="Hyperlink"/>
@@ -2376,7 +3096,7 @@
             <w:noProof/>
             <w:webHidden/>
           </w:rPr>
-          <w:instrText xml:space="preserve"> PAGEREF _Toc227646576 \h </w:instrText>
+          <w:instrText xml:space="preserve"> PAGEREF _Toc227649897 \h </w:instrText>
         </w:r>
         <w:r>
           <w:rPr>
@@ -2396,7 +3116,7 @@
             <w:noProof/>
             <w:webHidden/>
           </w:rPr>
-          <w:t>11</w:t>
+          <w:t>14</w:t>
         </w:r>
         <w:r>
           <w:rPr>
@@ -2421,7 +3141,7 @@
           <w14:ligatures w14:val="standardContextual"/>
         </w:rPr>
       </w:pPr>
-      <w:hyperlink w:anchor="_Toc227646577" w:history="1">
+      <w:hyperlink w:anchor="_Toc227649898" w:history="1">
         <w:r>
           <w:rPr>
             <w:rStyle w:val="Hyperlink"/>
@@ -2448,7 +3168,7 @@
             <w:noProof/>
             <w:webHidden/>
           </w:rPr>
-          <w:instrText xml:space="preserve"> PAGEREF _Toc227646577 \h </w:instrText>
+          <w:instrText xml:space="preserve"> PAGEREF _Toc227649898 \h </w:instrText>
         </w:r>
         <w:r>
           <w:rPr>
@@ -2468,7 +3188,7 @@
             <w:noProof/>
             <w:webHidden/>
           </w:rPr>
-          <w:t>13</w:t>
+          <w:t>16</w:t>
         </w:r>
         <w:r>
           <w:rPr>
@@ -2494,7 +3214,7 @@
           <w14:ligatures w14:val="standardContextual"/>
         </w:rPr>
       </w:pPr>
-      <w:hyperlink w:anchor="_Toc227646578" w:history="1">
+      <w:hyperlink w:anchor="_Toc227649899" w:history="1">
         <w:r>
           <w:rPr>
             <w:rStyle w:val="Hyperlink"/>
@@ -2538,7 +3258,7 @@
             <w:noProof/>
             <w:webHidden/>
           </w:rPr>
-          <w:instrText xml:space="preserve"> PAGEREF _Toc227646578 \h </w:instrText>
+          <w:instrText xml:space="preserve"> PAGEREF _Toc227649899 \h </w:instrText>
         </w:r>
         <w:r>
           <w:rPr>
@@ -2558,7 +3278,7 @@
             <w:noProof/>
             <w:webHidden/>
           </w:rPr>
-          <w:t>13</w:t>
+          <w:t>16</w:t>
         </w:r>
         <w:r>
           <w:rPr>
@@ -2584,7 +3304,7 @@
           <w14:ligatures w14:val="standardContextual"/>
         </w:rPr>
       </w:pPr>
-      <w:hyperlink w:anchor="_Toc227646579" w:history="1">
+      <w:hyperlink w:anchor="_Toc227649900" w:history="1">
         <w:r>
           <w:rPr>
             <w:rStyle w:val="Hyperlink"/>
@@ -2628,7 +3348,7 @@
             <w:noProof/>
             <w:webHidden/>
           </w:rPr>
-          <w:instrText xml:space="preserve"> PAGEREF _Toc227646579 \h </w:instrText>
+          <w:instrText xml:space="preserve"> PAGEREF _Toc227649900 \h </w:instrText>
         </w:r>
         <w:r>
           <w:rPr>
@@ -2648,7 +3368,7 @@
             <w:noProof/>
             <w:webHidden/>
           </w:rPr>
-          <w:t>14</w:t>
+          <w:t>17</w:t>
         </w:r>
         <w:r>
           <w:rPr>
@@ -2674,7 +3394,7 @@
           <w14:ligatures w14:val="standardContextual"/>
         </w:rPr>
       </w:pPr>
-      <w:hyperlink w:anchor="_Toc227646580" w:history="1">
+      <w:hyperlink w:anchor="_Toc227649901" w:history="1">
         <w:r>
           <w:rPr>
             <w:rStyle w:val="Hyperlink"/>
@@ -2718,7 +3438,7 @@
             <w:noProof/>
             <w:webHidden/>
           </w:rPr>
-          <w:instrText xml:space="preserve"> PAGEREF _Toc227646580 \h </w:instrText>
+          <w:instrText xml:space="preserve"> PAGEREF _Toc227649901 \h </w:instrText>
         </w:r>
         <w:r>
           <w:rPr>
@@ -2738,7 +3458,7 @@
             <w:noProof/>
             <w:webHidden/>
           </w:rPr>
-          <w:t>14</w:t>
+          <w:t>17</w:t>
         </w:r>
         <w:r>
           <w:rPr>
@@ -2764,7 +3484,7 @@
           <w14:ligatures w14:val="standardContextual"/>
         </w:rPr>
       </w:pPr>
-      <w:hyperlink w:anchor="_Toc227646581" w:history="1">
+      <w:hyperlink w:anchor="_Toc227649902" w:history="1">
         <w:r>
           <w:rPr>
             <w:rStyle w:val="Hyperlink"/>
@@ -2808,7 +3528,7 @@
             <w:noProof/>
             <w:webHidden/>
           </w:rPr>
-          <w:instrText xml:space="preserve"> PAGEREF _Toc227646581 \h </w:instrText>
+          <w:instrText xml:space="preserve"> PAGEREF _Toc227649902 \h </w:instrText>
         </w:r>
         <w:r>
           <w:rPr>
@@ -2828,7 +3548,7 @@
             <w:noProof/>
             <w:webHidden/>
           </w:rPr>
-          <w:t>14</w:t>
+          <w:t>17</w:t>
         </w:r>
         <w:r>
           <w:rPr>
@@ -2854,7 +3574,7 @@
           <w14:ligatures w14:val="standardContextual"/>
         </w:rPr>
       </w:pPr>
-      <w:hyperlink w:anchor="_Toc227646582" w:history="1">
+      <w:hyperlink w:anchor="_Toc227649903" w:history="1">
         <w:r>
           <w:rPr>
             <w:rStyle w:val="Hyperlink"/>
@@ -2898,7 +3618,7 @@
             <w:noProof/>
             <w:webHidden/>
           </w:rPr>
-          <w:instrText xml:space="preserve"> PAGEREF _Toc227646582 \h </w:instrText>
+          <w:instrText xml:space="preserve"> PAGEREF _Toc227649903 \h </w:instrText>
         </w:r>
         <w:r>
           <w:rPr>
@@ -2918,7 +3638,7 @@
             <w:noProof/>
             <w:webHidden/>
           </w:rPr>
-          <w:t>15</w:t>
+          <w:t>18</w:t>
         </w:r>
         <w:r>
           <w:rPr>
@@ -2943,13 +3663,13 @@
           <w14:ligatures w14:val="standardContextual"/>
         </w:rPr>
       </w:pPr>
-      <w:hyperlink w:anchor="_Toc227646583" w:history="1">
+      <w:hyperlink w:anchor="_Toc227649904" w:history="1">
         <w:r>
           <w:rPr>
             <w:rStyle w:val="Hyperlink"/>
             <w:noProof/>
           </w:rPr>
-          <w:t>Design, Documentation &amp; Implementation</w:t>
+          <w:t>Project Management &amp; Time Plan</w:t>
         </w:r>
         <w:r>
           <w:rPr>
@@ -2970,7 +3690,7 @@
             <w:noProof/>
             <w:webHidden/>
           </w:rPr>
-          <w:instrText xml:space="preserve"> PAGEREF _Toc227646583 \h </w:instrText>
+          <w:instrText xml:space="preserve"> PAGEREF _Toc227649904 \h </w:instrText>
         </w:r>
         <w:r>
           <w:rPr>
@@ -2990,7 +3710,7 @@
             <w:noProof/>
             <w:webHidden/>
           </w:rPr>
-          <w:t>16</w:t>
+          <w:t>19</w:t>
         </w:r>
         <w:r>
           <w:rPr>
@@ -3016,13 +3736,13 @@
           <w14:ligatures w14:val="standardContextual"/>
         </w:rPr>
       </w:pPr>
-      <w:hyperlink w:anchor="_Toc227646584" w:history="1">
+      <w:hyperlink w:anchor="_Toc227649905" w:history="1">
         <w:r>
           <w:rPr>
             <w:rStyle w:val="Hyperlink"/>
             <w:noProof/>
           </w:rPr>
-          <w:t>6.1</w:t>
+          <w:t>7.1</w:t>
         </w:r>
         <w:r>
           <w:rPr>
@@ -3039,7 +3759,7 @@
             <w:rStyle w:val="Hyperlink"/>
             <w:noProof/>
           </w:rPr>
-          <w:t>Draft Implementation Design</w:t>
+          <w:t>Past Events</w:t>
         </w:r>
         <w:r>
           <w:rPr>
@@ -3060,7 +3780,7 @@
             <w:noProof/>
             <w:webHidden/>
           </w:rPr>
-          <w:instrText xml:space="preserve"> PAGEREF _Toc227646584 \h </w:instrText>
+          <w:instrText xml:space="preserve"> PAGEREF _Toc227649905 \h </w:instrText>
         </w:r>
         <w:r>
           <w:rPr>
@@ -3080,7 +3800,7 @@
             <w:noProof/>
             <w:webHidden/>
           </w:rPr>
-          <w:t>17</w:t>
+          <w:t>19</w:t>
         </w:r>
         <w:r>
           <w:rPr>
@@ -3106,13 +3826,13 @@
           <w14:ligatures w14:val="standardContextual"/>
         </w:rPr>
       </w:pPr>
-      <w:hyperlink w:anchor="_Toc227646585" w:history="1">
+      <w:hyperlink w:anchor="_Toc227649906" w:history="1">
         <w:r>
           <w:rPr>
             <w:rStyle w:val="Hyperlink"/>
             <w:noProof/>
           </w:rPr>
-          <w:t>6.2</w:t>
+          <w:t>7.2</w:t>
         </w:r>
         <w:r>
           <w:rPr>
@@ -3129,7 +3849,7 @@
             <w:rStyle w:val="Hyperlink"/>
             <w:noProof/>
           </w:rPr>
-          <w:t>Use Case Diagram</w:t>
+          <w:t>Current Events</w:t>
         </w:r>
         <w:r>
           <w:rPr>
@@ -3150,7 +3870,7 @@
             <w:noProof/>
             <w:webHidden/>
           </w:rPr>
-          <w:instrText xml:space="preserve"> PAGEREF _Toc227646585 \h </w:instrText>
+          <w:instrText xml:space="preserve"> PAGEREF _Toc227649906 \h </w:instrText>
         </w:r>
         <w:r>
           <w:rPr>
@@ -3170,79 +3890,7 @@
             <w:noProof/>
             <w:webHidden/>
           </w:rPr>
-          <w:t>17</w:t>
-        </w:r>
-        <w:r>
-          <w:rPr>
-            <w:noProof/>
-            <w:webHidden/>
-          </w:rPr>
-          <w:fldChar w:fldCharType="end"/>
-        </w:r>
-      </w:hyperlink>
-    </w:p>
-    <w:p>
-      <w:pPr>
-        <w:pStyle w:val="TOC2"/>
-        <w:tabs>
-          <w:tab w:val="right" w:leader="dot" w:pos="9350"/>
-        </w:tabs>
-        <w:rPr>
-          <w:rFonts w:asciiTheme="minorHAnsi" w:eastAsiaTheme="minorEastAsia" w:hAnsiTheme="minorHAnsi" w:cstheme="minorBidi"/>
-          <w:noProof/>
-          <w:kern w:val="2"/>
-          <w:lang w:val="en-MY" w:eastAsia="zh-CN"/>
-          <w14:ligatures w14:val="standardContextual"/>
-        </w:rPr>
-      </w:pPr>
-      <w:hyperlink w:anchor="_Toc227646586" w:history="1">
-        <w:r>
-          <w:rPr>
-            <w:rStyle w:val="Hyperlink"/>
-            <w:noProof/>
-          </w:rPr>
-          <w:t>Project Management &amp; Time Plan</w:t>
-        </w:r>
-        <w:r>
-          <w:rPr>
-            <w:noProof/>
-            <w:webHidden/>
-          </w:rPr>
-          <w:tab/>
-        </w:r>
-        <w:r>
-          <w:rPr>
-            <w:noProof/>
-            <w:webHidden/>
-          </w:rPr>
-          <w:fldChar w:fldCharType="begin"/>
-        </w:r>
-        <w:r>
-          <w:rPr>
-            <w:noProof/>
-            <w:webHidden/>
-          </w:rPr>
-          <w:instrText xml:space="preserve"> PAGEREF _Toc227646586 \h </w:instrText>
-        </w:r>
-        <w:r>
-          <w:rPr>
-            <w:noProof/>
-            <w:webHidden/>
-          </w:rPr>
-        </w:r>
-        <w:r>
-          <w:rPr>
-            <w:noProof/>
-            <w:webHidden/>
-          </w:rPr>
-          <w:fldChar w:fldCharType="separate"/>
-        </w:r>
-        <w:r>
-          <w:rPr>
-            <w:noProof/>
-            <w:webHidden/>
-          </w:rPr>
-          <w:t>18</w:t>
+          <w:t>19</w:t>
         </w:r>
         <w:r>
           <w:rPr>
@@ -3268,13 +3916,13 @@
           <w14:ligatures w14:val="standardContextual"/>
         </w:rPr>
       </w:pPr>
-      <w:hyperlink w:anchor="_Toc227646587" w:history="1">
+      <w:hyperlink w:anchor="_Toc227649907" w:history="1">
         <w:r>
           <w:rPr>
             <w:rStyle w:val="Hyperlink"/>
             <w:noProof/>
           </w:rPr>
-          <w:t>7.1</w:t>
+          <w:t>7.3</w:t>
         </w:r>
         <w:r>
           <w:rPr>
@@ -3291,7 +3939,7 @@
             <w:rStyle w:val="Hyperlink"/>
             <w:noProof/>
           </w:rPr>
-          <w:t>Past Events</w:t>
+          <w:t>Future &amp; Planned Events</w:t>
         </w:r>
         <w:r>
           <w:rPr>
@@ -3312,7 +3960,7 @@
             <w:noProof/>
             <w:webHidden/>
           </w:rPr>
-          <w:instrText xml:space="preserve"> PAGEREF _Toc227646587 \h </w:instrText>
+          <w:instrText xml:space="preserve"> PAGEREF _Toc227649907 \h </w:instrText>
         </w:r>
         <w:r>
           <w:rPr>
@@ -3332,187 +3980,7 @@
             <w:noProof/>
             <w:webHidden/>
           </w:rPr>
-          <w:t>18</w:t>
-        </w:r>
-        <w:r>
-          <w:rPr>
-            <w:noProof/>
-            <w:webHidden/>
-          </w:rPr>
-          <w:fldChar w:fldCharType="end"/>
-        </w:r>
-      </w:hyperlink>
-    </w:p>
-    <w:p>
-      <w:pPr>
-        <w:pStyle w:val="TOC3"/>
-        <w:tabs>
-          <w:tab w:val="left" w:pos="1200"/>
-          <w:tab w:val="right" w:leader="dot" w:pos="9350"/>
-        </w:tabs>
-        <w:rPr>
-          <w:rFonts w:asciiTheme="minorHAnsi" w:eastAsiaTheme="minorEastAsia" w:hAnsiTheme="minorHAnsi" w:cstheme="minorBidi"/>
-          <w:noProof/>
-          <w:kern w:val="2"/>
-          <w:lang w:val="en-MY" w:eastAsia="zh-CN"/>
-          <w14:ligatures w14:val="standardContextual"/>
-        </w:rPr>
-      </w:pPr>
-      <w:hyperlink w:anchor="_Toc227646588" w:history="1">
-        <w:r>
-          <w:rPr>
-            <w:rStyle w:val="Hyperlink"/>
-            <w:noProof/>
-          </w:rPr>
-          <w:t>7.2</w:t>
-        </w:r>
-        <w:r>
-          <w:rPr>
-            <w:rFonts w:asciiTheme="minorHAnsi" w:eastAsiaTheme="minorEastAsia" w:hAnsiTheme="minorHAnsi" w:cstheme="minorBidi"/>
-            <w:noProof/>
-            <w:kern w:val="2"/>
-            <w:lang w:val="en-MY" w:eastAsia="zh-CN"/>
-            <w14:ligatures w14:val="standardContextual"/>
-          </w:rPr>
-          <w:tab/>
-        </w:r>
-        <w:r>
-          <w:rPr>
-            <w:rStyle w:val="Hyperlink"/>
-            <w:noProof/>
-          </w:rPr>
-          <w:t>Current Events</w:t>
-        </w:r>
-        <w:r>
-          <w:rPr>
-            <w:noProof/>
-            <w:webHidden/>
-          </w:rPr>
-          <w:tab/>
-        </w:r>
-        <w:r>
-          <w:rPr>
-            <w:noProof/>
-            <w:webHidden/>
-          </w:rPr>
-          <w:fldChar w:fldCharType="begin"/>
-        </w:r>
-        <w:r>
-          <w:rPr>
-            <w:noProof/>
-            <w:webHidden/>
-          </w:rPr>
-          <w:instrText xml:space="preserve"> PAGEREF _Toc227646588 \h </w:instrText>
-        </w:r>
-        <w:r>
-          <w:rPr>
-            <w:noProof/>
-            <w:webHidden/>
-          </w:rPr>
-        </w:r>
-        <w:r>
-          <w:rPr>
-            <w:noProof/>
-            <w:webHidden/>
-          </w:rPr>
-          <w:fldChar w:fldCharType="separate"/>
-        </w:r>
-        <w:r>
-          <w:rPr>
-            <w:noProof/>
-            <w:webHidden/>
-          </w:rPr>
-          <w:t>18</w:t>
-        </w:r>
-        <w:r>
-          <w:rPr>
-            <w:noProof/>
-            <w:webHidden/>
-          </w:rPr>
-          <w:fldChar w:fldCharType="end"/>
-        </w:r>
-      </w:hyperlink>
-    </w:p>
-    <w:p>
-      <w:pPr>
-        <w:pStyle w:val="TOC3"/>
-        <w:tabs>
-          <w:tab w:val="left" w:pos="1200"/>
-          <w:tab w:val="right" w:leader="dot" w:pos="9350"/>
-        </w:tabs>
-        <w:rPr>
-          <w:rFonts w:asciiTheme="minorHAnsi" w:eastAsiaTheme="minorEastAsia" w:hAnsiTheme="minorHAnsi" w:cstheme="minorBidi"/>
-          <w:noProof/>
-          <w:kern w:val="2"/>
-          <w:lang w:val="en-MY" w:eastAsia="zh-CN"/>
-          <w14:ligatures w14:val="standardContextual"/>
-        </w:rPr>
-      </w:pPr>
-      <w:hyperlink w:anchor="_Toc227646589" w:history="1">
-        <w:r>
-          <w:rPr>
-            <w:rStyle w:val="Hyperlink"/>
-            <w:noProof/>
-          </w:rPr>
-          <w:t>7.3</w:t>
-        </w:r>
-        <w:r>
-          <w:rPr>
-            <w:rFonts w:asciiTheme="minorHAnsi" w:eastAsiaTheme="minorEastAsia" w:hAnsiTheme="minorHAnsi" w:cstheme="minorBidi"/>
-            <w:noProof/>
-            <w:kern w:val="2"/>
-            <w:lang w:val="en-MY" w:eastAsia="zh-CN"/>
-            <w14:ligatures w14:val="standardContextual"/>
-          </w:rPr>
-          <w:tab/>
-        </w:r>
-        <w:r>
-          <w:rPr>
-            <w:rStyle w:val="Hyperlink"/>
-            <w:noProof/>
-          </w:rPr>
-          <w:t>Future &amp; Planned Events</w:t>
-        </w:r>
-        <w:r>
-          <w:rPr>
-            <w:noProof/>
-            <w:webHidden/>
-          </w:rPr>
-          <w:tab/>
-        </w:r>
-        <w:r>
-          <w:rPr>
-            <w:noProof/>
-            <w:webHidden/>
-          </w:rPr>
-          <w:fldChar w:fldCharType="begin"/>
-        </w:r>
-        <w:r>
-          <w:rPr>
-            <w:noProof/>
-            <w:webHidden/>
-          </w:rPr>
-          <w:instrText xml:space="preserve"> PAGEREF _Toc227646589 \h </w:instrText>
-        </w:r>
-        <w:r>
-          <w:rPr>
-            <w:noProof/>
-            <w:webHidden/>
-          </w:rPr>
-        </w:r>
-        <w:r>
-          <w:rPr>
-            <w:noProof/>
-            <w:webHidden/>
-          </w:rPr>
-          <w:fldChar w:fldCharType="separate"/>
-        </w:r>
-        <w:r>
-          <w:rPr>
-            <w:noProof/>
-            <w:webHidden/>
-          </w:rPr>
-          <w:t>18</w:t>
+          <w:t>19</w:t>
         </w:r>
         <w:r>
           <w:rPr>
@@ -3537,7 +4005,7 @@
           <w14:ligatures w14:val="standardContextual"/>
         </w:rPr>
       </w:pPr>
-      <w:hyperlink w:anchor="_Toc227646590" w:history="1">
+      <w:hyperlink w:anchor="_Toc227649908" w:history="1">
         <w:r>
           <w:rPr>
             <w:rStyle w:val="Hyperlink"/>
@@ -3564,7 +4032,7 @@
             <w:noProof/>
             <w:webHidden/>
           </w:rPr>
-          <w:instrText xml:space="preserve"> PAGEREF _Toc227646590 \h </w:instrText>
+          <w:instrText xml:space="preserve"> PAGEREF _Toc227649908 \h </w:instrText>
         </w:r>
         <w:r>
           <w:rPr>
@@ -3584,7 +4052,7 @@
             <w:noProof/>
             <w:webHidden/>
           </w:rPr>
-          <w:t>19</w:t>
+          <w:t>20</w:t>
         </w:r>
         <w:r>
           <w:rPr>
@@ -3609,7 +4077,7 @@
           <w14:ligatures w14:val="standardContextual"/>
         </w:rPr>
       </w:pPr>
-      <w:hyperlink w:anchor="_Toc227646591" w:history="1">
+      <w:hyperlink w:anchor="_Toc227649909" w:history="1">
         <w:r>
           <w:rPr>
             <w:rStyle w:val="Hyperlink"/>
@@ -3636,7 +4104,7 @@
             <w:noProof/>
             <w:webHidden/>
           </w:rPr>
-          <w:instrText xml:space="preserve"> PAGEREF _Toc227646591 \h </w:instrText>
+          <w:instrText xml:space="preserve"> PAGEREF _Toc227649909 \h </w:instrText>
         </w:r>
         <w:r>
           <w:rPr>
@@ -3656,7 +4124,7 @@
             <w:noProof/>
             <w:webHidden/>
           </w:rPr>
-          <w:t>21</w:t>
+          <w:t>22</w:t>
         </w:r>
         <w:r>
           <w:rPr>
@@ -3693,7 +4161,7 @@
         <w:pStyle w:val="Heading2"/>
         <w:spacing w:line="276" w:lineRule="auto"/>
       </w:pPr>
-      <w:bookmarkStart w:id="1" w:name="_Toc227646561"/>
+      <w:bookmarkStart w:id="1" w:name="_Toc227649871"/>
       <w:r>
         <w:t>Introduction &amp; Project Description</w:t>
       </w:r>
@@ -3707,7 +4175,7 @@
         <w:pStyle w:val="Heading3"/>
         <w:spacing w:line="276" w:lineRule="auto"/>
       </w:pPr>
-      <w:bookmarkStart w:id="2" w:name="_Toc227646562"/>
+      <w:bookmarkStart w:id="2" w:name="_Toc227649872"/>
       <w:r>
         <w:t>1.1</w:t>
       </w:r>
@@ -3783,7 +4251,7 @@
         <w:pStyle w:val="Heading3"/>
         <w:spacing w:line="276" w:lineRule="auto"/>
       </w:pPr>
-      <w:bookmarkStart w:id="3" w:name="_Toc227646563"/>
+      <w:bookmarkStart w:id="3" w:name="_Toc227649873"/>
       <w:r>
         <w:t>1.</w:t>
       </w:r>
@@ -3883,25 +4351,7 @@
         <w:spacing w:line="276" w:lineRule="auto"/>
       </w:pPr>
       <w:r>
-        <w:t xml:space="preserve">The more concealing culture among Malaysian serves as a double edge sword in the matter of skin cancer. On one side, the dressing culture of covering majority of the skin helps to reduce the skin exposure towards ultraviolet light thus indirectly reducing the risk of skin cancer. On the contrary, because of culture belief (of not exposing body part) among Malay women, they are also less likely to seek medical attention when encountered with skin related issue. In which Dr. Hermawan stated: “For skin cancer case among Malaysian, particularly Malay women [due to cultural belief], they don’t share their skin to opposite gender [doctor for diagnosis].” Dr. Hermawan expressed his concerned regarding the accessibility of skin assessment system towards people in different </w:t>
-      </w:r>
-      <w:r>
-        <w:t>ethnic</w:t>
-      </w:r>
-      <w:r>
-        <w:t xml:space="preserve"> </w:t>
-      </w:r>
-      <w:r>
-        <w:t>groups and</w:t>
-      </w:r>
-      <w:r>
-        <w:t xml:space="preserve"> thus proposed the development of a mobile-based </w:t>
-      </w:r>
-      <w:r>
-        <w:t>non-invasive</w:t>
-      </w:r>
-      <w:r>
-        <w:t xml:space="preserve"> skin assessment system to address this issue.</w:t>
+        <w:t>The more concealing culture among Malaysian serves as a double edge sword in the matter of skin cancer. On one side, the dressing culture of covering majority of the skin helps to reduce the skin exposure towards ultraviolet light thus indirectly reducing the risk of skin cancer. On the contrary, because of culture belief (of not exposing body part) among Malay women, they are also less likely to seek medical attention when encountered with skin related issue. In which Dr. Hermawan stated: “For skin cancer case among Malaysian, particularly Malay women [due to cultural belief], they don’t share their skin to opposite gender [doctor for diagnosis].” Dr. Hermawan expressed his concerned regarding the accessibility of skin assessment system towards people in different ethnic groups and thus proposed the development of a mobile-based non-invasive skin assessment system to address this issue.</w:t>
       </w:r>
     </w:p>
     <w:p>
@@ -3909,7 +4359,7 @@
         <w:pStyle w:val="Heading3"/>
         <w:spacing w:line="276" w:lineRule="auto"/>
       </w:pPr>
-      <w:bookmarkStart w:id="4" w:name="_Toc227646564"/>
+      <w:bookmarkStart w:id="4" w:name="_Toc227649874"/>
       <w:r>
         <w:t>1.</w:t>
       </w:r>
@@ -4001,6 +4451,15 @@
       <w:r>
         <w:t>The application will provide referrals to medical practitioners and dermatologists if cause-of-concern is found.</w:t>
       </w:r>
+      <w:r>
+        <w:t xml:space="preserve"> </w:t>
+      </w:r>
+      <w:r>
+        <w:rPr>
+          <w:highlight w:val="yellow"/>
+        </w:rPr>
+        <w:t>[IMPROVE HERE/BASE OFF IGR]</w:t>
+      </w:r>
     </w:p>
     <w:p>
       <w:pPr>
@@ -4030,14 +4489,14 @@
         <w:pStyle w:val="Heading2"/>
         <w:spacing w:line="276" w:lineRule="auto"/>
       </w:pPr>
-      <w:bookmarkStart w:id="5" w:name="_Toc227646565"/>
+      <w:bookmarkStart w:id="5" w:name="_Toc227649875"/>
       <w:r>
         <w:t xml:space="preserve">Background </w:t>
       </w:r>
+      <w:r>
+        <w:t>Research</w:t>
+      </w:r>
       <w:bookmarkEnd w:id="5"/>
-      <w:r>
-        <w:t>Research</w:t>
-      </w:r>
     </w:p>
     <w:p>
       <w:pPr>
@@ -4045,7 +4504,7 @@
         <w:spacing w:line="276" w:lineRule="auto"/>
       </w:pPr>
       <w:bookmarkStart w:id="6" w:name="_Toc216281418"/>
-      <w:bookmarkStart w:id="7" w:name="_Toc227646566"/>
+      <w:bookmarkStart w:id="7" w:name="_Toc227649876"/>
       <w:r>
         <w:t>2.1</w:t>
       </w:r>
@@ -4057,41 +4516,245 @@
         <w:t>Similar Systems</w:t>
       </w:r>
       <w:bookmarkEnd w:id="7"/>
+    </w:p>
+    <w:p>
+      <w:pPr>
+        <w:spacing w:line="276" w:lineRule="auto"/>
+      </w:pPr>
+      <w:r>
+        <w:t xml:space="preserve">Various systems already exist that aim to address and incorporate AI-assisted skin cancer detection, each of them with their own distinct and unique approaches and limitations which have informed </w:t>
+      </w:r>
+      <w:r>
+        <w:t>the</w:t>
+      </w:r>
+      <w:r>
+        <w:t xml:space="preserve"> project’s design decisions.</w:t>
+      </w:r>
+    </w:p>
+    <w:p>
+      <w:pPr>
+        <w:pStyle w:val="ListParagraph"/>
+        <w:numPr>
+          <w:ilvl w:val="0"/>
+          <w:numId w:val="23"/>
+        </w:numPr>
+        <w:spacing w:line="276" w:lineRule="auto"/>
+        <w:outlineLvl w:val="3"/>
+        <w:rPr>
+          <w:b/>
+          <w:bCs/>
+          <w:vanish/>
+          <w:sz w:val="30"/>
+          <w:szCs w:val="30"/>
+        </w:rPr>
+      </w:pPr>
+      <w:bookmarkStart w:id="8" w:name="_Toc227649556"/>
+      <w:bookmarkStart w:id="9" w:name="_Toc227649877"/>
+      <w:bookmarkEnd w:id="8"/>
+      <w:bookmarkEnd w:id="9"/>
+    </w:p>
+    <w:p>
+      <w:pPr>
+        <w:pStyle w:val="ListParagraph"/>
+        <w:numPr>
+          <w:ilvl w:val="0"/>
+          <w:numId w:val="23"/>
+        </w:numPr>
+        <w:spacing w:line="276" w:lineRule="auto"/>
+        <w:outlineLvl w:val="3"/>
+        <w:rPr>
+          <w:b/>
+          <w:bCs/>
+          <w:vanish/>
+          <w:sz w:val="30"/>
+          <w:szCs w:val="30"/>
+        </w:rPr>
+      </w:pPr>
+      <w:bookmarkStart w:id="10" w:name="_Toc227649557"/>
+      <w:bookmarkStart w:id="11" w:name="_Toc227649878"/>
+      <w:bookmarkEnd w:id="10"/>
+      <w:bookmarkEnd w:id="11"/>
+    </w:p>
+    <w:p>
+      <w:pPr>
+        <w:pStyle w:val="ListParagraph"/>
+        <w:numPr>
+          <w:ilvl w:val="1"/>
+          <w:numId w:val="23"/>
+        </w:numPr>
+        <w:spacing w:line="276" w:lineRule="auto"/>
+        <w:outlineLvl w:val="3"/>
+        <w:rPr>
+          <w:b/>
+          <w:bCs/>
+          <w:vanish/>
+          <w:sz w:val="30"/>
+          <w:szCs w:val="30"/>
+        </w:rPr>
+      </w:pPr>
+      <w:bookmarkStart w:id="12" w:name="_Toc227649558"/>
+      <w:bookmarkStart w:id="13" w:name="_Toc227649879"/>
+      <w:bookmarkEnd w:id="12"/>
+      <w:bookmarkEnd w:id="13"/>
+    </w:p>
+    <w:p>
+      <w:pPr>
+        <w:pStyle w:val="Heading4"/>
+      </w:pPr>
+      <w:bookmarkStart w:id="14" w:name="_Toc227649880"/>
+      <w:r>
+        <w:t>DERM</w:t>
+      </w:r>
+      <w:bookmarkEnd w:id="14"/>
+    </w:p>
+    <w:p>
+      <w:pPr>
+        <w:spacing w:line="276" w:lineRule="auto"/>
+      </w:pPr>
+      <w:r>
+        <w:t xml:space="preserve">DERM is an AI skin cancer detection system </w:t>
+      </w:r>
+      <w:r>
+        <w:t>which facilitates the assessment of skin lesions and assists secondary medical institutions by reducing the need for urgent suspected skin cancer appointments [8]. The main drawback pertains to the clinical workflow and standardized equipment (dermoscopes) used in this process, where the skin lesion images are captured by healthcare professionals rather than by the patients themselves [8].</w:t>
+      </w:r>
+    </w:p>
+    <w:p>
+      <w:pPr>
+        <w:pStyle w:val="Heading4"/>
+      </w:pPr>
+      <w:bookmarkStart w:id="15" w:name="_Toc227649881"/>
+      <w:r>
+        <w:t>Model Dermatol</w:t>
+      </w:r>
+      <w:bookmarkEnd w:id="15"/>
+    </w:p>
+    <w:p>
+      <w:pPr>
+        <w:spacing w:line="276" w:lineRule="auto"/>
+      </w:pPr>
+      <w:r>
+        <w:t xml:space="preserve">Model Dermatol, published by Iderma, is a free AI skin disease analysis application that analyse user submitted skin photograph and search for relevant medical documents about the potential skin disease based on the provided photo. The application claims to be able to provide relevant info on more than 180 types of skin disease to help the user understand their potential skin problems. </w:t>
+      </w:r>
+    </w:p>
+    <w:p>
+      <w:pPr>
+        <w:spacing w:line="276" w:lineRule="auto"/>
+      </w:pPr>
+      <w:r>
+        <w:t xml:space="preserve">The procedure of using the application is as follow: </w:t>
+      </w:r>
+    </w:p>
+    <w:p>
+      <w:pPr>
+        <w:pStyle w:val="ListParagraph"/>
+        <w:numPr>
+          <w:ilvl w:val="0"/>
+          <w:numId w:val="37"/>
+        </w:numPr>
+        <w:spacing w:line="276" w:lineRule="auto"/>
+      </w:pPr>
+      <w:r>
+        <w:t xml:space="preserve">The </w:t>
+      </w:r>
+      <w:r>
+        <w:t xml:space="preserve">User </w:t>
+      </w:r>
+      <w:r>
+        <w:t>enters</w:t>
+      </w:r>
+      <w:r>
+        <w:t xml:space="preserve"> some personal information (gender and year of birth) and their skin information (onset, itching, pain). </w:t>
+      </w:r>
+    </w:p>
+    <w:p>
+      <w:pPr>
+        <w:pStyle w:val="ListParagraph"/>
+        <w:numPr>
+          <w:ilvl w:val="0"/>
+          <w:numId w:val="37"/>
+        </w:numPr>
+        <w:spacing w:line="276" w:lineRule="auto"/>
+      </w:pPr>
+      <w:r>
+        <w:t xml:space="preserve">The </w:t>
+      </w:r>
+      <w:r>
+        <w:t>User take</w:t>
+      </w:r>
+      <w:r>
+        <w:t>s</w:t>
+      </w:r>
       <w:r>
         <w:t xml:space="preserve"> </w:t>
       </w:r>
-    </w:p>
-    <w:p>
-      <w:pPr>
-        <w:spacing w:line="276" w:lineRule="auto"/>
-      </w:pPr>
-      <w:r>
-        <w:t xml:space="preserve">Various systems already exist that aim to address and incorporate AI-assisted skin cancer detection, each of them with their own distinct and unique approaches and limitations which have informed </w:t>
-      </w:r>
-      <w:r>
-        <w:t>the</w:t>
-      </w:r>
-      <w:r>
-        <w:t xml:space="preserve"> project’s design decisions.</w:t>
-      </w:r>
-    </w:p>
-    <w:p>
-      <w:pPr>
-        <w:spacing w:line="276" w:lineRule="auto"/>
-      </w:pPr>
-      <w:r>
-        <w:t xml:space="preserve">DERM is an AI skin cancer detection system </w:t>
-      </w:r>
-      <w:r>
-        <w:t>which facilitates the assessment of skin lesions and assists secondary medical institutions by reducing the need for urgent suspected skin cancer appointments [8]. The main drawback pertains to the clinical workflow and standardized equipment (dermoscopes) used in this process, where the skin lesion images are captured by healthcare professionals rather than by the patients themselves [8].</w:t>
-      </w:r>
-    </w:p>
-    <w:p>
-      <w:pPr>
-        <w:spacing w:line="276" w:lineRule="auto"/>
-      </w:pPr>
-      <w:r>
-        <w:t>Meanwhile, SkinVision</w:t>
+      <w:r>
+        <w:t>or</w:t>
+      </w:r>
+      <w:r>
+        <w:t xml:space="preserve"> upload</w:t>
+      </w:r>
+      <w:r>
+        <w:t>s</w:t>
+      </w:r>
+      <w:r>
+        <w:t xml:space="preserve"> a photo regarding their skin surface. </w:t>
+      </w:r>
+    </w:p>
+    <w:p>
+      <w:pPr>
+        <w:pStyle w:val="ListParagraph"/>
+        <w:numPr>
+          <w:ilvl w:val="0"/>
+          <w:numId w:val="37"/>
+        </w:numPr>
+        <w:spacing w:line="276" w:lineRule="auto"/>
+      </w:pPr>
+      <w:r>
+        <w:t xml:space="preserve">The application then analyses the provided photo and </w:t>
+      </w:r>
+      <w:r>
+        <w:t>gives</w:t>
+      </w:r>
+      <w:r>
+        <w:t xml:space="preserve"> a score between 0 and 100 to indicate the risk of user having a skin disease. </w:t>
+      </w:r>
+    </w:p>
+    <w:p>
+      <w:pPr>
+        <w:spacing w:line="276" w:lineRule="auto"/>
+      </w:pPr>
+      <w:r>
+        <w:t xml:space="preserve">Model Dermatol does not provide a specific prediction regarding what type of skin disease the user might have. Instead, it provides a risk score to suggest the likelihood of the user suffer from a certain skin disease. The application then provides a list of information that were fetched from the websites: Wikipedia and PubMed to the user. </w:t>
+      </w:r>
+      <w:r>
+        <w:t>This information</w:t>
+      </w:r>
+      <w:r>
+        <w:t xml:space="preserve"> includes images and description of different types of skin disease, and they serve as an indicator of what are the possible skin diseases the user might have, based on the provided photo.</w:t>
+      </w:r>
+    </w:p>
+    <w:p>
+      <w:pPr>
+        <w:spacing w:line="276" w:lineRule="auto"/>
+      </w:pPr>
+    </w:p>
+    <w:p>
+      <w:pPr>
+        <w:pStyle w:val="Heading4"/>
+      </w:pPr>
+      <w:bookmarkStart w:id="16" w:name="_Toc227649882"/>
+      <w:r>
+        <w:lastRenderedPageBreak/>
+        <w:t>SkinVision</w:t>
+      </w:r>
+      <w:bookmarkEnd w:id="16"/>
+    </w:p>
+    <w:p>
+      <w:pPr>
+        <w:spacing w:line="276" w:lineRule="auto"/>
+      </w:pPr>
+      <w:r>
+        <w:t>SkinVision</w:t>
       </w:r>
       <w:r>
         <w:t xml:space="preserve"> is another consumer appli</w:t>
@@ -4126,23 +4789,38 @@
         <w:t xml:space="preserve"> itself by incorporating various features, including a multimodal approach via incorporating patient metadata</w:t>
       </w:r>
       <w:r>
-        <w:t xml:space="preserve"> alongside image classification and prioritizing accessibility through smartphone-based input while lowering the prerequisites needed to access care.</w:t>
+        <w:t xml:space="preserve"> alongside image classification and prioritizing accessibility through smartphone-based input while lowering the prerequisites needed to access care</w:t>
+      </w:r>
+      <w:r>
+        <w:t xml:space="preserve"> via ethically and voluntarily collecting skin lesion samples from users</w:t>
+      </w:r>
+      <w:r>
+        <w:t>.</w:t>
       </w:r>
     </w:p>
     <w:p>
       <w:pPr>
         <w:pStyle w:val="Heading3"/>
-        <w:spacing w:line="276" w:lineRule="auto"/>
-      </w:pPr>
-      <w:bookmarkStart w:id="8" w:name="_Toc227646567"/>
-      <w:r>
-        <w:t xml:space="preserve">2.2 </w:t>
-      </w:r>
-      <w:r>
-        <w:tab/>
+        <w:numPr>
+          <w:ilvl w:val="1"/>
+          <w:numId w:val="23"/>
+        </w:numPr>
+        <w:spacing w:line="276" w:lineRule="auto"/>
+        <w:ind w:hanging="1080"/>
+      </w:pPr>
+      <w:bookmarkStart w:id="17" w:name="_Toc227649883"/>
+      <w:r>
         <w:t>Literature Review</w:t>
       </w:r>
-      <w:bookmarkEnd w:id="8"/>
+      <w:bookmarkEnd w:id="17"/>
+    </w:p>
+    <w:p>
+      <w:pPr>
+        <w:pStyle w:val="Heading4"/>
+      </w:pPr>
+      <w:r>
+        <w:t>Skin Cancer, Melanoma &amp; ABCDE Rule</w:t>
+      </w:r>
     </w:p>
     <w:p>
       <w:pPr>
@@ -4176,7 +4854,6 @@
         <w:spacing w:line="276" w:lineRule="auto"/>
       </w:pPr>
       <w:r>
-        <w:lastRenderedPageBreak/>
         <w:t xml:space="preserve">Asymmetry – The shape of one half does not match the other half. </w:t>
       </w:r>
     </w:p>
@@ -4240,18 +4917,44 @@
     </w:p>
     <w:p>
       <w:pPr>
+        <w:pStyle w:val="Heading4"/>
+      </w:pPr>
+      <w:r>
+        <w:t>Prior usage of AI in skin cancer diagnosis</w:t>
+      </w:r>
+    </w:p>
+    <w:p>
+      <w:pPr>
         <w:spacing w:line="276" w:lineRule="auto"/>
       </w:pPr>
       <w:r>
         <w:t xml:space="preserve">The current research </w:t>
       </w:r>
       <w:r>
-        <w:t xml:space="preserve">in AI usage in Skin Cancer Diagnosis highlights a </w:t>
+        <w:t xml:space="preserve">in AI usage in </w:t>
+      </w:r>
+      <w:r>
+        <w:t>s</w:t>
+      </w:r>
+      <w:r>
+        <w:t xml:space="preserve">kin </w:t>
+      </w:r>
+      <w:r>
+        <w:t>c</w:t>
+      </w:r>
+      <w:r>
+        <w:t xml:space="preserve">ancer </w:t>
       </w:r>
       <w:r>
         <w:t>d</w:t>
       </w:r>
       <w:r>
+        <w:t xml:space="preserve">iagnosis highlights a </w:t>
+      </w:r>
+      <w:r>
+        <w:t>d</w:t>
+      </w:r>
+      <w:r>
         <w:t xml:space="preserve">isproportionate performance disparity between specialized </w:t>
       </w:r>
       <w:r>
@@ -4297,7 +5000,11 @@
         <w:t xml:space="preserve">papers found that </w:t>
       </w:r>
       <w:r>
-        <w:t>consumer-purpose LLMs such as ChatGPT-4 Omni consistently underperform when matched against specialized</w:t>
+        <w:t xml:space="preserve">consumer-purpose LLMs such as ChatGPT-4 Omni </w:t>
+      </w:r>
+      <w:r>
+        <w:lastRenderedPageBreak/>
+        <w:t>consistently underperform when matched against specialized</w:t>
       </w:r>
       <w:r>
         <w:t xml:space="preserve"> dermatological algorithms</w:t>
@@ -4440,6 +5147,14 @@
     </w:p>
     <w:p>
       <w:pPr>
+        <w:pStyle w:val="Heading4"/>
+      </w:pPr>
+      <w:r>
+        <w:t>Preceding Work Review</w:t>
+      </w:r>
+    </w:p>
+    <w:p>
+      <w:pPr>
         <w:spacing w:line="276" w:lineRule="auto"/>
       </w:pPr>
       <w:r>
@@ -4458,14 +5173,86 @@
         <w:t>. However</w:t>
       </w:r>
       <w:r>
-        <w:t xml:space="preserve"> while conducting the literature review for the “Introduction to Image Processing” COMP2032 coursework, the paper on White Blood Cell (WBC) segmentation and classification by Mohamad Abou Ali, Fadi and Ignacio detailed the usage of a model called the “Segment Anything Model” that was utilized to segment </w:t>
+        <w:t xml:space="preserve"> while conducting the literature review for the “Introduction to Image Processing” COMP2032 coursework, the paper on White Blood Cell (WBC) segmentation and classification by Mohamad Abou Ali, Fadi and Ignacio detailed the usage of a model called the “Segment Anything Model” that was utilized to segment WBC’s from Red Blood Cells (RBC) and compartmentalize them to create entirely distinct, composite images</w:t>
+      </w:r>
+      <w:r>
+        <w:t xml:space="preserve"> [16].</w:t>
+      </w:r>
+    </w:p>
+    <w:p>
+      <w:pPr>
+        <w:spacing w:line="276" w:lineRule="auto"/>
+      </w:pPr>
+      <w:r>
+        <w:t xml:space="preserve">The skin cancer classification model is trained by feeding the model with lesion dataset, that is, dataset created from a list of images of skin lesion. There are two distinctive group for images of skin lesion: clinical image and </w:t>
+      </w:r>
+      <w:r>
+        <w:t>dermoscopic</w:t>
+      </w:r>
+      <w:r>
+        <w:t xml:space="preserve"> image. Where clinical image is the image of skin lesion taken by a camera in close </w:t>
+      </w:r>
+      <w:r>
+        <w:t>distance,</w:t>
+      </w:r>
+      <w:r>
+        <w:t xml:space="preserve"> while </w:t>
+      </w:r>
+      <w:r>
+        <w:t>dermoscopic</w:t>
+      </w:r>
+      <w:r>
+        <w:t xml:space="preserve"> image is the image of skin lesion taken by using a </w:t>
+      </w:r>
+      <w:proofErr w:type="spellStart"/>
+      <w:r>
+        <w:t>derm</w:t>
+      </w:r>
+      <w:r>
+        <w:t>ato</w:t>
+      </w:r>
+      <w:r>
+        <w:t>scope</w:t>
+      </w:r>
+      <w:proofErr w:type="spellEnd"/>
+      <w:r>
+        <w:t xml:space="preserve"> to zoom in the skin lesion. The skin lesion dataset that is being used to train the model in this preceding work is a set of </w:t>
+      </w:r>
+      <w:r>
+        <w:t>dermoscopic</w:t>
+      </w:r>
+      <w:r>
+        <w:t xml:space="preserve"> image, specifically the ISIC 2018 dataset. This is due to the lack of clinical image dataset at the time when this preceding work was being done. However, it is ideal that in future work, the dataset that is chosen to train the skin cancer model would be clinical image dataset, as </w:t>
       </w:r>
       <w:r>
         <w:lastRenderedPageBreak/>
-        <w:t>WBC’s from Red Blood Cells (RBC) and compartmentalize them to create entirely distinct, composite images</w:t>
-      </w:r>
-      <w:r>
-        <w:t xml:space="preserve"> [16].</w:t>
+        <w:t xml:space="preserve">model trained with </w:t>
+      </w:r>
+      <w:r>
+        <w:t>dermoscopic</w:t>
+      </w:r>
+      <w:r>
+        <w:t xml:space="preserve"> image can only give an accurate prediction if its input is also of type </w:t>
+      </w:r>
+      <w:r>
+        <w:t>dermoscopic</w:t>
+      </w:r>
+      <w:r>
+        <w:t xml:space="preserve"> image. The idea of building a mobile-based skin assessment system is to increase the accessibility of skin assessment to the general public, and it needs to be considered that the general consumer would not have a personal dermoscope to take a </w:t>
+      </w:r>
+      <w:r>
+        <w:t>dermoscopic</w:t>
+      </w:r>
+      <w:r>
+        <w:t xml:space="preserve"> image for the skin cancer classification model.</w:t>
+      </w:r>
+    </w:p>
+    <w:p>
+      <w:pPr>
+        <w:pStyle w:val="Heading4"/>
+      </w:pPr>
+      <w:r>
+        <w:t>Data Preprocessing</w:t>
       </w:r>
     </w:p>
     <w:p>
@@ -4484,6 +5271,14 @@
     </w:p>
     <w:p>
       <w:pPr>
+        <w:pStyle w:val="Heading4"/>
+      </w:pPr>
+      <w:r>
+        <w:t>Class Imbalance</w:t>
+      </w:r>
+    </w:p>
+    <w:p>
+      <w:pPr>
         <w:spacing w:line="276" w:lineRule="auto"/>
       </w:pPr>
       <w:r>
@@ -4501,10 +5296,48 @@
     </w:p>
     <w:p>
       <w:pPr>
-        <w:spacing w:line="276" w:lineRule="auto"/>
-      </w:pPr>
-      <w:r>
-        <w:t xml:space="preserve">The FitzPatrick Skin Type scale is a scale that classifies skin </w:t>
+        <w:pStyle w:val="Heading4"/>
+        <w:rPr>
+          <w:lang w:val="fr-CA"/>
+        </w:rPr>
+      </w:pPr>
+      <w:r>
+        <w:rPr>
+          <w:lang w:val="fr-CA"/>
+        </w:rPr>
+        <w:t>Skin Type Scale</w:t>
+      </w:r>
+      <w:r>
+        <w:rPr>
+          <w:lang w:val="fr-CA"/>
+        </w:rPr>
+        <w:t xml:space="preserve"> &amp; </w:t>
+      </w:r>
+      <w:r>
+        <w:rPr>
+          <w:lang w:val="fr-CA"/>
+        </w:rPr>
+        <w:t>N</w:t>
+      </w:r>
+      <w:r>
+        <w:rPr>
+          <w:lang w:val="fr-CA"/>
+        </w:rPr>
+        <w:t>onlinearity</w:t>
+      </w:r>
+    </w:p>
+    <w:p>
+      <w:pPr>
+        <w:spacing w:line="276" w:lineRule="auto"/>
+      </w:pPr>
+      <w:r>
+        <w:t>The Fitz</w:t>
+      </w:r>
+      <w:r>
+        <w:t>p</w:t>
+      </w:r>
+      <w:r>
+        <w:t xml:space="preserve">atrick Skin Type scale is a scale that classifies skin </w:t>
       </w:r>
       <w:r>
         <w:t>colour</w:t>
@@ -4528,7 +5361,7 @@
         <w:t xml:space="preserve"> [17]</w:t>
       </w:r>
       <w:r>
-        <w:t>.</w:t>
+        <w:t>, and while other metrics exist such as the Monk Skin Tone, in order for them to be utilized effectively, dataset annotations need to include them in addition to, or over the Fitzpatrick scale.</w:t>
       </w:r>
       <w:r>
         <w:br w:type="page"/>
@@ -4549,7 +5382,7 @@
         <w:pStyle w:val="Heading2"/>
         <w:spacing w:line="276" w:lineRule="auto"/>
       </w:pPr>
-      <w:bookmarkStart w:id="9" w:name="_Toc227646568"/>
+      <w:bookmarkStart w:id="18" w:name="_Toc227649884"/>
       <w:r>
         <w:t>User</w:t>
       </w:r>
@@ -4565,7 +5398,7 @@
       <w:r>
         <w:t>Requirement Specifications</w:t>
       </w:r>
-      <w:bookmarkEnd w:id="9"/>
+      <w:bookmarkEnd w:id="18"/>
     </w:p>
     <w:p>
       <w:pPr>
@@ -4606,6 +5439,12 @@
       </w:r>
       <w:r>
         <w:t xml:space="preserve">, those being: </w:t>
+      </w:r>
+      <w:r>
+        <w:rPr>
+          <w:highlight w:val="yellow"/>
+        </w:rPr>
+        <w:t>[IMPROVE AND RESOLVE HERE/BASE OFF IGR]</w:t>
       </w:r>
     </w:p>
     <w:p>
@@ -4746,7 +5585,7 @@
         <w:pStyle w:val="Heading3"/>
         <w:spacing w:line="276" w:lineRule="auto"/>
       </w:pPr>
-      <w:bookmarkStart w:id="10" w:name="_Toc227646569"/>
+      <w:bookmarkStart w:id="19" w:name="_Toc227649885"/>
       <w:r>
         <w:t>3</w:t>
       </w:r>
@@ -4759,7 +5598,7 @@
       <w:r>
         <w:t>Functional System Requirements</w:t>
       </w:r>
-      <w:bookmarkEnd w:id="10"/>
+      <w:bookmarkEnd w:id="19"/>
     </w:p>
     <w:p>
       <w:pPr>
@@ -5007,19 +5846,19 @@
         <w:pStyle w:val="Heading3"/>
         <w:spacing w:line="276" w:lineRule="auto"/>
       </w:pPr>
-      <w:bookmarkStart w:id="11" w:name="_Toc227646570"/>
+      <w:bookmarkStart w:id="20" w:name="_Toc227649886"/>
       <w:r>
         <w:t>3.2</w:t>
       </w:r>
-      <w:bookmarkStart w:id="12" w:name="_Hlk216357526"/>
+      <w:bookmarkStart w:id="21" w:name="_Hlk216357526"/>
       <w:r>
         <w:tab/>
       </w:r>
-      <w:bookmarkEnd w:id="12"/>
+      <w:bookmarkEnd w:id="21"/>
       <w:r>
         <w:t>Non-Functional System Requirements</w:t>
       </w:r>
-      <w:bookmarkEnd w:id="11"/>
+      <w:bookmarkEnd w:id="20"/>
     </w:p>
     <w:p>
       <w:pPr>
@@ -5190,7 +6029,7 @@
         <w:pStyle w:val="Heading3"/>
         <w:spacing w:line="276" w:lineRule="auto"/>
       </w:pPr>
-      <w:bookmarkStart w:id="13" w:name="_Toc227646571"/>
+      <w:bookmarkStart w:id="22" w:name="_Toc227649887"/>
       <w:r>
         <w:t>3.3</w:t>
       </w:r>
@@ -5200,7 +6039,7 @@
       <w:r>
         <w:t>Functional User Requirements</w:t>
       </w:r>
-      <w:bookmarkEnd w:id="13"/>
+      <w:bookmarkEnd w:id="22"/>
     </w:p>
     <w:p>
       <w:pPr>
@@ -5272,7 +6111,7 @@
       <w:r>
         <w:tab/>
       </w:r>
-      <w:bookmarkStart w:id="14" w:name="_Hlk216358379"/>
+      <w:bookmarkStart w:id="23" w:name="_Hlk216358379"/>
       <w:r>
         <w:t>The user shall be able to capture a new photo of a skin lesion using the in-app</w:t>
       </w:r>
@@ -5283,7 +6122,7 @@
         <w:t>camera or select an existing photo from their gallery.</w:t>
       </w:r>
     </w:p>
-    <w:bookmarkEnd w:id="14"/>
+    <w:bookmarkEnd w:id="23"/>
     <w:p>
       <w:pPr>
         <w:spacing w:line="276" w:lineRule="auto"/>
@@ -5419,8 +6258,9 @@
         <w:pStyle w:val="Heading3"/>
         <w:spacing w:line="276" w:lineRule="auto"/>
       </w:pPr>
-      <w:bookmarkStart w:id="15" w:name="_Toc227646572"/>
-      <w:r>
+      <w:bookmarkStart w:id="24" w:name="_Toc227649888"/>
+      <w:r>
+        <w:lastRenderedPageBreak/>
         <w:t>3.4</w:t>
       </w:r>
       <w:r>
@@ -5429,7 +6269,7 @@
       <w:r>
         <w:t>Non-Functional User Requirements</w:t>
       </w:r>
-      <w:bookmarkEnd w:id="15"/>
+      <w:bookmarkEnd w:id="24"/>
     </w:p>
     <w:p>
       <w:pPr>
@@ -5454,7 +6294,6 @@
         <w:spacing w:line="276" w:lineRule="auto"/>
       </w:pPr>
       <w:r>
-        <w:lastRenderedPageBreak/>
         <w:t>NFUR-2.</w:t>
       </w:r>
       <w:r>
@@ -5534,11 +6373,11 @@
         <w:pStyle w:val="Heading2"/>
         <w:spacing w:line="276" w:lineRule="auto"/>
       </w:pPr>
-      <w:bookmarkStart w:id="16" w:name="_Toc227646573"/>
+      <w:bookmarkStart w:id="25" w:name="_Toc227649889"/>
       <w:r>
         <w:t>Technical Stack &amp; Development Decisions</w:t>
       </w:r>
-      <w:bookmarkEnd w:id="16"/>
+      <w:bookmarkEnd w:id="25"/>
     </w:p>
     <w:p>
       <w:pPr>
@@ -5551,260 +6390,259 @@
     <w:p>
       <w:pPr>
         <w:pStyle w:val="Heading3"/>
+      </w:pPr>
+      <w:bookmarkStart w:id="26" w:name="_Toc227649890"/>
+      <w:r>
+        <w:t>4.1</w:t>
+      </w:r>
+      <w:r>
+        <w:tab/>
+        <w:t>Coding Languages</w:t>
+      </w:r>
+      <w:bookmarkEnd w:id="26"/>
+      <w:r>
+        <w:tab/>
+      </w:r>
+    </w:p>
+    <w:p>
+      <w:pPr>
+        <w:pStyle w:val="Heading4"/>
         <w:numPr>
-          <w:ilvl w:val="1"/>
-          <w:numId w:val="23"/>
+          <w:ilvl w:val="0"/>
+          <w:numId w:val="0"/>
         </w:numPr>
-        <w:spacing w:line="276" w:lineRule="auto"/>
-        <w:ind w:left="720"/>
-      </w:pPr>
-      <w:bookmarkStart w:id="17" w:name="_Toc227646574"/>
-      <w:r>
+        <w:ind w:left="1080" w:hanging="1080"/>
+      </w:pPr>
+      <w:bookmarkStart w:id="27" w:name="_Toc227649891"/>
+      <w:r>
+        <w:t xml:space="preserve">4.1.1. </w:t>
+      </w:r>
+      <w:r>
+        <w:tab/>
+        <w:t>Dart</w:t>
+      </w:r>
+      <w:bookmarkEnd w:id="27"/>
+    </w:p>
+    <w:p>
+      <w:r>
+        <w:t>Dart was a primary coding language as</w:t>
+      </w:r>
+      <w:r>
+        <w:t xml:space="preserve"> Flutter </w:t>
+      </w:r>
+      <w:r>
+        <w:t>was selected as</w:t>
+      </w:r>
+      <w:r>
+        <w:t xml:space="preserve"> the primary framework used for this project, Dart programming language</w:t>
+      </w:r>
+      <w:r>
+        <w:t xml:space="preserve"> powers Flutter and</w:t>
+      </w:r>
+      <w:r>
+        <w:t xml:space="preserve"> will be the primary programming language used for developing the application’s logic and function.</w:t>
+      </w:r>
+    </w:p>
+    <w:p>
+      <w:pPr>
+        <w:pStyle w:val="Heading4"/>
+        <w:numPr>
+          <w:ilvl w:val="0"/>
+          <w:numId w:val="0"/>
+        </w:numPr>
+        <w:ind w:left="1080" w:hanging="1080"/>
+      </w:pPr>
+      <w:bookmarkStart w:id="28" w:name="_Toc227649892"/>
+      <w:r>
+        <w:t>4.1.</w:t>
+      </w:r>
+      <w:r>
+        <w:t>2</w:t>
+      </w:r>
+      <w:r>
+        <w:t xml:space="preserve">. </w:t>
+      </w:r>
+      <w:r>
+        <w:tab/>
+      </w:r>
+      <w:r>
+        <w:t>Python</w:t>
+      </w:r>
+      <w:bookmarkEnd w:id="28"/>
+    </w:p>
+    <w:p>
+      <w:r>
+        <w:t xml:space="preserve">Python is chosen as this project’s primary language for writing the back-end functionality such as training the AI model and creating API. Python is chosen due to its large number of libraries and simplicity to implement a certain function. It is able to provide the team specific library to tackle with each for the listed problem, for instance </w:t>
+      </w:r>
+      <w:r>
+        <w:t>PyTorch and TensorFlow for ML &amp; NN applications and quick prototyping</w:t>
+      </w:r>
+      <w:r>
+        <w:t>.</w:t>
+      </w:r>
+    </w:p>
+    <w:p>
+      <w:pPr>
+        <w:pStyle w:val="Heading3"/>
+      </w:pPr>
+      <w:bookmarkStart w:id="29" w:name="_Toc227649893"/>
+      <w:r>
+        <w:t>4.</w:t>
+      </w:r>
+      <w:r>
+        <w:t>2</w:t>
+      </w:r>
+      <w:r>
+        <w:tab/>
         <w:t>Coding Languages</w:t>
       </w:r>
-      <w:bookmarkEnd w:id="17"/>
-    </w:p>
-    <w:p>
-      <w:pPr>
-        <w:pStyle w:val="ListParagraph"/>
+      <w:bookmarkEnd w:id="29"/>
+      <w:r>
+        <w:tab/>
+      </w:r>
+    </w:p>
+    <w:p>
+      <w:pPr>
+        <w:pStyle w:val="Heading4"/>
         <w:numPr>
-          <w:ilvl w:val="2"/>
-          <w:numId w:val="23"/>
+          <w:ilvl w:val="0"/>
+          <w:numId w:val="0"/>
         </w:numPr>
-        <w:ind w:hanging="1080"/>
-        <w:rPr>
-          <w:b/>
-          <w:bCs/>
-          <w:sz w:val="30"/>
-          <w:szCs w:val="30"/>
-        </w:rPr>
-      </w:pPr>
-      <w:r>
-        <w:rPr>
-          <w:b/>
-          <w:bCs/>
-          <w:sz w:val="30"/>
-          <w:szCs w:val="30"/>
-        </w:rPr>
-        <w:t>D</w:t>
-      </w:r>
-      <w:r>
-        <w:rPr>
-          <w:b/>
-          <w:bCs/>
-          <w:sz w:val="30"/>
-          <w:szCs w:val="30"/>
-        </w:rPr>
-        <w:t>art</w:t>
-      </w:r>
-    </w:p>
-    <w:p>
-      <w:r>
-        <w:t>Dart was a primary coding language as</w:t>
-      </w:r>
-      <w:r>
-        <w:t xml:space="preserve"> Flutter </w:t>
-      </w:r>
-      <w:r>
-        <w:t>was selected as</w:t>
-      </w:r>
-      <w:r>
-        <w:t xml:space="preserve"> the primary framework used for this project, Dart programming language</w:t>
-      </w:r>
-      <w:r>
-        <w:t xml:space="preserve"> powers Flutter and</w:t>
-      </w:r>
-      <w:r>
-        <w:t xml:space="preserve"> will be the primary programming language used for developing the application’s logic and function.</w:t>
-      </w:r>
-    </w:p>
-    <w:p>
-      <w:pPr>
-        <w:pStyle w:val="ListParagraph"/>
+        <w:ind w:left="1080" w:hanging="1080"/>
+      </w:pPr>
+      <w:bookmarkStart w:id="30" w:name="_Toc227649894"/>
+      <w:r>
+        <w:t>4.</w:t>
+      </w:r>
+      <w:r>
+        <w:t>2</w:t>
+      </w:r>
+      <w:r>
+        <w:t>.</w:t>
+      </w:r>
+      <w:r>
+        <w:t>1</w:t>
+      </w:r>
+      <w:r>
+        <w:t xml:space="preserve">. </w:t>
+      </w:r>
+      <w:r>
+        <w:tab/>
+      </w:r>
+      <w:r>
+        <w:t>Firebase</w:t>
+      </w:r>
+      <w:bookmarkEnd w:id="30"/>
+    </w:p>
+    <w:p>
+      <w:pPr>
+        <w:spacing w:line="276" w:lineRule="auto"/>
+      </w:pPr>
+      <w:r>
+        <w:t xml:space="preserve">Firebase is a </w:t>
+      </w:r>
+      <w:proofErr w:type="gramStart"/>
+      <w:r>
+        <w:t>bac</w:t>
+      </w:r>
+      <w:r>
+        <w:t>k-</w:t>
+      </w:r>
+      <w:r>
+        <w:t>end</w:t>
+      </w:r>
+      <w:proofErr w:type="gramEnd"/>
+      <w:r>
+        <w:t xml:space="preserve"> as a service product that provides services such as cloud storage and authentication solution. It is chosen as this project’s back-end service, specifically used for authentication solution and authentication solution only. The reason of choosing Firebase as </w:t>
+      </w:r>
+      <w:r>
+        <w:lastRenderedPageBreak/>
+        <w:t>the service provider is that Flutter provides a library to support the implementation of Firebase API such as registering new user and verifying email address.</w:t>
+      </w:r>
+    </w:p>
+    <w:p>
+      <w:pPr>
+        <w:pStyle w:val="Heading4"/>
         <w:numPr>
-          <w:ilvl w:val="2"/>
-          <w:numId w:val="23"/>
+          <w:ilvl w:val="0"/>
+          <w:numId w:val="0"/>
         </w:numPr>
-        <w:ind w:hanging="1080"/>
-        <w:rPr>
-          <w:b/>
-          <w:bCs/>
-          <w:sz w:val="30"/>
-          <w:szCs w:val="30"/>
-        </w:rPr>
-      </w:pPr>
-      <w:r>
-        <w:rPr>
-          <w:b/>
-          <w:bCs/>
-          <w:sz w:val="30"/>
-          <w:szCs w:val="30"/>
-        </w:rPr>
+        <w:ind w:left="1080" w:hanging="1080"/>
+      </w:pPr>
+      <w:bookmarkStart w:id="31" w:name="_Toc227649895"/>
+      <w:r>
+        <w:t>4.</w:t>
+      </w:r>
+      <w:r>
+        <w:t>2.2</w:t>
+      </w:r>
+      <w:r>
+        <w:t xml:space="preserve">. </w:t>
+      </w:r>
+      <w:r>
+        <w:tab/>
         <w:t>Python</w:t>
       </w:r>
-    </w:p>
-    <w:p>
-      <w:r>
-        <w:t xml:space="preserve">Python is chosen as this project’s primary language for writing the back-end functionality such as training the AI model and creating API. Python is chosen due to its large </w:t>
-      </w:r>
-      <w:r>
-        <w:t>number</w:t>
-      </w:r>
-      <w:r>
-        <w:t xml:space="preserve"> of libraries and simplicity to implement a certain function. It is able to provide the team specific library to tackle with each for the listed problem, for instance </w:t>
-      </w:r>
-      <w:r>
-        <w:t>PyTorch and TensorFlow for ML &amp; NN applications and quick prototyping</w:t>
+      <w:r>
+        <w:t>Anywhere</w:t>
+      </w:r>
+      <w:bookmarkEnd w:id="31"/>
+    </w:p>
+    <w:p>
+      <w:pPr>
+        <w:spacing w:line="276" w:lineRule="auto"/>
+      </w:pPr>
+      <w:r>
+        <w:t>PythonAnywhere is a web hosting service based on the Python programming language, and it will be used as this project’s hosting service provider. The reason of choosing PythonAnywhere is that it provides quick and easy solution to host Python related program. It also provides the developers a free plan with limited usage quota to try out the service and it is ideal for testing project prototype. Since the AI model of skin cancer prediction may be heavy and require a lot of processing power, it will not be ideal to run the program directly on the user’s mobile device; instead it shall be run on a server and that the application should send an API request to the server to request for the skin cancer prediction.</w:t>
+      </w:r>
+    </w:p>
+    <w:p>
+      <w:pPr>
+        <w:pStyle w:val="Heading4"/>
+        <w:numPr>
+          <w:ilvl w:val="0"/>
+          <w:numId w:val="0"/>
+        </w:numPr>
+        <w:ind w:left="1080" w:hanging="1080"/>
+      </w:pPr>
+      <w:bookmarkStart w:id="32" w:name="_Toc227649896"/>
+      <w:r>
+        <w:t>4.</w:t>
+      </w:r>
+      <w:r>
+        <w:t>2</w:t>
       </w:r>
       <w:r>
         <w:t>.</w:t>
       </w:r>
+      <w:r>
+        <w:t>3</w:t>
+      </w:r>
+      <w:r>
+        <w:t xml:space="preserve">. </w:t>
+      </w:r>
+      <w:r>
+        <w:tab/>
+      </w:r>
+      <w:r>
+        <w:t>GitHub</w:t>
+      </w:r>
+      <w:bookmarkEnd w:id="32"/>
+    </w:p>
+    <w:p>
+      <w:pPr>
+        <w:spacing w:line="276" w:lineRule="auto"/>
+      </w:pPr>
+      <w:r>
+        <w:t>GitHub is a platform that allows developers to share and manage their code. It uses Git as a version control system to help developers track the changes that has been made to a codebase; and it allows developers to collab and work on the same codebase concurrently and remotely. It is chosen as the team’s collaborative tool as most of the team members are familiar with the functionality of Git itself.</w:t>
+      </w:r>
     </w:p>
     <w:p>
       <w:pPr>
         <w:pStyle w:val="Heading3"/>
-        <w:numPr>
-          <w:ilvl w:val="1"/>
-          <w:numId w:val="23"/>
-        </w:numPr>
-        <w:tabs>
-          <w:tab w:val="left" w:pos="720"/>
-        </w:tabs>
-        <w:spacing w:line="276" w:lineRule="auto"/>
-        <w:ind w:hanging="1080"/>
-      </w:pPr>
-      <w:bookmarkStart w:id="18" w:name="_Toc227646575"/>
-      <w:r>
-        <w:t>Applications and Service</w:t>
-      </w:r>
-      <w:bookmarkEnd w:id="18"/>
-      <w:r>
-        <w:t>s</w:t>
-      </w:r>
-    </w:p>
-    <w:p>
-      <w:pPr>
-        <w:pStyle w:val="ListParagraph"/>
-        <w:numPr>
-          <w:ilvl w:val="2"/>
-          <w:numId w:val="23"/>
-        </w:numPr>
-        <w:spacing w:line="276" w:lineRule="auto"/>
-        <w:ind w:hanging="1080"/>
-        <w:rPr>
-          <w:b/>
-          <w:bCs/>
-          <w:sz w:val="30"/>
-          <w:szCs w:val="30"/>
-        </w:rPr>
-      </w:pPr>
-      <w:r>
-        <w:rPr>
-          <w:b/>
-          <w:bCs/>
-          <w:sz w:val="30"/>
-          <w:szCs w:val="30"/>
-        </w:rPr>
-        <w:t>Firebase</w:t>
-      </w:r>
-    </w:p>
-    <w:p>
-      <w:pPr>
-        <w:spacing w:line="276" w:lineRule="auto"/>
-      </w:pPr>
-      <w:r>
-        <w:t xml:space="preserve">Firebase is a </w:t>
-      </w:r>
-      <w:proofErr w:type="gramStart"/>
-      <w:r>
-        <w:t>bac</w:t>
-      </w:r>
-      <w:r>
-        <w:t>k-</w:t>
-      </w:r>
-      <w:r>
-        <w:t>end</w:t>
-      </w:r>
-      <w:proofErr w:type="gramEnd"/>
-      <w:r>
-        <w:t xml:space="preserve"> as a service product that provides services such as cloud storage and authentication solution. It is chosen as this project’s back-end service, specifically used for authentication solution and authentication solution only. The reason of choosing Firebase as the service provider is that Flutter provides a library to support the implementation of Firebase API such as registering new user and verifying email address.</w:t>
-      </w:r>
-    </w:p>
-    <w:p>
-      <w:pPr>
-        <w:pStyle w:val="ListParagraph"/>
-        <w:numPr>
-          <w:ilvl w:val="2"/>
-          <w:numId w:val="23"/>
-        </w:numPr>
-        <w:spacing w:line="276" w:lineRule="auto"/>
-        <w:ind w:hanging="1080"/>
-        <w:rPr>
-          <w:b/>
-          <w:bCs/>
-          <w:sz w:val="30"/>
-          <w:szCs w:val="30"/>
-        </w:rPr>
-      </w:pPr>
-      <w:r>
-        <w:rPr>
-          <w:b/>
-          <w:bCs/>
-          <w:sz w:val="30"/>
-          <w:szCs w:val="30"/>
-        </w:rPr>
-        <w:t>PythonAnywhere</w:t>
-      </w:r>
-    </w:p>
-    <w:p>
-      <w:pPr>
-        <w:spacing w:line="276" w:lineRule="auto"/>
-      </w:pPr>
-      <w:r>
-        <w:lastRenderedPageBreak/>
-        <w:t>PythonAnywhere is a web hosting service based on the Python programming language, and it will be used as this project’s hosting service provider. The reason of choosing PythonAnywhere is that it provides quick and easy solution to host Python related program. It also provides the developers a free plan with limited usage quota to try out the service and it is ideal for testing project prototype. Since the AI model of skin cancer prediction may be heavy and require a lot of processing power, it will not be ideal to run the program directly on the user’s mobile device; instead it shall be run on a server and that the application should send an API request to the server to request for the skin cancer prediction.</w:t>
-      </w:r>
-    </w:p>
-    <w:p>
-      <w:pPr>
-        <w:pStyle w:val="ListParagraph"/>
-        <w:numPr>
-          <w:ilvl w:val="2"/>
-          <w:numId w:val="23"/>
-        </w:numPr>
-        <w:spacing w:line="276" w:lineRule="auto"/>
-        <w:ind w:hanging="1080"/>
-        <w:rPr>
-          <w:b/>
-          <w:bCs/>
-          <w:sz w:val="30"/>
-          <w:szCs w:val="30"/>
-        </w:rPr>
-      </w:pPr>
-      <w:r>
-        <w:rPr>
-          <w:b/>
-          <w:bCs/>
-          <w:sz w:val="30"/>
-          <w:szCs w:val="30"/>
-        </w:rPr>
-        <w:t>GitHub</w:t>
-      </w:r>
-    </w:p>
-    <w:p>
-      <w:pPr>
-        <w:spacing w:line="276" w:lineRule="auto"/>
-      </w:pPr>
-      <w:r>
-        <w:t>GitHub is a platform that allows developers to share and manage their code. It uses Git as a version control system to help developers track the changes that has been made to a codebase; and it allows developers to collab and work on the same codebase concurrently and remotely. It is chosen as the team’s collaborative tool as most of the team members are familiar with the functionality of Git itself.</w:t>
-      </w:r>
-    </w:p>
-    <w:p>
-      <w:pPr>
-        <w:pStyle w:val="Heading3"/>
-        <w:spacing w:line="276" w:lineRule="auto"/>
-      </w:pPr>
-      <w:bookmarkStart w:id="19" w:name="_Toc227646576"/>
+        <w:spacing w:line="276" w:lineRule="auto"/>
+      </w:pPr>
+      <w:bookmarkStart w:id="33" w:name="_Toc227649897"/>
       <w:r>
         <w:t>4.3</w:t>
       </w:r>
@@ -5812,7 +6650,7 @@
         <w:tab/>
         <w:t>Datasets Details</w:t>
       </w:r>
-      <w:bookmarkEnd w:id="19"/>
+      <w:bookmarkEnd w:id="33"/>
     </w:p>
     <w:p>
       <w:pPr>
@@ -5922,7 +6760,11 @@
         <w:ind w:left="450" w:hanging="450"/>
       </w:pPr>
       <w:r>
-        <w:t>MRA-MIDAS: The Multi-Modal Image Dataset for AI-based Skin Cancer is provided by the Melanoma Research Alliance and is based on 3830 total images acquired from 1290 unique lesions taken using smartphones and dermoscopes, some issues were found with this dataset and were brought up with the Stanford AIMI team, where one of our members maintained an correspondence with them, however no response was received from their end after submission of the list of notable dataset issues.</w:t>
+        <w:t xml:space="preserve">MRA-MIDAS: The Multi-Modal Image Dataset for AI-based Skin Cancer is provided by the Melanoma Research Alliance and is based on 3830 total images acquired from 1290 unique lesions taken using smartphones and dermoscopes, some issues were found with this dataset and were brought up with the Stanford AIMI team, where one of our </w:t>
+      </w:r>
+      <w:r>
+        <w:lastRenderedPageBreak/>
+        <w:t>members maintained an correspondence with them, however no response was received from their end after submission of the list of notable dataset issues.</w:t>
       </w:r>
     </w:p>
     <w:p>
@@ -5939,11 +6781,7 @@
         <w:ind w:left="450" w:hanging="450"/>
       </w:pPr>
       <w:r>
-        <w:t xml:space="preserve">Fitzpatrick 17k Dataset: The Fitzpatrick 17k dataset was gratefully provided to us by Assistant Professor Matt Groh, however after manually reviewing it, we decided against </w:t>
-      </w:r>
-      <w:r>
-        <w:lastRenderedPageBreak/>
-        <w:t>using it as manual extraction of feasible images would have been time-consuming and not worth the effort which would have been better allocated elsewhere.</w:t>
+        <w:t>Fitzpatrick 17k Dataset: The Fitzpatrick 17k dataset was gratefully provided to us by Assistant Professor Matt Groh, however after manually reviewing it, we decided against using it as manual extraction of feasible images would have been time-consuming and not worth the effort which would have been better allocated elsewhere.</w:t>
       </w:r>
     </w:p>
     <w:p>
@@ -5972,18 +6810,18 @@
         <w:pStyle w:val="Heading2"/>
         <w:spacing w:line="276" w:lineRule="auto"/>
       </w:pPr>
-      <w:bookmarkStart w:id="20" w:name="_Toc227646577"/>
+      <w:bookmarkStart w:id="34" w:name="_Toc227649898"/>
       <w:r>
         <w:t>Challenges &amp; Obstacles</w:t>
       </w:r>
-      <w:bookmarkEnd w:id="20"/>
+      <w:bookmarkEnd w:id="34"/>
     </w:p>
     <w:p>
       <w:pPr>
         <w:pStyle w:val="Heading3"/>
         <w:spacing w:line="276" w:lineRule="auto"/>
       </w:pPr>
-      <w:bookmarkStart w:id="21" w:name="_Toc227646578"/>
+      <w:bookmarkStart w:id="35" w:name="_Toc227649899"/>
       <w:r>
         <w:t>5</w:t>
       </w:r>
@@ -6000,7 +6838,7 @@
       <w:r>
         <w:t xml:space="preserve"> &amp; Exploratory Data Analysis [EDA]</w:t>
       </w:r>
-      <w:bookmarkEnd w:id="21"/>
+      <w:bookmarkEnd w:id="35"/>
     </w:p>
     <w:p>
       <w:pPr>
@@ -6100,7 +6938,7 @@
         <w:pStyle w:val="Heading3"/>
         <w:spacing w:line="276" w:lineRule="auto"/>
       </w:pPr>
-      <w:bookmarkStart w:id="22" w:name="_Toc227646579"/>
+      <w:bookmarkStart w:id="36" w:name="_Toc227649900"/>
       <w:r>
         <w:t>5</w:t>
       </w:r>
@@ -6123,7 +6961,7 @@
       <w:r>
         <w:t xml:space="preserve"> Images</w:t>
       </w:r>
-      <w:bookmarkEnd w:id="22"/>
+      <w:bookmarkEnd w:id="36"/>
     </w:p>
     <w:p>
       <w:pPr>
@@ -6149,7 +6987,7 @@
         <w:pStyle w:val="Heading3"/>
         <w:spacing w:line="276" w:lineRule="auto"/>
       </w:pPr>
-      <w:bookmarkStart w:id="23" w:name="_Toc227646580"/>
+      <w:bookmarkStart w:id="37" w:name="_Toc227649901"/>
       <w:r>
         <w:t>5</w:t>
       </w:r>
@@ -6165,7 +7003,7 @@
       <w:r>
         <w:t>Class Imbalance and Training Stability</w:t>
       </w:r>
-      <w:bookmarkEnd w:id="23"/>
+      <w:bookmarkEnd w:id="37"/>
     </w:p>
     <w:p>
       <w:pPr>
@@ -6180,7 +7018,7 @@
         <w:pStyle w:val="Heading3"/>
         <w:spacing w:line="276" w:lineRule="auto"/>
       </w:pPr>
-      <w:bookmarkStart w:id="24" w:name="_Toc227646581"/>
+      <w:bookmarkStart w:id="38" w:name="_Toc227649902"/>
       <w:r>
         <w:t>5</w:t>
       </w:r>
@@ -6196,7 +7034,7 @@
       <w:r>
         <w:t>Dermoscopic vs. Clinical Models</w:t>
       </w:r>
-      <w:bookmarkEnd w:id="24"/>
+      <w:bookmarkEnd w:id="38"/>
     </w:p>
     <w:p>
       <w:pPr>
@@ -6224,7 +7062,7 @@
         <w:pStyle w:val="Heading3"/>
         <w:spacing w:line="276" w:lineRule="auto"/>
       </w:pPr>
-      <w:bookmarkStart w:id="25" w:name="_Toc227646582"/>
+      <w:bookmarkStart w:id="39" w:name="_Toc227649903"/>
       <w:r>
         <w:t>5</w:t>
       </w:r>
@@ -6240,7 +7078,7 @@
       <w:r>
         <w:t>GPU utilization for Model Training</w:t>
       </w:r>
-      <w:bookmarkEnd w:id="25"/>
+      <w:bookmarkEnd w:id="39"/>
     </w:p>
     <w:p>
       <w:pPr>
@@ -6279,14 +7117,14 @@
         <w:pStyle w:val="Heading2"/>
         <w:spacing w:line="276" w:lineRule="auto"/>
       </w:pPr>
-      <w:bookmarkStart w:id="26" w:name="_Toc227646586"/>
+      <w:bookmarkStart w:id="40" w:name="_Toc227649904"/>
       <w:r>
         <w:t xml:space="preserve">Project Management &amp; </w:t>
       </w:r>
       <w:r>
         <w:t>Time Plan</w:t>
       </w:r>
-      <w:bookmarkEnd w:id="26"/>
+      <w:bookmarkEnd w:id="40"/>
       <w:r>
         <w:t xml:space="preserve"> </w:t>
       </w:r>
@@ -6296,7 +7134,7 @@
         <w:pStyle w:val="Heading3"/>
         <w:spacing w:line="276" w:lineRule="auto"/>
       </w:pPr>
-      <w:bookmarkStart w:id="27" w:name="_Toc227646587"/>
+      <w:bookmarkStart w:id="41" w:name="_Toc227649905"/>
       <w:r>
         <w:t>7</w:t>
       </w:r>
@@ -6307,14 +7145,14 @@
         <w:tab/>
         <w:t>Past Events</w:t>
       </w:r>
-      <w:bookmarkEnd w:id="27"/>
+      <w:bookmarkEnd w:id="41"/>
     </w:p>
     <w:p>
       <w:pPr>
         <w:pStyle w:val="Heading3"/>
         <w:spacing w:line="276" w:lineRule="auto"/>
       </w:pPr>
-      <w:bookmarkStart w:id="28" w:name="_Toc227646588"/>
+      <w:bookmarkStart w:id="42" w:name="_Toc227649906"/>
       <w:r>
         <w:t>7</w:t>
       </w:r>
@@ -6325,14 +7163,14 @@
         <w:tab/>
         <w:t>Current Events</w:t>
       </w:r>
-      <w:bookmarkEnd w:id="28"/>
+      <w:bookmarkEnd w:id="42"/>
     </w:p>
     <w:p>
       <w:pPr>
         <w:pStyle w:val="Heading3"/>
         <w:spacing w:line="276" w:lineRule="auto"/>
       </w:pPr>
-      <w:bookmarkStart w:id="29" w:name="_Toc227646589"/>
+      <w:bookmarkStart w:id="43" w:name="_Toc227649907"/>
       <w:r>
         <w:t>7</w:t>
       </w:r>
@@ -6343,7 +7181,7 @@
         <w:tab/>
         <w:t>Future &amp; Planned Events</w:t>
       </w:r>
-      <w:bookmarkEnd w:id="29"/>
+      <w:bookmarkEnd w:id="43"/>
       <w:r>
         <w:br w:type="page"/>
       </w:r>
@@ -6366,11 +7204,11 @@
         <w:pStyle w:val="Heading2"/>
         <w:spacing w:line="276" w:lineRule="auto"/>
       </w:pPr>
-      <w:bookmarkStart w:id="30" w:name="_Toc227646590"/>
+      <w:bookmarkStart w:id="44" w:name="_Toc227649908"/>
       <w:r>
         <w:t>References</w:t>
       </w:r>
-      <w:bookmarkEnd w:id="30"/>
+      <w:bookmarkEnd w:id="44"/>
     </w:p>
     <w:p>
       <w:pPr>
@@ -6823,11 +7661,11 @@
         <w:pStyle w:val="Heading2"/>
         <w:spacing w:line="276" w:lineRule="auto"/>
       </w:pPr>
-      <w:bookmarkStart w:id="31" w:name="_Toc227646591"/>
+      <w:bookmarkStart w:id="45" w:name="_Toc227649909"/>
       <w:r>
         <w:t>Appendix</w:t>
       </w:r>
-      <w:bookmarkEnd w:id="31"/>
+      <w:bookmarkEnd w:id="45"/>
     </w:p>
     <w:p>
       <w:pPr>
@@ -7497,6 +8335,95 @@
     </w:lvl>
   </w:abstractNum>
   <w:abstractNum w:abstractNumId="5" w15:restartNumberingAfterBreak="0">
+    <w:nsid w:val="24E51119"/>
+    <w:multiLevelType w:val="hybridMultilevel"/>
+    <w:tmpl w:val="661A7B0C"/>
+    <w:lvl w:ilvl="0" w:tplc="4409000F">
+      <w:start w:val="1"/>
+      <w:numFmt w:val="decimal"/>
+      <w:lvlText w:val="%1."/>
+      <w:lvlJc w:val="left"/>
+      <w:pPr>
+        <w:ind w:left="720" w:hanging="360"/>
+      </w:pPr>
+      <w:rPr>
+        <w:rFonts w:hint="default"/>
+      </w:rPr>
+    </w:lvl>
+    <w:lvl w:ilvl="1" w:tplc="44090019" w:tentative="1">
+      <w:start w:val="1"/>
+      <w:numFmt w:val="lowerLetter"/>
+      <w:lvlText w:val="%2."/>
+      <w:lvlJc w:val="left"/>
+      <w:pPr>
+        <w:ind w:left="1440" w:hanging="360"/>
+      </w:pPr>
+    </w:lvl>
+    <w:lvl w:ilvl="2" w:tplc="4409001B" w:tentative="1">
+      <w:start w:val="1"/>
+      <w:numFmt w:val="lowerRoman"/>
+      <w:lvlText w:val="%3."/>
+      <w:lvlJc w:val="right"/>
+      <w:pPr>
+        <w:ind w:left="2160" w:hanging="180"/>
+      </w:pPr>
+    </w:lvl>
+    <w:lvl w:ilvl="3" w:tplc="4409000F" w:tentative="1">
+      <w:start w:val="1"/>
+      <w:numFmt w:val="decimal"/>
+      <w:lvlText w:val="%4."/>
+      <w:lvlJc w:val="left"/>
+      <w:pPr>
+        <w:ind w:left="2880" w:hanging="360"/>
+      </w:pPr>
+    </w:lvl>
+    <w:lvl w:ilvl="4" w:tplc="44090019" w:tentative="1">
+      <w:start w:val="1"/>
+      <w:numFmt w:val="lowerLetter"/>
+      <w:lvlText w:val="%5."/>
+      <w:lvlJc w:val="left"/>
+      <w:pPr>
+        <w:ind w:left="3600" w:hanging="360"/>
+      </w:pPr>
+    </w:lvl>
+    <w:lvl w:ilvl="5" w:tplc="4409001B" w:tentative="1">
+      <w:start w:val="1"/>
+      <w:numFmt w:val="lowerRoman"/>
+      <w:lvlText w:val="%6."/>
+      <w:lvlJc w:val="right"/>
+      <w:pPr>
+        <w:ind w:left="4320" w:hanging="180"/>
+      </w:pPr>
+    </w:lvl>
+    <w:lvl w:ilvl="6" w:tplc="4409000F" w:tentative="1">
+      <w:start w:val="1"/>
+      <w:numFmt w:val="decimal"/>
+      <w:lvlText w:val="%7."/>
+      <w:lvlJc w:val="left"/>
+      <w:pPr>
+        <w:ind w:left="5040" w:hanging="360"/>
+      </w:pPr>
+    </w:lvl>
+    <w:lvl w:ilvl="7" w:tplc="44090019" w:tentative="1">
+      <w:start w:val="1"/>
+      <w:numFmt w:val="lowerLetter"/>
+      <w:lvlText w:val="%8."/>
+      <w:lvlJc w:val="left"/>
+      <w:pPr>
+        <w:ind w:left="5760" w:hanging="360"/>
+      </w:pPr>
+    </w:lvl>
+    <w:lvl w:ilvl="8" w:tplc="4409001B" w:tentative="1">
+      <w:start w:val="1"/>
+      <w:numFmt w:val="lowerRoman"/>
+      <w:lvlText w:val="%9."/>
+      <w:lvlJc w:val="right"/>
+      <w:pPr>
+        <w:ind w:left="6480" w:hanging="180"/>
+      </w:pPr>
+    </w:lvl>
+  </w:abstractNum>
+  <w:abstractNum w:abstractNumId="6" w15:restartNumberingAfterBreak="0">
     <w:nsid w:val="28226B57"/>
     <w:multiLevelType w:val="hybridMultilevel"/>
     <w:tmpl w:val="D5BC364C"/>
@@ -7585,7 +8512,7 @@
       </w:pPr>
     </w:lvl>
   </w:abstractNum>
-  <w:abstractNum w:abstractNumId="6" w15:restartNumberingAfterBreak="0">
+  <w:abstractNum w:abstractNumId="7" w15:restartNumberingAfterBreak="0">
     <w:nsid w:val="28405B57"/>
     <w:multiLevelType w:val="hybridMultilevel"/>
     <w:tmpl w:val="8216F2C8"/>
@@ -7697,7 +8624,7 @@
       </w:rPr>
     </w:lvl>
   </w:abstractNum>
-  <w:abstractNum w:abstractNumId="7" w15:restartNumberingAfterBreak="0">
+  <w:abstractNum w:abstractNumId="8" w15:restartNumberingAfterBreak="0">
     <w:nsid w:val="29AF5183"/>
     <w:multiLevelType w:val="hybridMultilevel"/>
     <w:tmpl w:val="2B0E228C"/>
@@ -7786,7 +8713,7 @@
       </w:pPr>
     </w:lvl>
   </w:abstractNum>
-  <w:abstractNum w:abstractNumId="8" w15:restartNumberingAfterBreak="0">
+  <w:abstractNum w:abstractNumId="9" w15:restartNumberingAfterBreak="0">
     <w:nsid w:val="2AA539D2"/>
     <w:multiLevelType w:val="multilevel"/>
     <w:tmpl w:val="EC2E4672"/>
@@ -7899,7 +8826,7 @@
       </w:rPr>
     </w:lvl>
   </w:abstractNum>
-  <w:abstractNum w:abstractNumId="9" w15:restartNumberingAfterBreak="0">
+  <w:abstractNum w:abstractNumId="10" w15:restartNumberingAfterBreak="0">
     <w:nsid w:val="2E3E47AA"/>
     <w:multiLevelType w:val="hybridMultilevel"/>
     <w:tmpl w:val="F4C4B788"/>
@@ -7988,7 +8915,7 @@
       </w:pPr>
     </w:lvl>
   </w:abstractNum>
-  <w:abstractNum w:abstractNumId="10" w15:restartNumberingAfterBreak="0">
+  <w:abstractNum w:abstractNumId="11" w15:restartNumberingAfterBreak="0">
     <w:nsid w:val="38944EA4"/>
     <w:multiLevelType w:val="hybridMultilevel"/>
     <w:tmpl w:val="AAD67C14"/>
@@ -8100,7 +9027,7 @@
       </w:rPr>
     </w:lvl>
   </w:abstractNum>
-  <w:abstractNum w:abstractNumId="11" w15:restartNumberingAfterBreak="0">
+  <w:abstractNum w:abstractNumId="12" w15:restartNumberingAfterBreak="0">
     <w:nsid w:val="3D1D3552"/>
     <w:multiLevelType w:val="multilevel"/>
     <w:tmpl w:val="8BFE283E"/>
@@ -8249,7 +9176,7 @@
       </w:rPr>
     </w:lvl>
   </w:abstractNum>
-  <w:abstractNum w:abstractNumId="12" w15:restartNumberingAfterBreak="0">
+  <w:abstractNum w:abstractNumId="13" w15:restartNumberingAfterBreak="0">
     <w:nsid w:val="3EB26CE6"/>
     <w:multiLevelType w:val="hybridMultilevel"/>
     <w:tmpl w:val="6D5A9D6C"/>
@@ -8338,7 +9265,7 @@
       </w:pPr>
     </w:lvl>
   </w:abstractNum>
-  <w:abstractNum w:abstractNumId="13" w15:restartNumberingAfterBreak="0">
+  <w:abstractNum w:abstractNumId="14" w15:restartNumberingAfterBreak="0">
     <w:nsid w:val="3F531559"/>
     <w:multiLevelType w:val="hybridMultilevel"/>
     <w:tmpl w:val="05A03E6A"/>
@@ -8451,7 +9378,7 @@
       </w:rPr>
     </w:lvl>
   </w:abstractNum>
-  <w:abstractNum w:abstractNumId="14" w15:restartNumberingAfterBreak="0">
+  <w:abstractNum w:abstractNumId="15" w15:restartNumberingAfterBreak="0">
     <w:nsid w:val="40CF0D06"/>
     <w:multiLevelType w:val="hybridMultilevel"/>
     <w:tmpl w:val="9F54ED7A"/>
@@ -8563,7 +9490,7 @@
       </w:rPr>
     </w:lvl>
   </w:abstractNum>
-  <w:abstractNum w:abstractNumId="15" w15:restartNumberingAfterBreak="0">
+  <w:abstractNum w:abstractNumId="16" w15:restartNumberingAfterBreak="0">
     <w:nsid w:val="42822500"/>
     <w:multiLevelType w:val="hybridMultilevel"/>
     <w:tmpl w:val="855A3BC4"/>
@@ -8676,7 +9603,7 @@
       </w:rPr>
     </w:lvl>
   </w:abstractNum>
-  <w:abstractNum w:abstractNumId="16" w15:restartNumberingAfterBreak="0">
+  <w:abstractNum w:abstractNumId="17" w15:restartNumberingAfterBreak="0">
     <w:nsid w:val="44EB257A"/>
     <w:multiLevelType w:val="hybridMultilevel"/>
     <w:tmpl w:val="027A4658"/>
@@ -8762,7 +9689,7 @@
       </w:pPr>
     </w:lvl>
   </w:abstractNum>
-  <w:abstractNum w:abstractNumId="17" w15:restartNumberingAfterBreak="0">
+  <w:abstractNum w:abstractNumId="18" w15:restartNumberingAfterBreak="0">
     <w:nsid w:val="4A7A62E0"/>
     <w:multiLevelType w:val="hybridMultilevel"/>
     <w:tmpl w:val="A880A792"/>
@@ -8875,7 +9802,7 @@
       </w:rPr>
     </w:lvl>
   </w:abstractNum>
-  <w:abstractNum w:abstractNumId="18" w15:restartNumberingAfterBreak="0">
+  <w:abstractNum w:abstractNumId="19" w15:restartNumberingAfterBreak="0">
     <w:nsid w:val="4CDA17E8"/>
     <w:multiLevelType w:val="hybridMultilevel"/>
     <w:tmpl w:val="6E402B14"/>
@@ -8964,7 +9891,7 @@
       </w:pPr>
     </w:lvl>
   </w:abstractNum>
-  <w:abstractNum w:abstractNumId="19" w15:restartNumberingAfterBreak="0">
+  <w:abstractNum w:abstractNumId="20" w15:restartNumberingAfterBreak="0">
     <w:nsid w:val="59F8519C"/>
     <w:multiLevelType w:val="hybridMultilevel"/>
     <w:tmpl w:val="23D8909E"/>
@@ -9053,7 +9980,7 @@
       </w:pPr>
     </w:lvl>
   </w:abstractNum>
-  <w:abstractNum w:abstractNumId="20" w15:restartNumberingAfterBreak="0">
+  <w:abstractNum w:abstractNumId="21" w15:restartNumberingAfterBreak="0">
     <w:nsid w:val="5C416AF1"/>
     <w:multiLevelType w:val="hybridMultilevel"/>
     <w:tmpl w:val="CD0AB6F2"/>
@@ -9165,10 +10092,10 @@
       </w:rPr>
     </w:lvl>
   </w:abstractNum>
-  <w:abstractNum w:abstractNumId="21" w15:restartNumberingAfterBreak="0">
+  <w:abstractNum w:abstractNumId="22" w15:restartNumberingAfterBreak="0">
     <w:nsid w:val="5C9054E2"/>
     <w:multiLevelType w:val="multilevel"/>
-    <w:tmpl w:val="6F384A4A"/>
+    <w:tmpl w:val="DDF243BC"/>
     <w:lvl w:ilvl="0">
       <w:start w:val="1"/>
       <w:numFmt w:val="decimal"/>
@@ -9197,6 +10124,7 @@
     <w:lvl w:ilvl="2">
       <w:start w:val="1"/>
       <w:numFmt w:val="decimal"/>
+      <w:pStyle w:val="Heading4"/>
       <w:isLgl/>
       <w:lvlText w:val="%1.%2.%3"/>
       <w:lvlJc w:val="left"/>
@@ -9290,7 +10218,7 @@
       </w:rPr>
     </w:lvl>
   </w:abstractNum>
-  <w:abstractNum w:abstractNumId="22" w15:restartNumberingAfterBreak="0">
+  <w:abstractNum w:abstractNumId="23" w15:restartNumberingAfterBreak="0">
     <w:nsid w:val="60F96E99"/>
     <w:multiLevelType w:val="hybridMultilevel"/>
     <w:tmpl w:val="C0A40084"/>
@@ -9379,7 +10307,7 @@
       </w:pPr>
     </w:lvl>
   </w:abstractNum>
-  <w:abstractNum w:abstractNumId="23" w15:restartNumberingAfterBreak="0">
+  <w:abstractNum w:abstractNumId="24" w15:restartNumberingAfterBreak="0">
     <w:nsid w:val="629D7DD8"/>
     <w:multiLevelType w:val="hybridMultilevel"/>
     <w:tmpl w:val="538A5500"/>
@@ -9492,7 +10420,7 @@
       </w:rPr>
     </w:lvl>
   </w:abstractNum>
-  <w:abstractNum w:abstractNumId="24" w15:restartNumberingAfterBreak="0">
+  <w:abstractNum w:abstractNumId="25" w15:restartNumberingAfterBreak="0">
     <w:nsid w:val="63B73DCB"/>
     <w:multiLevelType w:val="hybridMultilevel"/>
     <w:tmpl w:val="70C6C83A"/>
@@ -9604,7 +10532,7 @@
       </w:rPr>
     </w:lvl>
   </w:abstractNum>
-  <w:abstractNum w:abstractNumId="25" w15:restartNumberingAfterBreak="0">
+  <w:abstractNum w:abstractNumId="26" w15:restartNumberingAfterBreak="0">
     <w:nsid w:val="6422414F"/>
     <w:multiLevelType w:val="hybridMultilevel"/>
     <w:tmpl w:val="667041EA"/>
@@ -9693,7 +10621,7 @@
       </w:pPr>
     </w:lvl>
   </w:abstractNum>
-  <w:abstractNum w:abstractNumId="26" w15:restartNumberingAfterBreak="0">
+  <w:abstractNum w:abstractNumId="27" w15:restartNumberingAfterBreak="0">
     <w:nsid w:val="67271D44"/>
     <w:multiLevelType w:val="hybridMultilevel"/>
     <w:tmpl w:val="551C9252"/>
@@ -9782,7 +10710,7 @@
       </w:pPr>
     </w:lvl>
   </w:abstractNum>
-  <w:abstractNum w:abstractNumId="27" w15:restartNumberingAfterBreak="0">
+  <w:abstractNum w:abstractNumId="28" w15:restartNumberingAfterBreak="0">
     <w:nsid w:val="67D6578A"/>
     <w:multiLevelType w:val="hybridMultilevel"/>
     <w:tmpl w:val="EE640D16"/>
@@ -9871,7 +10799,7 @@
       </w:pPr>
     </w:lvl>
   </w:abstractNum>
-  <w:abstractNum w:abstractNumId="28" w15:restartNumberingAfterBreak="0">
+  <w:abstractNum w:abstractNumId="29" w15:restartNumberingAfterBreak="0">
     <w:nsid w:val="68932351"/>
     <w:multiLevelType w:val="hybridMultilevel"/>
     <w:tmpl w:val="F8B4B71A"/>
@@ -9986,7 +10914,7 @@
       </w:rPr>
     </w:lvl>
   </w:abstractNum>
-  <w:abstractNum w:abstractNumId="29" w15:restartNumberingAfterBreak="0">
+  <w:abstractNum w:abstractNumId="30" w15:restartNumberingAfterBreak="0">
     <w:nsid w:val="70DF70C4"/>
     <w:multiLevelType w:val="hybridMultilevel"/>
     <w:tmpl w:val="A0C2BCFA"/>
@@ -10075,7 +11003,7 @@
       </w:pPr>
     </w:lvl>
   </w:abstractNum>
-  <w:abstractNum w:abstractNumId="30" w15:restartNumberingAfterBreak="0">
+  <w:abstractNum w:abstractNumId="31" w15:restartNumberingAfterBreak="0">
     <w:nsid w:val="73F00399"/>
     <w:multiLevelType w:val="hybridMultilevel"/>
     <w:tmpl w:val="8C18E526"/>
@@ -10188,7 +11116,7 @@
       </w:rPr>
     </w:lvl>
   </w:abstractNum>
-  <w:abstractNum w:abstractNumId="31" w15:restartNumberingAfterBreak="0">
+  <w:abstractNum w:abstractNumId="32" w15:restartNumberingAfterBreak="0">
     <w:nsid w:val="76921010"/>
     <w:multiLevelType w:val="hybridMultilevel"/>
     <w:tmpl w:val="774E685A"/>
@@ -10303,7 +11231,7 @@
       </w:rPr>
     </w:lvl>
   </w:abstractNum>
-  <w:abstractNum w:abstractNumId="32" w15:restartNumberingAfterBreak="0">
+  <w:abstractNum w:abstractNumId="33" w15:restartNumberingAfterBreak="0">
     <w:nsid w:val="770E2803"/>
     <w:multiLevelType w:val="hybridMultilevel"/>
     <w:tmpl w:val="030E71F0"/>
@@ -10416,7 +11344,7 @@
       </w:rPr>
     </w:lvl>
   </w:abstractNum>
-  <w:abstractNum w:abstractNumId="33" w15:restartNumberingAfterBreak="0">
+  <w:abstractNum w:abstractNumId="34" w15:restartNumberingAfterBreak="0">
     <w:nsid w:val="7A0C5E08"/>
     <w:multiLevelType w:val="hybridMultilevel"/>
     <w:tmpl w:val="3DE85C4E"/>
@@ -10529,7 +11457,7 @@
       </w:rPr>
     </w:lvl>
   </w:abstractNum>
-  <w:abstractNum w:abstractNumId="34" w15:restartNumberingAfterBreak="0">
+  <w:abstractNum w:abstractNumId="35" w15:restartNumberingAfterBreak="0">
     <w:nsid w:val="7E9020A9"/>
     <w:multiLevelType w:val="hybridMultilevel"/>
     <w:tmpl w:val="4A84234E"/>
@@ -10618,7 +11546,7 @@
       </w:pPr>
     </w:lvl>
   </w:abstractNum>
-  <w:abstractNum w:abstractNumId="35" w15:restartNumberingAfterBreak="0">
+  <w:abstractNum w:abstractNumId="36" w15:restartNumberingAfterBreak="0">
     <w:nsid w:val="7FC861B9"/>
     <w:multiLevelType w:val="hybridMultilevel"/>
     <w:tmpl w:val="EC2CDBDC"/>
@@ -10708,112 +11636,115 @@
     </w:lvl>
   </w:abstractNum>
   <w:num w:numId="1" w16cid:durableId="2064712393">
-    <w:abstractNumId w:val="12"/>
+    <w:abstractNumId w:val="13"/>
   </w:num>
   <w:num w:numId="2" w16cid:durableId="982613840">
-    <w:abstractNumId w:val="29"/>
+    <w:abstractNumId w:val="30"/>
   </w:num>
   <w:num w:numId="3" w16cid:durableId="34696722">
     <w:abstractNumId w:val="4"/>
   </w:num>
   <w:num w:numId="4" w16cid:durableId="979724115">
-    <w:abstractNumId w:val="35"/>
+    <w:abstractNumId w:val="36"/>
   </w:num>
   <w:num w:numId="5" w16cid:durableId="516575690">
-    <w:abstractNumId w:val="16"/>
+    <w:abstractNumId w:val="17"/>
   </w:num>
   <w:num w:numId="6" w16cid:durableId="807745686">
     <w:abstractNumId w:val="1"/>
   </w:num>
   <w:num w:numId="7" w16cid:durableId="1520049316">
-    <w:abstractNumId w:val="33"/>
+    <w:abstractNumId w:val="34"/>
   </w:num>
   <w:num w:numId="8" w16cid:durableId="198973599">
+    <w:abstractNumId w:val="9"/>
+  </w:num>
+  <w:num w:numId="9" w16cid:durableId="1177623024">
+    <w:abstractNumId w:val="28"/>
+  </w:num>
+  <w:num w:numId="10" w16cid:durableId="511070537">
+    <w:abstractNumId w:val="23"/>
+  </w:num>
+  <w:num w:numId="11" w16cid:durableId="784427824">
+    <w:abstractNumId w:val="27"/>
+  </w:num>
+  <w:num w:numId="12" w16cid:durableId="1457140122">
     <w:abstractNumId w:val="8"/>
   </w:num>
-  <w:num w:numId="9" w16cid:durableId="1177623024">
-    <w:abstractNumId w:val="27"/>
-  </w:num>
-  <w:num w:numId="10" w16cid:durableId="511070537">
-    <w:abstractNumId w:val="22"/>
-  </w:num>
-  <w:num w:numId="11" w16cid:durableId="784427824">
-    <w:abstractNumId w:val="26"/>
-  </w:num>
-  <w:num w:numId="12" w16cid:durableId="1457140122">
-    <w:abstractNumId w:val="7"/>
-  </w:num>
   <w:num w:numId="13" w16cid:durableId="1692686484">
-    <w:abstractNumId w:val="30"/>
+    <w:abstractNumId w:val="31"/>
   </w:num>
   <w:num w:numId="14" w16cid:durableId="1897155767">
-    <w:abstractNumId w:val="15"/>
+    <w:abstractNumId w:val="16"/>
   </w:num>
   <w:num w:numId="15" w16cid:durableId="370228397">
-    <w:abstractNumId w:val="11"/>
+    <w:abstractNumId w:val="12"/>
   </w:num>
   <w:num w:numId="16" w16cid:durableId="1930963845">
     <w:abstractNumId w:val="0"/>
   </w:num>
   <w:num w:numId="17" w16cid:durableId="1342272576">
-    <w:abstractNumId w:val="24"/>
+    <w:abstractNumId w:val="25"/>
   </w:num>
   <w:num w:numId="18" w16cid:durableId="182745335">
-    <w:abstractNumId w:val="10"/>
+    <w:abstractNumId w:val="11"/>
   </w:num>
   <w:num w:numId="19" w16cid:durableId="1896819236">
-    <w:abstractNumId w:val="20"/>
+    <w:abstractNumId w:val="21"/>
   </w:num>
   <w:num w:numId="20" w16cid:durableId="1344630814">
-    <w:abstractNumId w:val="14"/>
+    <w:abstractNumId w:val="15"/>
   </w:num>
   <w:num w:numId="21" w16cid:durableId="154348362">
-    <w:abstractNumId w:val="6"/>
+    <w:abstractNumId w:val="7"/>
   </w:num>
   <w:num w:numId="22" w16cid:durableId="1093937543">
-    <w:abstractNumId w:val="25"/>
+    <w:abstractNumId w:val="26"/>
   </w:num>
   <w:num w:numId="23" w16cid:durableId="742989385">
-    <w:abstractNumId w:val="21"/>
+    <w:abstractNumId w:val="22"/>
   </w:num>
   <w:num w:numId="24" w16cid:durableId="1092820407">
-    <w:abstractNumId w:val="18"/>
+    <w:abstractNumId w:val="19"/>
   </w:num>
   <w:num w:numId="25" w16cid:durableId="1203713366">
-    <w:abstractNumId w:val="5"/>
+    <w:abstractNumId w:val="6"/>
   </w:num>
   <w:num w:numId="26" w16cid:durableId="1350136993">
     <w:abstractNumId w:val="2"/>
   </w:num>
   <w:num w:numId="27" w16cid:durableId="1589270320">
-    <w:abstractNumId w:val="19"/>
+    <w:abstractNumId w:val="20"/>
   </w:num>
   <w:num w:numId="28" w16cid:durableId="1025403573">
-    <w:abstractNumId w:val="17"/>
+    <w:abstractNumId w:val="18"/>
   </w:num>
   <w:num w:numId="29" w16cid:durableId="21789852">
-    <w:abstractNumId w:val="28"/>
+    <w:abstractNumId w:val="29"/>
   </w:num>
   <w:num w:numId="30" w16cid:durableId="1454862240">
-    <w:abstractNumId w:val="23"/>
+    <w:abstractNumId w:val="24"/>
   </w:num>
   <w:num w:numId="31" w16cid:durableId="173737922">
-    <w:abstractNumId w:val="31"/>
+    <w:abstractNumId w:val="32"/>
   </w:num>
   <w:num w:numId="32" w16cid:durableId="1350176460">
-    <w:abstractNumId w:val="32"/>
+    <w:abstractNumId w:val="33"/>
   </w:num>
   <w:num w:numId="33" w16cid:durableId="1992562078">
-    <w:abstractNumId w:val="13"/>
+    <w:abstractNumId w:val="14"/>
   </w:num>
   <w:num w:numId="34" w16cid:durableId="906451187">
     <w:abstractNumId w:val="3"/>
   </w:num>
   <w:num w:numId="35" w16cid:durableId="1425036502">
-    <w:abstractNumId w:val="9"/>
+    <w:abstractNumId w:val="10"/>
   </w:num>
   <w:num w:numId="36" w16cid:durableId="1461538051">
-    <w:abstractNumId w:val="34"/>
+    <w:abstractNumId w:val="35"/>
+  </w:num>
+  <w:num w:numId="37" w16cid:durableId="406197350">
+    <w:abstractNumId w:val="5"/>
   </w:num>
 </w:numbering>
 </file>
@@ -11282,6 +12213,31 @@
       <w:rFonts w:eastAsiaTheme="majorEastAsia" w:cstheme="majorBidi"/>
       <w:b/>
       <w:sz w:val="34"/>
+    </w:rPr>
+  </w:style>
+  <w:style w:type="paragraph" w:styleId="Heading4">
+    <w:name w:val="heading 4"/>
+    <w:basedOn w:val="ListParagraph"/>
+    <w:next w:val="Normal"/>
+    <w:link w:val="Heading4Char"/>
+    <w:uiPriority w:val="9"/>
+    <w:unhideWhenUsed/>
+    <w:qFormat/>
+    <w:rsid w:val="00281E82"/>
+    <w:pPr>
+      <w:numPr>
+        <w:ilvl w:val="2"/>
+        <w:numId w:val="23"/>
+      </w:numPr>
+      <w:spacing w:line="276" w:lineRule="auto"/>
+      <w:ind w:hanging="1080"/>
+      <w:outlineLvl w:val="3"/>
+    </w:pPr>
+    <w:rPr>
+      <w:b/>
+      <w:bCs/>
+      <w:sz w:val="30"/>
+      <w:szCs w:val="30"/>
     </w:rPr>
   </w:style>
   <w:style w:type="character" w:default="1" w:styleId="DefaultParagraphFont">
@@ -11904,6 +12860,34 @@
       <w:lang w:val="en-GB"/>
     </w:rPr>
   </w:style>
+  <w:style w:type="character" w:customStyle="1" w:styleId="Heading4Char">
+    <w:name w:val="Heading 4 Char"/>
+    <w:basedOn w:val="DefaultParagraphFont"/>
+    <w:link w:val="Heading4"/>
+    <w:uiPriority w:val="9"/>
+    <w:rsid w:val="00281E82"/>
+    <w:rPr>
+      <w:rFonts w:ascii="Cambria" w:eastAsia="Times New Roman" w:hAnsi="Cambria"/>
+      <w:b/>
+      <w:bCs/>
+      <w:sz w:val="30"/>
+      <w:szCs w:val="30"/>
+      <w:lang w:val="en-GB"/>
+    </w:rPr>
+  </w:style>
+  <w:style w:type="paragraph" w:styleId="TOC4">
+    <w:name w:val="toc 4"/>
+    <w:basedOn w:val="Normal"/>
+    <w:next w:val="Normal"/>
+    <w:autoRedefine/>
+    <w:uiPriority w:val="39"/>
+    <w:unhideWhenUsed/>
+    <w:rsid w:val="00E14EC6"/>
+    <w:pPr>
+      <w:spacing w:after="100"/>
+      <w:ind w:left="720"/>
+    </w:pPr>
+  </w:style>
 </w:styles>
 </file>
 
@@ -12203,17 +13187,136 @@
 </file>
 
 <file path=customXml/item1.xml><?xml version="1.0" encoding="utf-8"?>
-<p:properties xmlns:p="http://schemas.microsoft.com/office/2006/metadata/properties" xmlns:xsi="http://www.w3.org/2001/XMLSchema-instance" xmlns:pc="http://schemas.microsoft.com/office/infopath/2007/PartnerControls">
-  <documentManagement>
-    <lcf76f155ced4ddcb4097134ff3c332f xmlns="faf62b20-c8da-4daa-956c-e9ab12c67244">
-      <Terms xmlns="http://schemas.microsoft.com/office/infopath/2007/PartnerControls"/>
-    </lcf76f155ced4ddcb4097134ff3c332f>
-    <TaxCatchAll xmlns="df7d1a9d-cedb-4395-b476-da0cf3f51f11" xsi:nil="true"/>
-  </documentManagement>
-</p:properties>
+<b:Sources xmlns:b="http://schemas.openxmlformats.org/officeDocument/2006/bibliography" xmlns="http://schemas.openxmlformats.org/officeDocument/2006/bibliography" SelectedStyle="\IEEE2006OfficeOnline.xsl" StyleName="IEEE" Version="2006">
+  <b:Source>
+    <b:Tag>Gab23</b:Tag>
+    <b:SourceType>DocumentFromInternetSite</b:SourceType>
+    <b:Guid>{B510A10F-C43F-4F4B-BA69-262A24BFED3B}</b:Guid>
+    <b:Author>
+      <b:Author>
+        <b:NameList>
+          <b:Person>
+            <b:Last>Gabriella Brancaccio</b:Last>
+            <b:First>Anna</b:First>
+            <b:Middle>Balato, Josep Malvehy, Susana Puig, Giuseppe Argenziano, Harald Kittler</b:Middle>
+          </b:Person>
+        </b:NameList>
+      </b:Author>
+    </b:Author>
+    <b:Title>Artificial Intelligence in Skin Cancer Diagnosis: A Reality Check</b:Title>
+    <b:Year>2023</b:Year>
+    <b:Month>February</b:Month>
+    <b:Day>21</b:Day>
+    <b:YearAccessed>2025</b:YearAccessed>
+    <b:MonthAccessed>December</b:MonthAccessed>
+    <b:DayAccessed>11</b:DayAccessed>
+    <b:URL>https://doi.org/10.1016/j.jid.2023.10.004</b:URL>
+    <b:RefOrder>2</b:RefOrder>
+  </b:Source>
+  <b:Source>
+    <b:Tag>Mah24</b:Tag>
+    <b:SourceType>DocumentFromInternetSite</b:SourceType>
+    <b:Guid>{A3644326-68D3-48F4-904D-1D1F00621CB5}</b:Guid>
+    <b:Author>
+      <b:Author>
+        <b:NameList>
+          <b:Person>
+            <b:Last>Mahmoud</b:Last>
+            <b:First>N.M.,</b:First>
+            <b:Middle>Soliman, A.M.</b:Middle>
+          </b:Person>
+        </b:NameList>
+      </b:Author>
+    </b:Author>
+    <b:Title>Early automated detection system for skin cancer diagnosis using artificial intelligent techniques.</b:Title>
+    <b:Year>2024</b:Year>
+    <b:Month>April</b:Month>
+    <b:Day>28</b:Day>
+    <b:YearAccessed>2025</b:YearAccessed>
+    <b:MonthAccessed>December</b:MonthAccessed>
+    <b:DayAccessed>11</b:DayAccessed>
+    <b:URL>https://doi.org/10.1038/s41598-024-59783-0</b:URL>
+    <b:RefOrder>1</b:RefOrder>
+  </b:Source>
+  <b:Source>
+    <b:Tag>Shi24</b:Tag>
+    <b:SourceType>DocumentFromInternetSite</b:SourceType>
+    <b:Guid>{8EFD7C5D-8503-4E24-82AC-464345958DF4}</b:Guid>
+    <b:Author>
+      <b:Author>
+        <b:NameList>
+          <b:Person>
+            <b:Last>Shifai</b:Last>
+            <b:First>Naweed</b:First>
+            <b:Middle>et al.</b:Middle>
+          </b:Person>
+        </b:NameList>
+      </b:Author>
+    </b:Author>
+    <b:Title>Can ChatGPT vision diagnose melanoma? An exploratory diagnostic accuracy study</b:Title>
+    <b:Year>2024</b:Year>
+    <b:Month>January</b:Month>
+    <b:Day>18</b:Day>
+    <b:YearAccessed>2025</b:YearAccessed>
+    <b:MonthAccessed>December</b:MonthAccessed>
+    <b:DayAccessed>11</b:DayAccessed>
+    <b:URL>https://doi.org/10.1016/j.jaad.2023.12.062</b:URL>
+    <b:RefOrder>3</b:RefOrder>
+  </b:Source>
+  <b:Source>
+    <b:Tag>Sat25</b:Tag>
+    <b:SourceType>DocumentFromInternetSite</b:SourceType>
+    <b:Guid>{4480987A-0D96-4140-8A88-2D7DB9AED7BF}</b:Guid>
+    <b:Author>
+      <b:Author>
+        <b:NameList>
+          <b:Person>
+            <b:Last>Sattler SS</b:Last>
+            <b:First>Chetla</b:First>
+            <b:Middle>N, Chen M, Hage TR, Chang J, Guo WY, Hugh J.</b:Middle>
+          </b:Person>
+        </b:NameList>
+      </b:Author>
+    </b:Author>
+    <b:Title>Evaluating the Diagnostic Accuracy of ChatGPT-4 Omni and ChatGPT-4 Turbo in Identifying Melanoma: Comparative Study.</b:Title>
+    <b:Year>2025</b:Year>
+    <b:Month>March</b:Month>
+    <b:Day>21</b:Day>
+    <b:YearAccessed>2025</b:YearAccessed>
+    <b:MonthAccessed>December</b:MonthAccessed>
+    <b:DayAccessed>11</b:DayAccessed>
+    <b:URL>https://doi.org/10.2196/67551</b:URL>
+    <b:RefOrder>4</b:RefOrder>
+  </b:Source>
+  <b:Source>
+    <b:Tag>Cen25</b:Tag>
+    <b:SourceType>ElectronicSource</b:SourceType>
+    <b:Guid>{826A5052-6773-4142-90F9-547D307FC804}</b:Guid>
+    <b:Title>MRA-MIDAS: Multimodal Image Dataset for AI-based Skin Cancer</b:Title>
+    <b:Year>2025</b:Year>
+    <b:URL>https://doi.org/10.71718/15nz-jv40</b:URL>
+    <b:Author>
+      <b:Author>
+        <b:Corporate>Center for Artificial Intelligence in Medicine &amp; Imaging | Stanford University</b:Corporate>
+      </b:Author>
+    </b:Author>
+    <b:City>Stanford</b:City>
+    <b:Publisher>Stanford University</b:Publisher>
+    <b:RefOrder>5</b:RefOrder>
+  </b:Source>
+</b:Sources>
 </file>
 
 <file path=customXml/item2.xml><?xml version="1.0" encoding="utf-8"?>
+<?mso-contentType ?>
+<FormTemplates xmlns="http://schemas.microsoft.com/sharepoint/v3/contenttype/forms">
+  <Display>DocumentLibraryForm</Display>
+  <Edit>DocumentLibraryForm</Edit>
+  <New>DocumentLibraryForm</New>
+</FormTemplates>
+</file>
+
+<file path=customXml/item3.xml><?xml version="1.0" encoding="utf-8"?>
 <ct:contentTypeSchema xmlns:ct="http://schemas.microsoft.com/office/2006/metadata/contentType" xmlns:ma="http://schemas.microsoft.com/office/2006/metadata/properties/metaAttributes" ct:_="" ma:_="" ma:contentTypeName="Document" ma:contentTypeID="0x0101001BE8E41E6D72074AA98535AADE116969" ma:contentTypeVersion="10" ma:contentTypeDescription="Create a new document." ma:contentTypeScope="" ma:versionID="df07fe4da328925d1a6cde1251b7c4ee">
   <xsd:schema xmlns:xsd="http://www.w3.org/2001/XMLSchema" xmlns:xs="http://www.w3.org/2001/XMLSchema" xmlns:p="http://schemas.microsoft.com/office/2006/metadata/properties" xmlns:ns2="faf62b20-c8da-4daa-956c-e9ab12c67244" xmlns:ns3="df7d1a9d-cedb-4395-b476-da0cf3f51f11" targetNamespace="http://schemas.microsoft.com/office/2006/metadata/properties" ma:root="true" ma:fieldsID="1f5336b85b4ffa83618898e2dbeb5103" ns2:_="" ns3:_="">
     <xsd:import namespace="faf62b20-c8da-4daa-956c-e9ab12c67244"/>
@@ -12402,148 +13505,34 @@
 </ct:contentTypeSchema>
 </file>
 
-<file path=customXml/item3.xml><?xml version="1.0" encoding="utf-8"?>
-<?mso-contentType ?>
-<FormTemplates xmlns="http://schemas.microsoft.com/sharepoint/v3/contenttype/forms">
-  <Display>DocumentLibraryForm</Display>
-  <Edit>DocumentLibraryForm</Edit>
-  <New>DocumentLibraryForm</New>
-</FormTemplates>
-</file>
-
 <file path=customXml/item4.xml><?xml version="1.0" encoding="utf-8"?>
-<b:Sources xmlns:b="http://schemas.openxmlformats.org/officeDocument/2006/bibliography" xmlns="http://schemas.openxmlformats.org/officeDocument/2006/bibliography" SelectedStyle="\IEEE2006OfficeOnline.xsl" StyleName="IEEE" Version="2006">
-  <b:Source>
-    <b:Tag>Gab23</b:Tag>
-    <b:SourceType>DocumentFromInternetSite</b:SourceType>
-    <b:Guid>{B510A10F-C43F-4F4B-BA69-262A24BFED3B}</b:Guid>
-    <b:Author>
-      <b:Author>
-        <b:NameList>
-          <b:Person>
-            <b:Last>Gabriella Brancaccio</b:Last>
-            <b:First>Anna</b:First>
-            <b:Middle>Balato, Josep Malvehy, Susana Puig, Giuseppe Argenziano, Harald Kittler</b:Middle>
-          </b:Person>
-        </b:NameList>
-      </b:Author>
-    </b:Author>
-    <b:Title>Artificial Intelligence in Skin Cancer Diagnosis: A Reality Check</b:Title>
-    <b:Year>2023</b:Year>
-    <b:Month>February</b:Month>
-    <b:Day>21</b:Day>
-    <b:YearAccessed>2025</b:YearAccessed>
-    <b:MonthAccessed>December</b:MonthAccessed>
-    <b:DayAccessed>11</b:DayAccessed>
-    <b:URL>https://doi.org/10.1016/j.jid.2023.10.004</b:URL>
-    <b:RefOrder>2</b:RefOrder>
-  </b:Source>
-  <b:Source>
-    <b:Tag>Mah24</b:Tag>
-    <b:SourceType>DocumentFromInternetSite</b:SourceType>
-    <b:Guid>{A3644326-68D3-48F4-904D-1D1F00621CB5}</b:Guid>
-    <b:Author>
-      <b:Author>
-        <b:NameList>
-          <b:Person>
-            <b:Last>Mahmoud</b:Last>
-            <b:First>N.M.,</b:First>
-            <b:Middle>Soliman, A.M.</b:Middle>
-          </b:Person>
-        </b:NameList>
-      </b:Author>
-    </b:Author>
-    <b:Title>Early automated detection system for skin cancer diagnosis using artificial intelligent techniques.</b:Title>
-    <b:Year>2024</b:Year>
-    <b:Month>April</b:Month>
-    <b:Day>28</b:Day>
-    <b:YearAccessed>2025</b:YearAccessed>
-    <b:MonthAccessed>December</b:MonthAccessed>
-    <b:DayAccessed>11</b:DayAccessed>
-    <b:URL>https://doi.org/10.1038/s41598-024-59783-0</b:URL>
-    <b:RefOrder>1</b:RefOrder>
-  </b:Source>
-  <b:Source>
-    <b:Tag>Shi24</b:Tag>
-    <b:SourceType>DocumentFromInternetSite</b:SourceType>
-    <b:Guid>{8EFD7C5D-8503-4E24-82AC-464345958DF4}</b:Guid>
-    <b:Author>
-      <b:Author>
-        <b:NameList>
-          <b:Person>
-            <b:Last>Shifai</b:Last>
-            <b:First>Naweed</b:First>
-            <b:Middle>et al.</b:Middle>
-          </b:Person>
-        </b:NameList>
-      </b:Author>
-    </b:Author>
-    <b:Title>Can ChatGPT vision diagnose melanoma? An exploratory diagnostic accuracy study</b:Title>
-    <b:Year>2024</b:Year>
-    <b:Month>January</b:Month>
-    <b:Day>18</b:Day>
-    <b:YearAccessed>2025</b:YearAccessed>
-    <b:MonthAccessed>December</b:MonthAccessed>
-    <b:DayAccessed>11</b:DayAccessed>
-    <b:URL>https://doi.org/10.1016/j.jaad.2023.12.062</b:URL>
-    <b:RefOrder>3</b:RefOrder>
-  </b:Source>
-  <b:Source>
-    <b:Tag>Sat25</b:Tag>
-    <b:SourceType>DocumentFromInternetSite</b:SourceType>
-    <b:Guid>{4480987A-0D96-4140-8A88-2D7DB9AED7BF}</b:Guid>
-    <b:Author>
-      <b:Author>
-        <b:NameList>
-          <b:Person>
-            <b:Last>Sattler SS</b:Last>
-            <b:First>Chetla</b:First>
-            <b:Middle>N, Chen M, Hage TR, Chang J, Guo WY, Hugh J.</b:Middle>
-          </b:Person>
-        </b:NameList>
-      </b:Author>
-    </b:Author>
-    <b:Title>Evaluating the Diagnostic Accuracy of ChatGPT-4 Omni and ChatGPT-4 Turbo in Identifying Melanoma: Comparative Study.</b:Title>
-    <b:Year>2025</b:Year>
-    <b:Month>March</b:Month>
-    <b:Day>21</b:Day>
-    <b:YearAccessed>2025</b:YearAccessed>
-    <b:MonthAccessed>December</b:MonthAccessed>
-    <b:DayAccessed>11</b:DayAccessed>
-    <b:URL>https://doi.org/10.2196/67551</b:URL>
-    <b:RefOrder>4</b:RefOrder>
-  </b:Source>
-  <b:Source>
-    <b:Tag>Cen25</b:Tag>
-    <b:SourceType>ElectronicSource</b:SourceType>
-    <b:Guid>{826A5052-6773-4142-90F9-547D307FC804}</b:Guid>
-    <b:Title>MRA-MIDAS: Multimodal Image Dataset for AI-based Skin Cancer</b:Title>
-    <b:Year>2025</b:Year>
-    <b:URL>https://doi.org/10.71718/15nz-jv40</b:URL>
-    <b:Author>
-      <b:Author>
-        <b:Corporate>Center for Artificial Intelligence in Medicine &amp; Imaging | Stanford University</b:Corporate>
-      </b:Author>
-    </b:Author>
-    <b:City>Stanford</b:City>
-    <b:Publisher>Stanford University</b:Publisher>
-    <b:RefOrder>5</b:RefOrder>
-  </b:Source>
-</b:Sources>
+<p:properties xmlns:p="http://schemas.microsoft.com/office/2006/metadata/properties" xmlns:xsi="http://www.w3.org/2001/XMLSchema-instance" xmlns:pc="http://schemas.microsoft.com/office/infopath/2007/PartnerControls">
+  <documentManagement>
+    <lcf76f155ced4ddcb4097134ff3c332f xmlns="faf62b20-c8da-4daa-956c-e9ab12c67244">
+      <Terms xmlns="http://schemas.microsoft.com/office/infopath/2007/PartnerControls"/>
+    </lcf76f155ced4ddcb4097134ff3c332f>
+    <TaxCatchAll xmlns="df7d1a9d-cedb-4395-b476-da0cf3f51f11" xsi:nil="true"/>
+  </documentManagement>
+</p:properties>
 </file>
 
 <file path=customXml/itemProps1.xml><?xml version="1.0" encoding="utf-8"?>
-<ds:datastoreItem xmlns:ds="http://schemas.openxmlformats.org/officeDocument/2006/customXml" ds:itemID="{44F358D5-0857-467B-88D4-4B358885389C}">
+<ds:datastoreItem xmlns:ds="http://schemas.openxmlformats.org/officeDocument/2006/customXml" ds:itemID="{F0E44BB1-C071-45EF-BD0E-FEE1D61E3AE5}">
   <ds:schemaRefs>
-    <ds:schemaRef ds:uri="http://schemas.microsoft.com/office/2006/metadata/properties"/>
-    <ds:schemaRef ds:uri="http://schemas.microsoft.com/office/infopath/2007/PartnerControls"/>
-    <ds:schemaRef ds:uri="faf62b20-c8da-4daa-956c-e9ab12c67244"/>
-    <ds:schemaRef ds:uri="df7d1a9d-cedb-4395-b476-da0cf3f51f11"/>
+    <ds:schemaRef ds:uri="http://schemas.openxmlformats.org/officeDocument/2006/bibliography"/>
   </ds:schemaRefs>
 </ds:datastoreItem>
 </file>
 
 <file path=customXml/itemProps2.xml><?xml version="1.0" encoding="utf-8"?>
+<ds:datastoreItem xmlns:ds="http://schemas.openxmlformats.org/officeDocument/2006/customXml" ds:itemID="{871B1494-6919-4249-97FB-CB30C389842B}">
+  <ds:schemaRefs>
+    <ds:schemaRef ds:uri="http://schemas.microsoft.com/sharepoint/v3/contenttype/forms"/>
+  </ds:schemaRefs>
+</ds:datastoreItem>
+</file>
+
+<file path=customXml/itemProps3.xml><?xml version="1.0" encoding="utf-8"?>
 <ds:datastoreItem xmlns:ds="http://schemas.openxmlformats.org/officeDocument/2006/customXml" ds:itemID="{3CDB9B22-1B97-427A-8E0D-F18D7251E28D}">
   <ds:schemaRefs>
     <ds:schemaRef ds:uri="http://schemas.microsoft.com/office/2006/metadata/contentType"/>
@@ -12562,18 +13551,13 @@
 </ds:datastoreItem>
 </file>
 
-<file path=customXml/itemProps3.xml><?xml version="1.0" encoding="utf-8"?>
-<ds:datastoreItem xmlns:ds="http://schemas.openxmlformats.org/officeDocument/2006/customXml" ds:itemID="{871B1494-6919-4249-97FB-CB30C389842B}">
+<file path=customXml/itemProps4.xml><?xml version="1.0" encoding="utf-8"?>
+<ds:datastoreItem xmlns:ds="http://schemas.openxmlformats.org/officeDocument/2006/customXml" ds:itemID="{44F358D5-0857-467B-88D4-4B358885389C}">
   <ds:schemaRefs>
-    <ds:schemaRef ds:uri="http://schemas.microsoft.com/sharepoint/v3/contenttype/forms"/>
-  </ds:schemaRefs>
-</ds:datastoreItem>
-</file>
-
-<file path=customXml/itemProps4.xml><?xml version="1.0" encoding="utf-8"?>
-<ds:datastoreItem xmlns:ds="http://schemas.openxmlformats.org/officeDocument/2006/customXml" ds:itemID="{F0E44BB1-C071-45EF-BD0E-FEE1D61E3AE5}">
-  <ds:schemaRefs>
-    <ds:schemaRef ds:uri="http://schemas.openxmlformats.org/officeDocument/2006/bibliography"/>
+    <ds:schemaRef ds:uri="http://schemas.microsoft.com/office/2006/metadata/properties"/>
+    <ds:schemaRef ds:uri="http://schemas.microsoft.com/office/infopath/2007/PartnerControls"/>
+    <ds:schemaRef ds:uri="faf62b20-c8da-4daa-956c-e9ab12c67244"/>
+    <ds:schemaRef ds:uri="df7d1a9d-cedb-4395-b476-da0cf3f51f11"/>
   </ds:schemaRefs>
 </ds:datastoreItem>
 </file>
</xml_diff>

<commit_message>
Doc: Testing & Performance Results Discussion
</commit_message>
<xml_diff>
--- a/FInal-Grp-6.docx
+++ b/FInal-Grp-6.docx
@@ -7575,7 +7575,13 @@
       </w:pPr>
       <w:bookmarkStart w:id="43" w:name="_Toc227699980"/>
       <w:r>
-        <w:t>Technical Stack &amp; Development Decisions</w:t>
+        <w:t>Tech</w:t>
+      </w:r>
+      <w:r>
+        <w:t xml:space="preserve"> Stack</w:t>
+      </w:r>
+      <w:r>
+        <w:t xml:space="preserve"> &amp; Development Decisions</w:t>
       </w:r>
       <w:bookmarkEnd w:id="43"/>
     </w:p>
@@ -7829,11 +7835,6 @@
     </w:p>
     <w:p>
       <w:pPr>
-        <w:spacing w:line="276" w:lineRule="auto"/>
-      </w:pPr>
-    </w:p>
-    <w:p>
-      <w:pPr>
         <w:pStyle w:val="Heading4"/>
         <w:numPr>
           <w:ilvl w:val="0"/>
@@ -7843,7 +7844,6 @@
       </w:pPr>
       <w:bookmarkStart w:id="49" w:name="_Toc227699986"/>
       <w:r>
-        <w:lastRenderedPageBreak/>
         <w:t xml:space="preserve">4.2.2. </w:t>
       </w:r>
       <w:r>
@@ -7857,7 +7857,11 @@
         <w:spacing w:line="276" w:lineRule="auto"/>
       </w:pPr>
       <w:r>
-        <w:t>PythonAnywhere is a web hosting service based on the Python programming language, and it will be used as this project’s hosting service provider. The reason of choosing PythonAnywhere is that it provides quick and easy solution to host Python related program. It also provides the developers a free plan with limited usage quota to try out the service and it is ideal for testing project prototype. Since the AI model of skin cancer prediction may be heavy and require a lot of processing power, it will not be ideal to run the program directly on the user’s mobile device; instead it shall be run on a server and that the application should send an API request to the server to request for the skin cancer prediction.</w:t>
+        <w:t xml:space="preserve">PythonAnywhere is a web hosting service based on the Python programming language, and it will be used as this project’s hosting service provider. The reason of choosing </w:t>
+      </w:r>
+      <w:r>
+        <w:lastRenderedPageBreak/>
+        <w:t>PythonAnywhere is that it provides quick and easy solution to host Python related program. It also provides the developers a free plan with limited usage quota to try out the service and it is ideal for testing project prototype. Since the AI model of skin cancer prediction may be heavy and require a lot of processing power, it will not be ideal to run the program directly on the user’s mobile device; instead it shall be run on a server and that the application should send an API request to the server to request for the skin cancer prediction.</w:t>
       </w:r>
     </w:p>
     <w:p>
@@ -8047,6 +8051,22 @@
     </w:p>
     <w:p>
       <w:pPr>
+        <w:tabs>
+          <w:tab w:val="left" w:pos="540"/>
+        </w:tabs>
+        <w:spacing w:line="276" w:lineRule="auto"/>
+      </w:pPr>
+    </w:p>
+    <w:p>
+      <w:pPr>
+        <w:tabs>
+          <w:tab w:val="left" w:pos="540"/>
+        </w:tabs>
+        <w:spacing w:line="276" w:lineRule="auto"/>
+      </w:pPr>
+    </w:p>
+    <w:p>
+      <w:pPr>
         <w:pStyle w:val="Chapters"/>
         <w:spacing w:line="276" w:lineRule="auto"/>
       </w:pPr>
@@ -8171,28 +8191,7 @@
           <w:sz w:val="30"/>
           <w:szCs w:val="30"/>
         </w:rPr>
-        <w:t>V0.</w:t>
-      </w:r>
-      <w:r>
-        <w:rPr>
-          <w:sz w:val="30"/>
-          <w:szCs w:val="30"/>
-        </w:rPr>
-        <w:t>2</w:t>
-      </w:r>
-      <w:r>
-        <w:rPr>
-          <w:sz w:val="30"/>
-          <w:szCs w:val="30"/>
-        </w:rPr>
-        <w:t xml:space="preserve"> | </w:t>
-      </w:r>
-      <w:r>
-        <w:rPr>
-          <w:sz w:val="30"/>
-          <w:szCs w:val="30"/>
-        </w:rPr>
-        <w:t>Multimodal Implementation</w:t>
+        <w:t>V0.2 | Multimodal Implementation</w:t>
       </w:r>
       <w:bookmarkEnd w:id="55"/>
     </w:p>
@@ -8388,7 +8387,13 @@
       </w:r>
     </w:p>
     <w:p>
-      <w:r>
+      <w:pPr>
+        <w:spacing w:after="0"/>
+      </w:pPr>
+      <w:r>
+        <w:rPr>
+          <w:noProof/>
+        </w:rPr>
         <w:drawing>
           <wp:inline distT="0" distB="0" distL="0" distR="0" wp14:anchorId="08162AD0" wp14:editId="776EE88A">
             <wp:extent cx="5943600" cy="2521585"/>
@@ -8429,6 +8434,7 @@
     <w:p>
       <w:pPr>
         <w:pStyle w:val="Quote"/>
+        <w:spacing w:before="0"/>
         <w:rPr>
           <w:rStyle w:val="SubtleEmphasis"/>
           <w:i/>
@@ -8454,10 +8460,642 @@
     </w:p>
     <w:p>
       <w:r>
+        <w:t xml:space="preserve">The results from V0.2 achieved accuracy results ranging between 81.3%, 86% and 24.8% among all three (3) test sets while the balanced accuracy and F1 scores fluctuated with a variance of </w:t>
+      </w:r>
+      <w:r>
+        <w:t>±</w:t>
+      </w:r>
+      <w:r>
+        <w:t xml:space="preserve">8.36% </w:t>
+      </w:r>
+      <w:r>
+        <w:t>(</w:t>
+      </w:r>
+      <w:r>
+        <w:t>as shown in Fig. X.</w:t>
+      </w:r>
+      <w:r>
+        <w:t xml:space="preserve">). Per-class analysis indicates strong performance across the board with most classes, with slight dips for Melanoma (MEL), Actinic Keratosis (AK) and Squamous Cell Carcinoma (SCC), all with recall metrics at 71%, 56%, 67% respectively, however after referencing back to the literature review, the lowered recall metrics for AK &amp; SCC, </w:t>
+      </w:r>
+      <w:r>
+        <w:t>especially when comparing them against each other makes sense as AK is a pre-cursor/pre-malignant skin lesion which has the potential to mutate in SCC, while MEL’s lower recall can be attributed to the fact that the model may find difficulties when comparing it against Melanocytic Nevi (Moles, NV) due to their visual similarities.</w:t>
+      </w:r>
+    </w:p>
+    <w:p>
+      <w:pPr>
+        <w:spacing w:after="0"/>
+        <w:jc w:val="center"/>
+      </w:pPr>
+      <w:r>
+        <w:rPr>
+          <w:noProof/>
+        </w:rPr>
+        <w:drawing>
+          <wp:inline distT="0" distB="0" distL="0" distR="0" wp14:anchorId="49DCB405" wp14:editId="32F2F989">
+            <wp:extent cx="4309745" cy="1009650"/>
+            <wp:effectExtent l="0" t="0" r="0" b="0"/>
+            <wp:docPr id="746944343" name="Picture 6"/>
+            <wp:cNvGraphicFramePr>
+              <a:graphicFrameLocks xmlns:a="http://schemas.openxmlformats.org/drawingml/2006/main" noChangeAspect="1"/>
+            </wp:cNvGraphicFramePr>
+            <a:graphic xmlns:a="http://schemas.openxmlformats.org/drawingml/2006/main">
+              <a:graphicData uri="http://schemas.openxmlformats.org/drawingml/2006/picture">
+                <pic:pic xmlns:pic="http://schemas.openxmlformats.org/drawingml/2006/picture">
+                  <pic:nvPicPr>
+                    <pic:cNvPr id="0" name="Picture 9"/>
+                    <pic:cNvPicPr>
+                      <a:picLocks noChangeAspect="1" noChangeArrowheads="1"/>
+                    </pic:cNvPicPr>
+                  </pic:nvPicPr>
+                  <pic:blipFill>
+                    <a:blip r:embed="rId13">
+                      <a:extLst>
+                        <a:ext uri="{28A0092B-C50C-407E-A947-70E740481C1C}">
+                          <a14:useLocalDpi xmlns:a14="http://schemas.microsoft.com/office/drawing/2010/main" val="0"/>
+                        </a:ext>
+                      </a:extLst>
+                    </a:blip>
+                    <a:srcRect/>
+                    <a:stretch>
+                      <a:fillRect/>
+                    </a:stretch>
+                  </pic:blipFill>
+                  <pic:spPr bwMode="auto">
+                    <a:xfrm>
+                      <a:off x="0" y="0"/>
+                      <a:ext cx="4309745" cy="1009650"/>
+                    </a:xfrm>
+                    <a:prstGeom prst="rect">
+                      <a:avLst/>
+                    </a:prstGeom>
+                    <a:noFill/>
+                    <a:ln>
+                      <a:noFill/>
+                    </a:ln>
+                  </pic:spPr>
+                </pic:pic>
+              </a:graphicData>
+            </a:graphic>
+          </wp:inline>
+        </w:drawing>
+      </w:r>
+    </w:p>
+    <w:p>
+      <w:pPr>
+        <w:pStyle w:val="Quote"/>
+        <w:spacing w:before="0"/>
+      </w:pPr>
+      <w:r>
+        <w:rPr>
+          <w:rStyle w:val="SubtleEmphasis"/>
+          <w:i/>
+          <w:iCs/>
+        </w:rPr>
+        <w:t xml:space="preserve">Figure X. </w:t>
+      </w:r>
+      <w:r>
+        <w:rPr>
+          <w:rStyle w:val="SubtleEmphasis"/>
+          <w:i/>
+          <w:iCs/>
+        </w:rPr>
+        <w:t>V0.2 Overview of Evaluation Results</w:t>
+      </w:r>
+    </w:p>
+    <w:p/>
+    <w:p>
+      <w:pPr>
+        <w:jc w:val="center"/>
+      </w:pPr>
+      <w:r>
+        <w:rPr>
+          <w:noProof/>
+        </w:rPr>
+        <w:lastRenderedPageBreak/>
+        <w:drawing>
+          <wp:inline distT="0" distB="0" distL="0" distR="0" wp14:anchorId="35BBED09" wp14:editId="05813B1B">
+            <wp:extent cx="3896360" cy="3315970"/>
+            <wp:effectExtent l="0" t="0" r="0" b="8255"/>
+            <wp:docPr id="1634893984" name="Picture 2"/>
+            <wp:cNvGraphicFramePr>
+              <a:graphicFrameLocks xmlns:a="http://schemas.openxmlformats.org/drawingml/2006/main" noChangeAspect="1"/>
+            </wp:cNvGraphicFramePr>
+            <a:graphic xmlns:a="http://schemas.openxmlformats.org/drawingml/2006/main">
+              <a:graphicData uri="http://schemas.openxmlformats.org/drawingml/2006/picture">
+                <pic:pic xmlns:pic="http://schemas.openxmlformats.org/drawingml/2006/picture">
+                  <pic:nvPicPr>
+                    <pic:cNvPr id="0" name="Picture 2"/>
+                    <pic:cNvPicPr>
+                      <a:picLocks noChangeAspect="1" noChangeArrowheads="1"/>
+                    </pic:cNvPicPr>
+                  </pic:nvPicPr>
+                  <pic:blipFill>
+                    <a:blip r:embed="rId14">
+                      <a:extLst>
+                        <a:ext uri="{28A0092B-C50C-407E-A947-70E740481C1C}">
+                          <a14:useLocalDpi xmlns:a14="http://schemas.microsoft.com/office/drawing/2010/main" val="0"/>
+                        </a:ext>
+                      </a:extLst>
+                    </a:blip>
+                    <a:srcRect/>
+                    <a:stretch>
+                      <a:fillRect/>
+                    </a:stretch>
+                  </pic:blipFill>
+                  <pic:spPr bwMode="auto">
+                    <a:xfrm>
+                      <a:off x="0" y="0"/>
+                      <a:ext cx="3896360" cy="3315970"/>
+                    </a:xfrm>
+                    <a:prstGeom prst="rect">
+                      <a:avLst/>
+                    </a:prstGeom>
+                    <a:noFill/>
+                    <a:ln>
+                      <a:noFill/>
+                    </a:ln>
+                  </pic:spPr>
+                </pic:pic>
+              </a:graphicData>
+            </a:graphic>
+          </wp:inline>
+        </w:drawing>
+      </w:r>
+    </w:p>
+    <w:p>
+      <w:pPr>
+        <w:pStyle w:val="Quote"/>
+        <w:spacing w:before="0"/>
+        <w:rPr>
+          <w:rStyle w:val="SubtleEmphasis"/>
+          <w:i/>
+          <w:iCs/>
+          <w:lang w:val="en-MY"/>
+        </w:rPr>
+      </w:pPr>
+      <w:r>
+        <w:rPr>
+          <w:rStyle w:val="SubtleEmphasis"/>
+          <w:i/>
+          <w:iCs/>
+          <w:lang w:val="en-MY"/>
+        </w:rPr>
+        <w:t>Figure X. V0.</w:t>
+      </w:r>
+      <w:r>
+        <w:rPr>
+          <w:rStyle w:val="SubtleEmphasis"/>
+          <w:i/>
+          <w:iCs/>
+          <w:lang w:val="en-MY"/>
+        </w:rPr>
+        <w:t>2</w:t>
+      </w:r>
+      <w:r>
+        <w:rPr>
+          <w:rStyle w:val="SubtleEmphasis"/>
+          <w:i/>
+          <w:iCs/>
+          <w:lang w:val="en-MY"/>
+        </w:rPr>
+        <w:t xml:space="preserve"> Internal Test </w:t>
+      </w:r>
+      <w:r>
+        <w:rPr>
+          <w:rStyle w:val="SubtleEmphasis"/>
+          <w:i/>
+          <w:iCs/>
+          <w:lang w:val="en-MY"/>
+        </w:rPr>
+        <w:t>Results</w:t>
+      </w:r>
+    </w:p>
+    <w:p>
+      <w:r>
+        <w:t>Upon looking at the external test sets, generalizability for the PH</w:t>
+      </w:r>
+      <w:r>
+        <w:rPr>
+          <w:vertAlign w:val="superscript"/>
+        </w:rPr>
+        <w:t>2</w:t>
+      </w:r>
+      <w:r>
+        <w:t xml:space="preserve"> dataset performs strongly with an accuracy of 86%, it is of note that the dataset only contains melanoma and nevus classes, and the model’s ability to generalize across unseen dermoscopic images. </w:t>
+      </w:r>
+      <w:r>
+        <w:t>However,</w:t>
+      </w:r>
+      <w:r>
+        <w:t xml:space="preserve"> the results from the PAD-UFES-20 dataset highlighted a severe domain gap</w:t>
+      </w:r>
+      <w:r>
+        <w:t xml:space="preserve"> where the accuracy dropped to 24.8% accuracy </w:t>
+      </w:r>
+      <w:r>
         <w:rPr>
           <w:highlight w:val="yellow"/>
         </w:rPr>
-        <w:t>[Discuss performance results]</w:t>
+        <w:t>with Fig. X.</w:t>
+      </w:r>
+      <w:r>
+        <w:t xml:space="preserve"> highlighting the confusion matrix visualization of the various misclassifications.</w:t>
+      </w:r>
+    </w:p>
+    <w:p>
+      <w:pPr>
+        <w:jc w:val="center"/>
+      </w:pPr>
+      <w:r>
+        <w:rPr>
+          <w:noProof/>
+        </w:rPr>
+        <w:drawing>
+          <wp:inline distT="0" distB="0" distL="0" distR="0" wp14:anchorId="75082E05" wp14:editId="55DA78DE">
+            <wp:extent cx="5735055" cy="2514600"/>
+            <wp:effectExtent l="0" t="0" r="0" b="0"/>
+            <wp:docPr id="2054369797" name="Picture 5"/>
+            <wp:cNvGraphicFramePr>
+              <a:graphicFrameLocks xmlns:a="http://schemas.openxmlformats.org/drawingml/2006/main" noChangeAspect="1"/>
+            </wp:cNvGraphicFramePr>
+            <a:graphic xmlns:a="http://schemas.openxmlformats.org/drawingml/2006/main">
+              <a:graphicData uri="http://schemas.openxmlformats.org/drawingml/2006/picture">
+                <pic:pic xmlns:pic="http://schemas.openxmlformats.org/drawingml/2006/picture">
+                  <pic:nvPicPr>
+                    <pic:cNvPr id="0" name="Picture 8"/>
+                    <pic:cNvPicPr>
+                      <a:picLocks noChangeAspect="1" noChangeArrowheads="1"/>
+                    </pic:cNvPicPr>
+                  </pic:nvPicPr>
+                  <pic:blipFill>
+                    <a:blip r:embed="rId15">
+                      <a:extLst>
+                        <a:ext uri="{28A0092B-C50C-407E-A947-70E740481C1C}">
+                          <a14:useLocalDpi xmlns:a14="http://schemas.microsoft.com/office/drawing/2010/main" val="0"/>
+                        </a:ext>
+                      </a:extLst>
+                    </a:blip>
+                    <a:srcRect/>
+                    <a:stretch>
+                      <a:fillRect/>
+                    </a:stretch>
+                  </pic:blipFill>
+                  <pic:spPr bwMode="auto">
+                    <a:xfrm>
+                      <a:off x="0" y="0"/>
+                      <a:ext cx="5750992" cy="2521588"/>
+                    </a:xfrm>
+                    <a:prstGeom prst="rect">
+                      <a:avLst/>
+                    </a:prstGeom>
+                    <a:noFill/>
+                    <a:ln>
+                      <a:noFill/>
+                    </a:ln>
+                  </pic:spPr>
+                </pic:pic>
+              </a:graphicData>
+            </a:graphic>
+          </wp:inline>
+        </w:drawing>
+      </w:r>
+    </w:p>
+    <w:p>
+      <w:pPr>
+        <w:pStyle w:val="Quote"/>
+        <w:spacing w:before="0"/>
+        <w:rPr>
+          <w:lang w:val="fr-CA"/>
+        </w:rPr>
+      </w:pPr>
+      <w:r>
+        <w:rPr>
+          <w:rStyle w:val="SubtleEmphasis"/>
+          <w:i/>
+          <w:iCs/>
+          <w:lang w:val="fr-CA"/>
+        </w:rPr>
+        <w:t xml:space="preserve">Figure X. V0.2 </w:t>
+      </w:r>
+      <w:proofErr w:type="spellStart"/>
+      <w:r>
+        <w:rPr>
+          <w:rStyle w:val="SubtleEmphasis"/>
+          <w:i/>
+          <w:iCs/>
+          <w:lang w:val="fr-CA"/>
+        </w:rPr>
+        <w:t>Internal</w:t>
+      </w:r>
+      <w:proofErr w:type="spellEnd"/>
+      <w:r>
+        <w:rPr>
+          <w:rStyle w:val="SubtleEmphasis"/>
+          <w:i/>
+          <w:iCs/>
+          <w:lang w:val="fr-CA"/>
+        </w:rPr>
+        <w:t xml:space="preserve"> Test Confusion Ma</w:t>
+      </w:r>
+      <w:r>
+        <w:rPr>
+          <w:rStyle w:val="SubtleEmphasis"/>
+          <w:i/>
+          <w:iCs/>
+          <w:lang w:val="fr-CA"/>
+        </w:rPr>
+        <w:t>trix</w:t>
+      </w:r>
+    </w:p>
+    <w:p>
+      <w:pPr>
+        <w:spacing w:after="0"/>
+        <w:jc w:val="center"/>
+      </w:pPr>
+      <w:r>
+        <w:rPr>
+          <w:noProof/>
+        </w:rPr>
+        <w:lastRenderedPageBreak/>
+        <w:drawing>
+          <wp:inline distT="0" distB="0" distL="0" distR="0" wp14:anchorId="395BB630" wp14:editId="0E692B9A">
+            <wp:extent cx="5797399" cy="2543175"/>
+            <wp:effectExtent l="0" t="0" r="0" b="0"/>
+            <wp:docPr id="444781554" name="Picture 4"/>
+            <wp:cNvGraphicFramePr>
+              <a:graphicFrameLocks xmlns:a="http://schemas.openxmlformats.org/drawingml/2006/main" noChangeAspect="1"/>
+            </wp:cNvGraphicFramePr>
+            <a:graphic xmlns:a="http://schemas.openxmlformats.org/drawingml/2006/main">
+              <a:graphicData uri="http://schemas.openxmlformats.org/drawingml/2006/picture">
+                <pic:pic xmlns:pic="http://schemas.openxmlformats.org/drawingml/2006/picture">
+                  <pic:nvPicPr>
+                    <pic:cNvPr id="0" name="Picture 7"/>
+                    <pic:cNvPicPr>
+                      <a:picLocks noChangeAspect="1" noChangeArrowheads="1"/>
+                    </pic:cNvPicPr>
+                  </pic:nvPicPr>
+                  <pic:blipFill>
+                    <a:blip r:embed="rId16">
+                      <a:extLst>
+                        <a:ext uri="{28A0092B-C50C-407E-A947-70E740481C1C}">
+                          <a14:useLocalDpi xmlns:a14="http://schemas.microsoft.com/office/drawing/2010/main" val="0"/>
+                        </a:ext>
+                      </a:extLst>
+                    </a:blip>
+                    <a:srcRect/>
+                    <a:stretch>
+                      <a:fillRect/>
+                    </a:stretch>
+                  </pic:blipFill>
+                  <pic:spPr bwMode="auto">
+                    <a:xfrm>
+                      <a:off x="0" y="0"/>
+                      <a:ext cx="5805823" cy="2546870"/>
+                    </a:xfrm>
+                    <a:prstGeom prst="rect">
+                      <a:avLst/>
+                    </a:prstGeom>
+                    <a:noFill/>
+                    <a:ln>
+                      <a:noFill/>
+                    </a:ln>
+                  </pic:spPr>
+                </pic:pic>
+              </a:graphicData>
+            </a:graphic>
+          </wp:inline>
+        </w:drawing>
+      </w:r>
+    </w:p>
+    <w:p>
+      <w:pPr>
+        <w:pStyle w:val="Quote"/>
+        <w:spacing w:before="0"/>
+        <w:rPr>
+          <w:lang w:val="fr-CA"/>
+        </w:rPr>
+      </w:pPr>
+      <w:r>
+        <w:rPr>
+          <w:rStyle w:val="SubtleEmphasis"/>
+          <w:i/>
+          <w:iCs/>
+          <w:lang w:val="fr-CA"/>
+        </w:rPr>
+        <w:t>Figure X. V0.2 PH</w:t>
+      </w:r>
+      <w:r>
+        <w:rPr>
+          <w:rStyle w:val="SubtleEmphasis"/>
+          <w:i/>
+          <w:iCs/>
+          <w:vertAlign w:val="superscript"/>
+          <w:lang w:val="fr-CA"/>
+        </w:rPr>
+        <w:t>2</w:t>
+      </w:r>
+      <w:r>
+        <w:rPr>
+          <w:rStyle w:val="SubtleEmphasis"/>
+          <w:i/>
+          <w:iCs/>
+          <w:lang w:val="fr-CA"/>
+        </w:rPr>
+        <w:t xml:space="preserve"> C</w:t>
+      </w:r>
+      <w:r>
+        <w:rPr>
+          <w:rStyle w:val="SubtleEmphasis"/>
+          <w:i/>
+          <w:iCs/>
+          <w:lang w:val="fr-CA"/>
+        </w:rPr>
+        <w:t>onfusion Matrix</w:t>
+      </w:r>
+    </w:p>
+    <w:p>
+      <w:pPr>
+        <w:spacing w:after="0"/>
+        <w:jc w:val="center"/>
+        <w:rPr>
+          <w:noProof/>
+        </w:rPr>
+      </w:pPr>
+      <w:r>
+        <w:rPr>
+          <w:noProof/>
+        </w:rPr>
+        <w:drawing>
+          <wp:inline distT="0" distB="0" distL="0" distR="0" wp14:anchorId="73BA7674" wp14:editId="535F333B">
+            <wp:extent cx="5886450" cy="2557713"/>
+            <wp:effectExtent l="0" t="0" r="0" b="0"/>
+            <wp:docPr id="94066918" name="Picture 1"/>
+            <wp:cNvGraphicFramePr>
+              <a:graphicFrameLocks xmlns:a="http://schemas.openxmlformats.org/drawingml/2006/main" noChangeAspect="1"/>
+            </wp:cNvGraphicFramePr>
+            <a:graphic xmlns:a="http://schemas.openxmlformats.org/drawingml/2006/main">
+              <a:graphicData uri="http://schemas.openxmlformats.org/drawingml/2006/picture">
+                <pic:pic xmlns:pic="http://schemas.openxmlformats.org/drawingml/2006/picture">
+                  <pic:nvPicPr>
+                    <pic:cNvPr id="0" name="Picture 1"/>
+                    <pic:cNvPicPr>
+                      <a:picLocks noChangeAspect="1" noChangeArrowheads="1"/>
+                    </pic:cNvPicPr>
+                  </pic:nvPicPr>
+                  <pic:blipFill>
+                    <a:blip r:embed="rId17">
+                      <a:extLst>
+                        <a:ext uri="{28A0092B-C50C-407E-A947-70E740481C1C}">
+                          <a14:useLocalDpi xmlns:a14="http://schemas.microsoft.com/office/drawing/2010/main" val="0"/>
+                        </a:ext>
+                      </a:extLst>
+                    </a:blip>
+                    <a:srcRect/>
+                    <a:stretch>
+                      <a:fillRect/>
+                    </a:stretch>
+                  </pic:blipFill>
+                  <pic:spPr bwMode="auto">
+                    <a:xfrm>
+                      <a:off x="0" y="0"/>
+                      <a:ext cx="5897610" cy="2562562"/>
+                    </a:xfrm>
+                    <a:prstGeom prst="rect">
+                      <a:avLst/>
+                    </a:prstGeom>
+                    <a:noFill/>
+                    <a:ln>
+                      <a:noFill/>
+                    </a:ln>
+                  </pic:spPr>
+                </pic:pic>
+              </a:graphicData>
+            </a:graphic>
+          </wp:inline>
+        </w:drawing>
+      </w:r>
+    </w:p>
+    <w:p>
+      <w:pPr>
+        <w:pStyle w:val="Quote"/>
+        <w:spacing w:before="0"/>
+        <w:rPr>
+          <w:lang w:val="fr-CA"/>
+        </w:rPr>
+      </w:pPr>
+      <w:r>
+        <w:rPr>
+          <w:rStyle w:val="SubtleEmphasis"/>
+          <w:i/>
+          <w:iCs/>
+          <w:lang w:val="fr-CA"/>
+        </w:rPr>
+        <w:t>Figure X. V0.2 PAD-UFES-20 Con</w:t>
+      </w:r>
+      <w:r>
+        <w:rPr>
+          <w:rStyle w:val="SubtleEmphasis"/>
+          <w:i/>
+          <w:iCs/>
+          <w:lang w:val="fr-CA"/>
+        </w:rPr>
+        <w:t>fusion Matrix</w:t>
+      </w:r>
+    </w:p>
+    <w:p>
+      <w:pPr>
+        <w:rPr>
+          <w:lang w:val="en-MY"/>
+        </w:rPr>
+      </w:pPr>
+      <w:r>
+        <w:t xml:space="preserve">Additionally, the validation loss </w:t>
+      </w:r>
+      <w:r>
+        <w:rPr>
+          <w:highlight w:val="yellow"/>
+        </w:rPr>
+        <w:t>as shown in Fig. X</w:t>
+      </w:r>
+      <w:r>
+        <w:t>. reveals an overfitting gap which diverges and grows starting from approximately epoch 7 and continues to plateau as the training loss continues to decrease. This motivated several of our architectural changes in V0.3, however the overfitting issue has remained prevalent as will be shown later.</w:t>
+      </w:r>
+    </w:p>
+    <w:p>
+      <w:r>
+        <w:rPr>
+          <w:noProof/>
+        </w:rPr>
+        <w:drawing>
+          <wp:inline distT="0" distB="0" distL="0" distR="0" wp14:anchorId="680832FC" wp14:editId="335578E8">
+            <wp:extent cx="5943600" cy="1891665"/>
+            <wp:effectExtent l="0" t="0" r="0" b="0"/>
+            <wp:docPr id="165105710" name="Picture 3"/>
+            <wp:cNvGraphicFramePr>
+              <a:graphicFrameLocks xmlns:a="http://schemas.openxmlformats.org/drawingml/2006/main" noChangeAspect="1"/>
+            </wp:cNvGraphicFramePr>
+            <a:graphic xmlns:a="http://schemas.openxmlformats.org/drawingml/2006/main">
+              <a:graphicData uri="http://schemas.openxmlformats.org/drawingml/2006/picture">
+                <pic:pic xmlns:pic="http://schemas.openxmlformats.org/drawingml/2006/picture">
+                  <pic:nvPicPr>
+                    <pic:cNvPr id="0" name="Picture 3"/>
+                    <pic:cNvPicPr>
+                      <a:picLocks noChangeAspect="1" noChangeArrowheads="1"/>
+                    </pic:cNvPicPr>
+                  </pic:nvPicPr>
+                  <pic:blipFill>
+                    <a:blip r:embed="rId18">
+                      <a:extLst>
+                        <a:ext uri="{28A0092B-C50C-407E-A947-70E740481C1C}">
+                          <a14:useLocalDpi xmlns:a14="http://schemas.microsoft.com/office/drawing/2010/main" val="0"/>
+                        </a:ext>
+                      </a:extLst>
+                    </a:blip>
+                    <a:srcRect/>
+                    <a:stretch>
+                      <a:fillRect/>
+                    </a:stretch>
+                  </pic:blipFill>
+                  <pic:spPr bwMode="auto">
+                    <a:xfrm>
+                      <a:off x="0" y="0"/>
+                      <a:ext cx="5943600" cy="1891665"/>
+                    </a:xfrm>
+                    <a:prstGeom prst="rect">
+                      <a:avLst/>
+                    </a:prstGeom>
+                    <a:noFill/>
+                    <a:ln>
+                      <a:noFill/>
+                    </a:ln>
+                  </pic:spPr>
+                </pic:pic>
+              </a:graphicData>
+            </a:graphic>
+          </wp:inline>
+        </w:drawing>
+      </w:r>
+    </w:p>
+    <w:p>
+      <w:pPr>
+        <w:pStyle w:val="Quote"/>
+        <w:spacing w:before="0"/>
+      </w:pPr>
+      <w:r>
+        <w:rPr>
+          <w:rStyle w:val="SubtleEmphasis"/>
+          <w:i/>
+          <w:iCs/>
+        </w:rPr>
+        <w:t xml:space="preserve">Figure X. </w:t>
+      </w:r>
+      <w:r>
+        <w:rPr>
+          <w:rStyle w:val="SubtleEmphasis"/>
+          <w:i/>
+          <w:iCs/>
+        </w:rPr>
+        <w:t>V0.2 Training Curves</w:t>
       </w:r>
     </w:p>
     <w:p>
@@ -8483,28 +9121,8 @@
           <w:sz w:val="30"/>
           <w:szCs w:val="30"/>
         </w:rPr>
-        <w:t>V0.</w:t>
-      </w:r>
-      <w:r>
-        <w:rPr>
-          <w:sz w:val="30"/>
-          <w:szCs w:val="30"/>
-        </w:rPr>
-        <w:t>3</w:t>
-      </w:r>
-      <w:r>
-        <w:rPr>
-          <w:sz w:val="30"/>
-          <w:szCs w:val="30"/>
-        </w:rPr>
-        <w:t xml:space="preserve"> | </w:t>
-      </w:r>
-      <w:r>
-        <w:rPr>
-          <w:sz w:val="30"/>
-          <w:szCs w:val="30"/>
-        </w:rPr>
-        <w:t>Modularization &amp; Tunin</w:t>
+        <w:lastRenderedPageBreak/>
+        <w:t>V0.3 | Modularization &amp; Tunin</w:t>
       </w:r>
       <w:r>
         <w:rPr>
@@ -8569,19 +9187,1287 @@
     </w:p>
     <w:p>
       <w:r>
+        <w:t xml:space="preserve">According to Fig. X., </w:t>
+      </w:r>
+      <w:r>
+        <w:t>V0.3’s accuracy improved for the internal test set and the PAD-UFES-20</w:t>
+      </w:r>
+      <w:r>
+        <w:t xml:space="preserve"> from 81.3% &amp; 24.8% to 83.3% &amp; 33.8% respectively, while the</w:t>
+      </w:r>
+      <w:r>
+        <w:rPr>
+          <w:vertAlign w:val="superscript"/>
+        </w:rPr>
+        <w:t xml:space="preserve"> </w:t>
+      </w:r>
+      <w:r>
+        <w:t>PH</w:t>
+      </w:r>
+      <w:r>
+        <w:rPr>
+          <w:vertAlign w:val="superscript"/>
+        </w:rPr>
+        <w:t>2</w:t>
+      </w:r>
+      <w:r>
+        <w:t xml:space="preserve"> test set decreases down to 81% from 86%. Per-class analysis from the confusion matrices </w:t>
+      </w:r>
+      <w:r>
         <w:rPr>
           <w:highlight w:val="yellow"/>
         </w:rPr>
-        <w:t>[Discuss performance results]</w:t>
+        <w:t>(Fig. X-X)</w:t>
+      </w:r>
+      <w:r>
+        <w:t xml:space="preserve"> shows that </w:t>
+      </w:r>
+      <w:r>
+        <w:t>the</w:t>
+      </w:r>
+      <w:r>
+        <w:t xml:space="preserve"> model performed similarly to V0.2, with the same notes on AK and SCC being mistaken for each other on the Internal test set, however the MEL recall improved to 85% from 71%.</w:t>
+      </w:r>
+    </w:p>
+    <w:p>
+      <w:pPr>
+        <w:spacing w:after="0"/>
+        <w:jc w:val="center"/>
+      </w:pPr>
+      <w:r>
+        <w:rPr>
+          <w:noProof/>
+        </w:rPr>
+        <w:drawing>
+          <wp:inline distT="0" distB="0" distL="0" distR="0" wp14:anchorId="594074C9" wp14:editId="521D2885">
+            <wp:extent cx="4226943" cy="1101741"/>
+            <wp:effectExtent l="0" t="0" r="2540" b="3175"/>
+            <wp:docPr id="198378126" name="Picture 1"/>
+            <wp:cNvGraphicFramePr>
+              <a:graphicFrameLocks xmlns:a="http://schemas.openxmlformats.org/drawingml/2006/main" noChangeAspect="1"/>
+            </wp:cNvGraphicFramePr>
+            <a:graphic xmlns:a="http://schemas.openxmlformats.org/drawingml/2006/main">
+              <a:graphicData uri="http://schemas.openxmlformats.org/drawingml/2006/picture">
+                <pic:pic xmlns:pic="http://schemas.openxmlformats.org/drawingml/2006/picture">
+                  <pic:nvPicPr>
+                    <pic:cNvPr id="1087493519" name=""/>
+                    <pic:cNvPicPr/>
+                  </pic:nvPicPr>
+                  <pic:blipFill>
+                    <a:blip r:embed="rId19"/>
+                    <a:stretch>
+                      <a:fillRect/>
+                    </a:stretch>
+                  </pic:blipFill>
+                  <pic:spPr>
+                    <a:xfrm>
+                      <a:off x="0" y="0"/>
+                      <a:ext cx="4274750" cy="1114202"/>
+                    </a:xfrm>
+                    <a:prstGeom prst="rect">
+                      <a:avLst/>
+                    </a:prstGeom>
+                  </pic:spPr>
+                </pic:pic>
+              </a:graphicData>
+            </a:graphic>
+          </wp:inline>
+        </w:drawing>
+      </w:r>
+    </w:p>
+    <w:p>
+      <w:pPr>
+        <w:pStyle w:val="Quote"/>
+        <w:spacing w:before="0"/>
+        <w:rPr>
+          <w:rStyle w:val="SubtleEmphasis"/>
+          <w:i/>
+          <w:iCs/>
+        </w:rPr>
+      </w:pPr>
+      <w:r>
+        <w:rPr>
+          <w:rStyle w:val="SubtleEmphasis"/>
+          <w:i/>
+          <w:iCs/>
+        </w:rPr>
+        <w:t xml:space="preserve">Figure X. </w:t>
+      </w:r>
+      <w:r>
+        <w:rPr>
+          <w:rStyle w:val="SubtleEmphasis"/>
+          <w:i/>
+          <w:iCs/>
+        </w:rPr>
+        <w:t>V0.3 Overview of Evaluation Results</w:t>
+      </w:r>
+    </w:p>
+    <w:p>
+      <w:pPr>
+        <w:spacing w:after="0"/>
+        <w:jc w:val="center"/>
+      </w:pPr>
+      <w:r>
+        <w:rPr>
+          <w:noProof/>
+        </w:rPr>
+        <w:drawing>
+          <wp:inline distT="0" distB="0" distL="0" distR="0" wp14:anchorId="25BC7CB9" wp14:editId="73F9C0FE">
+            <wp:extent cx="4235139" cy="3893069"/>
+            <wp:effectExtent l="0" t="0" r="0" b="0"/>
+            <wp:docPr id="881752231" name="Picture 1"/>
+            <wp:cNvGraphicFramePr>
+              <a:graphicFrameLocks xmlns:a="http://schemas.openxmlformats.org/drawingml/2006/main" noChangeAspect="1"/>
+            </wp:cNvGraphicFramePr>
+            <a:graphic xmlns:a="http://schemas.openxmlformats.org/drawingml/2006/main">
+              <a:graphicData uri="http://schemas.openxmlformats.org/drawingml/2006/picture">
+                <pic:pic xmlns:pic="http://schemas.openxmlformats.org/drawingml/2006/picture">
+                  <pic:nvPicPr>
+                    <pic:cNvPr id="2083479498" name=""/>
+                    <pic:cNvPicPr/>
+                  </pic:nvPicPr>
+                  <pic:blipFill>
+                    <a:blip r:embed="rId20"/>
+                    <a:stretch>
+                      <a:fillRect/>
+                    </a:stretch>
+                  </pic:blipFill>
+                  <pic:spPr>
+                    <a:xfrm>
+                      <a:off x="0" y="0"/>
+                      <a:ext cx="4247088" cy="3904052"/>
+                    </a:xfrm>
+                    <a:prstGeom prst="rect">
+                      <a:avLst/>
+                    </a:prstGeom>
+                  </pic:spPr>
+                </pic:pic>
+              </a:graphicData>
+            </a:graphic>
+          </wp:inline>
+        </w:drawing>
+      </w:r>
+    </w:p>
+    <w:p>
+      <w:pPr>
+        <w:pStyle w:val="Quote"/>
+        <w:spacing w:before="0"/>
+        <w:rPr>
+          <w:lang w:val="en-MY"/>
+        </w:rPr>
+      </w:pPr>
+      <w:r>
+        <w:rPr>
+          <w:rStyle w:val="SubtleEmphasis"/>
+          <w:i/>
+          <w:iCs/>
+          <w:lang w:val="en-MY"/>
+        </w:rPr>
+        <w:t>Figure X. V0.</w:t>
+      </w:r>
+      <w:r>
+        <w:rPr>
+          <w:rStyle w:val="SubtleEmphasis"/>
+          <w:i/>
+          <w:iCs/>
+          <w:lang w:val="en-MY"/>
+        </w:rPr>
+        <w:t>3</w:t>
+      </w:r>
+      <w:r>
+        <w:rPr>
+          <w:rStyle w:val="SubtleEmphasis"/>
+          <w:i/>
+          <w:iCs/>
+          <w:lang w:val="en-MY"/>
+        </w:rPr>
+        <w:t xml:space="preserve"> Internal Test </w:t>
+      </w:r>
+      <w:r>
+        <w:rPr>
+          <w:rStyle w:val="SubtleEmphasis"/>
+          <w:i/>
+          <w:iCs/>
+          <w:lang w:val="en-MY"/>
+        </w:rPr>
+        <w:t>Results</w:t>
+      </w:r>
+    </w:p>
+    <w:p>
+      <w:r>
+        <w:lastRenderedPageBreak/>
+        <w:t>As for the external test sets, it remained relatively consistent as V0.2, with minor setbacks for PH</w:t>
+      </w:r>
+      <w:r>
+        <w:rPr>
+          <w:vertAlign w:val="superscript"/>
+        </w:rPr>
+        <w:t>2</w:t>
+      </w:r>
+      <w:r>
+        <w:t>’s NV recall and marginal improvements in PAD-UFES-20, however it remains well below a reasonable level to use in a clinical or general-setting given its base accuracy is at 33.8%</w:t>
+      </w:r>
+      <w:r>
+        <w:t>, this highlights the generalizability issues with using dermoscopic models against clinical images</w:t>
+      </w:r>
+      <w:r>
+        <w:t>.</w:t>
+      </w:r>
+    </w:p>
+    <w:p>
+      <w:pPr>
+        <w:spacing w:after="0"/>
+        <w:jc w:val="center"/>
+      </w:pPr>
+      <w:r>
+        <w:rPr>
+          <w:noProof/>
+        </w:rPr>
+        <w:drawing>
+          <wp:inline distT="0" distB="0" distL="0" distR="0" wp14:anchorId="23EEC970" wp14:editId="30E5B329">
+            <wp:extent cx="5245531" cy="2313974"/>
+            <wp:effectExtent l="0" t="0" r="0" b="0"/>
+            <wp:docPr id="1197342072" name="Picture 10"/>
+            <wp:cNvGraphicFramePr>
+              <a:graphicFrameLocks xmlns:a="http://schemas.openxmlformats.org/drawingml/2006/main" noChangeAspect="1"/>
+            </wp:cNvGraphicFramePr>
+            <a:graphic xmlns:a="http://schemas.openxmlformats.org/drawingml/2006/main">
+              <a:graphicData uri="http://schemas.openxmlformats.org/drawingml/2006/picture">
+                <pic:pic xmlns:pic="http://schemas.openxmlformats.org/drawingml/2006/picture">
+                  <pic:nvPicPr>
+                    <pic:cNvPr id="0" name="Picture 16"/>
+                    <pic:cNvPicPr>
+                      <a:picLocks noChangeAspect="1" noChangeArrowheads="1"/>
+                    </pic:cNvPicPr>
+                  </pic:nvPicPr>
+                  <pic:blipFill>
+                    <a:blip r:embed="rId21" cstate="print">
+                      <a:extLst>
+                        <a:ext uri="{28A0092B-C50C-407E-A947-70E740481C1C}">
+                          <a14:useLocalDpi xmlns:a14="http://schemas.microsoft.com/office/drawing/2010/main" val="0"/>
+                        </a:ext>
+                      </a:extLst>
+                    </a:blip>
+                    <a:srcRect/>
+                    <a:stretch>
+                      <a:fillRect/>
+                    </a:stretch>
+                  </pic:blipFill>
+                  <pic:spPr bwMode="auto">
+                    <a:xfrm>
+                      <a:off x="0" y="0"/>
+                      <a:ext cx="5251743" cy="2316714"/>
+                    </a:xfrm>
+                    <a:prstGeom prst="rect">
+                      <a:avLst/>
+                    </a:prstGeom>
+                    <a:noFill/>
+                    <a:ln>
+                      <a:noFill/>
+                    </a:ln>
+                  </pic:spPr>
+                </pic:pic>
+              </a:graphicData>
+            </a:graphic>
+          </wp:inline>
+        </w:drawing>
+      </w:r>
+    </w:p>
+    <w:p>
+      <w:pPr>
+        <w:pStyle w:val="Quote"/>
+        <w:spacing w:before="0"/>
+        <w:rPr>
+          <w:lang w:val="fr-CA"/>
+        </w:rPr>
+      </w:pPr>
+      <w:r>
+        <w:rPr>
+          <w:rStyle w:val="SubtleEmphasis"/>
+          <w:i/>
+          <w:iCs/>
+          <w:lang w:val="fr-CA"/>
+        </w:rPr>
+        <w:t xml:space="preserve">Figure X. V0.3 </w:t>
+      </w:r>
+      <w:proofErr w:type="spellStart"/>
+      <w:r>
+        <w:rPr>
+          <w:rStyle w:val="SubtleEmphasis"/>
+          <w:i/>
+          <w:iCs/>
+          <w:lang w:val="fr-CA"/>
+        </w:rPr>
+        <w:t>Internal</w:t>
+      </w:r>
+      <w:proofErr w:type="spellEnd"/>
+      <w:r>
+        <w:rPr>
+          <w:rStyle w:val="SubtleEmphasis"/>
+          <w:i/>
+          <w:iCs/>
+          <w:lang w:val="fr-CA"/>
+        </w:rPr>
+        <w:t xml:space="preserve"> Test Confusion Matrix</w:t>
+      </w:r>
+    </w:p>
+    <w:p>
+      <w:pPr>
+        <w:spacing w:after="0"/>
+        <w:jc w:val="center"/>
+        <w:rPr>
+          <w:rStyle w:val="SubtleEmphasis"/>
+          <w:i w:val="0"/>
+          <w:iCs w:val="0"/>
+        </w:rPr>
+      </w:pPr>
+      <w:r>
+        <w:rPr>
+          <w:noProof/>
+        </w:rPr>
+        <w:drawing>
+          <wp:inline distT="0" distB="0" distL="0" distR="0" wp14:anchorId="5E080446" wp14:editId="73EEF2CE">
+            <wp:extent cx="5331124" cy="2370528"/>
+            <wp:effectExtent l="0" t="0" r="3175" b="0"/>
+            <wp:docPr id="1631654809" name="Picture 8"/>
+            <wp:cNvGraphicFramePr>
+              <a:graphicFrameLocks xmlns:a="http://schemas.openxmlformats.org/drawingml/2006/main" noChangeAspect="1"/>
+            </wp:cNvGraphicFramePr>
+            <a:graphic xmlns:a="http://schemas.openxmlformats.org/drawingml/2006/main">
+              <a:graphicData uri="http://schemas.openxmlformats.org/drawingml/2006/picture">
+                <pic:pic xmlns:pic="http://schemas.openxmlformats.org/drawingml/2006/picture">
+                  <pic:nvPicPr>
+                    <pic:cNvPr id="0" name="Picture 14"/>
+                    <pic:cNvPicPr>
+                      <a:picLocks noChangeAspect="1" noChangeArrowheads="1"/>
+                    </pic:cNvPicPr>
+                  </pic:nvPicPr>
+                  <pic:blipFill>
+                    <a:blip r:embed="rId22" cstate="print">
+                      <a:extLst>
+                        <a:ext uri="{28A0092B-C50C-407E-A947-70E740481C1C}">
+                          <a14:useLocalDpi xmlns:a14="http://schemas.microsoft.com/office/drawing/2010/main" val="0"/>
+                        </a:ext>
+                      </a:extLst>
+                    </a:blip>
+                    <a:srcRect/>
+                    <a:stretch>
+                      <a:fillRect/>
+                    </a:stretch>
+                  </pic:blipFill>
+                  <pic:spPr bwMode="auto">
+                    <a:xfrm>
+                      <a:off x="0" y="0"/>
+                      <a:ext cx="5340237" cy="2374580"/>
+                    </a:xfrm>
+                    <a:prstGeom prst="rect">
+                      <a:avLst/>
+                    </a:prstGeom>
+                    <a:noFill/>
+                    <a:ln>
+                      <a:noFill/>
+                    </a:ln>
+                  </pic:spPr>
+                </pic:pic>
+              </a:graphicData>
+            </a:graphic>
+          </wp:inline>
+        </w:drawing>
+      </w:r>
+    </w:p>
+    <w:p>
+      <w:pPr>
+        <w:pStyle w:val="Quote"/>
+        <w:spacing w:before="0"/>
+        <w:rPr>
+          <w:lang w:val="fr-CA"/>
+        </w:rPr>
+      </w:pPr>
+      <w:r>
+        <w:rPr>
+          <w:rStyle w:val="SubtleEmphasis"/>
+          <w:i/>
+          <w:iCs/>
+          <w:lang w:val="fr-CA"/>
+        </w:rPr>
+        <w:t>Figure X. V0.</w:t>
+      </w:r>
+      <w:r>
+        <w:rPr>
+          <w:rStyle w:val="SubtleEmphasis"/>
+          <w:i/>
+          <w:iCs/>
+          <w:lang w:val="fr-CA"/>
+        </w:rPr>
+        <w:t>3</w:t>
+      </w:r>
+      <w:r>
+        <w:rPr>
+          <w:rStyle w:val="SubtleEmphasis"/>
+          <w:i/>
+          <w:iCs/>
+          <w:lang w:val="fr-CA"/>
+        </w:rPr>
+        <w:t xml:space="preserve"> </w:t>
+      </w:r>
+      <w:r>
+        <w:rPr>
+          <w:rStyle w:val="SubtleEmphasis"/>
+          <w:i/>
+          <w:iCs/>
+          <w:lang w:val="fr-CA"/>
+        </w:rPr>
+        <w:t>PAD-UFES-20</w:t>
+      </w:r>
+      <w:r>
+        <w:rPr>
+          <w:rStyle w:val="SubtleEmphasis"/>
+          <w:i/>
+          <w:iCs/>
+          <w:lang w:val="fr-CA"/>
+        </w:rPr>
+        <w:t xml:space="preserve"> Confusion Ma</w:t>
+      </w:r>
+      <w:r>
+        <w:rPr>
+          <w:rStyle w:val="SubtleEmphasis"/>
+          <w:i/>
+          <w:iCs/>
+          <w:lang w:val="fr-CA"/>
+        </w:rPr>
+        <w:t>trix</w:t>
+      </w:r>
+    </w:p>
+    <w:p>
+      <w:pPr>
+        <w:spacing w:after="0"/>
+        <w:jc w:val="center"/>
+        <w:rPr>
+          <w:rStyle w:val="SubtleEmphasis"/>
+          <w:i w:val="0"/>
+          <w:iCs w:val="0"/>
+        </w:rPr>
+      </w:pPr>
+      <w:r>
+        <w:rPr>
+          <w:noProof/>
+        </w:rPr>
+        <w:drawing>
+          <wp:inline distT="0" distB="0" distL="0" distR="0" wp14:anchorId="26A9517F" wp14:editId="0E653D08">
+            <wp:extent cx="5176842" cy="2311880"/>
+            <wp:effectExtent l="0" t="0" r="5080" b="0"/>
+            <wp:docPr id="349884813" name="Picture 9"/>
+            <wp:cNvGraphicFramePr>
+              <a:graphicFrameLocks xmlns:a="http://schemas.openxmlformats.org/drawingml/2006/main" noChangeAspect="1"/>
+            </wp:cNvGraphicFramePr>
+            <a:graphic xmlns:a="http://schemas.openxmlformats.org/drawingml/2006/main">
+              <a:graphicData uri="http://schemas.openxmlformats.org/drawingml/2006/picture">
+                <pic:pic xmlns:pic="http://schemas.openxmlformats.org/drawingml/2006/picture">
+                  <pic:nvPicPr>
+                    <pic:cNvPr id="0" name="Picture 15"/>
+                    <pic:cNvPicPr>
+                      <a:picLocks noChangeAspect="1" noChangeArrowheads="1"/>
+                    </pic:cNvPicPr>
+                  </pic:nvPicPr>
+                  <pic:blipFill>
+                    <a:blip r:embed="rId23">
+                      <a:extLst>
+                        <a:ext uri="{28A0092B-C50C-407E-A947-70E740481C1C}">
+                          <a14:useLocalDpi xmlns:a14="http://schemas.microsoft.com/office/drawing/2010/main" val="0"/>
+                        </a:ext>
+                      </a:extLst>
+                    </a:blip>
+                    <a:srcRect/>
+                    <a:stretch>
+                      <a:fillRect/>
+                    </a:stretch>
+                  </pic:blipFill>
+                  <pic:spPr bwMode="auto">
+                    <a:xfrm>
+                      <a:off x="0" y="0"/>
+                      <a:ext cx="5191163" cy="2318275"/>
+                    </a:xfrm>
+                    <a:prstGeom prst="rect">
+                      <a:avLst/>
+                    </a:prstGeom>
+                    <a:noFill/>
+                    <a:ln>
+                      <a:noFill/>
+                    </a:ln>
+                  </pic:spPr>
+                </pic:pic>
+              </a:graphicData>
+            </a:graphic>
+          </wp:inline>
+        </w:drawing>
+      </w:r>
+    </w:p>
+    <w:p>
+      <w:pPr>
+        <w:pStyle w:val="Quote"/>
+        <w:spacing w:before="0"/>
+        <w:rPr>
+          <w:lang w:val="fr-CA"/>
+        </w:rPr>
+      </w:pPr>
+      <w:r>
+        <w:rPr>
+          <w:rStyle w:val="SubtleEmphasis"/>
+          <w:i/>
+          <w:iCs/>
+          <w:lang w:val="fr-CA"/>
+        </w:rPr>
+        <w:t>Figure X. V0.</w:t>
+      </w:r>
+      <w:r>
+        <w:rPr>
+          <w:rStyle w:val="SubtleEmphasis"/>
+          <w:i/>
+          <w:iCs/>
+          <w:lang w:val="fr-CA"/>
+        </w:rPr>
+        <w:t>3</w:t>
+      </w:r>
+      <w:r>
+        <w:rPr>
+          <w:rStyle w:val="SubtleEmphasis"/>
+          <w:i/>
+          <w:iCs/>
+          <w:lang w:val="fr-CA"/>
+        </w:rPr>
+        <w:t xml:space="preserve"> PH</w:t>
+      </w:r>
+      <w:r>
+        <w:rPr>
+          <w:rStyle w:val="SubtleEmphasis"/>
+          <w:i/>
+          <w:iCs/>
+          <w:vertAlign w:val="superscript"/>
+          <w:lang w:val="fr-CA"/>
+        </w:rPr>
+        <w:t>2</w:t>
+      </w:r>
+      <w:r>
+        <w:rPr>
+          <w:rStyle w:val="SubtleEmphasis"/>
+          <w:i/>
+          <w:iCs/>
+          <w:lang w:val="fr-CA"/>
+        </w:rPr>
+        <w:t xml:space="preserve"> </w:t>
+      </w:r>
+      <w:r>
+        <w:rPr>
+          <w:rStyle w:val="SubtleEmphasis"/>
+          <w:i/>
+          <w:iCs/>
+          <w:lang w:val="fr-CA"/>
+        </w:rPr>
+        <w:t>Confusion Ma</w:t>
+      </w:r>
+      <w:r>
+        <w:rPr>
+          <w:rStyle w:val="SubtleEmphasis"/>
+          <w:i/>
+          <w:iCs/>
+          <w:lang w:val="fr-CA"/>
+        </w:rPr>
+        <w:t>trix</w:t>
+      </w:r>
+    </w:p>
+    <w:p>
+      <w:r>
+        <w:lastRenderedPageBreak/>
+        <w:t>As shown in the training curves, the overfitting issue remains prevalent and should be further investigated in future works.</w:t>
+      </w:r>
+    </w:p>
+    <w:p>
+      <w:pPr>
+        <w:spacing w:after="0"/>
+      </w:pPr>
+      <w:r>
+        <w:rPr>
+          <w:noProof/>
+        </w:rPr>
+        <w:drawing>
+          <wp:inline distT="0" distB="0" distL="0" distR="0" wp14:anchorId="4CAF10E1" wp14:editId="732768B1">
+            <wp:extent cx="5934075" cy="1943100"/>
+            <wp:effectExtent l="0" t="0" r="9525" b="0"/>
+            <wp:docPr id="1550190117" name="Picture 13"/>
+            <wp:cNvGraphicFramePr>
+              <a:graphicFrameLocks xmlns:a="http://schemas.openxmlformats.org/drawingml/2006/main" noChangeAspect="1"/>
+            </wp:cNvGraphicFramePr>
+            <a:graphic xmlns:a="http://schemas.openxmlformats.org/drawingml/2006/main">
+              <a:graphicData uri="http://schemas.openxmlformats.org/drawingml/2006/picture">
+                <pic:pic xmlns:pic="http://schemas.openxmlformats.org/drawingml/2006/picture">
+                  <pic:nvPicPr>
+                    <pic:cNvPr id="0" name="Picture 23"/>
+                    <pic:cNvPicPr>
+                      <a:picLocks noChangeAspect="1" noChangeArrowheads="1"/>
+                    </pic:cNvPicPr>
+                  </pic:nvPicPr>
+                  <pic:blipFill>
+                    <a:blip r:embed="rId24">
+                      <a:extLst>
+                        <a:ext uri="{28A0092B-C50C-407E-A947-70E740481C1C}">
+                          <a14:useLocalDpi xmlns:a14="http://schemas.microsoft.com/office/drawing/2010/main" val="0"/>
+                        </a:ext>
+                      </a:extLst>
+                    </a:blip>
+                    <a:srcRect/>
+                    <a:stretch>
+                      <a:fillRect/>
+                    </a:stretch>
+                  </pic:blipFill>
+                  <pic:spPr bwMode="auto">
+                    <a:xfrm>
+                      <a:off x="0" y="0"/>
+                      <a:ext cx="5934075" cy="1943100"/>
+                    </a:xfrm>
+                    <a:prstGeom prst="rect">
+                      <a:avLst/>
+                    </a:prstGeom>
+                    <a:noFill/>
+                    <a:ln>
+                      <a:noFill/>
+                    </a:ln>
+                  </pic:spPr>
+                </pic:pic>
+              </a:graphicData>
+            </a:graphic>
+          </wp:inline>
+        </w:drawing>
+      </w:r>
+    </w:p>
+    <w:p>
+      <w:pPr>
+        <w:pStyle w:val="Quote"/>
+        <w:spacing w:before="0"/>
+      </w:pPr>
+      <w:r>
+        <w:rPr>
+          <w:rStyle w:val="SubtleEmphasis"/>
+          <w:i/>
+          <w:iCs/>
+        </w:rPr>
+        <w:t xml:space="preserve">Figure X. </w:t>
+      </w:r>
+      <w:r>
+        <w:rPr>
+          <w:rStyle w:val="SubtleEmphasis"/>
+          <w:i/>
+          <w:iCs/>
+        </w:rPr>
+        <w:t>V0.3 Training Curves</w:t>
       </w:r>
     </w:p>
     <w:p>
       <w:pPr>
         <w:pStyle w:val="Heading3"/>
+        <w:numPr>
+          <w:ilvl w:val="2"/>
+          <w:numId w:val="36"/>
+        </w:numPr>
+        <w:tabs>
+          <w:tab w:val="left" w:pos="990"/>
+        </w:tabs>
+        <w:spacing w:line="276" w:lineRule="auto"/>
+        <w:ind w:hanging="1440"/>
+        <w:rPr>
+          <w:sz w:val="30"/>
+          <w:szCs w:val="30"/>
+        </w:rPr>
+      </w:pPr>
+      <w:r>
+        <w:rPr>
+          <w:sz w:val="30"/>
+          <w:szCs w:val="30"/>
+        </w:rPr>
+        <w:t>V0.</w:t>
+      </w:r>
+      <w:r>
+        <w:rPr>
+          <w:sz w:val="30"/>
+          <w:szCs w:val="30"/>
+        </w:rPr>
+        <w:t>4</w:t>
+      </w:r>
+      <w:r>
+        <w:rPr>
+          <w:sz w:val="30"/>
+          <w:szCs w:val="30"/>
+        </w:rPr>
+        <w:t xml:space="preserve"> | </w:t>
+      </w:r>
+      <w:r>
+        <w:rPr>
+          <w:sz w:val="30"/>
+          <w:szCs w:val="30"/>
+        </w:rPr>
+        <w:t>Clinical Dataset Implementation</w:t>
+      </w:r>
+    </w:p>
+    <w:p>
+      <w:r>
+        <w:t>The fourth iteration involved changing from the dermoscopic datasets as the training sets to using the clinical ones (PAD-UFES-20 and MRA-MIDAS) while retaining PH2 as an external test set, this required altering the mappings for both the localization and classification labels significantly in addition to cleaning the metadata excel sheet for the MRA-MIDAS dataset.</w:t>
+      </w:r>
+    </w:p>
+    <w:p>
+      <w:r>
+        <w:t>Furthermore, an additional feature was included where any missing pictures that were mentioned in the metadata sheets but didn’t exist in its respective dataset folder was flagged and its file name was stored in a log to inform the user of the issue.</w:t>
+      </w:r>
+    </w:p>
+    <w:p>
+      <w:r>
+        <w:t>V0.4 implemented a different, 3-class scheme (benign, malignant, and uncertain) as we shifted to using clinical datasets for training. While testing against the internal test set, V0.4 achieved 73.3%, 56.1 &amp; 74.5% in regard to accuracy, balanced accuracy and weighted F1-scores. These scores are not to be compared to V0.3 as we have significantly altered the scope of the training data, switching from dermoscopic photos from HAM10000 &amp; ISIC2019 to smartphone-grade photos from PAD-UFES-20 and MRA-MIDAS.</w:t>
+      </w:r>
+    </w:p>
+    <w:p>
+      <w:pPr>
+        <w:spacing w:after="0"/>
+        <w:jc w:val="center"/>
+        <w:rPr>
+          <w:noProof/>
+        </w:rPr>
+      </w:pPr>
+      <w:r>
+        <w:rPr>
+          <w:noProof/>
+        </w:rPr>
+        <w:drawing>
+          <wp:inline distT="0" distB="0" distL="0" distR="0" wp14:anchorId="0A472D80" wp14:editId="55C6599B">
+            <wp:extent cx="4063042" cy="2861188"/>
+            <wp:effectExtent l="0" t="0" r="0" b="0"/>
+            <wp:docPr id="1284395796" name="Picture 1"/>
+            <wp:cNvGraphicFramePr>
+              <a:graphicFrameLocks xmlns:a="http://schemas.openxmlformats.org/drawingml/2006/main" noChangeAspect="1"/>
+            </wp:cNvGraphicFramePr>
+            <a:graphic xmlns:a="http://schemas.openxmlformats.org/drawingml/2006/main">
+              <a:graphicData uri="http://schemas.openxmlformats.org/drawingml/2006/picture">
+                <pic:pic xmlns:pic="http://schemas.openxmlformats.org/drawingml/2006/picture">
+                  <pic:nvPicPr>
+                    <pic:cNvPr id="1284395796" name=""/>
+                    <pic:cNvPicPr/>
+                  </pic:nvPicPr>
+                  <pic:blipFill>
+                    <a:blip r:embed="rId25"/>
+                    <a:stretch>
+                      <a:fillRect/>
+                    </a:stretch>
+                  </pic:blipFill>
+                  <pic:spPr>
+                    <a:xfrm>
+                      <a:off x="0" y="0"/>
+                      <a:ext cx="4074287" cy="2869106"/>
+                    </a:xfrm>
+                    <a:prstGeom prst="rect">
+                      <a:avLst/>
+                    </a:prstGeom>
+                  </pic:spPr>
+                </pic:pic>
+              </a:graphicData>
+            </a:graphic>
+          </wp:inline>
+        </w:drawing>
+      </w:r>
+    </w:p>
+    <w:p>
+      <w:pPr>
+        <w:pStyle w:val="Quote"/>
+        <w:spacing w:before="0"/>
+        <w:rPr>
+          <w:lang w:val="en-MY"/>
+        </w:rPr>
+      </w:pPr>
+      <w:r>
+        <w:rPr>
+          <w:rStyle w:val="SubtleEmphasis"/>
+          <w:i/>
+          <w:iCs/>
+          <w:lang w:val="en-MY"/>
+        </w:rPr>
+        <w:t>Figure X. V0.</w:t>
+      </w:r>
+      <w:r>
+        <w:rPr>
+          <w:rStyle w:val="SubtleEmphasis"/>
+          <w:i/>
+          <w:iCs/>
+          <w:lang w:val="en-MY"/>
+        </w:rPr>
+        <w:t>4</w:t>
+      </w:r>
+      <w:r>
+        <w:rPr>
+          <w:rStyle w:val="SubtleEmphasis"/>
+          <w:i/>
+          <w:iCs/>
+          <w:lang w:val="en-MY"/>
+        </w:rPr>
+        <w:t xml:space="preserve"> Internal Test </w:t>
+      </w:r>
+      <w:r>
+        <w:rPr>
+          <w:rStyle w:val="SubtleEmphasis"/>
+          <w:i/>
+          <w:iCs/>
+          <w:lang w:val="en-MY"/>
+        </w:rPr>
+        <w:t>Results</w:t>
+      </w:r>
+    </w:p>
+    <w:p>
+      <w:pPr>
+        <w:spacing w:after="0"/>
+      </w:pPr>
+      <w:r>
+        <w:rPr>
+          <w:noProof/>
+        </w:rPr>
+        <w:lastRenderedPageBreak/>
+        <w:drawing>
+          <wp:inline distT="0" distB="0" distL="0" distR="0" wp14:anchorId="28B4E7FA" wp14:editId="3F3431B2">
+            <wp:extent cx="5830114" cy="1343212"/>
+            <wp:effectExtent l="0" t="0" r="0" b="9525"/>
+            <wp:docPr id="796138880" name="Picture 1"/>
+            <wp:cNvGraphicFramePr>
+              <a:graphicFrameLocks xmlns:a="http://schemas.openxmlformats.org/drawingml/2006/main" noChangeAspect="1"/>
+            </wp:cNvGraphicFramePr>
+            <a:graphic xmlns:a="http://schemas.openxmlformats.org/drawingml/2006/main">
+              <a:graphicData uri="http://schemas.openxmlformats.org/drawingml/2006/picture">
+                <pic:pic xmlns:pic="http://schemas.openxmlformats.org/drawingml/2006/picture">
+                  <pic:nvPicPr>
+                    <pic:cNvPr id="796138880" name=""/>
+                    <pic:cNvPicPr/>
+                  </pic:nvPicPr>
+                  <pic:blipFill>
+                    <a:blip r:embed="rId26"/>
+                    <a:stretch>
+                      <a:fillRect/>
+                    </a:stretch>
+                  </pic:blipFill>
+                  <pic:spPr>
+                    <a:xfrm>
+                      <a:off x="0" y="0"/>
+                      <a:ext cx="5830114" cy="1343212"/>
+                    </a:xfrm>
+                    <a:prstGeom prst="rect">
+                      <a:avLst/>
+                    </a:prstGeom>
+                  </pic:spPr>
+                </pic:pic>
+              </a:graphicData>
+            </a:graphic>
+          </wp:inline>
+        </w:drawing>
+      </w:r>
+    </w:p>
+    <w:p>
+      <w:pPr>
+        <w:pStyle w:val="Quote"/>
+        <w:spacing w:before="0" w:after="0"/>
+        <w:rPr>
+          <w:rStyle w:val="SubtleEmphasis"/>
+          <w:i/>
+          <w:iCs/>
+        </w:rPr>
+      </w:pPr>
+      <w:r>
+        <w:rPr>
+          <w:rStyle w:val="SubtleEmphasis"/>
+          <w:i/>
+          <w:iCs/>
+        </w:rPr>
+        <w:t xml:space="preserve">Figure X. </w:t>
+      </w:r>
+      <w:r>
+        <w:rPr>
+          <w:rStyle w:val="SubtleEmphasis"/>
+          <w:i/>
+          <w:iCs/>
+        </w:rPr>
+        <w:t>V0.4 Overview of Evaluation Results</w:t>
+      </w:r>
+    </w:p>
+    <w:p/>
+    <w:p>
+      <w:r>
+        <w:t xml:space="preserve">As shown in </w:t>
+      </w:r>
+      <w:r>
+        <w:rPr>
+          <w:highlight w:val="yellow"/>
+        </w:rPr>
+        <w:t>Fig. X.</w:t>
+      </w:r>
+      <w:r>
+        <w:t xml:space="preserve"> We opted for one external test set as the images would only be used against other smartphone grade </w:t>
+      </w:r>
+      <w:r>
+        <w:t>cameras and</w:t>
+      </w:r>
+      <w:r>
+        <w:t xml:space="preserve"> opted for PH</w:t>
+      </w:r>
+      <w:r>
+        <w:rPr>
+          <w:vertAlign w:val="superscript"/>
+        </w:rPr>
+        <w:t>2</w:t>
+      </w:r>
+      <w:r>
+        <w:t xml:space="preserve"> to test its ability to detect MEL, the results were expected, with a drastic accuracy dip to 59%, however the Balanced Accuracy and F1-Scores were at 57.5% and 64.3% respectively</w:t>
+      </w:r>
+      <w:r>
+        <w:t>. This confirmed that image modality (clinical vs. dermoscopic) to be the primary issue rather than another variable such as the classification scheme.</w:t>
+      </w:r>
+    </w:p>
+    <w:p>
+      <w:r>
+        <w:t>The confusion matrices below illustrate the per-class prediction distributions across both test sets.</w:t>
+      </w:r>
+    </w:p>
+    <w:p>
+      <w:pPr>
+        <w:spacing w:after="0"/>
+        <w:jc w:val="center"/>
+      </w:pPr>
+      <w:r>
+        <w:rPr>
+          <w:noProof/>
+        </w:rPr>
+        <w:drawing>
+          <wp:inline distT="0" distB="0" distL="0" distR="0" wp14:anchorId="4FE44E14" wp14:editId="31731A33">
+            <wp:extent cx="5546785" cy="2450215"/>
+            <wp:effectExtent l="0" t="0" r="0" b="7620"/>
+            <wp:docPr id="1683776979" name="Picture 12"/>
+            <wp:cNvGraphicFramePr>
+              <a:graphicFrameLocks xmlns:a="http://schemas.openxmlformats.org/drawingml/2006/main" noChangeAspect="1"/>
+            </wp:cNvGraphicFramePr>
+            <a:graphic xmlns:a="http://schemas.openxmlformats.org/drawingml/2006/main">
+              <a:graphicData uri="http://schemas.openxmlformats.org/drawingml/2006/picture">
+                <pic:pic xmlns:pic="http://schemas.openxmlformats.org/drawingml/2006/picture">
+                  <pic:nvPicPr>
+                    <pic:cNvPr id="0" name="Picture 22"/>
+                    <pic:cNvPicPr>
+                      <a:picLocks noChangeAspect="1" noChangeArrowheads="1"/>
+                    </pic:cNvPicPr>
+                  </pic:nvPicPr>
+                  <pic:blipFill>
+                    <a:blip r:embed="rId27">
+                      <a:extLst>
+                        <a:ext uri="{28A0092B-C50C-407E-A947-70E740481C1C}">
+                          <a14:useLocalDpi xmlns:a14="http://schemas.microsoft.com/office/drawing/2010/main" val="0"/>
+                        </a:ext>
+                      </a:extLst>
+                    </a:blip>
+                    <a:srcRect/>
+                    <a:stretch>
+                      <a:fillRect/>
+                    </a:stretch>
+                  </pic:blipFill>
+                  <pic:spPr bwMode="auto">
+                    <a:xfrm>
+                      <a:off x="0" y="0"/>
+                      <a:ext cx="5552814" cy="2452878"/>
+                    </a:xfrm>
+                    <a:prstGeom prst="rect">
+                      <a:avLst/>
+                    </a:prstGeom>
+                    <a:noFill/>
+                    <a:ln>
+                      <a:noFill/>
+                    </a:ln>
+                  </pic:spPr>
+                </pic:pic>
+              </a:graphicData>
+            </a:graphic>
+          </wp:inline>
+        </w:drawing>
+      </w:r>
+    </w:p>
+    <w:p>
+      <w:pPr>
+        <w:pStyle w:val="Quote"/>
+        <w:spacing w:before="0" w:after="0"/>
+        <w:rPr>
+          <w:lang w:val="fr-CA"/>
+        </w:rPr>
+      </w:pPr>
+      <w:r>
+        <w:rPr>
+          <w:rStyle w:val="SubtleEmphasis"/>
+          <w:i/>
+          <w:iCs/>
+          <w:lang w:val="fr-CA"/>
+        </w:rPr>
+        <w:t xml:space="preserve">Figure X. V0.4 </w:t>
+      </w:r>
+      <w:proofErr w:type="spellStart"/>
+      <w:r>
+        <w:rPr>
+          <w:rStyle w:val="SubtleEmphasis"/>
+          <w:i/>
+          <w:iCs/>
+          <w:lang w:val="fr-CA"/>
+        </w:rPr>
+        <w:t>Internal</w:t>
+      </w:r>
+      <w:proofErr w:type="spellEnd"/>
+      <w:r>
+        <w:rPr>
+          <w:rStyle w:val="SubtleEmphasis"/>
+          <w:i/>
+          <w:iCs/>
+          <w:lang w:val="fr-CA"/>
+        </w:rPr>
+        <w:t xml:space="preserve"> Test Confusion Ma</w:t>
+      </w:r>
+      <w:r>
+        <w:rPr>
+          <w:rStyle w:val="SubtleEmphasis"/>
+          <w:i/>
+          <w:iCs/>
+          <w:lang w:val="fr-CA"/>
+        </w:rPr>
+        <w:t>trix</w:t>
+      </w:r>
+    </w:p>
+    <w:p>
+      <w:pPr>
+        <w:spacing w:after="0"/>
+        <w:jc w:val="center"/>
+      </w:pPr>
+      <w:r>
+        <w:rPr>
+          <w:noProof/>
+        </w:rPr>
+        <w:drawing>
+          <wp:inline distT="0" distB="0" distL="0" distR="0" wp14:anchorId="2B96368E" wp14:editId="7336A184">
+            <wp:extent cx="5598543" cy="2488042"/>
+            <wp:effectExtent l="0" t="0" r="2540" b="7620"/>
+            <wp:docPr id="2048785175" name="Picture 11"/>
+            <wp:cNvGraphicFramePr>
+              <a:graphicFrameLocks xmlns:a="http://schemas.openxmlformats.org/drawingml/2006/main" noChangeAspect="1"/>
+            </wp:cNvGraphicFramePr>
+            <a:graphic xmlns:a="http://schemas.openxmlformats.org/drawingml/2006/main">
+              <a:graphicData uri="http://schemas.openxmlformats.org/drawingml/2006/picture">
+                <pic:pic xmlns:pic="http://schemas.openxmlformats.org/drawingml/2006/picture">
+                  <pic:nvPicPr>
+                    <pic:cNvPr id="0" name="Picture 21"/>
+                    <pic:cNvPicPr>
+                      <a:picLocks noChangeAspect="1" noChangeArrowheads="1"/>
+                    </pic:cNvPicPr>
+                  </pic:nvPicPr>
+                  <pic:blipFill>
+                    <a:blip r:embed="rId28">
+                      <a:extLst>
+                        <a:ext uri="{28A0092B-C50C-407E-A947-70E740481C1C}">
+                          <a14:useLocalDpi xmlns:a14="http://schemas.microsoft.com/office/drawing/2010/main" val="0"/>
+                        </a:ext>
+                      </a:extLst>
+                    </a:blip>
+                    <a:srcRect/>
+                    <a:stretch>
+                      <a:fillRect/>
+                    </a:stretch>
+                  </pic:blipFill>
+                  <pic:spPr bwMode="auto">
+                    <a:xfrm>
+                      <a:off x="0" y="0"/>
+                      <a:ext cx="5602066" cy="2489608"/>
+                    </a:xfrm>
+                    <a:prstGeom prst="rect">
+                      <a:avLst/>
+                    </a:prstGeom>
+                    <a:noFill/>
+                    <a:ln>
+                      <a:noFill/>
+                    </a:ln>
+                  </pic:spPr>
+                </pic:pic>
+              </a:graphicData>
+            </a:graphic>
+          </wp:inline>
+        </w:drawing>
+      </w:r>
+    </w:p>
+    <w:p>
+      <w:pPr>
+        <w:pStyle w:val="Quote"/>
+        <w:spacing w:before="0" w:after="0"/>
+        <w:rPr>
+          <w:rStyle w:val="SubtleEmphasis"/>
+          <w:i/>
+          <w:iCs/>
+          <w:lang w:val="fr-CA"/>
+        </w:rPr>
+      </w:pPr>
+      <w:r>
+        <w:rPr>
+          <w:rStyle w:val="SubtleEmphasis"/>
+          <w:i/>
+          <w:iCs/>
+          <w:lang w:val="fr-CA"/>
+        </w:rPr>
+        <w:t>Figure X. V0.4 PH</w:t>
+      </w:r>
+      <w:r>
+        <w:rPr>
+          <w:rStyle w:val="SubtleEmphasis"/>
+          <w:i/>
+          <w:iCs/>
+          <w:vertAlign w:val="superscript"/>
+          <w:lang w:val="fr-CA"/>
+        </w:rPr>
+        <w:t>2</w:t>
+      </w:r>
+      <w:r>
+        <w:rPr>
+          <w:rStyle w:val="SubtleEmphasis"/>
+          <w:i/>
+          <w:iCs/>
+          <w:lang w:val="fr-CA"/>
+        </w:rPr>
+        <w:t xml:space="preserve"> C</w:t>
+      </w:r>
+      <w:r>
+        <w:rPr>
+          <w:rStyle w:val="SubtleEmphasis"/>
+          <w:i/>
+          <w:iCs/>
+          <w:lang w:val="fr-CA"/>
+        </w:rPr>
+        <w:t>onfusion Matrix</w:t>
+      </w:r>
+    </w:p>
+    <w:p>
+      <w:pPr>
+        <w:rPr>
+          <w:lang w:val="en-MY"/>
+        </w:rPr>
+      </w:pPr>
+      <w:r>
+        <w:rPr>
+          <w:lang w:val="en-MY"/>
+        </w:rPr>
+        <w:lastRenderedPageBreak/>
+        <w:t>Overfitting remains to be a</w:t>
+      </w:r>
+      <w:r>
+        <w:rPr>
+          <w:lang w:val="en-MY"/>
+        </w:rPr>
+        <w:t xml:space="preserve">n issue, and should be investigated in future works by comparing it against baseline CNN or </w:t>
+      </w:r>
+      <w:proofErr w:type="spellStart"/>
+      <w:r>
+        <w:rPr>
+          <w:lang w:val="en-MY"/>
+        </w:rPr>
+        <w:t>ViT</w:t>
+      </w:r>
+      <w:proofErr w:type="spellEnd"/>
+      <w:r>
+        <w:rPr>
+          <w:lang w:val="en-MY"/>
+        </w:rPr>
+        <w:t xml:space="preserve"> models to determine its cause as shown </w:t>
+      </w:r>
+      <w:r>
+        <w:rPr>
+          <w:highlight w:val="yellow"/>
+          <w:lang w:val="en-MY"/>
+        </w:rPr>
+        <w:t>in Fig. X.</w:t>
+      </w:r>
+    </w:p>
+    <w:p>
+      <w:pPr>
+        <w:spacing w:after="0"/>
+      </w:pPr>
+      <w:r>
+        <w:rPr>
+          <w:noProof/>
+        </w:rPr>
+        <w:drawing>
+          <wp:inline distT="0" distB="0" distL="0" distR="0" wp14:anchorId="311774B7" wp14:editId="6BE55A0F">
+            <wp:extent cx="5943600" cy="1951990"/>
+            <wp:effectExtent l="0" t="0" r="0" b="0"/>
+            <wp:docPr id="38643469" name="Picture 7"/>
+            <wp:cNvGraphicFramePr>
+              <a:graphicFrameLocks xmlns:a="http://schemas.openxmlformats.org/drawingml/2006/main" noChangeAspect="1"/>
+            </wp:cNvGraphicFramePr>
+            <a:graphic xmlns:a="http://schemas.openxmlformats.org/drawingml/2006/main">
+              <a:graphicData uri="http://schemas.openxmlformats.org/drawingml/2006/picture">
+                <pic:pic xmlns:pic="http://schemas.openxmlformats.org/drawingml/2006/picture">
+                  <pic:nvPicPr>
+                    <pic:cNvPr id="0" name="Picture 13"/>
+                    <pic:cNvPicPr>
+                      <a:picLocks noChangeAspect="1" noChangeArrowheads="1"/>
+                    </pic:cNvPicPr>
+                  </pic:nvPicPr>
+                  <pic:blipFill>
+                    <a:blip r:embed="rId29">
+                      <a:extLst>
+                        <a:ext uri="{28A0092B-C50C-407E-A947-70E740481C1C}">
+                          <a14:useLocalDpi xmlns:a14="http://schemas.microsoft.com/office/drawing/2010/main" val="0"/>
+                        </a:ext>
+                      </a:extLst>
+                    </a:blip>
+                    <a:srcRect/>
+                    <a:stretch>
+                      <a:fillRect/>
+                    </a:stretch>
+                  </pic:blipFill>
+                  <pic:spPr bwMode="auto">
+                    <a:xfrm>
+                      <a:off x="0" y="0"/>
+                      <a:ext cx="5943600" cy="1951990"/>
+                    </a:xfrm>
+                    <a:prstGeom prst="rect">
+                      <a:avLst/>
+                    </a:prstGeom>
+                    <a:noFill/>
+                    <a:ln>
+                      <a:noFill/>
+                    </a:ln>
+                  </pic:spPr>
+                </pic:pic>
+              </a:graphicData>
+            </a:graphic>
+          </wp:inline>
+        </w:drawing>
+      </w:r>
+    </w:p>
+    <w:p>
+      <w:pPr>
+        <w:pStyle w:val="Quote"/>
+        <w:spacing w:before="0"/>
+      </w:pPr>
+      <w:r>
+        <w:rPr>
+          <w:rStyle w:val="SubtleEmphasis"/>
+          <w:i/>
+          <w:iCs/>
+        </w:rPr>
+        <w:t xml:space="preserve">Figure X. </w:t>
+      </w:r>
+      <w:r>
+        <w:rPr>
+          <w:rStyle w:val="SubtleEmphasis"/>
+          <w:i/>
+          <w:iCs/>
+        </w:rPr>
+        <w:t>V0.4 Training Curves</w:t>
+      </w:r>
+    </w:p>
+    <w:p>
+      <w:pPr>
+        <w:pStyle w:val="Heading3"/>
       </w:pPr>
       <w:bookmarkStart w:id="57" w:name="_Toc227699994"/>
       <w:r>
-        <w:lastRenderedPageBreak/>
         <w:t xml:space="preserve">5.2. </w:t>
       </w:r>
       <w:r>
@@ -8606,21 +10492,10 @@
       </w:pPr>
       <w:bookmarkStart w:id="58" w:name="_Toc227699995"/>
       <w:r>
-        <w:t>5</w:t>
-      </w:r>
-      <w:r>
-        <w:t>.</w:t>
-      </w:r>
-      <w:r>
-        <w:t>2</w:t>
-      </w:r>
-      <w:r>
-        <w:t xml:space="preserve">.1. </w:t>
+        <w:t xml:space="preserve">5.2.1. </w:t>
       </w:r>
       <w:r>
         <w:tab/>
-      </w:r>
-      <w:r>
         <w:t>[INSERT TEXT HERE]</w:t>
       </w:r>
       <w:bookmarkEnd w:id="58"/>
@@ -8722,7 +10597,7 @@
                     <pic:cNvPicPr/>
                   </pic:nvPicPr>
                   <pic:blipFill>
-                    <a:blip r:embed="rId13"/>
+                    <a:blip r:embed="rId30"/>
                     <a:stretch>
                       <a:fillRect/>
                     </a:stretch>
@@ -9079,7 +10954,7 @@
       <w:r>
         <w:t xml:space="preserve">, [Online]. Available: </w:t>
       </w:r>
-      <w:hyperlink r:id="rId14" w:history="1">
+      <w:hyperlink r:id="rId31" w:history="1">
         <w:r>
           <w:rPr>
             <w:rStyle w:val="Hyperlink"/>
@@ -9457,7 +11332,7 @@
       <w:r>
         <w:t xml:space="preserve">[Online]. Available: </w:t>
       </w:r>
-      <w:hyperlink r:id="rId15" w:history="1">
+      <w:hyperlink r:id="rId32" w:history="1">
         <w:r>
           <w:rPr>
             <w:rStyle w:val="Hyperlink"/>
@@ -9481,13 +11356,13 @@
         </w:numPr>
         <w:spacing w:line="276" w:lineRule="auto"/>
         <w:rPr>
-          <w:lang w:val="fr-CA"/>
-        </w:rPr>
-      </w:pPr>
-      <w:r>
-        <w:rPr>
           <w:lang w:val="en-MY"/>
         </w:rPr>
+      </w:pPr>
+      <w:r>
+        <w:rPr>
+          <w:lang w:val="en-MY"/>
+        </w:rPr>
         <w:t>M. H. Hamim, “</w:t>
       </w:r>
       <w:r>
@@ -9502,69 +11377,33 @@
         </w:rPr>
         <w:t xml:space="preserve">,” Kaggle. [Online]. </w:t>
       </w:r>
-      <w:proofErr w:type="spellStart"/>
-      <w:r>
-        <w:rPr>
-          <w:lang w:val="fr-CA"/>
-        </w:rPr>
-        <w:t>Available</w:t>
-      </w:r>
-      <w:proofErr w:type="spellEnd"/>
-      <w:r>
-        <w:rPr>
-          <w:lang w:val="fr-CA"/>
-        </w:rPr>
-        <w:t xml:space="preserve">: </w:t>
-      </w:r>
-      <w:hyperlink r:id="rId16" w:history="1">
+      <w:r>
+        <w:rPr>
+          <w:lang w:val="en-MY"/>
+        </w:rPr>
+        <w:t xml:space="preserve">Available: </w:t>
+      </w:r>
+      <w:hyperlink r:id="rId33" w:history="1">
         <w:r>
           <w:rPr>
             <w:rStyle w:val="Hyperlink"/>
-            <w:lang w:val="fr-CA"/>
+            <w:lang w:val="en-MY"/>
           </w:rPr>
           <w:t>https://www.kaggle.com/mahmudulhasanhamim/code</w:t>
         </w:r>
       </w:hyperlink>
       <w:r>
         <w:rPr>
-          <w:lang w:val="fr-CA"/>
-        </w:rPr>
-        <w:t>. [</w:t>
-      </w:r>
-      <w:proofErr w:type="spellStart"/>
-      <w:r>
-        <w:rPr>
-          <w:lang w:val="fr-CA"/>
-        </w:rPr>
-        <w:t>Accessed</w:t>
-      </w:r>
-      <w:proofErr w:type="spellEnd"/>
-      <w:r>
-        <w:rPr>
-          <w:lang w:val="fr-CA"/>
-        </w:rPr>
-        <w:t xml:space="preserve"> : </w:t>
-      </w:r>
-      <w:proofErr w:type="spellStart"/>
-      <w:r>
-        <w:rPr>
-          <w:lang w:val="fr-CA"/>
-        </w:rPr>
-        <w:t>Feb</w:t>
-      </w:r>
-      <w:proofErr w:type="spellEnd"/>
-      <w:r>
-        <w:rPr>
-          <w:lang w:val="fr-CA"/>
-        </w:rPr>
-        <w:t>. 18, 2026]</w:t>
+          <w:lang w:val="en-MY"/>
+        </w:rPr>
+        <w:t>. [Accessed : Feb. 18, 2026]</w:t>
       </w:r>
     </w:p>
     <w:p>
       <w:pPr>
         <w:spacing w:line="276" w:lineRule="auto"/>
         <w:rPr>
-          <w:lang w:val="fr-CA"/>
+          <w:lang w:val="en-MY"/>
         </w:rPr>
       </w:pPr>
     </w:p>
@@ -9572,12 +11411,12 @@
       <w:pPr>
         <w:spacing w:line="276" w:lineRule="auto"/>
         <w:rPr>
-          <w:lang w:val="fr-CA"/>
-        </w:rPr>
-      </w:pPr>
-      <w:r>
-        <w:rPr>
-          <w:lang w:val="fr-CA"/>
+          <w:lang w:val="en-MY"/>
+        </w:rPr>
+      </w:pPr>
+      <w:r>
+        <w:rPr>
+          <w:lang w:val="en-MY"/>
         </w:rPr>
         <w:br w:type="page"/>
       </w:r>
@@ -9641,7 +11480,7 @@
       </w:r>
     </w:p>
     <w:sectPr>
-      <w:headerReference w:type="default" r:id="rId17"/>
+      <w:headerReference w:type="default" r:id="rId34"/>
       <w:pgSz w:w="12240" w:h="15840"/>
       <w:pgMar w:top="720" w:right="1440" w:bottom="720" w:left="1440" w:header="720" w:footer="720" w:gutter="0"/>
       <w:cols w:space="720"/>
@@ -11226,6 +13065,127 @@
     </w:lvl>
   </w:abstractNum>
   <w:abstractNum w:abstractNumId="14" w15:restartNumberingAfterBreak="0">
+    <w:nsid w:val="2AEC555B"/>
+    <w:multiLevelType w:val="multilevel"/>
+    <w:tmpl w:val="765C3442"/>
+    <w:lvl w:ilvl="0">
+      <w:start w:val="1"/>
+      <w:numFmt w:val="decimal"/>
+      <w:lvlText w:val="%1."/>
+      <w:lvlJc w:val="left"/>
+      <w:pPr>
+        <w:ind w:left="720" w:hanging="360"/>
+      </w:pPr>
+      <w:rPr>
+        <w:rFonts w:hint="default"/>
+      </w:rPr>
+    </w:lvl>
+    <w:lvl w:ilvl="1">
+      <w:start w:val="1"/>
+      <w:numFmt w:val="decimal"/>
+      <w:isLgl/>
+      <w:lvlText w:val="%1.%2"/>
+      <w:lvlJc w:val="left"/>
+      <w:pPr>
+        <w:ind w:left="1080" w:hanging="720"/>
+      </w:pPr>
+      <w:rPr>
+        <w:rFonts w:hint="default"/>
+      </w:rPr>
+    </w:lvl>
+    <w:lvl w:ilvl="2">
+      <w:start w:val="1"/>
+      <w:numFmt w:val="decimal"/>
+      <w:isLgl/>
+      <w:lvlText w:val="%1.%2.%3"/>
+      <w:lvlJc w:val="left"/>
+      <w:pPr>
+        <w:ind w:left="1440" w:hanging="1080"/>
+      </w:pPr>
+      <w:rPr>
+        <w:rFonts w:hint="default"/>
+      </w:rPr>
+    </w:lvl>
+    <w:lvl w:ilvl="3">
+      <w:start w:val="1"/>
+      <w:numFmt w:val="decimal"/>
+      <w:isLgl/>
+      <w:lvlText w:val="%1.%2.%3.%4"/>
+      <w:lvlJc w:val="left"/>
+      <w:pPr>
+        <w:ind w:left="1440" w:hanging="1080"/>
+      </w:pPr>
+      <w:rPr>
+        <w:rFonts w:hint="default"/>
+      </w:rPr>
+    </w:lvl>
+    <w:lvl w:ilvl="4">
+      <w:start w:val="1"/>
+      <w:numFmt w:val="decimal"/>
+      <w:isLgl/>
+      <w:lvlText w:val="%1.%2.%3.%4.%5"/>
+      <w:lvlJc w:val="left"/>
+      <w:pPr>
+        <w:ind w:left="1800" w:hanging="1440"/>
+      </w:pPr>
+      <w:rPr>
+        <w:rFonts w:hint="default"/>
+      </w:rPr>
+    </w:lvl>
+    <w:lvl w:ilvl="5">
+      <w:start w:val="1"/>
+      <w:numFmt w:val="decimal"/>
+      <w:isLgl/>
+      <w:lvlText w:val="%1.%2.%3.%4.%5.%6"/>
+      <w:lvlJc w:val="left"/>
+      <w:pPr>
+        <w:ind w:left="2160" w:hanging="1800"/>
+      </w:pPr>
+      <w:rPr>
+        <w:rFonts w:hint="default"/>
+      </w:rPr>
+    </w:lvl>
+    <w:lvl w:ilvl="6">
+      <w:start w:val="1"/>
+      <w:numFmt w:val="decimal"/>
+      <w:isLgl/>
+      <w:lvlText w:val="%1.%2.%3.%4.%5.%6.%7"/>
+      <w:lvlJc w:val="left"/>
+      <w:pPr>
+        <w:ind w:left="2520" w:hanging="2160"/>
+      </w:pPr>
+      <w:rPr>
+        <w:rFonts w:hint="default"/>
+      </w:rPr>
+    </w:lvl>
+    <w:lvl w:ilvl="7">
+      <w:start w:val="1"/>
+      <w:numFmt w:val="decimal"/>
+      <w:isLgl/>
+      <w:lvlText w:val="%1.%2.%3.%4.%5.%6.%7.%8"/>
+      <w:lvlJc w:val="left"/>
+      <w:pPr>
+        <w:ind w:left="2880" w:hanging="2520"/>
+      </w:pPr>
+      <w:rPr>
+        <w:rFonts w:hint="default"/>
+      </w:rPr>
+    </w:lvl>
+    <w:lvl w:ilvl="8">
+      <w:start w:val="1"/>
+      <w:numFmt w:val="decimal"/>
+      <w:isLgl/>
+      <w:lvlText w:val="%1.%2.%3.%4.%5.%6.%7.%8.%9"/>
+      <w:lvlJc w:val="left"/>
+      <w:pPr>
+        <w:ind w:left="2880" w:hanging="2520"/>
+      </w:pPr>
+      <w:rPr>
+        <w:rFonts w:hint="default"/>
+      </w:rPr>
+    </w:lvl>
+  </w:abstractNum>
+  <w:abstractNum w:abstractNumId="15" w15:restartNumberingAfterBreak="0">
     <w:nsid w:val="2E3E47AA"/>
     <w:multiLevelType w:val="hybridMultilevel"/>
     <w:tmpl w:val="F4C4B788"/>
@@ -11314,7 +13274,7 @@
       </w:pPr>
     </w:lvl>
   </w:abstractNum>
-  <w:abstractNum w:abstractNumId="15" w15:restartNumberingAfterBreak="0">
+  <w:abstractNum w:abstractNumId="16" w15:restartNumberingAfterBreak="0">
     <w:nsid w:val="37F86799"/>
     <w:multiLevelType w:val="multilevel"/>
     <w:tmpl w:val="765C3442"/>
@@ -11435,7 +13395,7 @@
       </w:rPr>
     </w:lvl>
   </w:abstractNum>
-  <w:abstractNum w:abstractNumId="16" w15:restartNumberingAfterBreak="0">
+  <w:abstractNum w:abstractNumId="17" w15:restartNumberingAfterBreak="0">
     <w:nsid w:val="38944EA4"/>
     <w:multiLevelType w:val="hybridMultilevel"/>
     <w:tmpl w:val="AAD67C14"/>
@@ -11547,7 +13507,7 @@
       </w:rPr>
     </w:lvl>
   </w:abstractNum>
-  <w:abstractNum w:abstractNumId="17" w15:restartNumberingAfterBreak="0">
+  <w:abstractNum w:abstractNumId="18" w15:restartNumberingAfterBreak="0">
     <w:nsid w:val="3D1D3552"/>
     <w:multiLevelType w:val="multilevel"/>
     <w:tmpl w:val="8BFE283E"/>
@@ -11696,7 +13656,7 @@
       </w:rPr>
     </w:lvl>
   </w:abstractNum>
-  <w:abstractNum w:abstractNumId="18" w15:restartNumberingAfterBreak="0">
+  <w:abstractNum w:abstractNumId="19" w15:restartNumberingAfterBreak="0">
     <w:nsid w:val="3EB26CE6"/>
     <w:multiLevelType w:val="hybridMultilevel"/>
     <w:tmpl w:val="6D5A9D6C"/>
@@ -11785,7 +13745,7 @@
       </w:pPr>
     </w:lvl>
   </w:abstractNum>
-  <w:abstractNum w:abstractNumId="19" w15:restartNumberingAfterBreak="0">
+  <w:abstractNum w:abstractNumId="20" w15:restartNumberingAfterBreak="0">
     <w:nsid w:val="3F531559"/>
     <w:multiLevelType w:val="hybridMultilevel"/>
     <w:tmpl w:val="05A03E6A"/>
@@ -11898,7 +13858,7 @@
       </w:rPr>
     </w:lvl>
   </w:abstractNum>
-  <w:abstractNum w:abstractNumId="20" w15:restartNumberingAfterBreak="0">
+  <w:abstractNum w:abstractNumId="21" w15:restartNumberingAfterBreak="0">
     <w:nsid w:val="40CF0D06"/>
     <w:multiLevelType w:val="hybridMultilevel"/>
     <w:tmpl w:val="9F54ED7A"/>
@@ -12010,7 +13970,7 @@
       </w:rPr>
     </w:lvl>
   </w:abstractNum>
-  <w:abstractNum w:abstractNumId="21" w15:restartNumberingAfterBreak="0">
+  <w:abstractNum w:abstractNumId="22" w15:restartNumberingAfterBreak="0">
     <w:nsid w:val="42822500"/>
     <w:multiLevelType w:val="hybridMultilevel"/>
     <w:tmpl w:val="855A3BC4"/>
@@ -12123,7 +14083,7 @@
       </w:rPr>
     </w:lvl>
   </w:abstractNum>
-  <w:abstractNum w:abstractNumId="22" w15:restartNumberingAfterBreak="0">
+  <w:abstractNum w:abstractNumId="23" w15:restartNumberingAfterBreak="0">
     <w:nsid w:val="44EB257A"/>
     <w:multiLevelType w:val="hybridMultilevel"/>
     <w:tmpl w:val="027A4658"/>
@@ -12209,7 +14169,7 @@
       </w:pPr>
     </w:lvl>
   </w:abstractNum>
-  <w:abstractNum w:abstractNumId="23" w15:restartNumberingAfterBreak="0">
+  <w:abstractNum w:abstractNumId="24" w15:restartNumberingAfterBreak="0">
     <w:nsid w:val="4A7A62E0"/>
     <w:multiLevelType w:val="hybridMultilevel"/>
     <w:tmpl w:val="A880A792"/>
@@ -12322,7 +14282,7 @@
       </w:rPr>
     </w:lvl>
   </w:abstractNum>
-  <w:abstractNum w:abstractNumId="24" w15:restartNumberingAfterBreak="0">
+  <w:abstractNum w:abstractNumId="25" w15:restartNumberingAfterBreak="0">
     <w:nsid w:val="4CDA17E8"/>
     <w:multiLevelType w:val="hybridMultilevel"/>
     <w:tmpl w:val="6E402B14"/>
@@ -12411,7 +14371,7 @@
       </w:pPr>
     </w:lvl>
   </w:abstractNum>
-  <w:abstractNum w:abstractNumId="25" w15:restartNumberingAfterBreak="0">
+  <w:abstractNum w:abstractNumId="26" w15:restartNumberingAfterBreak="0">
     <w:nsid w:val="59F8519C"/>
     <w:multiLevelType w:val="hybridMultilevel"/>
     <w:tmpl w:val="23D8909E"/>
@@ -12500,7 +14460,7 @@
       </w:pPr>
     </w:lvl>
   </w:abstractNum>
-  <w:abstractNum w:abstractNumId="26" w15:restartNumberingAfterBreak="0">
+  <w:abstractNum w:abstractNumId="27" w15:restartNumberingAfterBreak="0">
     <w:nsid w:val="5C416AF1"/>
     <w:multiLevelType w:val="hybridMultilevel"/>
     <w:tmpl w:val="CD0AB6F2"/>
@@ -12612,7 +14572,7 @@
       </w:rPr>
     </w:lvl>
   </w:abstractNum>
-  <w:abstractNum w:abstractNumId="27" w15:restartNumberingAfterBreak="0">
+  <w:abstractNum w:abstractNumId="28" w15:restartNumberingAfterBreak="0">
     <w:nsid w:val="5C9054E2"/>
     <w:multiLevelType w:val="multilevel"/>
     <w:tmpl w:val="DDF243BC"/>
@@ -12738,7 +14698,7 @@
       </w:rPr>
     </w:lvl>
   </w:abstractNum>
-  <w:abstractNum w:abstractNumId="28" w15:restartNumberingAfterBreak="0">
+  <w:abstractNum w:abstractNumId="29" w15:restartNumberingAfterBreak="0">
     <w:nsid w:val="5FFC0E65"/>
     <w:multiLevelType w:val="hybridMultilevel"/>
     <w:tmpl w:val="E33025EC"/>
@@ -12851,7 +14811,7 @@
       </w:rPr>
     </w:lvl>
   </w:abstractNum>
-  <w:abstractNum w:abstractNumId="29" w15:restartNumberingAfterBreak="0">
+  <w:abstractNum w:abstractNumId="30" w15:restartNumberingAfterBreak="0">
     <w:nsid w:val="60F96E99"/>
     <w:multiLevelType w:val="hybridMultilevel"/>
     <w:tmpl w:val="C0A40084"/>
@@ -12940,7 +14900,7 @@
       </w:pPr>
     </w:lvl>
   </w:abstractNum>
-  <w:abstractNum w:abstractNumId="30" w15:restartNumberingAfterBreak="0">
+  <w:abstractNum w:abstractNumId="31" w15:restartNumberingAfterBreak="0">
     <w:nsid w:val="629D7DD8"/>
     <w:multiLevelType w:val="hybridMultilevel"/>
     <w:tmpl w:val="538A5500"/>
@@ -13053,7 +15013,7 @@
       </w:rPr>
     </w:lvl>
   </w:abstractNum>
-  <w:abstractNum w:abstractNumId="31" w15:restartNumberingAfterBreak="0">
+  <w:abstractNum w:abstractNumId="32" w15:restartNumberingAfterBreak="0">
     <w:nsid w:val="63B73DCB"/>
     <w:multiLevelType w:val="hybridMultilevel"/>
     <w:tmpl w:val="70C6C83A"/>
@@ -13165,7 +15125,7 @@
       </w:rPr>
     </w:lvl>
   </w:abstractNum>
-  <w:abstractNum w:abstractNumId="32" w15:restartNumberingAfterBreak="0">
+  <w:abstractNum w:abstractNumId="33" w15:restartNumberingAfterBreak="0">
     <w:nsid w:val="6422414F"/>
     <w:multiLevelType w:val="hybridMultilevel"/>
     <w:tmpl w:val="667041EA"/>
@@ -13254,7 +15214,7 @@
       </w:pPr>
     </w:lvl>
   </w:abstractNum>
-  <w:abstractNum w:abstractNumId="33" w15:restartNumberingAfterBreak="0">
+  <w:abstractNum w:abstractNumId="34" w15:restartNumberingAfterBreak="0">
     <w:nsid w:val="67271D44"/>
     <w:multiLevelType w:val="hybridMultilevel"/>
     <w:tmpl w:val="551C9252"/>
@@ -13343,7 +15303,7 @@
       </w:pPr>
     </w:lvl>
   </w:abstractNum>
-  <w:abstractNum w:abstractNumId="34" w15:restartNumberingAfterBreak="0">
+  <w:abstractNum w:abstractNumId="35" w15:restartNumberingAfterBreak="0">
     <w:nsid w:val="67D6578A"/>
     <w:multiLevelType w:val="hybridMultilevel"/>
     <w:tmpl w:val="EE640D16"/>
@@ -13432,7 +15392,7 @@
       </w:pPr>
     </w:lvl>
   </w:abstractNum>
-  <w:abstractNum w:abstractNumId="35" w15:restartNumberingAfterBreak="0">
+  <w:abstractNum w:abstractNumId="36" w15:restartNumberingAfterBreak="0">
     <w:nsid w:val="684B5008"/>
     <w:multiLevelType w:val="multilevel"/>
     <w:tmpl w:val="765C3442"/>
@@ -13553,7 +15513,7 @@
       </w:rPr>
     </w:lvl>
   </w:abstractNum>
-  <w:abstractNum w:abstractNumId="36" w15:restartNumberingAfterBreak="0">
+  <w:abstractNum w:abstractNumId="37" w15:restartNumberingAfterBreak="0">
     <w:nsid w:val="68932351"/>
     <w:multiLevelType w:val="hybridMultilevel"/>
     <w:tmpl w:val="F8B4B71A"/>
@@ -13668,7 +15628,7 @@
       </w:rPr>
     </w:lvl>
   </w:abstractNum>
-  <w:abstractNum w:abstractNumId="37" w15:restartNumberingAfterBreak="0">
+  <w:abstractNum w:abstractNumId="38" w15:restartNumberingAfterBreak="0">
     <w:nsid w:val="70DF70C4"/>
     <w:multiLevelType w:val="hybridMultilevel"/>
     <w:tmpl w:val="A0C2BCFA"/>
@@ -13757,7 +15717,7 @@
       </w:pPr>
     </w:lvl>
   </w:abstractNum>
-  <w:abstractNum w:abstractNumId="38" w15:restartNumberingAfterBreak="0">
+  <w:abstractNum w:abstractNumId="39" w15:restartNumberingAfterBreak="0">
     <w:nsid w:val="71CC5CF1"/>
     <w:multiLevelType w:val="multilevel"/>
     <w:tmpl w:val="765C3442"/>
@@ -13878,7 +15838,7 @@
       </w:rPr>
     </w:lvl>
   </w:abstractNum>
-  <w:abstractNum w:abstractNumId="39" w15:restartNumberingAfterBreak="0">
+  <w:abstractNum w:abstractNumId="40" w15:restartNumberingAfterBreak="0">
     <w:nsid w:val="73F00399"/>
     <w:multiLevelType w:val="hybridMultilevel"/>
     <w:tmpl w:val="8C18E526"/>
@@ -13991,7 +15951,7 @@
       </w:rPr>
     </w:lvl>
   </w:abstractNum>
-  <w:abstractNum w:abstractNumId="40" w15:restartNumberingAfterBreak="0">
+  <w:abstractNum w:abstractNumId="41" w15:restartNumberingAfterBreak="0">
     <w:nsid w:val="76921010"/>
     <w:multiLevelType w:val="hybridMultilevel"/>
     <w:tmpl w:val="774E685A"/>
@@ -14106,7 +16066,7 @@
       </w:rPr>
     </w:lvl>
   </w:abstractNum>
-  <w:abstractNum w:abstractNumId="41" w15:restartNumberingAfterBreak="0">
+  <w:abstractNum w:abstractNumId="42" w15:restartNumberingAfterBreak="0">
     <w:nsid w:val="770E2803"/>
     <w:multiLevelType w:val="hybridMultilevel"/>
     <w:tmpl w:val="030E71F0"/>
@@ -14219,7 +16179,7 @@
       </w:rPr>
     </w:lvl>
   </w:abstractNum>
-  <w:abstractNum w:abstractNumId="42" w15:restartNumberingAfterBreak="0">
+  <w:abstractNum w:abstractNumId="43" w15:restartNumberingAfterBreak="0">
     <w:nsid w:val="7A0C5E08"/>
     <w:multiLevelType w:val="hybridMultilevel"/>
     <w:tmpl w:val="3DE85C4E"/>
@@ -14332,7 +16292,7 @@
       </w:rPr>
     </w:lvl>
   </w:abstractNum>
-  <w:abstractNum w:abstractNumId="43" w15:restartNumberingAfterBreak="0">
+  <w:abstractNum w:abstractNumId="44" w15:restartNumberingAfterBreak="0">
     <w:nsid w:val="7E5A0766"/>
     <w:multiLevelType w:val="multilevel"/>
     <w:tmpl w:val="765C3442"/>
@@ -14453,7 +16413,7 @@
       </w:rPr>
     </w:lvl>
   </w:abstractNum>
-  <w:abstractNum w:abstractNumId="44" w15:restartNumberingAfterBreak="0">
+  <w:abstractNum w:abstractNumId="45" w15:restartNumberingAfterBreak="0">
     <w:nsid w:val="7E9020A9"/>
     <w:multiLevelType w:val="multilevel"/>
     <w:tmpl w:val="765C3442"/>
@@ -14574,7 +16534,7 @@
       </w:rPr>
     </w:lvl>
   </w:abstractNum>
-  <w:abstractNum w:abstractNumId="45" w15:restartNumberingAfterBreak="0">
+  <w:abstractNum w:abstractNumId="46" w15:restartNumberingAfterBreak="0">
     <w:nsid w:val="7FC861B9"/>
     <w:multiLevelType w:val="hybridMultilevel"/>
     <w:tmpl w:val="EC2CDBDC"/>
@@ -14664,76 +16624,76 @@
     </w:lvl>
   </w:abstractNum>
   <w:num w:numId="1" w16cid:durableId="2064712393">
-    <w:abstractNumId w:val="18"/>
+    <w:abstractNumId w:val="19"/>
   </w:num>
   <w:num w:numId="2" w16cid:durableId="982613840">
-    <w:abstractNumId w:val="37"/>
+    <w:abstractNumId w:val="38"/>
   </w:num>
   <w:num w:numId="3" w16cid:durableId="34696722">
     <w:abstractNumId w:val="7"/>
   </w:num>
   <w:num w:numId="4" w16cid:durableId="979724115">
-    <w:abstractNumId w:val="45"/>
+    <w:abstractNumId w:val="46"/>
   </w:num>
   <w:num w:numId="5" w16cid:durableId="516575690">
-    <w:abstractNumId w:val="22"/>
+    <w:abstractNumId w:val="23"/>
   </w:num>
   <w:num w:numId="6" w16cid:durableId="807745686">
     <w:abstractNumId w:val="3"/>
   </w:num>
   <w:num w:numId="7" w16cid:durableId="1520049316">
-    <w:abstractNumId w:val="42"/>
+    <w:abstractNumId w:val="43"/>
   </w:num>
   <w:num w:numId="8" w16cid:durableId="198973599">
     <w:abstractNumId w:val="13"/>
   </w:num>
   <w:num w:numId="9" w16cid:durableId="1177623024">
-    <w:abstractNumId w:val="34"/>
+    <w:abstractNumId w:val="35"/>
   </w:num>
   <w:num w:numId="10" w16cid:durableId="511070537">
-    <w:abstractNumId w:val="29"/>
+    <w:abstractNumId w:val="30"/>
   </w:num>
   <w:num w:numId="11" w16cid:durableId="784427824">
-    <w:abstractNumId w:val="33"/>
+    <w:abstractNumId w:val="34"/>
   </w:num>
   <w:num w:numId="12" w16cid:durableId="1457140122">
     <w:abstractNumId w:val="12"/>
   </w:num>
   <w:num w:numId="13" w16cid:durableId="1692686484">
-    <w:abstractNumId w:val="39"/>
+    <w:abstractNumId w:val="40"/>
   </w:num>
   <w:num w:numId="14" w16cid:durableId="1897155767">
-    <w:abstractNumId w:val="21"/>
+    <w:abstractNumId w:val="22"/>
   </w:num>
   <w:num w:numId="15" w16cid:durableId="370228397">
-    <w:abstractNumId w:val="17"/>
+    <w:abstractNumId w:val="18"/>
   </w:num>
   <w:num w:numId="16" w16cid:durableId="1930963845">
     <w:abstractNumId w:val="1"/>
   </w:num>
   <w:num w:numId="17" w16cid:durableId="1342272576">
-    <w:abstractNumId w:val="31"/>
+    <w:abstractNumId w:val="32"/>
   </w:num>
   <w:num w:numId="18" w16cid:durableId="182745335">
-    <w:abstractNumId w:val="16"/>
+    <w:abstractNumId w:val="17"/>
   </w:num>
   <w:num w:numId="19" w16cid:durableId="1896819236">
-    <w:abstractNumId w:val="26"/>
+    <w:abstractNumId w:val="27"/>
   </w:num>
   <w:num w:numId="20" w16cid:durableId="1344630814">
-    <w:abstractNumId w:val="20"/>
+    <w:abstractNumId w:val="21"/>
   </w:num>
   <w:num w:numId="21" w16cid:durableId="154348362">
     <w:abstractNumId w:val="11"/>
   </w:num>
   <w:num w:numId="22" w16cid:durableId="1093937543">
-    <w:abstractNumId w:val="32"/>
+    <w:abstractNumId w:val="33"/>
   </w:num>
   <w:num w:numId="23" w16cid:durableId="742989385">
-    <w:abstractNumId w:val="27"/>
+    <w:abstractNumId w:val="28"/>
   </w:num>
   <w:num w:numId="24" w16cid:durableId="1092820407">
-    <w:abstractNumId w:val="24"/>
+    <w:abstractNumId w:val="25"/>
   </w:num>
   <w:num w:numId="25" w16cid:durableId="1203713366">
     <w:abstractNumId w:val="10"/>
@@ -14742,34 +16702,34 @@
     <w:abstractNumId w:val="5"/>
   </w:num>
   <w:num w:numId="27" w16cid:durableId="1589270320">
-    <w:abstractNumId w:val="25"/>
+    <w:abstractNumId w:val="26"/>
   </w:num>
   <w:num w:numId="28" w16cid:durableId="1025403573">
-    <w:abstractNumId w:val="23"/>
+    <w:abstractNumId w:val="24"/>
   </w:num>
   <w:num w:numId="29" w16cid:durableId="21789852">
-    <w:abstractNumId w:val="36"/>
+    <w:abstractNumId w:val="37"/>
   </w:num>
   <w:num w:numId="30" w16cid:durableId="1454862240">
-    <w:abstractNumId w:val="30"/>
+    <w:abstractNumId w:val="31"/>
   </w:num>
   <w:num w:numId="31" w16cid:durableId="173737922">
-    <w:abstractNumId w:val="40"/>
+    <w:abstractNumId w:val="41"/>
   </w:num>
   <w:num w:numId="32" w16cid:durableId="1350176460">
-    <w:abstractNumId w:val="41"/>
+    <w:abstractNumId w:val="42"/>
   </w:num>
   <w:num w:numId="33" w16cid:durableId="1992562078">
-    <w:abstractNumId w:val="19"/>
+    <w:abstractNumId w:val="20"/>
   </w:num>
   <w:num w:numId="34" w16cid:durableId="906451187">
     <w:abstractNumId w:val="6"/>
   </w:num>
   <w:num w:numId="35" w16cid:durableId="1425036502">
-    <w:abstractNumId w:val="14"/>
+    <w:abstractNumId w:val="15"/>
   </w:num>
   <w:num w:numId="36" w16cid:durableId="1461538051">
-    <w:abstractNumId w:val="44"/>
+    <w:abstractNumId w:val="45"/>
   </w:num>
   <w:num w:numId="37" w16cid:durableId="406197350">
     <w:abstractNumId w:val="8"/>
@@ -14778,19 +16738,19 @@
     <w:abstractNumId w:val="2"/>
   </w:num>
   <w:num w:numId="39" w16cid:durableId="38676847">
-    <w:abstractNumId w:val="35"/>
+    <w:abstractNumId w:val="36"/>
   </w:num>
   <w:num w:numId="40" w16cid:durableId="726270728">
-    <w:abstractNumId w:val="15"/>
+    <w:abstractNumId w:val="16"/>
   </w:num>
   <w:num w:numId="41" w16cid:durableId="71780168">
     <w:abstractNumId w:val="9"/>
   </w:num>
   <w:num w:numId="42" w16cid:durableId="2128818646">
-    <w:abstractNumId w:val="43"/>
+    <w:abstractNumId w:val="44"/>
   </w:num>
   <w:num w:numId="43" w16cid:durableId="1493250795">
-    <w:abstractNumId w:val="38"/>
+    <w:abstractNumId w:val="39"/>
   </w:num>
   <w:num w:numId="44" w16cid:durableId="1413502268">
     <w:abstractNumId w:val="4"/>
@@ -14799,7 +16759,10 @@
     <w:abstractNumId w:val="0"/>
   </w:num>
   <w:num w:numId="46" w16cid:durableId="2095391704">
-    <w:abstractNumId w:val="28"/>
+    <w:abstractNumId w:val="29"/>
+  </w:num>
+  <w:num w:numId="47" w16cid:durableId="1317802647">
+    <w:abstractNumId w:val="14"/>
   </w:num>
 </w:numbering>
 </file>
@@ -15196,7 +17159,7 @@
   <w:style w:type="paragraph" w:default="1" w:styleId="Normal">
     <w:name w:val="Normal"/>
     <w:qFormat/>
-    <w:rsid w:val="00237C4A"/>
+    <w:rsid w:val="00AE241F"/>
     <w:pPr>
       <w:spacing w:after="120" w:line="280" w:lineRule="atLeast"/>
       <w:jc w:val="both"/>
@@ -15298,6 +17261,7 @@
   <w:style w:type="character" w:default="1" w:styleId="DefaultParagraphFont">
     <w:name w:val="Default Paragraph Font"/>
     <w:uiPriority w:val="1"/>
+    <w:semiHidden/>
     <w:unhideWhenUsed/>
   </w:style>
   <w:style w:type="table" w:default="1" w:styleId="TableNormal">

</xml_diff>